<commit_message>
refactor: translate codebase to English, clean comments, capture authentic Neovim screenshots and update lab report
</commit_message>
<xml_diff>
--- a/Lab1_HuynhKhanhThien.docx
+++ b/Lab1_HuynhKhanhThien.docx
@@ -4,7 +4,7 @@
   <w:body>
     <w:p>
       <w:pPr>
-        <w:spacing w:after="60" w:before="100"/>
+        <w:spacing w:after="40" w:before="60"/>
         <w:jc w:val="center"/>
       </w:pPr>
       <w:r>
@@ -13,30 +13,30 @@
           <w:b/>
           <w:bCs/>
           <w:color w:val="0F172A"/>
-          <w:sz w:val="24"/>
-          <w:szCs w:val="24"/>
+          <w:sz w:val="22"/>
+          <w:szCs w:val="22"/>
         </w:rPr>
         <w:t xml:space="preserve">TRƯỜNG ĐẠI HỌC CÔNG NGHỆ THÔNG TIN - ĐHQG TP.HCM</w:t>
       </w:r>
     </w:p>
     <w:p>
       <w:pPr>
-        <w:spacing w:after="180"/>
+        <w:spacing w:after="140"/>
         <w:jc w:val="center"/>
       </w:pPr>
       <w:r>
         <w:rPr>
           <w:rFonts w:ascii="Arial" w:cs="Arial" w:eastAsia="Arial" w:hAnsi="Arial"/>
           <w:color w:val="475569"/>
-          <w:sz w:val="20"/>
-          <w:szCs w:val="20"/>
-        </w:rPr>
-        <w:t xml:space="preserve">BIRMINGHAM CITY UNIVERSITY (BCU) - JOINT PROGRAM</w:t>
-      </w:r>
-    </w:p>
-    <w:p>
-      <w:pPr>
-        <w:spacing w:after="120" w:before="140"/>
+          <w:sz w:val="19"/>
+          <w:szCs w:val="19"/>
+        </w:rPr>
+        <w:t xml:space="preserve">CHƯƠNG TRÌNH LIÊN KẾT BIRMINGHAM CITY UNIVERSITY (BCU)</w:t>
+      </w:r>
+    </w:p>
+    <w:p>
+      <w:pPr>
+        <w:spacing w:after="80" w:before="100"/>
         <w:jc w:val="center"/>
       </w:pPr>
       <w:r>
@@ -44,16 +44,16 @@
           <w:rFonts w:ascii="Arial" w:cs="Arial" w:eastAsia="Arial" w:hAnsi="Arial"/>
           <w:b/>
           <w:bCs/>
-          <w:color w:val="0284C7"/>
-          <w:sz w:val="32"/>
-          <w:szCs w:val="32"/>
-        </w:rPr>
-        <w:t xml:space="preserve">BÁO CÁO THỰC HÀNH LAB 1</w:t>
-      </w:r>
-    </w:p>
-    <w:p>
-      <w:pPr>
-        <w:spacing w:after="240"/>
+          <w:color w:val="0369A1"/>
+          <w:sz w:val="28"/>
+          <w:szCs w:val="28"/>
+        </w:rPr>
+        <w:t xml:space="preserve">BÁO CÁO BÀI TẬP THỰC HÀNH LAB 1</w:t>
+      </w:r>
+    </w:p>
+    <w:p>
+      <w:pPr>
+        <w:spacing w:after="200"/>
         <w:jc w:val="center"/>
       </w:pPr>
       <w:r>
@@ -62,11 +62,11 @@
           <w:b/>
           <w:bCs/>
           <w:color w:val="1E293B"/>
-          <w:sz w:val="24"/>
-          <w:szCs w:val="24"/>
-        </w:rPr>
-        <w:t xml:space="preserve">MÔ TẢ VÀ GIẢI THÍCH CHI TIẾT XÂY DỰNG CV CÁ NHÂN
-VỚI SEMANTIC HTML5 VÀ MINIMALIST DARK CSS</w:t>
+          <w:sz w:val="21"/>
+          <w:szCs w:val="21"/>
+        </w:rPr>
+        <w:t xml:space="preserve">Môn học: Web Design and Development
+Đề tài: Môi trường &amp; Cơ bản về HTML / CSS (Trang CV Cá Nhân)</w:t>
       </w:r>
     </w:p>
     <w:tbl>
@@ -97,10 +97,10 @@
             </w:tcBorders>
             <w:shd w:fill="F1F5F9" w:val="clear"/>
             <w:tcMar>
-              <w:top w:type="dxa" w:w="100"/>
-              <w:left w:type="dxa" w:w="140"/>
-              <w:bottom w:type="dxa" w:w="100"/>
-              <w:right w:type="dxa" w:w="140"/>
+              <w:top w:type="dxa" w:w="80"/>
+              <w:left w:type="dxa" w:w="120"/>
+              <w:bottom w:type="dxa" w:w="80"/>
+              <w:right w:type="dxa" w:w="120"/>
             </w:tcMar>
           </w:tcPr>
           <w:p>
@@ -109,8 +109,8 @@
                 <w:rFonts w:ascii="Arial" w:cs="Arial" w:eastAsia="Arial" w:hAnsi="Arial"/>
                 <w:b/>
                 <w:bCs/>
-                <w:sz w:val="21"/>
-                <w:szCs w:val="21"/>
+                <w:sz w:val="20"/>
+                <w:szCs w:val="20"/>
               </w:rPr>
               <w:t xml:space="preserve">Họ và tên sinh viên:</w:t>
             </w:r>
@@ -126,10 +126,10 @@
               <w:right w:val="single" w:color="CBD5E1" w:sz="1"/>
             </w:tcBorders>
             <w:tcMar>
-              <w:top w:type="dxa" w:w="100"/>
-              <w:left w:type="dxa" w:w="140"/>
-              <w:bottom w:type="dxa" w:w="100"/>
-              <w:right w:type="dxa" w:w="140"/>
+              <w:top w:type="dxa" w:w="80"/>
+              <w:left w:type="dxa" w:w="120"/>
+              <w:bottom w:type="dxa" w:w="80"/>
+              <w:right w:type="dxa" w:w="120"/>
             </w:tcMar>
           </w:tcPr>
           <w:p>
@@ -138,9 +138,8 @@
                 <w:rFonts w:ascii="Arial" w:cs="Arial" w:eastAsia="Arial" w:hAnsi="Arial"/>
                 <w:b/>
                 <w:bCs/>
-                <w:color w:val="0284C7"/>
-                <w:sz w:val="21"/>
-                <w:szCs w:val="21"/>
+                <w:sz w:val="20"/>
+                <w:szCs w:val="20"/>
               </w:rPr>
               <w:t xml:space="preserve">Huỳnh Khánh Thiện (Huynh Khanh Thien)</w:t>
             </w:r>
@@ -159,10 +158,10 @@
             </w:tcBorders>
             <w:shd w:fill="F1F5F9" w:val="clear"/>
             <w:tcMar>
-              <w:top w:type="dxa" w:w="100"/>
-              <w:left w:type="dxa" w:w="140"/>
-              <w:bottom w:type="dxa" w:w="100"/>
-              <w:right w:type="dxa" w:w="140"/>
+              <w:top w:type="dxa" w:w="80"/>
+              <w:left w:type="dxa" w:w="120"/>
+              <w:bottom w:type="dxa" w:w="80"/>
+              <w:right w:type="dxa" w:w="120"/>
             </w:tcMar>
           </w:tcPr>
           <w:p>
@@ -171,8 +170,8 @@
                 <w:rFonts w:ascii="Arial" w:cs="Arial" w:eastAsia="Arial" w:hAnsi="Arial"/>
                 <w:b/>
                 <w:bCs/>
-                <w:sz w:val="21"/>
-                <w:szCs w:val="21"/>
+                <w:sz w:val="20"/>
+                <w:szCs w:val="20"/>
               </w:rPr>
               <w:t xml:space="preserve">Chuyên ngành:</w:t>
             </w:r>
@@ -188,20 +187,20 @@
               <w:right w:val="single" w:color="CBD5E1" w:sz="1"/>
             </w:tcBorders>
             <w:tcMar>
-              <w:top w:type="dxa" w:w="100"/>
-              <w:left w:type="dxa" w:w="140"/>
-              <w:bottom w:type="dxa" w:w="100"/>
-              <w:right w:type="dxa" w:w="140"/>
+              <w:top w:type="dxa" w:w="80"/>
+              <w:left w:type="dxa" w:w="120"/>
+              <w:bottom w:type="dxa" w:w="80"/>
+              <w:right w:type="dxa" w:w="120"/>
             </w:tcMar>
           </w:tcPr>
           <w:p>
             <w:r>
               <w:rPr>
                 <w:rFonts w:ascii="Arial" w:cs="Arial" w:eastAsia="Arial" w:hAnsi="Arial"/>
-                <w:sz w:val="21"/>
-                <w:szCs w:val="21"/>
+                <w:sz w:val="20"/>
+                <w:szCs w:val="20"/>
               </w:rPr>
-              <w:t xml:space="preserve">Khoa học Máy tính (Bachelor of Science in Computer Science)</w:t>
+              <w:t xml:space="preserve">Khoa học Máy tính (Computer Science - BCU Joint Program)</w:t>
             </w:r>
           </w:p>
         </w:tc>
@@ -218,10 +217,10 @@
             </w:tcBorders>
             <w:shd w:fill="F1F5F9" w:val="clear"/>
             <w:tcMar>
-              <w:top w:type="dxa" w:w="100"/>
-              <w:left w:type="dxa" w:w="140"/>
-              <w:bottom w:type="dxa" w:w="100"/>
-              <w:right w:type="dxa" w:w="140"/>
+              <w:top w:type="dxa" w:w="80"/>
+              <w:left w:type="dxa" w:w="120"/>
+              <w:bottom w:type="dxa" w:w="80"/>
+              <w:right w:type="dxa" w:w="120"/>
             </w:tcMar>
           </w:tcPr>
           <w:p>
@@ -230,67 +229,8 @@
                 <w:rFonts w:ascii="Arial" w:cs="Arial" w:eastAsia="Arial" w:hAnsi="Arial"/>
                 <w:b/>
                 <w:bCs/>
-                <w:sz w:val="21"/>
-                <w:szCs w:val="21"/>
-              </w:rPr>
-              <w:t xml:space="preserve">Môn học:</w:t>
-            </w:r>
-          </w:p>
-        </w:tc>
-        <w:tc>
-          <w:tcPr>
-            <w:tcW w:type="dxa" w:w="6426"/>
-            <w:tcBorders>
-              <w:top w:val="single" w:color="CBD5E1" w:sz="1"/>
-              <w:left w:val="single" w:color="CBD5E1" w:sz="1"/>
-              <w:bottom w:val="single" w:color="CBD5E1" w:sz="1"/>
-              <w:right w:val="single" w:color="CBD5E1" w:sz="1"/>
-            </w:tcBorders>
-            <w:tcMar>
-              <w:top w:type="dxa" w:w="100"/>
-              <w:left w:type="dxa" w:w="140"/>
-              <w:bottom w:type="dxa" w:w="100"/>
-              <w:right w:type="dxa" w:w="140"/>
-            </w:tcMar>
-          </w:tcPr>
-          <w:p>
-            <w:r>
-              <w:rPr>
-                <w:rFonts w:ascii="Arial" w:cs="Arial" w:eastAsia="Arial" w:hAnsi="Arial"/>
-                <w:sz w:val="21"/>
-                <w:szCs w:val="21"/>
-              </w:rPr>
-              <w:t xml:space="preserve">Web Design and Development (CS101 / Frontend Web)</w:t>
-            </w:r>
-          </w:p>
-        </w:tc>
-      </w:tr>
-      <w:tr>
-        <w:tc>
-          <w:tcPr>
-            <w:tcW w:type="dxa" w:w="2600"/>
-            <w:tcBorders>
-              <w:top w:val="single" w:color="CBD5E1" w:sz="1"/>
-              <w:left w:val="single" w:color="CBD5E1" w:sz="1"/>
-              <w:bottom w:val="single" w:color="CBD5E1" w:sz="1"/>
-              <w:right w:val="single" w:color="CBD5E1" w:sz="1"/>
-            </w:tcBorders>
-            <w:shd w:fill="F1F5F9" w:val="clear"/>
-            <w:tcMar>
-              <w:top w:type="dxa" w:w="100"/>
-              <w:left w:type="dxa" w:w="140"/>
-              <w:bottom w:type="dxa" w:w="100"/>
-              <w:right w:type="dxa" w:w="140"/>
-            </w:tcMar>
-          </w:tcPr>
-          <w:p>
-            <w:r>
-              <w:rPr>
-                <w:rFonts w:ascii="Arial" w:cs="Arial" w:eastAsia="Arial" w:hAnsi="Arial"/>
-                <w:b/>
-                <w:bCs/>
-                <w:sz w:val="21"/>
-                <w:szCs w:val="21"/>
+                <w:sz w:val="20"/>
+                <w:szCs w:val="20"/>
               </w:rPr>
               <w:t xml:space="preserve">GitHub Repository:</w:t>
             </w:r>
@@ -306,19 +246,19 @@
               <w:right w:val="single" w:color="CBD5E1" w:sz="1"/>
             </w:tcBorders>
             <w:tcMar>
-              <w:top w:type="dxa" w:w="100"/>
-              <w:left w:type="dxa" w:w="140"/>
-              <w:bottom w:type="dxa" w:w="100"/>
-              <w:right w:type="dxa" w:w="140"/>
+              <w:top w:type="dxa" w:w="80"/>
+              <w:left w:type="dxa" w:w="120"/>
+              <w:bottom w:type="dxa" w:w="80"/>
+              <w:right w:type="dxa" w:w="120"/>
             </w:tcMar>
           </w:tcPr>
           <w:p>
             <w:r>
               <w:rPr>
                 <w:rFonts w:ascii="Arial" w:cs="Arial" w:eastAsia="Arial" w:hAnsi="Arial"/>
-                <w:color w:val="0284C7"/>
-                <w:sz w:val="21"/>
-                <w:szCs w:val="21"/>
+                <w:color w:val="0369A1"/>
+                <w:sz w:val="20"/>
+                <w:szCs w:val="20"/>
               </w:rPr>
               <w:t xml:space="preserve">https://github.com/thien-z3d3r/lab1-cv (Public)</w:t>
             </w:r>
@@ -337,10 +277,10 @@
             </w:tcBorders>
             <w:shd w:fill="F1F5F9" w:val="clear"/>
             <w:tcMar>
-              <w:top w:type="dxa" w:w="100"/>
-              <w:left w:type="dxa" w:w="140"/>
-              <w:bottom w:type="dxa" w:w="100"/>
-              <w:right w:type="dxa" w:w="140"/>
+              <w:top w:type="dxa" w:w="80"/>
+              <w:left w:type="dxa" w:w="120"/>
+              <w:bottom w:type="dxa" w:w="80"/>
+              <w:right w:type="dxa" w:w="120"/>
             </w:tcMar>
           </w:tcPr>
           <w:p>
@@ -349,10 +289,10 @@
                 <w:rFonts w:ascii="Arial" w:cs="Arial" w:eastAsia="Arial" w:hAnsi="Arial"/>
                 <w:b/>
                 <w:bCs/>
-                <w:sz w:val="21"/>
-                <w:szCs w:val="21"/>
+                <w:sz w:val="20"/>
+                <w:szCs w:val="20"/>
               </w:rPr>
-              <w:t xml:space="preserve">GitHub Pages Live Demo:</w:t>
+              <w:t xml:space="preserve">GitHub Pages:</w:t>
             </w:r>
           </w:p>
         </w:tc>
@@ -366,19 +306,19 @@
               <w:right w:val="single" w:color="CBD5E1" w:sz="1"/>
             </w:tcBorders>
             <w:tcMar>
-              <w:top w:type="dxa" w:w="100"/>
-              <w:left w:type="dxa" w:w="140"/>
-              <w:bottom w:type="dxa" w:w="100"/>
-              <w:right w:type="dxa" w:w="140"/>
+              <w:top w:type="dxa" w:w="80"/>
+              <w:left w:type="dxa" w:w="120"/>
+              <w:bottom w:type="dxa" w:w="80"/>
+              <w:right w:type="dxa" w:w="120"/>
             </w:tcMar>
           </w:tcPr>
           <w:p>
             <w:r>
               <w:rPr>
                 <w:rFonts w:ascii="Arial" w:cs="Arial" w:eastAsia="Arial" w:hAnsi="Arial"/>
-                <w:color w:val="0284C7"/>
-                <w:sz w:val="21"/>
-                <w:szCs w:val="21"/>
+                <w:color w:val="0369A1"/>
+                <w:sz w:val="20"/>
+                <w:szCs w:val="20"/>
               </w:rPr>
               <w:t xml:space="preserve">https://thien-z3d3r.github.io/lab1-cv/</w:t>
             </w:r>
@@ -388,13 +328,13 @@
     </w:tbl>
     <w:p>
       <w:pPr>
-        <w:spacing w:after="200"/>
+        <w:spacing w:after="180"/>
       </w:pPr>
     </w:p>
     <w:p>
       <w:pPr>
         <w:pStyle w:val="Heading1"/>
-        <w:spacing w:after="140" w:before="280"/>
+        <w:spacing w:after="120" w:before="240"/>
       </w:pPr>
       <w:r>
         <w:rPr>
@@ -402,15 +342,15 @@
           <w:b/>
           <w:bCs/>
           <w:color w:val="0F172A"/>
-          <w:sz w:val="28"/>
-          <w:szCs w:val="28"/>
-        </w:rPr>
-        <w:t xml:space="preserve">1. Giới Thiệu &amp; Triết Lý Thiết Kế</w:t>
-      </w:r>
-    </w:p>
-    <w:p>
-      <w:pPr>
-        <w:spacing w:after="120" w:line="276"/>
+          <w:sz w:val="26"/>
+          <w:szCs w:val="26"/>
+        </w:rPr>
+        <w:t xml:space="preserve">1. Mục Tiêu &amp; Cấu Trúc Dự Án</w:t>
+      </w:r>
+    </w:p>
+    <w:p>
+      <w:pPr>
+        <w:spacing w:after="100" w:line="260"/>
       </w:pPr>
       <w:r>
         <w:rPr>
@@ -418,87 +358,51 @@
           <w:b w:val="false"/>
           <w:bCs w:val="false"/>
           <w:color w:val="334155"/>
-          <w:sz w:val="22"/>
-          <w:szCs w:val="22"/>
-        </w:rPr>
-        <w:t xml:space="preserve">Bài thực hành Lab 1 yêu cầu xây dựng một trang web lý lịch cá nhân (Online CV / Resume) hoàn chỉnh sử dụng cấu trúc ngữ nghĩa HTML5 hiện đại (Semantic HTML5) kết hợp định kiểu bằng CSS thuần. Mục tiêu cốt lõi là làm chủ các thẻ cấu trúc tài liệu, Box Model, hệ thống phân cấp nội dung, cũng như tạo dựng các tương tác người dùng mượt mà thông qua CSS transitions và transforms.</w:t>
-      </w:r>
-    </w:p>
-    <w:tbl>
-      <w:tblPr>
-        <w:tblW w:type="dxa" w:w="9026"/>
-        <w:tblBorders>
-          <w:top w:val="single" w:color="auto" w:sz="4"/>
-          <w:left w:val="single" w:color="auto" w:sz="4"/>
-          <w:bottom w:val="single" w:color="auto" w:sz="4"/>
-          <w:right w:val="single" w:color="auto" w:sz="4"/>
-          <w:insideH w:val="single" w:color="auto" w:sz="4"/>
-          <w:insideV w:val="single" w:color="auto" w:sz="4"/>
-        </w:tblBorders>
-      </w:tblPr>
-      <w:tblGrid>
-        <w:gridCol w:w="9026"/>
-      </w:tblGrid>
-      <w:tr>
-        <w:tc>
-          <w:tcPr>
-            <w:tcW w:type="dxa" w:w="9026"/>
-            <w:tcBorders>
-              <w:top w:val="none" w:color="FFFFFF" w:sz="0"/>
-              <w:left w:val="single" w:color="0284C7" w:sz="24"/>
-              <w:bottom w:val="none" w:color="FFFFFF" w:sz="0"/>
-              <w:right w:val="none" w:color="FFFFFF" w:sz="0"/>
-            </w:tcBorders>
-            <w:shd w:fill="F0F9FF" w:val="clear"/>
-            <w:tcMar>
-              <w:top w:type="dxa" w:w="120"/>
-              <w:left w:type="dxa" w:w="180"/>
-              <w:bottom w:type="dxa" w:w="120"/>
-              <w:right w:type="dxa" w:w="180"/>
-            </w:tcMar>
-          </w:tcPr>
-          <w:p>
-            <w:pPr>
-              <w:spacing w:after="60"/>
-            </w:pPr>
-            <w:r>
-              <w:rPr>
-                <w:rFonts w:ascii="Arial" w:cs="Arial" w:eastAsia="Arial" w:hAnsi="Arial"/>
-                <w:b/>
-                <w:bCs/>
-                <w:color w:val="0369A1"/>
-                <w:sz w:val="22"/>
-                <w:szCs w:val="22"/>
-              </w:rPr>
-              <w:t xml:space="preserve">Triết lý thiết kế (Muted Minimalist Aesthetics):</w:t>
-            </w:r>
-          </w:p>
-          <w:p>
-            <w:pPr>
-              <w:spacing w:after="0"/>
-            </w:pPr>
-            <w:r>
-              <w:rPr>
-                <w:rFonts w:ascii="Arial" w:cs="Arial" w:eastAsia="Arial" w:hAnsi="Arial"/>
-                <w:color w:val="1E293B"/>
-                <w:sz w:val="21"/>
-                <w:szCs w:val="21"/>
-              </w:rPr>
-              <w:t xml:space="preserve">Trang web được thiết kế theo tone màu trầm, tối giản, mang hơi hướng của các trang portfolio kỹ sư hệ thống/blockchain hàng đầu: nền màu tối than chì (charcoal/dark slate #0d0f12), bề mặt thẻ card #181b23 với đường viền mỏng tinh tế #242936, màu chữ có độ tương phản êm dịu #e2e8f0, và điểm xuyết điểm nhấn bằng sắc xanh biển dịu nhẹ (#38bdf8). Bố cục phân lớp rõ ràng giúp thông tin kỹ thuật được tiếp nhận trực quan, sắc nét và chuyên nghiệp.</w:t>
-            </w:r>
-          </w:p>
-        </w:tc>
-      </w:tr>
-    </w:tbl>
-    <w:p>
-      <w:pPr>
-        <w:spacing w:after="140"/>
-      </w:pPr>
+          <w:sz w:val="21"/>
+          <w:szCs w:val="21"/>
+        </w:rPr>
+        <w:t xml:space="preserve">Trong bài Lab 1, em thực hiện xây dựng một trang web lý lịch cá nhân (Online CV/Resume) bằng HTML5 và CSS thuần. Toàn bộ nội dung trang được xây dựng trực tiếp dựa trên hồ sơ cá nhân của em về mảng lập trình Smart Contract trên EVM, tối ưu hóa hệ thống (Solidity, Yul, Rust, C++) và hạ tầng tính toán phân tán.</w:t>
+      </w:r>
+    </w:p>
+    <w:p>
+      <w:pPr>
+        <w:spacing w:after="100" w:line="260"/>
+      </w:pPr>
+      <w:r>
+        <w:rPr>
+          <w:rFonts w:ascii="Arial" w:cs="Arial" w:eastAsia="Arial" w:hAnsi="Arial"/>
+          <w:b w:val="false"/>
+          <w:bCs w:val="false"/>
+          <w:color w:val="334155"/>
+          <w:sz w:val="21"/>
+          <w:szCs w:val="21"/>
+        </w:rPr>
+        <w:t xml:space="preserve">Giao diện trang web được định hướng theo phong cách tối giản (minimalist) với gam màu tối trầm (#0f1013), hạn chế các chi tiết trang trí thừa thãi để tập trung vào khả năng đọc và bố cục nội dung mạch lạc. Toàn bộ codebase được viết bằng tiếng Anh chuẩn mực để phục vụ môi trường học tập và công việc.</w:t>
+      </w:r>
+    </w:p>
+    <w:p>
+      <w:pPr>
+        <w:spacing w:after="100" w:line="260"/>
+      </w:pPr>
+      <w:r>
+        <w:rPr>
+          <w:rFonts w:ascii="Arial" w:cs="Arial" w:eastAsia="Arial" w:hAnsi="Arial"/>
+          <w:b w:val="false"/>
+          <w:bCs w:val="false"/>
+          <w:color w:val="334155"/>
+          <w:sz w:val="21"/>
+          <w:szCs w:val="21"/>
+        </w:rPr>
+        <w:t xml:space="preserve">Cấu trúc thư mục dự án gồm:
+• index.html: Chứa mã nguồn cấu trúc trang, sử dụng các thẻ HTML5 Semantic chuẩn.
+• style.css: Tệp định kiểu CSS riêng biệt (External CSS), quản lý biến màu sắc và responsive.
+• assets/: Thư mục chứa ảnh đại diện avatar.svg và favicon logo UIT.</w:t>
+      </w:r>
     </w:p>
     <w:p>
       <w:pPr>
         <w:pStyle w:val="Heading1"/>
-        <w:spacing w:after="140" w:before="280"/>
+        <w:spacing w:after="120" w:before="240"/>
       </w:pPr>
       <w:r>
         <w:rPr>
@@ -506,15 +410,15 @@
           <w:b/>
           <w:bCs/>
           <w:color w:val="0F172A"/>
-          <w:sz w:val="28"/>
-          <w:szCs w:val="28"/>
-        </w:rPr>
-        <w:t xml:space="preserve">2. Phân Tích &amp; Giải Thích Chi Tiết Mã Nguồn HTML5 (Kèm Ảnh Chụp Neovim)</w:t>
-      </w:r>
-    </w:p>
-    <w:p>
-      <w:pPr>
-        <w:spacing w:after="120" w:line="276"/>
+          <w:sz w:val="26"/>
+          <w:szCs w:val="26"/>
+        </w:rPr>
+        <w:t xml:space="preserve">2. Phân Tích Mã Nguồn HTML (index.html)</w:t>
+      </w:r>
+    </w:p>
+    <w:p>
+      <w:pPr>
+        <w:spacing w:after="100" w:line="260"/>
       </w:pPr>
       <w:r>
         <w:rPr>
@@ -522,16 +426,16 @@
           <w:b w:val="false"/>
           <w:bCs w:val="false"/>
           <w:color w:val="334155"/>
-          <w:sz w:val="22"/>
-          <w:szCs w:val="22"/>
-        </w:rPr>
-        <w:t xml:space="preserve">Mã nguồn được biên tập và quản lý trực tiếp bằng Neovim với môi trường cấu hình hiện đại (LazyVim, giao diện TokyoNight Night). Dưới đây là phân tích chi tiết từng khối chức năng:</w:t>
+          <w:sz w:val="21"/>
+          <w:szCs w:val="21"/>
+        </w:rPr>
+        <w:t xml:space="preserve">Dưới đây là phần giải thích các khối thẻ HTML chính trong bài làm, kèm theo ảnh chụp màn hình trực tiếp từ trình soạn thảo Neovim của em:</w:t>
       </w:r>
     </w:p>
     <w:p>
       <w:pPr>
         <w:pStyle w:val="Heading2"/>
-        <w:spacing w:after="100" w:before="200"/>
+        <w:spacing w:after="80" w:before="180"/>
       </w:pPr>
       <w:r>
         <w:rPr>
@@ -539,15 +443,15 @@
           <w:b/>
           <w:bCs/>
           <w:color w:val="1E293B"/>
-          <w:sz w:val="24"/>
-          <w:szCs w:val="24"/>
-        </w:rPr>
-        <w:t xml:space="preserve">2.1 Cấu Trúc Khởi Tạo &amp; Thanh Điều Hướng (index.html: Dòng 1 – 31)</w:t>
-      </w:r>
-    </w:p>
-    <w:p>
-      <w:pPr>
-        <w:spacing w:after="120" w:line="276"/>
+          <w:sz w:val="22"/>
+          <w:szCs w:val="22"/>
+        </w:rPr>
+        <w:t xml:space="preserve">2.1 Khởi tạo trang và thanh điều hướng (&lt;head&gt;, &lt;nav&gt;)</w:t>
+      </w:r>
+    </w:p>
+    <w:p>
+      <w:pPr>
+        <w:spacing w:after="100" w:line="260"/>
       </w:pPr>
       <w:r>
         <w:rPr>
@@ -555,27 +459,26 @@
           <w:b w:val="false"/>
           <w:bCs w:val="false"/>
           <w:color w:val="334155"/>
-          <w:sz w:val="22"/>
-          <w:szCs w:val="22"/>
-        </w:rPr>
-        <w:t xml:space="preserve">• &lt;!DOCTYPE html&gt;: Khai báo chuẩn HTML5 giúp trình duyệt kích hoạt chế độ dựng hình chuẩn (standard mode).
-• &lt;meta charset="UTF-8"&gt;: Thiết lập bảng mã ký tự quốc tế, hiển thị chính xác tiếng Việt có dấu.
-• &lt;meta name="viewport" content="width=device-width, initial-scale=1.0"&gt;: Đảm bảo giao diện hiển thị co giãn chuẩn xác trên màn hình di động, không bị vỡ bố cục.
-• &lt;link rel="icon" href="..."&gt;: Thực hiện Exercise 1 của đề bài, nhúng biểu trưng favicon UIT từ máy chủ chính thức.
-• &lt;nav class="navbar"&gt;: Thẻ ngữ nghĩa định vị thanh điều hướng đầu trang, chứa thương hiệu cá nhân và danh sách liên kết neo (jump links: #about, #experience, #projects, #skills, #education, #contact).</w:t>
-      </w:r>
-    </w:p>
-    <w:p>
-      <w:pPr>
-        <w:spacing w:after="60" w:before="140"/>
+          <w:sz w:val="21"/>
+          <w:szCs w:val="21"/>
+        </w:rPr>
+        <w:t xml:space="preserve">• Khai báo &lt;!DOCTYPE html&gt; và thẻ gốc &lt;html lang="en"&gt; theo chuẩn HTML5.
+• Thẻ &lt;meta charset="UTF-8"&gt; và &lt;meta name="viewport" content="width=device-width, initial-scale=1.0"&gt; đảm bảo trang co giãn đúng tỷ lệ trên các kích thước màn hình.
+• Thẻ &lt;link rel="icon"&gt; lấy logo UIT theo đúng gợi ý trong Exercise 1.
+• Thẻ ngữ nghĩa &lt;nav&gt; chứa tiêu đề tên cá nhân và danh sách liên kết neo (jump links) đến các phần tương ứng: About, Experience, Projects, Skills, Education, Contact.</w:t>
+      </w:r>
+    </w:p>
+    <w:p>
+      <w:pPr>
+        <w:spacing w:after="50" w:before="120"/>
         <w:jc w:val="center"/>
       </w:pPr>
       <w:r>
         <w:drawing>
           <wp:inline distT="0" distB="0" distL="0" distR="0">
-            <wp:extent cx="4762500" cy="4438650"/>
+            <wp:extent cx="5143500" cy="3286125"/>
             <wp:effectExtent t="0" r="0" b="0" l="0"/>
-            <wp:docPr id="1" name="Cấu trúc thẻ &lt;head&gt;, khai báo metadata, favicon UIT và thanh &lt;nav&gt; trong Neovim" descr="Cấu trúc thẻ &lt;head&gt;, khai báo metadata, favicon UIT và thanh &lt;nav&gt; trong Neovim" title="Cấu trúc thẻ &lt;head&gt;, khai báo metadata, favicon UIT và thanh &lt;nav&gt; trong Neovim"/>
+            <wp:docPr id="1" name="Hình 1: Khởi tạo trang, metadata, favicon UIT và thẻ ngữ nghĩa &lt;nav&gt; mở trong Neovim" descr="Hình 1: Khởi tạo trang, metadata, favicon UIT và thẻ ngữ nghĩa &lt;nav&gt; mở trong Neovim" title="Hình 1: Khởi tạo trang, metadata, favicon UIT và thẻ ngữ nghĩa &lt;nav&gt; mở trong Neovim"/>
             <wp:cNvGraphicFramePr>
               <a:graphicFrameLocks xmlns:a="http://schemas.openxmlformats.org/drawingml/2006/main" noChangeAspect="1"/>
             </wp:cNvGraphicFramePr>
@@ -598,7 +501,7 @@
                   <pic:spPr bwMode="auto">
                     <a:xfrm>
                       <a:off x="0" y="0"/>
-                      <a:ext cx="4762500" cy="4438650"/>
+                      <a:ext cx="5143500" cy="3286125"/>
                     </a:xfrm>
                     <a:prstGeom prst="rect">
                       <a:avLst/>
@@ -613,23 +516,23 @@
     </w:p>
     <w:p>
       <w:pPr>
-        <w:spacing w:after="160"/>
+        <w:spacing w:after="140"/>
         <w:jc w:val="center"/>
       </w:pPr>
       <w:r>
         <w:rPr>
           <w:rFonts w:ascii="Arial" w:cs="Arial" w:eastAsia="Arial" w:hAnsi="Arial"/>
           <w:color w:val="64748B"/>
-          <w:sz w:val="19"/>
-          <w:szCs w:val="19"/>
-        </w:rPr>
-        <w:t xml:space="preserve">Hình: Cấu trúc thẻ &lt;head&gt;, khai báo metadata, favicon UIT và thanh &lt;nav&gt; trong Neovim</w:t>
+          <w:sz w:val="18"/>
+          <w:szCs w:val="18"/>
+        </w:rPr>
+        <w:t xml:space="preserve">Hình 1: Khởi tạo trang, metadata, favicon UIT và thẻ ngữ nghĩa &lt;nav&gt; mở trong Neovim</w:t>
       </w:r>
     </w:p>
     <w:p>
       <w:pPr>
         <w:pStyle w:val="Heading2"/>
-        <w:spacing w:after="100" w:before="200"/>
+        <w:spacing w:after="80" w:before="180"/>
       </w:pPr>
       <w:r>
         <w:rPr>
@@ -637,15 +540,15 @@
           <w:b/>
           <w:bCs/>
           <w:color w:val="1E293B"/>
-          <w:sz w:val="24"/>
-          <w:szCs w:val="24"/>
-        </w:rPr>
-        <w:t xml:space="preserve">2.2 Khu Vực Giới Thiệu Cá Nhân - Hero Section (index.html: Dòng 33 – 60)</w:t>
-      </w:r>
-    </w:p>
-    <w:p>
-      <w:pPr>
-        <w:spacing w:after="120" w:line="276"/>
+          <w:sz w:val="22"/>
+          <w:szCs w:val="22"/>
+        </w:rPr>
+        <w:t xml:space="preserve">2.2 Phần giới thiệu đầu trang (&lt;header&gt;)</w:t>
+      </w:r>
+    </w:p>
+    <w:p>
+      <w:pPr>
+        <w:spacing w:after="100" w:line="260"/>
       </w:pPr>
       <w:r>
         <w:rPr>
@@ -653,26 +556,25 @@
           <w:b w:val="false"/>
           <w:bCs w:val="false"/>
           <w:color w:val="334155"/>
-          <w:sz w:val="22"/>
-          <w:szCs w:val="22"/>
-        </w:rPr>
-        <w:t xml:space="preserve">• &lt;header id="about" class="hero-section"&gt;: Đóng vai trò là mốc ngữ nghĩa giới thiệu tổng quan của trang.
-• Thẻ &lt;img&gt; với định dạng SVG vector sắc nét hiển thị ảnh đại diện lập trình viên kèm nhãn trạng thái 'Active'.
-• Cặp tiêu đề phân cấp &lt;h1&gt; (Tên sinh viên) và &lt;h2&gt; (Vị trí chuyên môn: Smart Contract &amp; Distributed Systems Developer).
-• Các thẻ nội tuyến: &lt;strong&gt; nhấn mạnh trọng tâm kỹ năng EVM, &lt;em&gt; biểu thị danh sách ngôn ngữ cấp thấp, và bộ ba nút bấm CTA (Call To Action) điều hướng nhanh.</w:t>
-      </w:r>
-    </w:p>
-    <w:p>
-      <w:pPr>
-        <w:spacing w:after="60" w:before="140"/>
+          <w:sz w:val="21"/>
+          <w:szCs w:val="21"/>
+        </w:rPr>
+        <w:t xml:space="preserve">• Thẻ &lt;header id="about"&gt; đóng vai trò phần giới thiệu đầu trang (Hero Section).
+• Sử dụng tiêu đề chính &lt;h1&gt; cho họ tên, thẻ &lt;p&gt; cho chức danh và đoạn tóm tắt định hướng nghề nghiệp.
+• Thẻ &lt;img&gt; nhúng ảnh đại diện vector (avatar.svg), đi kèm danh sách liên kết liên hệ trực tiếp (Email, Điện thoại, GitHub, LinkedIn).</w:t>
+      </w:r>
+    </w:p>
+    <w:p>
+      <w:pPr>
+        <w:spacing w:after="50" w:before="120"/>
         <w:jc w:val="center"/>
       </w:pPr>
       <w:r>
         <w:drawing>
           <wp:inline distT="0" distB="0" distL="0" distR="0">
-            <wp:extent cx="4762500" cy="2981325"/>
+            <wp:extent cx="5143500" cy="3286125"/>
             <wp:effectExtent t="0" r="0" b="0" l="0"/>
-            <wp:docPr id="2" name="Khối &lt;header&gt; giới thiệu cá nhân và avatar trong Neovim" descr="Khối &lt;header&gt; giới thiệu cá nhân và avatar trong Neovim" title="Khối &lt;header&gt; giới thiệu cá nhân và avatar trong Neovim"/>
+            <wp:docPr id="2" name="Hình 2: Cấu trúc &lt;header&gt; giới thiệu thông tin và liên hệ mở trong Neovim" descr="Hình 2: Cấu trúc &lt;header&gt; giới thiệu thông tin và liên hệ mở trong Neovim" title="Hình 2: Cấu trúc &lt;header&gt; giới thiệu thông tin và liên hệ mở trong Neovim"/>
             <wp:cNvGraphicFramePr>
               <a:graphicFrameLocks xmlns:a="http://schemas.openxmlformats.org/drawingml/2006/main" noChangeAspect="1"/>
             </wp:cNvGraphicFramePr>
@@ -695,7 +597,7 @@
                   <pic:spPr bwMode="auto">
                     <a:xfrm>
                       <a:off x="0" y="0"/>
-                      <a:ext cx="4762500" cy="2981325"/>
+                      <a:ext cx="5143500" cy="3286125"/>
                     </a:xfrm>
                     <a:prstGeom prst="rect">
                       <a:avLst/>
@@ -710,23 +612,23 @@
     </w:p>
     <w:p>
       <w:pPr>
-        <w:spacing w:after="160"/>
+        <w:spacing w:after="140"/>
         <w:jc w:val="center"/>
       </w:pPr>
       <w:r>
         <w:rPr>
           <w:rFonts w:ascii="Arial" w:cs="Arial" w:eastAsia="Arial" w:hAnsi="Arial"/>
           <w:color w:val="64748B"/>
-          <w:sz w:val="19"/>
-          <w:szCs w:val="19"/>
-        </w:rPr>
-        <w:t xml:space="preserve">Hình: Khối &lt;header&gt; giới thiệu cá nhân và avatar trong Neovim</w:t>
+          <w:sz w:val="18"/>
+          <w:szCs w:val="18"/>
+        </w:rPr>
+        <w:t xml:space="preserve">Hình 2: Cấu trúc &lt;header&gt; giới thiệu thông tin và liên hệ mở trong Neovim</w:t>
       </w:r>
     </w:p>
     <w:p>
       <w:pPr>
         <w:pStyle w:val="Heading2"/>
-        <w:spacing w:after="100" w:before="200"/>
+        <w:spacing w:after="80" w:before="180"/>
       </w:pPr>
       <w:r>
         <w:rPr>
@@ -734,15 +636,15 @@
           <w:b/>
           <w:bCs/>
           <w:color w:val="1E293B"/>
-          <w:sz w:val="24"/>
-          <w:szCs w:val="24"/>
-        </w:rPr>
-        <w:t xml:space="preserve">2.3 Khu Vực Kinh Nghiệm Làm Việc (index.html: Dòng 62 – 105)</w:t>
-      </w:r>
-    </w:p>
-    <w:p>
-      <w:pPr>
-        <w:spacing w:after="120" w:line="276"/>
+          <w:sz w:val="22"/>
+          <w:szCs w:val="22"/>
+        </w:rPr>
+        <w:t xml:space="preserve">2.3 Phần kinh nghiệm làm việc (&lt;section id="experience"&gt;)</w:t>
+      </w:r>
+    </w:p>
+    <w:p>
+      <w:pPr>
+        <w:spacing w:after="100" w:line="260"/>
       </w:pPr>
       <w:r>
         <w:rPr>
@@ -750,26 +652,25 @@
           <w:b w:val="false"/>
           <w:bCs w:val="false"/>
           <w:color w:val="334155"/>
-          <w:sz w:val="22"/>
-          <w:szCs w:val="22"/>
-        </w:rPr>
-        <w:t xml:space="preserve">• &lt;section id="experience"&gt;: Nhóm nội dung theo chủ đề kinh nghiệm thực tế.
-• &lt;article class="timeline-card"&gt;: Đóng gói từng đơn vị công việc độc lập (Uniswap Labs và Proprietary Trading). Việc dùng &lt;article&gt; hoàn toàn chuẩn mực theo ngữ nghĩa HTML5 cho các khối nội dung có thể đứng độc lập.
-• Thẻ &lt;mark&gt;: Làm nổi bật các chỉ số định lượng then chốt (+48% an toàn giao thức, +52% tốc độ phân phối, 500% lợi nhuận net).
-• Thẻ &lt;code&gt;: Bao gói các lệnh EVM cấp thấp (TSTORE, TLOAD) để biểu thị mã máy chính xác.</w:t>
-      </w:r>
-    </w:p>
-    <w:p>
-      <w:pPr>
-        <w:spacing w:after="60" w:before="140"/>
+          <w:sz w:val="21"/>
+          <w:szCs w:val="21"/>
+        </w:rPr>
+        <w:t xml:space="preserve">• Thẻ &lt;section id="experience"&gt; nhóm toàn bộ nội dung kinh nghiệm làm việc.
+• Mỗi vị trí công tác (Uniswap Labs và Hệ thống giao dịch phân tán) được đóng gói trong một thẻ &lt;article class="item-block"&gt; riêng biệt, thể hiện đúng ngữ nghĩa của một mẩu nội dung độc lập trong HTML5.
+• Tiêu đề công việc dùng &lt;h3&gt;, thời gian dùng &lt;span&gt;, và các trách nhiệm/kết quả được trình bày rõ ràng bằng danh sách &lt;ul&gt; và &lt;li&gt;.</w:t>
+      </w:r>
+    </w:p>
+    <w:p>
+      <w:pPr>
+        <w:spacing w:after="50" w:before="120"/>
         <w:jc w:val="center"/>
       </w:pPr>
       <w:r>
         <w:drawing>
           <wp:inline distT="0" distB="0" distL="0" distR="0">
-            <wp:extent cx="4762500" cy="3981450"/>
+            <wp:extent cx="5143500" cy="3286125"/>
             <wp:effectExtent t="0" r="0" b="0" l="0"/>
-            <wp:docPr id="3" name="Khối thẻ &lt;section&gt; kinh nghiệm làm việc và các thẻ &lt;article&gt; trong Neovim" descr="Khối thẻ &lt;section&gt; kinh nghiệm làm việc và các thẻ &lt;article&gt; trong Neovim" title="Khối thẻ &lt;section&gt; kinh nghiệm làm việc và các thẻ &lt;article&gt; trong Neovim"/>
+            <wp:docPr id="3" name="Hình 3: Cấu trúc &lt;section&gt; và các thẻ &lt;article&gt; kinh nghiệm mở trong Neovim" descr="Hình 3: Cấu trúc &lt;section&gt; và các thẻ &lt;article&gt; kinh nghiệm mở trong Neovim" title="Hình 3: Cấu trúc &lt;section&gt; và các thẻ &lt;article&gt; kinh nghiệm mở trong Neovim"/>
             <wp:cNvGraphicFramePr>
               <a:graphicFrameLocks xmlns:a="http://schemas.openxmlformats.org/drawingml/2006/main" noChangeAspect="1"/>
             </wp:cNvGraphicFramePr>
@@ -792,7 +693,7 @@
                   <pic:spPr bwMode="auto">
                     <a:xfrm>
                       <a:off x="0" y="0"/>
-                      <a:ext cx="4762500" cy="3981450"/>
+                      <a:ext cx="5143500" cy="3286125"/>
                     </a:xfrm>
                     <a:prstGeom prst="rect">
                       <a:avLst/>
@@ -807,23 +708,23 @@
     </w:p>
     <w:p>
       <w:pPr>
-        <w:spacing w:after="160"/>
+        <w:spacing w:after="140"/>
         <w:jc w:val="center"/>
       </w:pPr>
       <w:r>
         <w:rPr>
           <w:rFonts w:ascii="Arial" w:cs="Arial" w:eastAsia="Arial" w:hAnsi="Arial"/>
           <w:color w:val="64748B"/>
-          <w:sz w:val="19"/>
-          <w:szCs w:val="19"/>
-        </w:rPr>
-        <w:t xml:space="preserve">Hình: Khối thẻ &lt;section&gt; kinh nghiệm làm việc và các thẻ &lt;article&gt; trong Neovim</w:t>
+          <w:sz w:val="18"/>
+          <w:szCs w:val="18"/>
+        </w:rPr>
+        <w:t xml:space="preserve">Hình 3: Cấu trúc &lt;section&gt; và các thẻ &lt;article&gt; kinh nghiệm mở trong Neovim</w:t>
       </w:r>
     </w:p>
     <w:p>
       <w:pPr>
         <w:pStyle w:val="Heading2"/>
-        <w:spacing w:after="100" w:before="200"/>
+        <w:spacing w:after="80" w:before="180"/>
       </w:pPr>
       <w:r>
         <w:rPr>
@@ -831,15 +732,15 @@
           <w:b/>
           <w:bCs/>
           <w:color w:val="1E293B"/>
-          <w:sz w:val="24"/>
-          <w:szCs w:val="24"/>
-        </w:rPr>
-        <w:t xml:space="preserve">2.4 Bộ Sưu Tập Dự Án Tiêu Biểu (index.html: Dòng 133 – 178)</w:t>
-      </w:r>
-    </w:p>
-    <w:p>
-      <w:pPr>
-        <w:spacing w:after="120" w:line="276"/>
+          <w:sz w:val="22"/>
+          <w:szCs w:val="22"/>
+        </w:rPr>
+        <w:t xml:space="preserve">2.4 Phần dự án tiêu biểu (&lt;section id="projects"&gt;)</w:t>
+      </w:r>
+    </w:p>
+    <w:p>
+      <w:pPr>
+        <w:spacing w:after="100" w:line="260"/>
       </w:pPr>
       <w:r>
         <w:rPr>
@@ -847,24 +748,119 @@
           <w:b w:val="false"/>
           <w:bCs w:val="false"/>
           <w:color w:val="334155"/>
+          <w:sz w:val="21"/>
+          <w:szCs w:val="21"/>
+        </w:rPr>
+        <w:t xml:space="preserve">• Khu vực danh sách dự án bao gồm 4 dự án phần mềm chính: Streaming Anomaly Detector, Supply Chain Optimization Protocol, Deep Neural Network from Scratch, và Evolutionary Multi-Agent Simulator.
+• Mỗi dự án là một thẻ &lt;article class="project-item"&gt; chứa tiêu đề có liên kết &lt;a&gt;, nhãn công nghệ sử dụng và đoạn mô tả ngắn gọn.</w:t>
+      </w:r>
+    </w:p>
+    <w:p>
+      <w:pPr>
+        <w:spacing w:after="50" w:before="120"/>
+        <w:jc w:val="center"/>
+      </w:pPr>
+      <w:r>
+        <w:drawing>
+          <wp:inline distT="0" distB="0" distL="0" distR="0">
+            <wp:extent cx="5143500" cy="3286125"/>
+            <wp:effectExtent t="0" r="0" b="0" l="0"/>
+            <wp:docPr id="4" name="Hình 4: Danh sách thẻ dự án phần mềm tiêu biểu mở trong Neovim" descr="Hình 4: Danh sách thẻ dự án phần mềm tiêu biểu mở trong Neovim" title="Hình 4: Danh sách thẻ dự án phần mềm tiêu biểu mở trong Neovim"/>
+            <wp:cNvGraphicFramePr>
+              <a:graphicFrameLocks xmlns:a="http://schemas.openxmlformats.org/drawingml/2006/main" noChangeAspect="1"/>
+            </wp:cNvGraphicFramePr>
+            <a:graphic xmlns:a="http://schemas.openxmlformats.org/drawingml/2006/main">
+              <a:graphicData uri="http://schemas.openxmlformats.org/drawingml/2006/picture">
+                <pic:pic xmlns:pic="http://schemas.openxmlformats.org/drawingml/2006/picture">
+                  <pic:nvPicPr>
+                    <pic:cNvPr id="0" name="" descr=""/>
+                    <pic:cNvPicPr>
+                      <a:picLocks noChangeAspect="1" noChangeArrowheads="1"/>
+                    </pic:cNvPicPr>
+                  </pic:nvPicPr>
+                  <pic:blipFill>
+                    <a:blip r:embed="rId11" cstate="none"/>
+                    <a:srcRect/>
+                    <a:stretch>
+                      <a:fillRect/>
+                    </a:stretch>
+                  </pic:blipFill>
+                  <pic:spPr bwMode="auto">
+                    <a:xfrm>
+                      <a:off x="0" y="0"/>
+                      <a:ext cx="5143500" cy="3286125"/>
+                    </a:xfrm>
+                    <a:prstGeom prst="rect">
+                      <a:avLst/>
+                    </a:prstGeom>
+                  </pic:spPr>
+                </pic:pic>
+              </a:graphicData>
+            </a:graphic>
+          </wp:inline>
+        </w:drawing>
+      </w:r>
+    </w:p>
+    <w:p>
+      <w:pPr>
+        <w:spacing w:after="140"/>
+        <w:jc w:val="center"/>
+      </w:pPr>
+      <w:r>
+        <w:rPr>
+          <w:rFonts w:ascii="Arial" w:cs="Arial" w:eastAsia="Arial" w:hAnsi="Arial"/>
+          <w:color w:val="64748B"/>
+          <w:sz w:val="18"/>
+          <w:szCs w:val="18"/>
+        </w:rPr>
+        <w:t xml:space="preserve">Hình 4: Danh sách thẻ dự án phần mềm tiêu biểu mở trong Neovim</w:t>
+      </w:r>
+    </w:p>
+    <w:p>
+      <w:pPr>
+        <w:pStyle w:val="Heading2"/>
+        <w:spacing w:after="80" w:before="180"/>
+      </w:pPr>
+      <w:r>
+        <w:rPr>
+          <w:rFonts w:ascii="Arial" w:cs="Arial" w:eastAsia="Arial" w:hAnsi="Arial"/>
+          <w:b/>
+          <w:bCs/>
+          <w:color w:val="1E293B"/>
           <w:sz w:val="22"/>
           <w:szCs w:val="22"/>
         </w:rPr>
-        <w:t xml:space="preserve">• Cấu trúc danh mục dự án gồm 4 công trình kỹ thuật nổi bật được bố trí dạng lưới (Grid 2 cột).
-• Mỗi dự án được bọc trong &lt;article class="project-card"&gt; chứa các thẻ nhãn công nghệ (&lt;span class="badge"&gt;), tiêu đề &lt;h3&gt;, đoạn mô tả giải thuật &lt;p&gt;, và liên kết nguồn mở &lt;a class="link-arrow"&gt; dẫn trực tiếp về GitHub của sinh viên.</w:t>
-      </w:r>
-    </w:p>
-    <w:p>
-      <w:pPr>
-        <w:spacing w:after="60" w:before="140"/>
+        <w:t xml:space="preserve">2.5 Bảng kỹ năng kỹ thuật (&lt;table&gt;)</w:t>
+      </w:r>
+    </w:p>
+    <w:p>
+      <w:pPr>
+        <w:spacing w:after="100" w:line="260"/>
+      </w:pPr>
+      <w:r>
+        <w:rPr>
+          <w:rFonts w:ascii="Arial" w:cs="Arial" w:eastAsia="Arial" w:hAnsi="Arial"/>
+          <w:b w:val="false"/>
+          <w:bCs w:val="false"/>
+          <w:color w:val="334155"/>
+          <w:sz w:val="21"/>
+          <w:szCs w:val="21"/>
+        </w:rPr>
+        <w:t xml:space="preserve">• Để đáp ứng yêu cầu sử dụng phần tử bảng (table) trong đề bài Lab 1, em tạo bảng tổng hợp kỹ năng kỹ thuật gồm 4 nhóm: Smart Contracts, Systems &amp; Languages, AI/ML &amp; Automation, và Infrastructure &amp; DevOps.
+• Cấu trúc bảng gồm thẻ &lt;table&gt;, phần đầu bảng &lt;thead&gt; chứa các ô tiêu đề &lt;th scope="col"&gt;, và phần thân &lt;tbody&gt; chứa các hàng &lt;tr&gt; cùng dữ liệu &lt;td&gt;.</w:t>
+      </w:r>
+    </w:p>
+    <w:p>
+      <w:pPr>
+        <w:spacing w:after="50" w:before="120"/>
         <w:jc w:val="center"/>
       </w:pPr>
       <w:r>
         <w:drawing>
           <wp:inline distT="0" distB="0" distL="0" distR="0">
-            <wp:extent cx="4762500" cy="3981450"/>
+            <wp:extent cx="5143500" cy="3286125"/>
             <wp:effectExtent t="0" r="0" b="0" l="0"/>
-            <wp:docPr id="4" name="Cấu trúc danh sách card dự án phần mềm nổi bật trong Neovim" descr="Cấu trúc danh sách card dự án phần mềm nổi bật trong Neovim" title="Cấu trúc danh sách card dự án phần mềm nổi bật trong Neovim"/>
+            <wp:docPr id="5" name="Hình 5: Bảng kỹ năng kỹ thuật với cấu trúc &lt;table&gt; chuẩn mở trong Neovim" descr="Hình 5: Bảng kỹ năng kỹ thuật với cấu trúc &lt;table&gt; chuẩn mở trong Neovim" title="Hình 5: Bảng kỹ năng kỹ thuật với cấu trúc &lt;table&gt; chuẩn mở trong Neovim"/>
             <wp:cNvGraphicFramePr>
               <a:graphicFrameLocks xmlns:a="http://schemas.openxmlformats.org/drawingml/2006/main" noChangeAspect="1"/>
             </wp:cNvGraphicFramePr>
@@ -887,7 +883,7 @@
                   <pic:spPr bwMode="auto">
                     <a:xfrm>
                       <a:off x="0" y="0"/>
-                      <a:ext cx="4762500" cy="3981450"/>
+                      <a:ext cx="5143500" cy="3286125"/>
                     </a:xfrm>
                     <a:prstGeom prst="rect">
                       <a:avLst/>
@@ -902,23 +898,23 @@
     </w:p>
     <w:p>
       <w:pPr>
-        <w:spacing w:after="160"/>
+        <w:spacing w:after="140"/>
         <w:jc w:val="center"/>
       </w:pPr>
       <w:r>
         <w:rPr>
           <w:rFonts w:ascii="Arial" w:cs="Arial" w:eastAsia="Arial" w:hAnsi="Arial"/>
           <w:color w:val="64748B"/>
-          <w:sz w:val="19"/>
-          <w:szCs w:val="19"/>
-        </w:rPr>
-        <w:t xml:space="preserve">Hình: Cấu trúc danh sách card dự án phần mềm nổi bật trong Neovim</w:t>
+          <w:sz w:val="18"/>
+          <w:szCs w:val="18"/>
+        </w:rPr>
+        <w:t xml:space="preserve">Hình 5: Bảng kỹ năng kỹ thuật với cấu trúc &lt;table&gt; chuẩn mở trong Neovim</w:t>
       </w:r>
     </w:p>
     <w:p>
       <w:pPr>
         <w:pStyle w:val="Heading2"/>
-        <w:spacing w:after="100" w:before="200"/>
+        <w:spacing w:after="80" w:before="180"/>
       </w:pPr>
       <w:r>
         <w:rPr>
@@ -926,15 +922,15 @@
           <w:b/>
           <w:bCs/>
           <w:color w:val="1E293B"/>
-          <w:sz w:val="24"/>
-          <w:szCs w:val="24"/>
-        </w:rPr>
-        <w:t xml:space="preserve">2.5 Bảng Ma Trận Kỹ Năng Kỹ Thuật (index.html: Dòng 220 – 268)</w:t>
-      </w:r>
-    </w:p>
-    <w:p>
-      <w:pPr>
-        <w:spacing w:after="120" w:line="276"/>
+          <w:sz w:val="22"/>
+          <w:szCs w:val="22"/>
+        </w:rPr>
+        <w:t xml:space="preserve">2.6 Biểu mẫu liên hệ &amp; Thanh bên Aside (&lt;form&gt;, &lt;aside&gt;, &lt;footer&gt;)</w:t>
+      </w:r>
+    </w:p>
+    <w:p>
+      <w:pPr>
+        <w:spacing w:after="100" w:line="260"/>
       </w:pPr>
       <w:r>
         <w:rPr>
@@ -942,25 +938,153 @@
           <w:b w:val="false"/>
           <w:bCs w:val="false"/>
           <w:color w:val="334155"/>
+          <w:sz w:val="21"/>
+          <w:szCs w:val="21"/>
+        </w:rPr>
+        <w:t xml:space="preserve">• Thẻ &lt;form&gt;: Đáp ứng yêu cầu Form &amp; Input trong Lab 1 với các trường họ tên (&lt;input type="text"&gt;), email (&lt;input type="email"&gt;), ô nhập nội dung (&lt;textarea&gt;) và nút gửi (&lt;button type="submit"&gt;). Mỗi ô nhập đều có &lt;label&gt; gắn liền qua thuộc tính for/id.
+• Thẻ &lt;aside&gt;: Thanh bên chứa thông tin học vấn (Đại học Công nghệ Thông tin &amp; Birmingham City University), giải thưởng cuộc thi bằng danh sách có thứ tự &lt;ol&gt;, và thông số kỹ thuật nhanh bằng danh sách định nghĩa &lt;dl&gt;, &lt;dt&gt;, &lt;dd&gt;.
+• Thẻ &lt;footer&gt;: Chân trang thể hiện bản quyền cá nhân và đường link quay về đầu trang.</w:t>
+      </w:r>
+    </w:p>
+    <w:p>
+      <w:pPr>
+        <w:spacing w:after="50" w:before="120"/>
+        <w:jc w:val="center"/>
+      </w:pPr>
+      <w:r>
+        <w:drawing>
+          <wp:inline distT="0" distB="0" distL="0" distR="0">
+            <wp:extent cx="5143500" cy="3286125"/>
+            <wp:effectExtent t="0" r="0" b="0" l="0"/>
+            <wp:docPr id="6" name="Hình 6: Biểu mẫu &lt;form&gt;, thanh bên &lt;aside&gt; và chân trang &lt;footer&gt; mở trong Neovim" descr="Hình 6: Biểu mẫu &lt;form&gt;, thanh bên &lt;aside&gt; và chân trang &lt;footer&gt; mở trong Neovim" title="Hình 6: Biểu mẫu &lt;form&gt;, thanh bên &lt;aside&gt; và chân trang &lt;footer&gt; mở trong Neovim"/>
+            <wp:cNvGraphicFramePr>
+              <a:graphicFrameLocks xmlns:a="http://schemas.openxmlformats.org/drawingml/2006/main" noChangeAspect="1"/>
+            </wp:cNvGraphicFramePr>
+            <a:graphic xmlns:a="http://schemas.openxmlformats.org/drawingml/2006/main">
+              <a:graphicData uri="http://schemas.openxmlformats.org/drawingml/2006/picture">
+                <pic:pic xmlns:pic="http://schemas.openxmlformats.org/drawingml/2006/picture">
+                  <pic:nvPicPr>
+                    <pic:cNvPr id="0" name="" descr=""/>
+                    <pic:cNvPicPr>
+                      <a:picLocks noChangeAspect="1" noChangeArrowheads="1"/>
+                    </pic:cNvPicPr>
+                  </pic:nvPicPr>
+                  <pic:blipFill>
+                    <a:blip r:embed="rId12" cstate="none"/>
+                    <a:srcRect/>
+                    <a:stretch>
+                      <a:fillRect/>
+                    </a:stretch>
+                  </pic:blipFill>
+                  <pic:spPr bwMode="auto">
+                    <a:xfrm>
+                      <a:off x="0" y="0"/>
+                      <a:ext cx="5143500" cy="3286125"/>
+                    </a:xfrm>
+                    <a:prstGeom prst="rect">
+                      <a:avLst/>
+                    </a:prstGeom>
+                  </pic:spPr>
+                </pic:pic>
+              </a:graphicData>
+            </a:graphic>
+          </wp:inline>
+        </w:drawing>
+      </w:r>
+    </w:p>
+    <w:p>
+      <w:pPr>
+        <w:spacing w:after="140"/>
+        <w:jc w:val="center"/>
+      </w:pPr>
+      <w:r>
+        <w:rPr>
+          <w:rFonts w:ascii="Arial" w:cs="Arial" w:eastAsia="Arial" w:hAnsi="Arial"/>
+          <w:color w:val="64748B"/>
+          <w:sz w:val="18"/>
+          <w:szCs w:val="18"/>
+        </w:rPr>
+        <w:t xml:space="preserve">Hình 6: Biểu mẫu &lt;form&gt;, thanh bên &lt;aside&gt; và chân trang &lt;footer&gt; mở trong Neovim</w:t>
+      </w:r>
+    </w:p>
+    <w:p>
+      <w:pPr>
+        <w:pStyle w:val="Heading1"/>
+        <w:spacing w:after="120" w:before="240"/>
+      </w:pPr>
+      <w:r>
+        <w:rPr>
+          <w:rFonts w:ascii="Arial" w:cs="Arial" w:eastAsia="Arial" w:hAnsi="Arial"/>
+          <w:b/>
+          <w:bCs/>
+          <w:color w:val="0F172A"/>
+          <w:sz w:val="26"/>
+          <w:szCs w:val="26"/>
+        </w:rPr>
+        <w:t xml:space="preserve">3. Phân Tích Mã Nguồn CSS (style.css)</w:t>
+      </w:r>
+    </w:p>
+    <w:p>
+      <w:pPr>
+        <w:spacing w:after="100" w:line="260"/>
+      </w:pPr>
+      <w:r>
+        <w:rPr>
+          <w:rFonts w:ascii="Arial" w:cs="Arial" w:eastAsia="Arial" w:hAnsi="Arial"/>
+          <w:b w:val="false"/>
+          <w:bCs w:val="false"/>
+          <w:color w:val="334155"/>
+          <w:sz w:val="21"/>
+          <w:szCs w:val="21"/>
+        </w:rPr>
+        <w:t xml:space="preserve">File CSS được tách riêng và liên kết với HTML theo đúng khuyến nghị của đề bài (External CSS). Phong cách thiết kế ưu tiên sự gọn gàng, tính phân cấp rõ ràng và hỗ trợ tốt trên màn hình di động.</w:t>
+      </w:r>
+    </w:p>
+    <w:p>
+      <w:pPr>
+        <w:pStyle w:val="Heading2"/>
+        <w:spacing w:after="80" w:before="180"/>
+      </w:pPr>
+      <w:r>
+        <w:rPr>
+          <w:rFonts w:ascii="Arial" w:cs="Arial" w:eastAsia="Arial" w:hAnsi="Arial"/>
+          <w:b/>
+          <w:bCs/>
+          <w:color w:val="1E293B"/>
           <w:sz w:val="22"/>
           <w:szCs w:val="22"/>
         </w:rPr>
-        <w:t xml:space="preserve">• Đáp ứng trọn vẹn yêu cầu cấu trúc thẻ &lt;table&gt; trong Lab 1.
-• Bảng được thiết kế ngữ nghĩa chuẩn mực với &lt;thead&gt; chứa các ô tiêu đề cột &lt;th scope="col"&gt; và &lt;tbody&gt; chứa các hàng dữ liệu &lt;tr&gt;.
-• Phân loại 4 nhóm miền kỹ năng: Smart Contracts &amp; Web3, Systems &amp; Languages, AI/ML &amp; Automation, và Infrastructure &amp; DevOps. Các pill màu sắc (&lt;span class="level-pill"&gt;) đánh dấu mức độ thành thạo.</w:t>
-      </w:r>
-    </w:p>
-    <w:p>
-      <w:pPr>
-        <w:spacing w:after="60" w:before="140"/>
+        <w:t xml:space="preserve">3.1 Biến CSS, Reset &amp; Box Model</w:t>
+      </w:r>
+    </w:p>
+    <w:p>
+      <w:pPr>
+        <w:spacing w:after="100" w:line="260"/>
+      </w:pPr>
+      <w:r>
+        <w:rPr>
+          <w:rFonts w:ascii="Arial" w:cs="Arial" w:eastAsia="Arial" w:hAnsi="Arial"/>
+          <w:b w:val="false"/>
+          <w:bCs w:val="false"/>
+          <w:color w:val="334155"/>
+          <w:sz w:val="21"/>
+          <w:szCs w:val="21"/>
+        </w:rPr>
+        <w:t xml:space="preserve">• Khối :root khai báo các biến CSS (CSS Variables) để quản lý tập trung mã màu nền (--bg: #0f1013), màu bề mặt (--surface: #15171c), màu viền (--border: #22252c) và màu chữ (--text: #e1e4ea).
+• Quy tắc * { box-sizing: border-box; } giúp tính toán kích thước phần tử chính xác gồm cả padding và border, tránh lỗi vỡ bố cục khi thêm khoảng đệm.</w:t>
+      </w:r>
+    </w:p>
+    <w:p>
+      <w:pPr>
+        <w:spacing w:after="50" w:before="120"/>
         <w:jc w:val="center"/>
       </w:pPr>
       <w:r>
         <w:drawing>
           <wp:inline distT="0" distB="0" distL="0" distR="0">
-            <wp:extent cx="4762500" cy="3990975"/>
+            <wp:extent cx="5143500" cy="3286125"/>
             <wp:effectExtent t="0" r="0" b="0" l="0"/>
-            <wp:docPr id="5" name="Cấu trúc thẻ &lt;table&gt; ma trận kỹ năng chuyên môn trong Neovim" descr="Cấu trúc thẻ &lt;table&gt; ma trận kỹ năng chuyên môn trong Neovim" title="Cấu trúc thẻ &lt;table&gt; ma trận kỹ năng chuyên môn trong Neovim"/>
+            <wp:docPr id="7" name="Hình 7: Khai báo biến CSS :root và thiết lập Box Model mở trong Neovim" descr="Hình 7: Khai báo biến CSS :root và thiết lập Box Model mở trong Neovim" title="Hình 7: Khai báo biến CSS :root và thiết lập Box Model mở trong Neovim"/>
             <wp:cNvGraphicFramePr>
               <a:graphicFrameLocks xmlns:a="http://schemas.openxmlformats.org/drawingml/2006/main" noChangeAspect="1"/>
             </wp:cNvGraphicFramePr>
@@ -983,7 +1107,7 @@
                   <pic:spPr bwMode="auto">
                     <a:xfrm>
                       <a:off x="0" y="0"/>
-                      <a:ext cx="4762500" cy="3990975"/>
+                      <a:ext cx="5143500" cy="3286125"/>
                     </a:xfrm>
                     <a:prstGeom prst="rect">
                       <a:avLst/>
@@ -998,23 +1122,23 @@
     </w:p>
     <w:p>
       <w:pPr>
-        <w:spacing w:after="160"/>
+        <w:spacing w:after="140"/>
         <w:jc w:val="center"/>
       </w:pPr>
       <w:r>
         <w:rPr>
           <w:rFonts w:ascii="Arial" w:cs="Arial" w:eastAsia="Arial" w:hAnsi="Arial"/>
           <w:color w:val="64748B"/>
-          <w:sz w:val="19"/>
-          <w:szCs w:val="19"/>
-        </w:rPr>
-        <w:t xml:space="preserve">Hình: Cấu trúc thẻ &lt;table&gt; ma trận kỹ năng chuyên môn trong Neovim</w:t>
+          <w:sz w:val="18"/>
+          <w:szCs w:val="18"/>
+        </w:rPr>
+        <w:t xml:space="preserve">Hình 7: Khai báo biến CSS :root và thiết lập Box Model mở trong Neovim</w:t>
       </w:r>
     </w:p>
     <w:p>
       <w:pPr>
         <w:pStyle w:val="Heading2"/>
-        <w:spacing w:after="100" w:before="200"/>
+        <w:spacing w:after="80" w:before="180"/>
       </w:pPr>
       <w:r>
         <w:rPr>
@@ -1022,15 +1146,15 @@
           <w:b/>
           <w:bCs/>
           <w:color w:val="1E293B"/>
-          <w:sz w:val="24"/>
-          <w:szCs w:val="24"/>
-        </w:rPr>
-        <w:t xml:space="preserve">2.6 Biểu Mẫu Liên Hệ Tương Tác (index.html: Dòng 272 – 308)</w:t>
-      </w:r>
-    </w:p>
-    <w:p>
-      <w:pPr>
-        <w:spacing w:after="120" w:line="276"/>
+          <w:sz w:val="22"/>
+          <w:szCs w:val="22"/>
+        </w:rPr>
+        <w:t xml:space="preserve">3.2 Định kiểu Navigation &amp; Header</w:t>
+      </w:r>
+    </w:p>
+    <w:p>
+      <w:pPr>
+        <w:spacing w:after="100" w:line="260"/>
       </w:pPr>
       <w:r>
         <w:rPr>
@@ -1038,24 +1162,119 @@
           <w:b w:val="false"/>
           <w:bCs w:val="false"/>
           <w:color w:val="334155"/>
+          <w:sz w:val="21"/>
+          <w:szCs w:val="21"/>
+        </w:rPr>
+        <w:t xml:space="preserve">• Thanh .navbar sử dụng position: sticky và backdrop-filter: blur(8px) giúp thanh menu cố định phía trên khi cuộn trang.
+• Bố cục header dùng Flexbox chia hai phần: khối văn bản thông tin bên trái và ảnh đại diện bo tròn bên phải.</w:t>
+      </w:r>
+    </w:p>
+    <w:p>
+      <w:pPr>
+        <w:spacing w:after="50" w:before="120"/>
+        <w:jc w:val="center"/>
+      </w:pPr>
+      <w:r>
+        <w:drawing>
+          <wp:inline distT="0" distB="0" distL="0" distR="0">
+            <wp:extent cx="5143500" cy="3286125"/>
+            <wp:effectExtent t="0" r="0" b="0" l="0"/>
+            <wp:docPr id="8" name="Hình 8: Định kiểu thanh điều hướng và header mở trong Neovim" descr="Hình 8: Định kiểu thanh điều hướng và header mở trong Neovim" title="Hình 8: Định kiểu thanh điều hướng và header mở trong Neovim"/>
+            <wp:cNvGraphicFramePr>
+              <a:graphicFrameLocks xmlns:a="http://schemas.openxmlformats.org/drawingml/2006/main" noChangeAspect="1"/>
+            </wp:cNvGraphicFramePr>
+            <a:graphic xmlns:a="http://schemas.openxmlformats.org/drawingml/2006/main">
+              <a:graphicData uri="http://schemas.openxmlformats.org/drawingml/2006/picture">
+                <pic:pic xmlns:pic="http://schemas.openxmlformats.org/drawingml/2006/picture">
+                  <pic:nvPicPr>
+                    <pic:cNvPr id="0" name="" descr=""/>
+                    <pic:cNvPicPr>
+                      <a:picLocks noChangeAspect="1" noChangeArrowheads="1"/>
+                    </pic:cNvPicPr>
+                  </pic:nvPicPr>
+                  <pic:blipFill>
+                    <a:blip r:embed="rId13" cstate="none"/>
+                    <a:srcRect/>
+                    <a:stretch>
+                      <a:fillRect/>
+                    </a:stretch>
+                  </pic:blipFill>
+                  <pic:spPr bwMode="auto">
+                    <a:xfrm>
+                      <a:off x="0" y="0"/>
+                      <a:ext cx="5143500" cy="3286125"/>
+                    </a:xfrm>
+                    <a:prstGeom prst="rect">
+                      <a:avLst/>
+                    </a:prstGeom>
+                  </pic:spPr>
+                </pic:pic>
+              </a:graphicData>
+            </a:graphic>
+          </wp:inline>
+        </w:drawing>
+      </w:r>
+    </w:p>
+    <w:p>
+      <w:pPr>
+        <w:spacing w:after="140"/>
+        <w:jc w:val="center"/>
+      </w:pPr>
+      <w:r>
+        <w:rPr>
+          <w:rFonts w:ascii="Arial" w:cs="Arial" w:eastAsia="Arial" w:hAnsi="Arial"/>
+          <w:color w:val="64748B"/>
+          <w:sz w:val="18"/>
+          <w:szCs w:val="18"/>
+        </w:rPr>
+        <w:t xml:space="preserve">Hình 8: Định kiểu thanh điều hướng và header mở trong Neovim</w:t>
+      </w:r>
+    </w:p>
+    <w:p>
+      <w:pPr>
+        <w:pStyle w:val="Heading2"/>
+        <w:spacing w:after="80" w:before="180"/>
+      </w:pPr>
+      <w:r>
+        <w:rPr>
+          <w:rFonts w:ascii="Arial" w:cs="Arial" w:eastAsia="Arial" w:hAnsi="Arial"/>
+          <w:b/>
+          <w:bCs/>
+          <w:color w:val="1E293B"/>
           <w:sz w:val="22"/>
           <w:szCs w:val="22"/>
         </w:rPr>
-        <w:t xml:space="preserve">• Hoàn thành yêu cầu thành phần Forms &amp; Input trong bài Lab: thẻ &lt;form&gt;, các trường nhập liệu &lt;input type="text"&gt;, &lt;input type="email"&gt;, nhãn &lt;label for="..."&gt; liên kết chặt chẽ với trường nhập liệu bằng thuộc tính id.
-• Khung soạn văn bản đa dòng &lt;textarea&gt; và nút submit &lt;button type="submit"&gt; kèm tương tác cảnh báo JavaScript phản hồi khi gửi thư thành công.</w:t>
-      </w:r>
-    </w:p>
-    <w:p>
-      <w:pPr>
-        <w:spacing w:after="60" w:before="140"/>
+        <w:t xml:space="preserve">3.3 Bố cục nội dung chính, Card &amp; Hiệu ứng Hover (Exercise 4)</w:t>
+      </w:r>
+    </w:p>
+    <w:p>
+      <w:pPr>
+        <w:spacing w:after="100" w:line="260"/>
+      </w:pPr>
+      <w:r>
+        <w:rPr>
+          <w:rFonts w:ascii="Arial" w:cs="Arial" w:eastAsia="Arial" w:hAnsi="Arial"/>
+          <w:b w:val="false"/>
+          <w:bCs w:val="false"/>
+          <w:color w:val="334155"/>
+          <w:sz w:val="21"/>
+          <w:szCs w:val="21"/>
+        </w:rPr>
+        <w:t xml:space="preserve">• Bố cục trang chia thành 2 cột bằng CSS Grid (.layout-container { display: grid; grid-template-columns: 1fr 310px; gap: 48px; }).
+• Thực hiện yêu cầu Exercise 4 trong đề bài: Thẻ dự án .project-item và nút bấm đều được gắn transition: border-color 0.2s ease, transform 0.2s ease. Khi rê chuột qua (:hover), phần tử nhấc lên nhẹ nhàng bằng transform: translateY(-2px) và viền sáng hơn, tạo phản hồi xúc giác tự nhiên.</w:t>
+      </w:r>
+    </w:p>
+    <w:p>
+      <w:pPr>
+        <w:spacing w:after="50" w:before="120"/>
         <w:jc w:val="center"/>
       </w:pPr>
       <w:r>
         <w:drawing>
           <wp:inline distT="0" distB="0" distL="0" distR="0">
-            <wp:extent cx="4762500" cy="3971925"/>
+            <wp:extent cx="5143500" cy="3286125"/>
             <wp:effectExtent t="0" r="0" b="0" l="0"/>
-            <wp:docPr id="6" name="Biểu mẫu tương tác &lt;form&gt; và các trường nhập liệu trong Neovim" descr="Biểu mẫu tương tác &lt;form&gt; và các trường nhập liệu trong Neovim" title="Biểu mẫu tương tác &lt;form&gt; và các trường nhập liệu trong Neovim"/>
+            <wp:docPr id="9" name="Hình 9: Định kiểu danh sách bài viết và hiệu ứng hover mở trong Neovim" descr="Hình 9: Định kiểu danh sách bài viết và hiệu ứng hover mở trong Neovim" title="Hình 9: Định kiểu danh sách bài viết và hiệu ứng hover mở trong Neovim"/>
             <wp:cNvGraphicFramePr>
               <a:graphicFrameLocks xmlns:a="http://schemas.openxmlformats.org/drawingml/2006/main" noChangeAspect="1"/>
             </wp:cNvGraphicFramePr>
@@ -1078,7 +1297,7 @@
                   <pic:spPr bwMode="auto">
                     <a:xfrm>
                       <a:off x="0" y="0"/>
-                      <a:ext cx="4762500" cy="3971925"/>
+                      <a:ext cx="5143500" cy="3286125"/>
                     </a:xfrm>
                     <a:prstGeom prst="rect">
                       <a:avLst/>
@@ -1093,23 +1312,23 @@
     </w:p>
     <w:p>
       <w:pPr>
-        <w:spacing w:after="160"/>
+        <w:spacing w:after="140"/>
         <w:jc w:val="center"/>
       </w:pPr>
       <w:r>
         <w:rPr>
           <w:rFonts w:ascii="Arial" w:cs="Arial" w:eastAsia="Arial" w:hAnsi="Arial"/>
           <w:color w:val="64748B"/>
-          <w:sz w:val="19"/>
-          <w:szCs w:val="19"/>
-        </w:rPr>
-        <w:t xml:space="preserve">Hình: Biểu mẫu tương tác &lt;form&gt; và các trường nhập liệu trong Neovim</w:t>
+          <w:sz w:val="18"/>
+          <w:szCs w:val="18"/>
+        </w:rPr>
+        <w:t xml:space="preserve">Hình 9: Định kiểu danh sách bài viết và hiệu ứng hover mở trong Neovim</w:t>
       </w:r>
     </w:p>
     <w:p>
       <w:pPr>
         <w:pStyle w:val="Heading2"/>
-        <w:spacing w:after="100" w:before="200"/>
+        <w:spacing w:after="80" w:before="180"/>
       </w:pPr>
       <w:r>
         <w:rPr>
@@ -1117,15 +1336,15 @@
           <w:b/>
           <w:bCs/>
           <w:color w:val="1E293B"/>
-          <w:sz w:val="24"/>
-          <w:szCs w:val="24"/>
-        </w:rPr>
-        <w:t xml:space="preserve">2.7 Thanh Bên Ngữ Nghĩa Aside &amp; Chân Trang Footer (index.html: Dòng 312 – 352)</w:t>
-      </w:r>
-    </w:p>
-    <w:p>
-      <w:pPr>
-        <w:spacing w:after="120" w:line="276"/>
+          <w:sz w:val="22"/>
+          <w:szCs w:val="22"/>
+        </w:rPr>
+        <w:t xml:space="preserve">3.4 Định kiểu Bảng dữ liệu &amp; Form liên hệ</w:t>
+      </w:r>
+    </w:p>
+    <w:p>
+      <w:pPr>
+        <w:spacing w:after="100" w:line="260"/>
       </w:pPr>
       <w:r>
         <w:rPr>
@@ -1133,27 +1352,119 @@
           <w:b w:val="false"/>
           <w:bCs w:val="false"/>
           <w:color w:val="334155"/>
-          <w:sz w:val="22"/>
-          <w:szCs w:val="22"/>
-        </w:rPr>
-        <w:t xml:space="preserve">• &lt;aside class="sidebar"&gt;: Chứa các thông tin bổ trợ nhưng liên đới mật thiết với hồ sơ chính:
-  + Khối Học vấn: Đại học Công nghệ Thông tin (ĐHQG-HCM) liên kết Birmingham City University (BCU).
-  + Khối Giải thưởng: Sử dụng danh sách có thứ tự &lt;ol&gt; cho Giải Ba FPT AI &amp; Robotics Challenge và Giải Khuyến khích Cuộc thi AI Nha Trang.
-  + Khối Thông số kỹ thuật nhanh: Áp dụng danh sách định nghĩa &lt;dl&gt;, &lt;dt&gt; (tên thuộc tính) và &lt;dd&gt; (giá trị).
-• &lt;footer class="page-footer"&gt;: Chân trang cung cấp thông tin bản quyền và liên kết điều hướng cuộn ngược về đỉnh trang (#about).</w:t>
-      </w:r>
-    </w:p>
-    <w:p>
-      <w:pPr>
-        <w:spacing w:after="60" w:before="140"/>
+          <w:sz w:val="21"/>
+          <w:szCs w:val="21"/>
+        </w:rPr>
+        <w:t xml:space="preserve">• Bảng dữ liệu được bọc trong container có overflow-x: auto để không bị tràn khi xem trên màn hình nhỏ. Hàng bảng có hiệu ứng đổi màu nền nhẹ khi rê chuột.
+• Ô nhập liệu input và textarea khi focus sẽ đổi màu viền sang --border-focus (#4b5563) để người dùng nhận biết vị trí đang gõ phím.
+• Áp dụng Media Query (@media (max-width: 860px) và @media (max-width: 600px)) để tự động chuyển bố cục lưới thành 1 cột trên màn hình điện thoại.</w:t>
+      </w:r>
+    </w:p>
+    <w:p>
+      <w:pPr>
+        <w:spacing w:after="50" w:before="120"/>
         <w:jc w:val="center"/>
       </w:pPr>
       <w:r>
         <w:drawing>
           <wp:inline distT="0" distB="0" distL="0" distR="0">
-            <wp:extent cx="4762500" cy="4095750"/>
+            <wp:extent cx="5143500" cy="3286125"/>
             <wp:effectExtent t="0" r="0" b="0" l="0"/>
-            <wp:docPr id="7" name="Cấu trúc thanh bên &lt;aside&gt;, danh sách &lt;ol&gt;, &lt;dl&gt; và chân trang &lt;footer&gt; trong Neovim" descr="Cấu trúc thanh bên &lt;aside&gt;, danh sách &lt;ol&gt;, &lt;dl&gt; và chân trang &lt;footer&gt; trong Neovim" title="Cấu trúc thanh bên &lt;aside&gt;, danh sách &lt;ol&gt;, &lt;dl&gt; và chân trang &lt;footer&gt; trong Neovim"/>
+            <wp:docPr id="10" name="Hình 10: Định kiểu bảng, form liên hệ và media queries mở trong Neovim" descr="Hình 10: Định kiểu bảng, form liên hệ và media queries mở trong Neovim" title="Hình 10: Định kiểu bảng, form liên hệ và media queries mở trong Neovim"/>
+            <wp:cNvGraphicFramePr>
+              <a:graphicFrameLocks xmlns:a="http://schemas.openxmlformats.org/drawingml/2006/main" noChangeAspect="1"/>
+            </wp:cNvGraphicFramePr>
+            <a:graphic xmlns:a="http://schemas.openxmlformats.org/drawingml/2006/main">
+              <a:graphicData uri="http://schemas.openxmlformats.org/drawingml/2006/picture">
+                <pic:pic xmlns:pic="http://schemas.openxmlformats.org/drawingml/2006/picture">
+                  <pic:nvPicPr>
+                    <pic:cNvPr id="0" name="" descr=""/>
+                    <pic:cNvPicPr>
+                      <a:picLocks noChangeAspect="1" noChangeArrowheads="1"/>
+                    </pic:cNvPicPr>
+                  </pic:nvPicPr>
+                  <pic:blipFill>
+                    <a:blip r:embed="rId14" cstate="none"/>
+                    <a:srcRect/>
+                    <a:stretch>
+                      <a:fillRect/>
+                    </a:stretch>
+                  </pic:blipFill>
+                  <pic:spPr bwMode="auto">
+                    <a:xfrm>
+                      <a:off x="0" y="0"/>
+                      <a:ext cx="5143500" cy="3286125"/>
+                    </a:xfrm>
+                    <a:prstGeom prst="rect">
+                      <a:avLst/>
+                    </a:prstGeom>
+                  </pic:spPr>
+                </pic:pic>
+              </a:graphicData>
+            </a:graphic>
+          </wp:inline>
+        </w:drawing>
+      </w:r>
+    </w:p>
+    <w:p>
+      <w:pPr>
+        <w:spacing w:after="140"/>
+        <w:jc w:val="center"/>
+      </w:pPr>
+      <w:r>
+        <w:rPr>
+          <w:rFonts w:ascii="Arial" w:cs="Arial" w:eastAsia="Arial" w:hAnsi="Arial"/>
+          <w:color w:val="64748B"/>
+          <w:sz w:val="18"/>
+          <w:szCs w:val="18"/>
+        </w:rPr>
+        <w:t xml:space="preserve">Hình 10: Định kiểu bảng, form liên hệ và media queries mở trong Neovim</w:t>
+      </w:r>
+    </w:p>
+    <w:p>
+      <w:pPr>
+        <w:pStyle w:val="Heading1"/>
+        <w:spacing w:after="120" w:before="240"/>
+      </w:pPr>
+      <w:r>
+        <w:rPr>
+          <w:rFonts w:ascii="Arial" w:cs="Arial" w:eastAsia="Arial" w:hAnsi="Arial"/>
+          <w:b/>
+          <w:bCs/>
+          <w:color w:val="0F172A"/>
+          <w:sz w:val="26"/>
+          <w:szCs w:val="26"/>
+        </w:rPr>
+        <w:t xml:space="preserve">4. Kết Quả Giao Diện Hiển Thị Trực Quan</w:t>
+      </w:r>
+    </w:p>
+    <w:p>
+      <w:pPr>
+        <w:spacing w:after="100" w:line="260"/>
+      </w:pPr>
+      <w:r>
+        <w:rPr>
+          <w:rFonts w:ascii="Arial" w:cs="Arial" w:eastAsia="Arial" w:hAnsi="Arial"/>
+          <w:b w:val="false"/>
+          <w:bCs w:val="false"/>
+          <w:color w:val="334155"/>
+          <w:sz w:val="21"/>
+          <w:szCs w:val="21"/>
+        </w:rPr>
+        <w:t xml:space="preserve">Dưới đây là hình ảnh chụp giao diện trang web CV cá nhân sau khi hoàn thiện toàn bộ mã nguồn HTML5 và CSS:</w:t>
+      </w:r>
+    </w:p>
+    <w:p>
+      <w:pPr>
+        <w:spacing w:after="50" w:before="120"/>
+        <w:jc w:val="center"/>
+      </w:pPr>
+      <w:r>
+        <w:drawing>
+          <wp:inline distT="0" distB="0" distL="0" distR="0">
+            <wp:extent cx="4762500" cy="6553200"/>
+            <wp:effectExtent t="0" r="0" b="0" l="0"/>
+            <wp:docPr id="11" name="Hình 11: Giao diện hoàn chỉnh trang web CV Huynh Khanh Thien trên trình duyệt" descr="Hình 11: Giao diện hoàn chỉnh trang web CV Huynh Khanh Thien trên trình duyệt" title="Hình 11: Giao diện hoàn chỉnh trang web CV Huynh Khanh Thien trên trình duyệt"/>
             <wp:cNvGraphicFramePr>
               <a:graphicFrameLocks xmlns:a="http://schemas.openxmlformats.org/drawingml/2006/main" noChangeAspect="1"/>
             </wp:cNvGraphicFramePr>
@@ -1176,7 +1487,7 @@
                   <pic:spPr bwMode="auto">
                     <a:xfrm>
                       <a:off x="0" y="0"/>
-                      <a:ext cx="4762500" cy="4095750"/>
+                      <a:ext cx="4762500" cy="6553200"/>
                     </a:xfrm>
                     <a:prstGeom prst="rect">
                       <a:avLst/>
@@ -1191,23 +1502,23 @@
     </w:p>
     <w:p>
       <w:pPr>
-        <w:spacing w:after="160"/>
+        <w:spacing w:after="140"/>
         <w:jc w:val="center"/>
       </w:pPr>
       <w:r>
         <w:rPr>
           <w:rFonts w:ascii="Arial" w:cs="Arial" w:eastAsia="Arial" w:hAnsi="Arial"/>
           <w:color w:val="64748B"/>
-          <w:sz w:val="19"/>
-          <w:szCs w:val="19"/>
-        </w:rPr>
-        <w:t xml:space="preserve">Hình: Cấu trúc thanh bên &lt;aside&gt;, danh sách &lt;ol&gt;, &lt;dl&gt; và chân trang &lt;footer&gt; trong Neovim</w:t>
+          <w:sz w:val="18"/>
+          <w:szCs w:val="18"/>
+        </w:rPr>
+        <w:t xml:space="preserve">Hình 11: Giao diện hoàn chỉnh trang web CV Huynh Khanh Thien trên trình duyệt</w:t>
       </w:r>
     </w:p>
     <w:p>
       <w:pPr>
         <w:pStyle w:val="Heading1"/>
-        <w:spacing w:after="140" w:before="280"/>
+        <w:spacing w:after="120" w:before="240"/>
       </w:pPr>
       <w:r>
         <w:rPr>
@@ -1215,15 +1526,15 @@
           <w:b/>
           <w:bCs/>
           <w:color w:val="0F172A"/>
-          <w:sz w:val="28"/>
-          <w:szCs w:val="28"/>
-        </w:rPr>
-        <w:t xml:space="preserve">3. Phân Tích &amp; Giải Thích Chi Tiết Mã Nguồn CSS (Kèm Ảnh Chụp Neovim)</w:t>
-      </w:r>
-    </w:p>
-    <w:p>
-      <w:pPr>
-        <w:spacing w:after="120" w:line="276"/>
+          <w:sz w:val="26"/>
+          <w:szCs w:val="26"/>
+        </w:rPr>
+        <w:t xml:space="preserve">5. Quy Trình Triển Khai GitHub Pages</w:t>
+      </w:r>
+    </w:p>
+    <w:p>
+      <w:pPr>
+        <w:spacing w:after="100" w:line="260"/>
       </w:pPr>
       <w:r>
         <w:rPr>
@@ -1231,594 +1542,19 @@
           <w:b w:val="false"/>
           <w:bCs w:val="false"/>
           <w:color w:val="334155"/>
-          <w:sz w:val="22"/>
-          <w:szCs w:val="22"/>
-        </w:rPr>
-        <w:t xml:space="preserve">Toàn bộ phong cách giao diện được đóng gói trong tệp style.css riêng biệt (External CSS) theo khuyến nghị tại Mục 4.2 của Lab 1. Hệ thống CSS tuân thủ chặt chẽ Box Model, biến tùy biến (CSS Variables) và các kỹ thuật tạo chuyển động mượt mà.</w:t>
-      </w:r>
-    </w:p>
-    <w:p>
-      <w:pPr>
-        <w:pStyle w:val="Heading2"/>
-        <w:spacing w:after="100" w:before="200"/>
-      </w:pPr>
-      <w:r>
-        <w:rPr>
-          <w:rFonts w:ascii="Arial" w:cs="Arial" w:eastAsia="Arial" w:hAnsi="Arial"/>
-          <w:b/>
-          <w:bCs/>
-          <w:color w:val="1E293B"/>
-          <w:sz w:val="24"/>
-          <w:szCs w:val="24"/>
-        </w:rPr>
-        <w:t xml:space="preserve">3.1 Hệ Thống Biến Thiết Kế (CSS Variables) &amp; Reset Box Model (style.css: Dòng 7 – 44)</w:t>
-      </w:r>
-    </w:p>
-    <w:p>
-      <w:pPr>
-        <w:spacing w:after="120" w:line="276"/>
-      </w:pPr>
-      <w:r>
-        <w:rPr>
-          <w:rFonts w:ascii="Arial" w:cs="Arial" w:eastAsia="Arial" w:hAnsi="Arial"/>
-          <w:b w:val="false"/>
-          <w:bCs w:val="false"/>
-          <w:color w:val="334155"/>
-          <w:sz w:val="22"/>
-          <w:szCs w:val="22"/>
-        </w:rPr>
-        <w:t xml:space="preserve">• Biến tùy biến :root: Tập trung toàn bộ bảng màu trầm (--bg-primary, --bg-secondary, --border-subtle, --accent-primary), bán kính bo góc (--radius-sm, --radius-md), thời gian chuyển động transition (--transition-fast: 0.2s, --transition-normal: 0.3s) và bóng đổ (--shadow-card, --shadow-hover).
-• Reset toàn cục (*): Thiết lập box-sizing: border-box cho toàn bộ phần tử, giúp độ rộng (width) và độ cao (height) tính gộp cả padding và border, loại bỏ hoàn toàn các lỗi tràn màn hình ngoài ý muốn.</w:t>
-      </w:r>
-    </w:p>
-    <w:p>
-      <w:pPr>
-        <w:spacing w:after="60" w:before="140"/>
-        <w:jc w:val="center"/>
-      </w:pPr>
-      <w:r>
-        <w:drawing>
-          <wp:inline distT="0" distB="0" distL="0" distR="0">
-            <wp:extent cx="4762500" cy="5210175"/>
-            <wp:effectExtent t="0" r="0" b="0" l="0"/>
-            <wp:docPr id="8" name="Hệ thống biến CSS màu sắc, tokens và reset Box Model trong Neovim" descr="Hệ thống biến CSS màu sắc, tokens và reset Box Model trong Neovim" title="Hệ thống biến CSS màu sắc, tokens và reset Box Model trong Neovim"/>
-            <wp:cNvGraphicFramePr>
-              <a:graphicFrameLocks xmlns:a="http://schemas.openxmlformats.org/drawingml/2006/main" noChangeAspect="1"/>
-            </wp:cNvGraphicFramePr>
-            <a:graphic xmlns:a="http://schemas.openxmlformats.org/drawingml/2006/main">
-              <a:graphicData uri="http://schemas.openxmlformats.org/drawingml/2006/picture">
-                <pic:pic xmlns:pic="http://schemas.openxmlformats.org/drawingml/2006/picture">
-                  <pic:nvPicPr>
-                    <pic:cNvPr id="0" name="" descr=""/>
-                    <pic:cNvPicPr>
-                      <a:picLocks noChangeAspect="1" noChangeArrowheads="1"/>
-                    </pic:cNvPicPr>
-                  </pic:nvPicPr>
-                  <pic:blipFill>
-                    <a:blip r:embed="rId16" cstate="none"/>
-                    <a:srcRect/>
-                    <a:stretch>
-                      <a:fillRect/>
-                    </a:stretch>
-                  </pic:blipFill>
-                  <pic:spPr bwMode="auto">
-                    <a:xfrm>
-                      <a:off x="0" y="0"/>
-                      <a:ext cx="4762500" cy="5210175"/>
-                    </a:xfrm>
-                    <a:prstGeom prst="rect">
-                      <a:avLst/>
-                    </a:prstGeom>
-                  </pic:spPr>
-                </pic:pic>
-              </a:graphicData>
-            </a:graphic>
-          </wp:inline>
-        </w:drawing>
-      </w:r>
-    </w:p>
-    <w:p>
-      <w:pPr>
-        <w:spacing w:after="160"/>
-        <w:jc w:val="center"/>
-      </w:pPr>
-      <w:r>
-        <w:rPr>
-          <w:rFonts w:ascii="Arial" w:cs="Arial" w:eastAsia="Arial" w:hAnsi="Arial"/>
-          <w:color w:val="64748B"/>
-          <w:sz w:val="19"/>
-          <w:szCs w:val="19"/>
-        </w:rPr>
-        <w:t xml:space="preserve">Hình: Hệ thống biến CSS màu sắc, tokens và reset Box Model trong Neovim</w:t>
-      </w:r>
-    </w:p>
-    <w:p>
-      <w:pPr>
-        <w:pStyle w:val="Heading2"/>
-        <w:spacing w:after="100" w:before="200"/>
-      </w:pPr>
-      <w:r>
-        <w:rPr>
-          <w:rFonts w:ascii="Arial" w:cs="Arial" w:eastAsia="Arial" w:hAnsi="Arial"/>
-          <w:b/>
-          <w:bCs/>
-          <w:color w:val="1E293B"/>
-          <w:sz w:val="24"/>
-          <w:szCs w:val="24"/>
-        </w:rPr>
-        <w:t xml:space="preserve">3.2 Hiệu Ứng Chuyển Động Hover &amp; Nút Bấm - Exercise 4 (style.css: Dòng 195 – 242)</w:t>
-      </w:r>
-    </w:p>
-    <w:p>
-      <w:pPr>
-        <w:spacing w:after="120" w:line="276"/>
-      </w:pPr>
-      <w:r>
-        <w:rPr>
-          <w:rFonts w:ascii="Arial" w:cs="Arial" w:eastAsia="Arial" w:hAnsi="Arial"/>
-          <w:b w:val="false"/>
-          <w:bCs w:val="false"/>
-          <w:color w:val="334155"/>
-          <w:sz w:val="22"/>
-          <w:szCs w:val="22"/>
-        </w:rPr>
-        <w:t xml:space="preserve">• Thực hiện trọn vẹn yêu cầu Exercise 4 trong Lab 1:
-  + Sử dụng transition: transform 0.2s ease, background-color 0.2s ease, box-shadow 0.2s ease.
-  + Khi người dùng hover chuột vào nút (.btn-primary:hover), nút được nhấc bổng tinh tế bằng transform: translateY(-2px) đồng thời khuếch tán vệt sáng nền xanh dịu mắt (box-shadow: 0 4px 14px rgba(56, 189, 248, 0.25)).
-  + Tương tác phản hồi tức thời dưới 0.3 giây tạo cảm giác ứng dụng mượt mà, chuyên nghiệp và có độ nảy xúc giác.</w:t>
-      </w:r>
-    </w:p>
-    <w:p>
-      <w:pPr>
-        <w:spacing w:after="60" w:before="140"/>
-        <w:jc w:val="center"/>
-      </w:pPr>
-      <w:r>
-        <w:drawing>
-          <wp:inline distT="0" distB="0" distL="0" distR="0">
-            <wp:extent cx="4762500" cy="3990975"/>
-            <wp:effectExtent t="0" r="0" b="0" l="0"/>
-            <wp:docPr id="9" name="Định kiểu nút bấm và hiệu ứng transition/transform hover trong Neovim" descr="Định kiểu nút bấm và hiệu ứng transition/transform hover trong Neovim" title="Định kiểu nút bấm và hiệu ứng transition/transform hover trong Neovim"/>
-            <wp:cNvGraphicFramePr>
-              <a:graphicFrameLocks xmlns:a="http://schemas.openxmlformats.org/drawingml/2006/main" noChangeAspect="1"/>
-            </wp:cNvGraphicFramePr>
-            <a:graphic xmlns:a="http://schemas.openxmlformats.org/drawingml/2006/main">
-              <a:graphicData uri="http://schemas.openxmlformats.org/drawingml/2006/picture">
-                <pic:pic xmlns:pic="http://schemas.openxmlformats.org/drawingml/2006/picture">
-                  <pic:nvPicPr>
-                    <pic:cNvPr id="0" name="" descr=""/>
-                    <pic:cNvPicPr>
-                      <a:picLocks noChangeAspect="1" noChangeArrowheads="1"/>
-                    </pic:cNvPicPr>
-                  </pic:nvPicPr>
-                  <pic:blipFill>
-                    <a:blip r:embed="rId17" cstate="none"/>
-                    <a:srcRect/>
-                    <a:stretch>
-                      <a:fillRect/>
-                    </a:stretch>
-                  </pic:blipFill>
-                  <pic:spPr bwMode="auto">
-                    <a:xfrm>
-                      <a:off x="0" y="0"/>
-                      <a:ext cx="4762500" cy="3990975"/>
-                    </a:xfrm>
-                    <a:prstGeom prst="rect">
-                      <a:avLst/>
-                    </a:prstGeom>
-                  </pic:spPr>
-                </pic:pic>
-              </a:graphicData>
-            </a:graphic>
-          </wp:inline>
-        </w:drawing>
-      </w:r>
-    </w:p>
-    <w:p>
-      <w:pPr>
-        <w:spacing w:after="160"/>
-        <w:jc w:val="center"/>
-      </w:pPr>
-      <w:r>
-        <w:rPr>
-          <w:rFonts w:ascii="Arial" w:cs="Arial" w:eastAsia="Arial" w:hAnsi="Arial"/>
-          <w:color w:val="64748B"/>
-          <w:sz w:val="19"/>
-          <w:szCs w:val="19"/>
-        </w:rPr>
-        <w:t xml:space="preserve">Hình: Định kiểu nút bấm và hiệu ứng transition/transform hover trong Neovim</w:t>
-      </w:r>
-    </w:p>
-    <w:p>
-      <w:pPr>
-        <w:pStyle w:val="Heading2"/>
-        <w:spacing w:after="100" w:before="200"/>
-      </w:pPr>
-      <w:r>
-        <w:rPr>
-          <w:rFonts w:ascii="Arial" w:cs="Arial" w:eastAsia="Arial" w:hAnsi="Arial"/>
-          <w:b/>
-          <w:bCs/>
-          <w:color w:val="1E293B"/>
-          <w:sz w:val="24"/>
-          <w:szCs w:val="24"/>
-        </w:rPr>
-        <w:t xml:space="preserve">3.3 Bố Cục Thẻ Card &amp; Hiệu Ứng Nâng Chiều Sâu (style.css: Dòng 334 – 375)</w:t>
-      </w:r>
-    </w:p>
-    <w:p>
-      <w:pPr>
-        <w:spacing w:after="120" w:line="276"/>
-      </w:pPr>
-      <w:r>
-        <w:rPr>
-          <w:rFonts w:ascii="Arial" w:cs="Arial" w:eastAsia="Arial" w:hAnsi="Arial"/>
-          <w:b w:val="false"/>
-          <w:bCs w:val="false"/>
-          <w:color w:val="334155"/>
-          <w:sz w:val="22"/>
-          <w:szCs w:val="22"/>
-        </w:rPr>
-        <w:t xml:space="preserve">• Thẻ .timeline-card và .project-card được tạo hình với nền xám đen (#181b23) và viền mảnh (#242936).
-• Khi người dùng rê chuột qua (.timeline-card:hover), thẻ nổi lên với transform: translateY(-3px), viền đổi màu sáng hơn (--border-hover: #384152) và bóng đổ chuyển từ --shadow-card sang --shadow-hover sâu thẳm, tạo cảm giác phân tầng không gian 3D ấn tượng.</w:t>
-      </w:r>
-    </w:p>
-    <w:p>
-      <w:pPr>
-        <w:spacing w:after="60" w:before="140"/>
-        <w:jc w:val="center"/>
-      </w:pPr>
-      <w:r>
-        <w:drawing>
-          <wp:inline distT="0" distB="0" distL="0" distR="0">
-            <wp:extent cx="4762500" cy="4286250"/>
-            <wp:effectExtent t="0" r="0" b="0" l="0"/>
-            <wp:docPr id="10" name="Định kiểu thẻ Card và hiệu ứng đổ bóng nổi tầng trong Neovim" descr="Định kiểu thẻ Card và hiệu ứng đổ bóng nổi tầng trong Neovim" title="Định kiểu thẻ Card và hiệu ứng đổ bóng nổi tầng trong Neovim"/>
-            <wp:cNvGraphicFramePr>
-              <a:graphicFrameLocks xmlns:a="http://schemas.openxmlformats.org/drawingml/2006/main" noChangeAspect="1"/>
-            </wp:cNvGraphicFramePr>
-            <a:graphic xmlns:a="http://schemas.openxmlformats.org/drawingml/2006/main">
-              <a:graphicData uri="http://schemas.openxmlformats.org/drawingml/2006/picture">
-                <pic:pic xmlns:pic="http://schemas.openxmlformats.org/drawingml/2006/picture">
-                  <pic:nvPicPr>
-                    <pic:cNvPr id="0" name="" descr=""/>
-                    <pic:cNvPicPr>
-                      <a:picLocks noChangeAspect="1" noChangeArrowheads="1"/>
-                    </pic:cNvPicPr>
-                  </pic:nvPicPr>
-                  <pic:blipFill>
-                    <a:blip r:embed="rId18" cstate="none"/>
-                    <a:srcRect/>
-                    <a:stretch>
-                      <a:fillRect/>
-                    </a:stretch>
-                  </pic:blipFill>
-                  <pic:spPr bwMode="auto">
-                    <a:xfrm>
-                      <a:off x="0" y="0"/>
-                      <a:ext cx="4762500" cy="4286250"/>
-                    </a:xfrm>
-                    <a:prstGeom prst="rect">
-                      <a:avLst/>
-                    </a:prstGeom>
-                  </pic:spPr>
-                </pic:pic>
-              </a:graphicData>
-            </a:graphic>
-          </wp:inline>
-        </w:drawing>
-      </w:r>
-    </w:p>
-    <w:p>
-      <w:pPr>
-        <w:spacing w:after="160"/>
-        <w:jc w:val="center"/>
-      </w:pPr>
-      <w:r>
-        <w:rPr>
-          <w:rFonts w:ascii="Arial" w:cs="Arial" w:eastAsia="Arial" w:hAnsi="Arial"/>
-          <w:color w:val="64748B"/>
-          <w:sz w:val="19"/>
-          <w:szCs w:val="19"/>
-        </w:rPr>
-        <w:t xml:space="preserve">Hình: Định kiểu thẻ Card và hiệu ứng đổ bóng nổi tầng trong Neovim</w:t>
-      </w:r>
-    </w:p>
-    <w:p>
-      <w:pPr>
-        <w:pStyle w:val="Heading2"/>
-        <w:spacing w:after="100" w:before="200"/>
-      </w:pPr>
-      <w:r>
-        <w:rPr>
-          <w:rFonts w:ascii="Arial" w:cs="Arial" w:eastAsia="Arial" w:hAnsi="Arial"/>
-          <w:b/>
-          <w:bCs/>
-          <w:color w:val="1E293B"/>
-          <w:sz w:val="24"/>
-          <w:szCs w:val="24"/>
-        </w:rPr>
-        <w:t xml:space="preserve">3.4 Định Kiểu Bảng Kỹ Năng &amp; Biểu Mẫu Nhập Liệu (style.css: Dòng 485 – 535)</w:t>
-      </w:r>
-    </w:p>
-    <w:p>
-      <w:pPr>
-        <w:spacing w:after="120" w:line="276"/>
-      </w:pPr>
-      <w:r>
-        <w:rPr>
-          <w:rFonts w:ascii="Arial" w:cs="Arial" w:eastAsia="Arial" w:hAnsi="Arial"/>
-          <w:b w:val="false"/>
-          <w:bCs w:val="false"/>
-          <w:color w:val="334155"/>
-          <w:sz w:val="22"/>
-          <w:szCs w:val="22"/>
-        </w:rPr>
-        <w:t xml:space="preserve">• Bảng dữ liệu .skills-table: Thẻ tiêu đề thead có nền đậm cá tính, các dòng tbody sở hữu hiệu ứng trượt màu nhẹ nhàng khi hover (tr:hover { background-color: var(--bg-card); }).
-• Biểu mẫu .contact-form: Các ô input và textarea khi được nhấp chọn (:focus) sẽ kích hoạt viền sáng xanh mảnh kèm vệt glow (box-shadow: 0 0 0 2px rgba(56, 189, 248, 0.18)), nâng cao tối đa khả năng tập trung và trải nghiệm điền mẫu.</w:t>
-      </w:r>
-    </w:p>
-    <w:p>
-      <w:pPr>
-        <w:spacing w:after="60" w:before="140"/>
-        <w:jc w:val="center"/>
-      </w:pPr>
-      <w:r>
-        <w:drawing>
-          <wp:inline distT="0" distB="0" distL="0" distR="0">
-            <wp:extent cx="4762500" cy="3990975"/>
-            <wp:effectExtent t="0" r="0" b="0" l="0"/>
-            <wp:docPr id="11" name="Định kiểu bảng dữ liệu Responsive và trường Form trong Neovim" descr="Định kiểu bảng dữ liệu Responsive và trường Form trong Neovim" title="Định kiểu bảng dữ liệu Responsive và trường Form trong Neovim"/>
-            <wp:cNvGraphicFramePr>
-              <a:graphicFrameLocks xmlns:a="http://schemas.openxmlformats.org/drawingml/2006/main" noChangeAspect="1"/>
-            </wp:cNvGraphicFramePr>
-            <a:graphic xmlns:a="http://schemas.openxmlformats.org/drawingml/2006/main">
-              <a:graphicData uri="http://schemas.openxmlformats.org/drawingml/2006/picture">
-                <pic:pic xmlns:pic="http://schemas.openxmlformats.org/drawingml/2006/picture">
-                  <pic:nvPicPr>
-                    <pic:cNvPr id="0" name="" descr=""/>
-                    <pic:cNvPicPr>
-                      <a:picLocks noChangeAspect="1" noChangeArrowheads="1"/>
-                    </pic:cNvPicPr>
-                  </pic:nvPicPr>
-                  <pic:blipFill>
-                    <a:blip r:embed="rId19" cstate="none"/>
-                    <a:srcRect/>
-                    <a:stretch>
-                      <a:fillRect/>
-                    </a:stretch>
-                  </pic:blipFill>
-                  <pic:spPr bwMode="auto">
-                    <a:xfrm>
-                      <a:off x="0" y="0"/>
-                      <a:ext cx="4762500" cy="3990975"/>
-                    </a:xfrm>
-                    <a:prstGeom prst="rect">
-                      <a:avLst/>
-                    </a:prstGeom>
-                  </pic:spPr>
-                </pic:pic>
-              </a:graphicData>
-            </a:graphic>
-          </wp:inline>
-        </w:drawing>
-      </w:r>
-    </w:p>
-    <w:p>
-      <w:pPr>
-        <w:spacing w:after="160"/>
-        <w:jc w:val="center"/>
-      </w:pPr>
-      <w:r>
-        <w:rPr>
-          <w:rFonts w:ascii="Arial" w:cs="Arial" w:eastAsia="Arial" w:hAnsi="Arial"/>
-          <w:color w:val="64748B"/>
-          <w:sz w:val="19"/>
-          <w:szCs w:val="19"/>
-        </w:rPr>
-        <w:t xml:space="preserve">Hình: Định kiểu bảng dữ liệu Responsive và trường Form trong Neovim</w:t>
-      </w:r>
-    </w:p>
-    <w:p>
-      <w:pPr>
-        <w:pStyle w:val="Heading1"/>
-        <w:spacing w:after="140" w:before="280"/>
-      </w:pPr>
-      <w:r>
-        <w:rPr>
-          <w:rFonts w:ascii="Arial" w:cs="Arial" w:eastAsia="Arial" w:hAnsi="Arial"/>
-          <w:b/>
-          <w:bCs/>
-          <w:color w:val="0F172A"/>
-          <w:sz w:val="28"/>
-          <w:szCs w:val="28"/>
-        </w:rPr>
-        <w:t xml:space="preserve">4. Kết Quả Hiển Thị Hoàn Chỉnh Của Trang Web (Live Preview)</w:t>
-      </w:r>
-    </w:p>
-    <w:p>
-      <w:pPr>
-        <w:spacing w:after="120" w:line="276"/>
-      </w:pPr>
-      <w:r>
-        <w:rPr>
-          <w:rFonts w:ascii="Arial" w:cs="Arial" w:eastAsia="Arial" w:hAnsi="Arial"/>
-          <w:b w:val="false"/>
-          <w:bCs w:val="false"/>
-          <w:color w:val="334155"/>
-          <w:sz w:val="22"/>
-          <w:szCs w:val="22"/>
-        </w:rPr>
-        <w:t xml:space="preserve">Toàn bộ trang web cá nhân sau khi áp dụng đầy đủ mã nguồn HTML5 và CSS đã được kiểm thử render trực tiếp trên trình duyệt Chromium độ phân giải cao (1280x1800). Giao diện thể hiện sự cân đối, hài hòa về thị giác, bố cục phân tầng sắc sảo và đáp ứng toàn diện mọi yêu cầu bài tập của Lab 1.</w:t>
-      </w:r>
-    </w:p>
-    <w:p>
-      <w:pPr>
-        <w:spacing w:after="60" w:before="140"/>
-        <w:jc w:val="center"/>
-      </w:pPr>
-      <w:r>
-        <w:drawing>
-          <wp:inline distT="0" distB="0" distL="0" distR="0">
-            <wp:extent cx="4762500" cy="6696075"/>
-            <wp:effectExtent t="0" r="0" b="0" l="0"/>
-            <wp:docPr id="12" name="Giao diện hoàn chỉnh trang web CV cá nhân Huỳnh Khánh Thiện (Tone màu trầm, tối giản)" descr="Giao diện hoàn chỉnh trang web CV cá nhân Huỳnh Khánh Thiện (Tone màu trầm, tối giản)" title="Giao diện hoàn chỉnh trang web CV cá nhân Huỳnh Khánh Thiện (Tone màu trầm, tối giản)"/>
-            <wp:cNvGraphicFramePr>
-              <a:graphicFrameLocks xmlns:a="http://schemas.openxmlformats.org/drawingml/2006/main" noChangeAspect="1"/>
-            </wp:cNvGraphicFramePr>
-            <a:graphic xmlns:a="http://schemas.openxmlformats.org/drawingml/2006/main">
-              <a:graphicData uri="http://schemas.openxmlformats.org/drawingml/2006/picture">
-                <pic:pic xmlns:pic="http://schemas.openxmlformats.org/drawingml/2006/picture">
-                  <pic:nvPicPr>
-                    <pic:cNvPr id="0" name="" descr=""/>
-                    <pic:cNvPicPr>
-                      <a:picLocks noChangeAspect="1" noChangeArrowheads="1"/>
-                    </pic:cNvPicPr>
-                  </pic:nvPicPr>
-                  <pic:blipFill>
-                    <a:blip r:embed="rId20" cstate="none"/>
-                    <a:srcRect/>
-                    <a:stretch>
-                      <a:fillRect/>
-                    </a:stretch>
-                  </pic:blipFill>
-                  <pic:spPr bwMode="auto">
-                    <a:xfrm>
-                      <a:off x="0" y="0"/>
-                      <a:ext cx="4762500" cy="6696075"/>
-                    </a:xfrm>
-                    <a:prstGeom prst="rect">
-                      <a:avLst/>
-                    </a:prstGeom>
-                  </pic:spPr>
-                </pic:pic>
-              </a:graphicData>
-            </a:graphic>
-          </wp:inline>
-        </w:drawing>
-      </w:r>
-    </w:p>
-    <w:p>
-      <w:pPr>
-        <w:spacing w:after="160"/>
-        <w:jc w:val="center"/>
-      </w:pPr>
-      <w:r>
-        <w:rPr>
-          <w:rFonts w:ascii="Arial" w:cs="Arial" w:eastAsia="Arial" w:hAnsi="Arial"/>
-          <w:color w:val="64748B"/>
-          <w:sz w:val="19"/>
-          <w:szCs w:val="19"/>
-        </w:rPr>
-        <w:t xml:space="preserve">Hình: Giao diện hoàn chỉnh trang web CV cá nhân Huỳnh Khánh Thiện (Tone màu trầm, tối giản)</w:t>
-      </w:r>
-    </w:p>
-    <w:p>
-      <w:pPr>
-        <w:pStyle w:val="Heading1"/>
-        <w:spacing w:after="140" w:before="280"/>
-      </w:pPr>
-      <w:r>
-        <w:rPr>
-          <w:rFonts w:ascii="Arial" w:cs="Arial" w:eastAsia="Arial" w:hAnsi="Arial"/>
-          <w:b/>
-          <w:bCs/>
-          <w:color w:val="0F172A"/>
-          <w:sz w:val="28"/>
-          <w:szCs w:val="28"/>
-        </w:rPr>
-        <w:t xml:space="preserve">5. Kết Luận &amp; Hướng Dẫn Triển Khai GitHub Pages</w:t>
-      </w:r>
-    </w:p>
-    <w:p>
-      <w:pPr>
-        <w:spacing w:after="120" w:line="276"/>
-      </w:pPr>
-      <w:r>
-        <w:rPr>
-          <w:rFonts w:ascii="Arial" w:cs="Arial" w:eastAsia="Arial" w:hAnsi="Arial"/>
-          <w:b w:val="false"/>
-          <w:bCs w:val="false"/>
-          <w:color w:val="334155"/>
-          <w:sz w:val="22"/>
-          <w:szCs w:val="22"/>
-        </w:rPr>
-        <w:t xml:space="preserve">Trang web đã được tổ chức cấu trúc mã nguồn gọn gàng, tuân thủ nguyên tắc lập trình hướng ngữ nghĩa và thẩm mỹ tối giản hiện đại. Quy trình quản trị mã nguồn và triển khai trực tuyến lên GitHub Pages được thực hiện theo đúng chuẩn mực:</w:t>
-      </w:r>
-    </w:p>
-    <w:tbl>
-      <w:tblPr>
-        <w:tblW w:type="dxa" w:w="9026"/>
-        <w:tblBorders>
-          <w:top w:val="single" w:color="auto" w:sz="4"/>
-          <w:left w:val="single" w:color="auto" w:sz="4"/>
-          <w:bottom w:val="single" w:color="auto" w:sz="4"/>
-          <w:right w:val="single" w:color="auto" w:sz="4"/>
-          <w:insideH w:val="single" w:color="auto" w:sz="4"/>
-          <w:insideV w:val="single" w:color="auto" w:sz="4"/>
-        </w:tblBorders>
-      </w:tblPr>
-      <w:tblGrid>
-        <w:gridCol w:w="9026"/>
-      </w:tblGrid>
-      <w:tr>
-        <w:tc>
-          <w:tcPr>
-            <w:tcW w:type="dxa" w:w="9026"/>
-            <w:tcBorders>
-              <w:top w:val="none" w:color="FFFFFF" w:sz="0"/>
-              <w:left w:val="single" w:color="0284C7" w:sz="24"/>
-              <w:bottom w:val="none" w:color="FFFFFF" w:sz="0"/>
-              <w:right w:val="none" w:color="FFFFFF" w:sz="0"/>
-            </w:tcBorders>
-            <w:shd w:fill="F0F9FF" w:val="clear"/>
-            <w:tcMar>
-              <w:top w:type="dxa" w:w="120"/>
-              <w:left w:type="dxa" w:w="180"/>
-              <w:bottom w:type="dxa" w:w="120"/>
-              <w:right w:type="dxa" w:w="180"/>
-            </w:tcMar>
-          </w:tcPr>
-          <w:p>
-            <w:pPr>
-              <w:spacing w:after="60"/>
-            </w:pPr>
-            <w:r>
-              <w:rPr>
-                <w:rFonts w:ascii="Arial" w:cs="Arial" w:eastAsia="Arial" w:hAnsi="Arial"/>
-                <w:b/>
-                <w:bCs/>
-                <w:color w:val="0369A1"/>
-                <w:sz w:val="22"/>
-                <w:szCs w:val="22"/>
-              </w:rPr>
-              <w:t xml:space="preserve">Các bước triển khai GitHub Pages:</w:t>
-            </w:r>
-          </w:p>
-          <w:p>
-            <w:pPr>
-              <w:spacing w:after="0"/>
-            </w:pPr>
-            <w:r>
-              <w:rPr>
-                <w:rFonts w:ascii="Arial" w:cs="Arial" w:eastAsia="Arial" w:hAnsi="Arial"/>
-                <w:color w:val="1E293B"/>
-                <w:sz w:val="21"/>
-                <w:szCs w:val="21"/>
-              </w:rPr>
-              <w:t xml:space="preserve">1. Khởi tạo kho chứa cục bộ: git init &amp;&amp; git branch -m main
-2. Thêm và xác nhận mã nguồn: git add . &amp;&amp; git commit -m 'feat: add personal CV with semantic HTML5 and minimalist dark CSS styling'
-3. Đẩy lên GitHub Remote: git remote add origin https://github.com/thien-z3d3r/lab1-cv.git &amp;&amp; git push -u origin main
-4. Kích hoạt GitHub Pages: Truy cập repository trên GitHub -&gt; Settings -&gt; Pages -&gt; Chọn Source: 'Deploy from a branch' -&gt; Nhánh 'main', thư mục '/(root)' -&gt; Save.
-5. Kiểm tra kết quả trực tuyến: Truy cập đường dẫn https://thien-z3d3r.github.io/lab1-cv/ để nghiệm thu trang web chạy thực tế trên Internet.</w:t>
-            </w:r>
-          </w:p>
-        </w:tc>
-      </w:tr>
-    </w:tbl>
-    <w:p>
-      <w:pPr>
-        <w:spacing w:after="100" w:before="200"/>
+          <w:sz w:val="21"/>
+          <w:szCs w:val="21"/>
+        </w:rPr>
+        <w:t xml:space="preserve">Sau khi hoàn thiện mã nguồn, em thực hiện các bước triển khai lên môi trường mạng theo hướng dẫn tại Mục 5 của Lab 1:
+1. Khởi tạo kho chứa và commit: git add . &amp;&amp; git commit -m '...'
+2. Đẩy mã nguồn lên GitHub: git remote add origin https://github.com/thien-z3d3r/lab1-cv.git &amp;&amp; git push -u origin main
+3. Kích hoạt GitHub Pages trong phần Settings -&gt; Pages của repository, chọn nguồn từ nhánh main và thư mục /(root).
+4. Nghiệm thu trang web hoạt động bình thường tại địa chỉ: https://thien-z3d3r.github.io/lab1-cv/</w:t>
+      </w:r>
+    </w:p>
+    <w:p>
+      <w:pPr>
+        <w:spacing w:after="60" w:before="180"/>
         <w:jc w:val="center"/>
       </w:pPr>
       <w:r>
@@ -1830,7 +1566,7 @@
           <w:sz w:val="20"/>
           <w:szCs w:val="20"/>
         </w:rPr>
-        <w:t xml:space="preserve">--- HẾT BÁO CÁO LAB 1 ---</w:t>
+        <w:t xml:space="preserve">--- HẾT BÁO CÁO ---</w:t>
       </w:r>
     </w:p>
     <w:sectPr>
@@ -1892,8 +1628,8 @@
       <w:rPr>
         <w:rFonts w:ascii="Arial" w:cs="Arial" w:eastAsia="Arial" w:hAnsi="Arial"/>
         <w:color w:val="94A3B8"/>
-        <w:sz w:val="18"/>
-        <w:szCs w:val="18"/>
+        <w:sz w:val="17"/>
+        <w:szCs w:val="17"/>
       </w:rPr>
       <w:t xml:space="preserve">Trang </w:t>
     </w:r>
@@ -1901,8 +1637,8 @@
       <w:rPr>
         <w:rFonts w:ascii="Arial" w:cs="Arial" w:eastAsia="Arial" w:hAnsi="Arial"/>
         <w:color w:val="94A3B8"/>
-        <w:sz w:val="18"/>
-        <w:szCs w:val="18"/>
+        <w:sz w:val="17"/>
+        <w:szCs w:val="17"/>
       </w:rPr>
       <w:fldChar w:fldCharType="begin"/>
     </w:r>
@@ -1910,8 +1646,8 @@
       <w:rPr>
         <w:rFonts w:ascii="Arial" w:cs="Arial" w:eastAsia="Arial" w:hAnsi="Arial"/>
         <w:color w:val="94A3B8"/>
-        <w:sz w:val="18"/>
-        <w:szCs w:val="18"/>
+        <w:sz w:val="17"/>
+        <w:szCs w:val="17"/>
       </w:rPr>
       <w:instrText xml:space="preserve">PAGE</w:instrText>
     </w:r>
@@ -1919,8 +1655,8 @@
       <w:rPr>
         <w:rFonts w:ascii="Arial" w:cs="Arial" w:eastAsia="Arial" w:hAnsi="Arial"/>
         <w:color w:val="94A3B8"/>
-        <w:sz w:val="18"/>
-        <w:szCs w:val="18"/>
+        <w:sz w:val="17"/>
+        <w:szCs w:val="17"/>
       </w:rPr>
       <w:fldChar w:fldCharType="separate"/>
     </w:r>
@@ -1928,8 +1664,8 @@
       <w:rPr>
         <w:rFonts w:ascii="Arial" w:cs="Arial" w:eastAsia="Arial" w:hAnsi="Arial"/>
         <w:color w:val="94A3B8"/>
-        <w:sz w:val="18"/>
-        <w:szCs w:val="18"/>
+        <w:sz w:val="17"/>
+        <w:szCs w:val="17"/>
       </w:rPr>
       <w:fldChar w:fldCharType="end"/>
     </w:r>
@@ -1937,8 +1673,8 @@
       <w:rPr>
         <w:rFonts w:ascii="Arial" w:cs="Arial" w:eastAsia="Arial" w:hAnsi="Arial"/>
         <w:color w:val="94A3B8"/>
-        <w:sz w:val="18"/>
-        <w:szCs w:val="18"/>
+        <w:sz w:val="17"/>
+        <w:szCs w:val="17"/>
       </w:rPr>
       <w:t xml:space="preserve"> / </w:t>
     </w:r>
@@ -1946,8 +1682,8 @@
       <w:rPr>
         <w:rFonts w:ascii="Arial" w:cs="Arial" w:eastAsia="Arial" w:hAnsi="Arial"/>
         <w:color w:val="94A3B8"/>
-        <w:sz w:val="18"/>
-        <w:szCs w:val="18"/>
+        <w:sz w:val="17"/>
+        <w:szCs w:val="17"/>
       </w:rPr>
       <w:fldChar w:fldCharType="begin"/>
     </w:r>
@@ -1955,8 +1691,8 @@
       <w:rPr>
         <w:rFonts w:ascii="Arial" w:cs="Arial" w:eastAsia="Arial" w:hAnsi="Arial"/>
         <w:color w:val="94A3B8"/>
-        <w:sz w:val="18"/>
-        <w:szCs w:val="18"/>
+        <w:sz w:val="17"/>
+        <w:szCs w:val="17"/>
       </w:rPr>
       <w:instrText xml:space="preserve">NUMPAGES</w:instrText>
     </w:r>
@@ -1964,8 +1700,8 @@
       <w:rPr>
         <w:rFonts w:ascii="Arial" w:cs="Arial" w:eastAsia="Arial" w:hAnsi="Arial"/>
         <w:color w:val="94A3B8"/>
-        <w:sz w:val="18"/>
-        <w:szCs w:val="18"/>
+        <w:sz w:val="17"/>
+        <w:szCs w:val="17"/>
       </w:rPr>
       <w:fldChar w:fldCharType="separate"/>
     </w:r>
@@ -1973,8 +1709,8 @@
       <w:rPr>
         <w:rFonts w:ascii="Arial" w:cs="Arial" w:eastAsia="Arial" w:hAnsi="Arial"/>
         <w:color w:val="94A3B8"/>
-        <w:sz w:val="18"/>
-        <w:szCs w:val="18"/>
+        <w:sz w:val="17"/>
+        <w:szCs w:val="17"/>
       </w:rPr>
       <w:fldChar w:fldCharType="end"/>
     </w:r>
@@ -2029,10 +1765,10 @@
       <w:rPr>
         <w:rFonts w:ascii="Arial" w:cs="Arial" w:eastAsia="Arial" w:hAnsi="Arial"/>
         <w:color w:val="94A3B8"/>
-        <w:sz w:val="18"/>
-        <w:szCs w:val="18"/>
+        <w:sz w:val="17"/>
+        <w:szCs w:val="17"/>
       </w:rPr>
-      <w:t xml:space="preserve">Báo Cáo Lab 1 - Thiết Kế &amp; Phát Triển Web | Huỳnh Khánh Thiện</w:t>
+      <w:t xml:space="preserve">Báo Cáo Thực Hành Lab 1 - Thiết Kế &amp; Phát Triển Web | Huỳnh Khánh Thiện</w:t>
     </w:r>
   </w:p>
 </w:hdr>
@@ -2140,13 +1876,13 @@
       <w:rPr>
         <w:rFonts w:ascii="Arial" w:cs="Arial" w:eastAsia="Arial" w:hAnsi="Arial"/>
         <w:color w:val="334155"/>
-        <w:sz w:val="22"/>
-        <w:szCs w:val="22"/>
+        <w:sz w:val="21"/>
+        <w:szCs w:val="21"/>
       </w:rPr>
     </w:rPrDefault>
     <w:pPrDefault>
       <w:pPr>
-        <w:spacing w:line="276"/>
+        <w:spacing w:line="260"/>
       </w:pPr>
     </w:pPrDefault>
   </w:docDefaults>
@@ -2302,7 +2038,7 @@
     <w:unhideWhenUsed/>
     <w:pPr>
       <w:spacing w:after="100"/>
-      <w:ind w:left="220"/>
+      <w:ind w:left="210"/>
     </w:pPr>
   </w:style>
   <w:style w:type="paragraph" w:styleId="TOC3">
@@ -2314,7 +2050,7 @@
     <w:unhideWhenUsed/>
     <w:pPr>
       <w:spacing w:after="100"/>
-      <w:ind w:left="440"/>
+      <w:ind w:left="420"/>
     </w:pPr>
   </w:style>
   <w:style w:type="paragraph" w:styleId="TOC4">
@@ -2326,7 +2062,7 @@
     <w:unhideWhenUsed/>
     <w:pPr>
       <w:spacing w:after="100"/>
-      <w:ind w:left="660"/>
+      <w:ind w:left="630"/>
     </w:pPr>
   </w:style>
   <w:style w:type="paragraph" w:styleId="TOC5">
@@ -2338,7 +2074,7 @@
     <w:unhideWhenUsed/>
     <w:pPr>
       <w:spacing w:after="100"/>
-      <w:ind w:left="880"/>
+      <w:ind w:left="840"/>
     </w:pPr>
   </w:style>
   <w:style w:type="paragraph" w:styleId="TOC6">
@@ -2350,7 +2086,7 @@
     <w:unhideWhenUsed/>
     <w:pPr>
       <w:spacing w:after="100"/>
-      <w:ind w:left="1100"/>
+      <w:ind w:left="1050"/>
     </w:pPr>
   </w:style>
   <w:style w:type="paragraph" w:styleId="TOC7">
@@ -2362,7 +2098,7 @@
     <w:unhideWhenUsed/>
     <w:pPr>
       <w:spacing w:after="100"/>
-      <w:ind w:left="1320"/>
+      <w:ind w:left="1260"/>
     </w:pPr>
   </w:style>
   <w:style w:type="paragraph" w:styleId="TOC8">
@@ -2374,7 +2110,7 @@
     <w:unhideWhenUsed/>
     <w:pPr>
       <w:spacing w:after="100"/>
-      <w:ind w:left="1540"/>
+      <w:ind w:left="1470"/>
     </w:pPr>
   </w:style>
   <w:style w:type="paragraph" w:styleId="TOC9">
@@ -2386,7 +2122,7 @@
     <w:unhideWhenUsed/>
     <w:pPr>
       <w:spacing w:after="100"/>
-      <w:ind w:left="1760"/>
+      <w:ind w:left="1680"/>
     </w:pPr>
   </w:style>
   <w:style w:type="character" w:styleId="Hyperlink">

</xml_diff>

<commit_message>
fix: disable indent lines and statuscolumn bars to capture completely clean Neovim screenshots
</commit_message>
<xml_diff>
--- a/Lab1_HuynhKhanhThien.docx
+++ b/Lab1_HuynhKhanhThien.docx
@@ -779,101 +779,6 @@
                     </pic:cNvPicPr>
                   </pic:nvPicPr>
                   <pic:blipFill>
-                    <a:blip r:embed="rId11" cstate="none"/>
-                    <a:srcRect/>
-                    <a:stretch>
-                      <a:fillRect/>
-                    </a:stretch>
-                  </pic:blipFill>
-                  <pic:spPr bwMode="auto">
-                    <a:xfrm>
-                      <a:off x="0" y="0"/>
-                      <a:ext cx="5143500" cy="3286125"/>
-                    </a:xfrm>
-                    <a:prstGeom prst="rect">
-                      <a:avLst/>
-                    </a:prstGeom>
-                  </pic:spPr>
-                </pic:pic>
-              </a:graphicData>
-            </a:graphic>
-          </wp:inline>
-        </w:drawing>
-      </w:r>
-    </w:p>
-    <w:p>
-      <w:pPr>
-        <w:spacing w:after="140"/>
-        <w:jc w:val="center"/>
-      </w:pPr>
-      <w:r>
-        <w:rPr>
-          <w:rFonts w:ascii="Arial" w:cs="Arial" w:eastAsia="Arial" w:hAnsi="Arial"/>
-          <w:color w:val="64748B"/>
-          <w:sz w:val="18"/>
-          <w:szCs w:val="18"/>
-        </w:rPr>
-        <w:t xml:space="preserve">Hình 4: Danh sách thẻ dự án phần mềm tiêu biểu mở trong Neovim</w:t>
-      </w:r>
-    </w:p>
-    <w:p>
-      <w:pPr>
-        <w:pStyle w:val="Heading2"/>
-        <w:spacing w:after="80" w:before="180"/>
-      </w:pPr>
-      <w:r>
-        <w:rPr>
-          <w:rFonts w:ascii="Arial" w:cs="Arial" w:eastAsia="Arial" w:hAnsi="Arial"/>
-          <w:b/>
-          <w:bCs/>
-          <w:color w:val="1E293B"/>
-          <w:sz w:val="22"/>
-          <w:szCs w:val="22"/>
-        </w:rPr>
-        <w:t xml:space="preserve">2.5 Bảng kỹ năng kỹ thuật (&lt;table&gt;)</w:t>
-      </w:r>
-    </w:p>
-    <w:p>
-      <w:pPr>
-        <w:spacing w:after="100" w:line="260"/>
-      </w:pPr>
-      <w:r>
-        <w:rPr>
-          <w:rFonts w:ascii="Arial" w:cs="Arial" w:eastAsia="Arial" w:hAnsi="Arial"/>
-          <w:b w:val="false"/>
-          <w:bCs w:val="false"/>
-          <w:color w:val="334155"/>
-          <w:sz w:val="21"/>
-          <w:szCs w:val="21"/>
-        </w:rPr>
-        <w:t xml:space="preserve">• Để đáp ứng yêu cầu sử dụng phần tử bảng (table) trong đề bài Lab 1, em tạo bảng tổng hợp kỹ năng kỹ thuật gồm 4 nhóm: Smart Contracts, Systems &amp; Languages, AI/ML &amp; Automation, và Infrastructure &amp; DevOps.
-• Cấu trúc bảng gồm thẻ &lt;table&gt;, phần đầu bảng &lt;thead&gt; chứa các ô tiêu đề &lt;th scope="col"&gt;, và phần thân &lt;tbody&gt; chứa các hàng &lt;tr&gt; cùng dữ liệu &lt;td&gt;.</w:t>
-      </w:r>
-    </w:p>
-    <w:p>
-      <w:pPr>
-        <w:spacing w:after="50" w:before="120"/>
-        <w:jc w:val="center"/>
-      </w:pPr>
-      <w:r>
-        <w:drawing>
-          <wp:inline distT="0" distB="0" distL="0" distR="0">
-            <wp:extent cx="5143500" cy="3286125"/>
-            <wp:effectExtent t="0" r="0" b="0" l="0"/>
-            <wp:docPr id="5" name="Hình 5: Bảng kỹ năng kỹ thuật với cấu trúc &lt;table&gt; chuẩn mở trong Neovim" descr="Hình 5: Bảng kỹ năng kỹ thuật với cấu trúc &lt;table&gt; chuẩn mở trong Neovim" title="Hình 5: Bảng kỹ năng kỹ thuật với cấu trúc &lt;table&gt; chuẩn mở trong Neovim"/>
-            <wp:cNvGraphicFramePr>
-              <a:graphicFrameLocks xmlns:a="http://schemas.openxmlformats.org/drawingml/2006/main" noChangeAspect="1"/>
-            </wp:cNvGraphicFramePr>
-            <a:graphic xmlns:a="http://schemas.openxmlformats.org/drawingml/2006/main">
-              <a:graphicData uri="http://schemas.openxmlformats.org/drawingml/2006/picture">
-                <pic:pic xmlns:pic="http://schemas.openxmlformats.org/drawingml/2006/picture">
-                  <pic:nvPicPr>
-                    <pic:cNvPr id="0" name="" descr=""/>
-                    <pic:cNvPicPr>
-                      <a:picLocks noChangeAspect="1" noChangeArrowheads="1"/>
-                    </pic:cNvPicPr>
-                  </pic:nvPicPr>
-                  <pic:blipFill>
                     <a:blip r:embed="rId12" cstate="none"/>
                     <a:srcRect/>
                     <a:stretch>
@@ -908,7 +813,7 @@
           <w:sz w:val="18"/>
           <w:szCs w:val="18"/>
         </w:rPr>
-        <w:t xml:space="preserve">Hình 5: Bảng kỹ năng kỹ thuật với cấu trúc &lt;table&gt; chuẩn mở trong Neovim</w:t>
+        <w:t xml:space="preserve">Hình 4: Danh sách thẻ dự án phần mềm tiêu biểu mở trong Neovim</w:t>
       </w:r>
     </w:p>
     <w:p>
@@ -925,7 +830,7 @@
           <w:sz w:val="22"/>
           <w:szCs w:val="22"/>
         </w:rPr>
-        <w:t xml:space="preserve">2.6 Biểu mẫu liên hệ &amp; Thanh bên Aside (&lt;form&gt;, &lt;aside&gt;, &lt;footer&gt;)</w:t>
+        <w:t xml:space="preserve">2.5 Bảng kỹ năng kỹ thuật (&lt;table&gt;)</w:t>
       </w:r>
     </w:p>
     <w:p>
@@ -941,9 +846,8 @@
           <w:sz w:val="21"/>
           <w:szCs w:val="21"/>
         </w:rPr>
-        <w:t xml:space="preserve">• Thẻ &lt;form&gt;: Đáp ứng yêu cầu Form &amp; Input trong Lab 1 với các trường họ tên (&lt;input type="text"&gt;), email (&lt;input type="email"&gt;), ô nhập nội dung (&lt;textarea&gt;) và nút gửi (&lt;button type="submit"&gt;). Mỗi ô nhập đều có &lt;label&gt; gắn liền qua thuộc tính for/id.
-• Thẻ &lt;aside&gt;: Thanh bên chứa thông tin học vấn (Đại học Công nghệ Thông tin &amp; Birmingham City University), giải thưởng cuộc thi bằng danh sách có thứ tự &lt;ol&gt;, và thông số kỹ thuật nhanh bằng danh sách định nghĩa &lt;dl&gt;, &lt;dt&gt;, &lt;dd&gt;.
-• Thẻ &lt;footer&gt;: Chân trang thể hiện bản quyền cá nhân và đường link quay về đầu trang.</w:t>
+        <w:t xml:space="preserve">• Để đáp ứng yêu cầu sử dụng phần tử bảng (table) trong đề bài Lab 1, em tạo bảng tổng hợp kỹ năng kỹ thuật gồm 4 nhóm: Smart Contracts, Systems &amp; Languages, AI/ML &amp; Automation, và Infrastructure &amp; DevOps.
+• Cấu trúc bảng gồm thẻ &lt;table&gt;, phần đầu bảng &lt;thead&gt; chứa các ô tiêu đề &lt;th scope="col"&gt;, và phần thân &lt;tbody&gt; chứa các hàng &lt;tr&gt; cùng dữ liệu &lt;td&gt;.</w:t>
       </w:r>
     </w:p>
     <w:p>
@@ -956,135 +860,7 @@
           <wp:inline distT="0" distB="0" distL="0" distR="0">
             <wp:extent cx="5143500" cy="3286125"/>
             <wp:effectExtent t="0" r="0" b="0" l="0"/>
-            <wp:docPr id="6" name="Hình 6: Biểu mẫu &lt;form&gt;, thanh bên &lt;aside&gt; và chân trang &lt;footer&gt; mở trong Neovim" descr="Hình 6: Biểu mẫu &lt;form&gt;, thanh bên &lt;aside&gt; và chân trang &lt;footer&gt; mở trong Neovim" title="Hình 6: Biểu mẫu &lt;form&gt;, thanh bên &lt;aside&gt; và chân trang &lt;footer&gt; mở trong Neovim"/>
-            <wp:cNvGraphicFramePr>
-              <a:graphicFrameLocks xmlns:a="http://schemas.openxmlformats.org/drawingml/2006/main" noChangeAspect="1"/>
-            </wp:cNvGraphicFramePr>
-            <a:graphic xmlns:a="http://schemas.openxmlformats.org/drawingml/2006/main">
-              <a:graphicData uri="http://schemas.openxmlformats.org/drawingml/2006/picture">
-                <pic:pic xmlns:pic="http://schemas.openxmlformats.org/drawingml/2006/picture">
-                  <pic:nvPicPr>
-                    <pic:cNvPr id="0" name="" descr=""/>
-                    <pic:cNvPicPr>
-                      <a:picLocks noChangeAspect="1" noChangeArrowheads="1"/>
-                    </pic:cNvPicPr>
-                  </pic:nvPicPr>
-                  <pic:blipFill>
-                    <a:blip r:embed="rId12" cstate="none"/>
-                    <a:srcRect/>
-                    <a:stretch>
-                      <a:fillRect/>
-                    </a:stretch>
-                  </pic:blipFill>
-                  <pic:spPr bwMode="auto">
-                    <a:xfrm>
-                      <a:off x="0" y="0"/>
-                      <a:ext cx="5143500" cy="3286125"/>
-                    </a:xfrm>
-                    <a:prstGeom prst="rect">
-                      <a:avLst/>
-                    </a:prstGeom>
-                  </pic:spPr>
-                </pic:pic>
-              </a:graphicData>
-            </a:graphic>
-          </wp:inline>
-        </w:drawing>
-      </w:r>
-    </w:p>
-    <w:p>
-      <w:pPr>
-        <w:spacing w:after="140"/>
-        <w:jc w:val="center"/>
-      </w:pPr>
-      <w:r>
-        <w:rPr>
-          <w:rFonts w:ascii="Arial" w:cs="Arial" w:eastAsia="Arial" w:hAnsi="Arial"/>
-          <w:color w:val="64748B"/>
-          <w:sz w:val="18"/>
-          <w:szCs w:val="18"/>
-        </w:rPr>
-        <w:t xml:space="preserve">Hình 6: Biểu mẫu &lt;form&gt;, thanh bên &lt;aside&gt; và chân trang &lt;footer&gt; mở trong Neovim</w:t>
-      </w:r>
-    </w:p>
-    <w:p>
-      <w:pPr>
-        <w:pStyle w:val="Heading1"/>
-        <w:spacing w:after="120" w:before="240"/>
-      </w:pPr>
-      <w:r>
-        <w:rPr>
-          <w:rFonts w:ascii="Arial" w:cs="Arial" w:eastAsia="Arial" w:hAnsi="Arial"/>
-          <w:b/>
-          <w:bCs/>
-          <w:color w:val="0F172A"/>
-          <w:sz w:val="26"/>
-          <w:szCs w:val="26"/>
-        </w:rPr>
-        <w:t xml:space="preserve">3. Phân Tích Mã Nguồn CSS (style.css)</w:t>
-      </w:r>
-    </w:p>
-    <w:p>
-      <w:pPr>
-        <w:spacing w:after="100" w:line="260"/>
-      </w:pPr>
-      <w:r>
-        <w:rPr>
-          <w:rFonts w:ascii="Arial" w:cs="Arial" w:eastAsia="Arial" w:hAnsi="Arial"/>
-          <w:b w:val="false"/>
-          <w:bCs w:val="false"/>
-          <w:color w:val="334155"/>
-          <w:sz w:val="21"/>
-          <w:szCs w:val="21"/>
-        </w:rPr>
-        <w:t xml:space="preserve">File CSS được tách riêng và liên kết với HTML theo đúng khuyến nghị của đề bài (External CSS). Phong cách thiết kế ưu tiên sự gọn gàng, tính phân cấp rõ ràng và hỗ trợ tốt trên màn hình di động.</w:t>
-      </w:r>
-    </w:p>
-    <w:p>
-      <w:pPr>
-        <w:pStyle w:val="Heading2"/>
-        <w:spacing w:after="80" w:before="180"/>
-      </w:pPr>
-      <w:r>
-        <w:rPr>
-          <w:rFonts w:ascii="Arial" w:cs="Arial" w:eastAsia="Arial" w:hAnsi="Arial"/>
-          <w:b/>
-          <w:bCs/>
-          <w:color w:val="1E293B"/>
-          <w:sz w:val="22"/>
-          <w:szCs w:val="22"/>
-        </w:rPr>
-        <w:t xml:space="preserve">3.1 Biến CSS, Reset &amp; Box Model</w:t>
-      </w:r>
-    </w:p>
-    <w:p>
-      <w:pPr>
-        <w:spacing w:after="100" w:line="260"/>
-      </w:pPr>
-      <w:r>
-        <w:rPr>
-          <w:rFonts w:ascii="Arial" w:cs="Arial" w:eastAsia="Arial" w:hAnsi="Arial"/>
-          <w:b w:val="false"/>
-          <w:bCs w:val="false"/>
-          <w:color w:val="334155"/>
-          <w:sz w:val="21"/>
-          <w:szCs w:val="21"/>
-        </w:rPr>
-        <w:t xml:space="preserve">• Khối :root khai báo các biến CSS (CSS Variables) để quản lý tập trung mã màu nền (--bg: #0f1013), màu bề mặt (--surface: #15171c), màu viền (--border: #22252c) và màu chữ (--text: #e1e4ea).
-• Quy tắc * { box-sizing: border-box; } giúp tính toán kích thước phần tử chính xác gồm cả padding và border, tránh lỗi vỡ bố cục khi thêm khoảng đệm.</w:t>
-      </w:r>
-    </w:p>
-    <w:p>
-      <w:pPr>
-        <w:spacing w:after="50" w:before="120"/>
-        <w:jc w:val="center"/>
-      </w:pPr>
-      <w:r>
-        <w:drawing>
-          <wp:inline distT="0" distB="0" distL="0" distR="0">
-            <wp:extent cx="5143500" cy="3286125"/>
-            <wp:effectExtent t="0" r="0" b="0" l="0"/>
-            <wp:docPr id="7" name="Hình 7: Khai báo biến CSS :root và thiết lập Box Model mở trong Neovim" descr="Hình 7: Khai báo biến CSS :root và thiết lập Box Model mở trong Neovim" title="Hình 7: Khai báo biến CSS :root và thiết lập Box Model mở trong Neovim"/>
+            <wp:docPr id="5" name="Hình 5: Bảng kỹ năng kỹ thuật với cấu trúc &lt;table&gt; chuẩn mở trong Neovim" descr="Hình 5: Bảng kỹ năng kỹ thuật với cấu trúc &lt;table&gt; chuẩn mở trong Neovim" title="Hình 5: Bảng kỹ năng kỹ thuật với cấu trúc &lt;table&gt; chuẩn mở trong Neovim"/>
             <wp:cNvGraphicFramePr>
               <a:graphicFrameLocks xmlns:a="http://schemas.openxmlformats.org/drawingml/2006/main" noChangeAspect="1"/>
             </wp:cNvGraphicFramePr>
@@ -1132,7 +908,7 @@
           <w:sz w:val="18"/>
           <w:szCs w:val="18"/>
         </w:rPr>
-        <w:t xml:space="preserve">Hình 7: Khai báo biến CSS :root và thiết lập Box Model mở trong Neovim</w:t>
+        <w:t xml:space="preserve">Hình 5: Bảng kỹ năng kỹ thuật với cấu trúc &lt;table&gt; chuẩn mở trong Neovim</w:t>
       </w:r>
     </w:p>
     <w:p>
@@ -1149,7 +925,7 @@
           <w:sz w:val="22"/>
           <w:szCs w:val="22"/>
         </w:rPr>
-        <w:t xml:space="preserve">3.2 Định kiểu Navigation &amp; Header</w:t>
+        <w:t xml:space="preserve">2.6 Biểu mẫu liên hệ &amp; Thanh bên Aside (&lt;form&gt;, &lt;aside&gt;, &lt;footer&gt;)</w:t>
       </w:r>
     </w:p>
     <w:p>
@@ -1165,8 +941,9 @@
           <w:sz w:val="21"/>
           <w:szCs w:val="21"/>
         </w:rPr>
-        <w:t xml:space="preserve">• Thanh .navbar sử dụng position: sticky và backdrop-filter: blur(8px) giúp thanh menu cố định phía trên khi cuộn trang.
-• Bố cục header dùng Flexbox chia hai phần: khối văn bản thông tin bên trái và ảnh đại diện bo tròn bên phải.</w:t>
+        <w:t xml:space="preserve">• Thẻ &lt;form&gt;: Đáp ứng yêu cầu Form &amp; Input trong Lab 1 với các trường họ tên (&lt;input type="text"&gt;), email (&lt;input type="email"&gt;), ô nhập nội dung (&lt;textarea&gt;) và nút gửi (&lt;button type="submit"&gt;). Mỗi ô nhập đều có &lt;label&gt; gắn liền qua thuộc tính for/id.
+• Thẻ &lt;aside&gt;: Thanh bên chứa thông tin học vấn (Đại học Công nghệ Thông tin &amp; Birmingham City University), giải thưởng cuộc thi bằng danh sách có thứ tự &lt;ol&gt;, và thông số kỹ thuật nhanh bằng danh sách định nghĩa &lt;dl&gt;, &lt;dt&gt;, &lt;dd&gt;.
+• Thẻ &lt;footer&gt;: Chân trang thể hiện bản quyền cá nhân và đường link quay về đầu trang.</w:t>
       </w:r>
     </w:p>
     <w:p>
@@ -1179,102 +956,7 @@
           <wp:inline distT="0" distB="0" distL="0" distR="0">
             <wp:extent cx="5143500" cy="3286125"/>
             <wp:effectExtent t="0" r="0" b="0" l="0"/>
-            <wp:docPr id="8" name="Hình 8: Định kiểu thanh điều hướng và header mở trong Neovim" descr="Hình 8: Định kiểu thanh điều hướng và header mở trong Neovim" title="Hình 8: Định kiểu thanh điều hướng và header mở trong Neovim"/>
-            <wp:cNvGraphicFramePr>
-              <a:graphicFrameLocks xmlns:a="http://schemas.openxmlformats.org/drawingml/2006/main" noChangeAspect="1"/>
-            </wp:cNvGraphicFramePr>
-            <a:graphic xmlns:a="http://schemas.openxmlformats.org/drawingml/2006/main">
-              <a:graphicData uri="http://schemas.openxmlformats.org/drawingml/2006/picture">
-                <pic:pic xmlns:pic="http://schemas.openxmlformats.org/drawingml/2006/picture">
-                  <pic:nvPicPr>
-                    <pic:cNvPr id="0" name="" descr=""/>
-                    <pic:cNvPicPr>
-                      <a:picLocks noChangeAspect="1" noChangeArrowheads="1"/>
-                    </pic:cNvPicPr>
-                  </pic:nvPicPr>
-                  <pic:blipFill>
-                    <a:blip r:embed="rId13" cstate="none"/>
-                    <a:srcRect/>
-                    <a:stretch>
-                      <a:fillRect/>
-                    </a:stretch>
-                  </pic:blipFill>
-                  <pic:spPr bwMode="auto">
-                    <a:xfrm>
-                      <a:off x="0" y="0"/>
-                      <a:ext cx="5143500" cy="3286125"/>
-                    </a:xfrm>
-                    <a:prstGeom prst="rect">
-                      <a:avLst/>
-                    </a:prstGeom>
-                  </pic:spPr>
-                </pic:pic>
-              </a:graphicData>
-            </a:graphic>
-          </wp:inline>
-        </w:drawing>
-      </w:r>
-    </w:p>
-    <w:p>
-      <w:pPr>
-        <w:spacing w:after="140"/>
-        <w:jc w:val="center"/>
-      </w:pPr>
-      <w:r>
-        <w:rPr>
-          <w:rFonts w:ascii="Arial" w:cs="Arial" w:eastAsia="Arial" w:hAnsi="Arial"/>
-          <w:color w:val="64748B"/>
-          <w:sz w:val="18"/>
-          <w:szCs w:val="18"/>
-        </w:rPr>
-        <w:t xml:space="preserve">Hình 8: Định kiểu thanh điều hướng và header mở trong Neovim</w:t>
-      </w:r>
-    </w:p>
-    <w:p>
-      <w:pPr>
-        <w:pStyle w:val="Heading2"/>
-        <w:spacing w:after="80" w:before="180"/>
-      </w:pPr>
-      <w:r>
-        <w:rPr>
-          <w:rFonts w:ascii="Arial" w:cs="Arial" w:eastAsia="Arial" w:hAnsi="Arial"/>
-          <w:b/>
-          <w:bCs/>
-          <w:color w:val="1E293B"/>
-          <w:sz w:val="22"/>
-          <w:szCs w:val="22"/>
-        </w:rPr>
-        <w:t xml:space="preserve">3.3 Bố cục nội dung chính, Card &amp; Hiệu ứng Hover (Exercise 4)</w:t>
-      </w:r>
-    </w:p>
-    <w:p>
-      <w:pPr>
-        <w:spacing w:after="100" w:line="260"/>
-      </w:pPr>
-      <w:r>
-        <w:rPr>
-          <w:rFonts w:ascii="Arial" w:cs="Arial" w:eastAsia="Arial" w:hAnsi="Arial"/>
-          <w:b w:val="false"/>
-          <w:bCs w:val="false"/>
-          <w:color w:val="334155"/>
-          <w:sz w:val="21"/>
-          <w:szCs w:val="21"/>
-        </w:rPr>
-        <w:t xml:space="preserve">• Bố cục trang chia thành 2 cột bằng CSS Grid (.layout-container { display: grid; grid-template-columns: 1fr 310px; gap: 48px; }).
-• Thực hiện yêu cầu Exercise 4 trong đề bài: Thẻ dự án .project-item và nút bấm đều được gắn transition: border-color 0.2s ease, transform 0.2s ease. Khi rê chuột qua (:hover), phần tử nhấc lên nhẹ nhàng bằng transform: translateY(-2px) và viền sáng hơn, tạo phản hồi xúc giác tự nhiên.</w:t>
-      </w:r>
-    </w:p>
-    <w:p>
-      <w:pPr>
-        <w:spacing w:after="50" w:before="120"/>
-        <w:jc w:val="center"/>
-      </w:pPr>
-      <w:r>
-        <w:drawing>
-          <wp:inline distT="0" distB="0" distL="0" distR="0">
-            <wp:extent cx="5143500" cy="3286125"/>
-            <wp:effectExtent t="0" r="0" b="0" l="0"/>
-            <wp:docPr id="9" name="Hình 9: Định kiểu danh sách bài viết và hiệu ứng hover mở trong Neovim" descr="Hình 9: Định kiểu danh sách bài viết và hiệu ứng hover mở trong Neovim" title="Hình 9: Định kiểu danh sách bài viết và hiệu ứng hover mở trong Neovim"/>
+            <wp:docPr id="6" name="Hình 6: Biểu mẫu &lt;form&gt;, thanh bên &lt;aside&gt; và chân trang &lt;footer&gt; mở trong Neovim" descr="Hình 6: Biểu mẫu &lt;form&gt;, thanh bên &lt;aside&gt; và chân trang &lt;footer&gt; mở trong Neovim" title="Hình 6: Biểu mẫu &lt;form&gt;, thanh bên &lt;aside&gt; và chân trang &lt;footer&gt; mở trong Neovim"/>
             <wp:cNvGraphicFramePr>
               <a:graphicFrameLocks xmlns:a="http://schemas.openxmlformats.org/drawingml/2006/main" noChangeAspect="1"/>
             </wp:cNvGraphicFramePr>
@@ -1322,7 +1004,40 @@
           <w:sz w:val="18"/>
           <w:szCs w:val="18"/>
         </w:rPr>
-        <w:t xml:space="preserve">Hình 9: Định kiểu danh sách bài viết và hiệu ứng hover mở trong Neovim</w:t>
+        <w:t xml:space="preserve">Hình 6: Biểu mẫu &lt;form&gt;, thanh bên &lt;aside&gt; và chân trang &lt;footer&gt; mở trong Neovim</w:t>
+      </w:r>
+    </w:p>
+    <w:p>
+      <w:pPr>
+        <w:pStyle w:val="Heading1"/>
+        <w:spacing w:after="120" w:before="240"/>
+      </w:pPr>
+      <w:r>
+        <w:rPr>
+          <w:rFonts w:ascii="Arial" w:cs="Arial" w:eastAsia="Arial" w:hAnsi="Arial"/>
+          <w:b/>
+          <w:bCs/>
+          <w:color w:val="0F172A"/>
+          <w:sz w:val="26"/>
+          <w:szCs w:val="26"/>
+        </w:rPr>
+        <w:t xml:space="preserve">3. Phân Tích Mã Nguồn CSS (style.css)</w:t>
+      </w:r>
+    </w:p>
+    <w:p>
+      <w:pPr>
+        <w:spacing w:after="100" w:line="260"/>
+      </w:pPr>
+      <w:r>
+        <w:rPr>
+          <w:rFonts w:ascii="Arial" w:cs="Arial" w:eastAsia="Arial" w:hAnsi="Arial"/>
+          <w:b w:val="false"/>
+          <w:bCs w:val="false"/>
+          <w:color w:val="334155"/>
+          <w:sz w:val="21"/>
+          <w:szCs w:val="21"/>
+        </w:rPr>
+        <w:t xml:space="preserve">File CSS được tách riêng và liên kết với HTML theo đúng khuyến nghị của đề bài (External CSS). Phong cách thiết kế ưu tiên sự gọn gàng, tính phân cấp rõ ràng và hỗ trợ tốt trên màn hình di động.</w:t>
       </w:r>
     </w:p>
     <w:p>
@@ -1339,7 +1054,7 @@
           <w:sz w:val="22"/>
           <w:szCs w:val="22"/>
         </w:rPr>
-        <w:t xml:space="preserve">3.4 Định kiểu Bảng dữ liệu &amp; Form liên hệ</w:t>
+        <w:t xml:space="preserve">3.1 Biến CSS, Reset &amp; Box Model</w:t>
       </w:r>
     </w:p>
     <w:p>
@@ -1355,9 +1070,8 @@
           <w:sz w:val="21"/>
           <w:szCs w:val="21"/>
         </w:rPr>
-        <w:t xml:space="preserve">• Bảng dữ liệu được bọc trong container có overflow-x: auto để không bị tràn khi xem trên màn hình nhỏ. Hàng bảng có hiệu ứng đổi màu nền nhẹ khi rê chuột.
-• Ô nhập liệu input và textarea khi focus sẽ đổi màu viền sang --border-focus (#4b5563) để người dùng nhận biết vị trí đang gõ phím.
-• Áp dụng Media Query (@media (max-width: 860px) và @media (max-width: 600px)) để tự động chuyển bố cục lưới thành 1 cột trên màn hình điện thoại.</w:t>
+        <w:t xml:space="preserve">• Khối :root khai báo các biến CSS (CSS Variables) để quản lý tập trung mã màu nền (--bg: #0f1013), màu bề mặt (--surface: #15171c), màu viền (--border: #22252c) và màu chữ (--text: #e1e4ea).
+• Quy tắc * { box-sizing: border-box; } giúp tính toán kích thước phần tử chính xác gồm cả padding và border, tránh lỗi vỡ bố cục khi thêm khoảng đệm.</w:t>
       </w:r>
     </w:p>
     <w:p>
@@ -1370,7 +1084,7 @@
           <wp:inline distT="0" distB="0" distL="0" distR="0">
             <wp:extent cx="5143500" cy="3286125"/>
             <wp:effectExtent t="0" r="0" b="0" l="0"/>
-            <wp:docPr id="10" name="Hình 10: Định kiểu bảng, form liên hệ và media queries mở trong Neovim" descr="Hình 10: Định kiểu bảng, form liên hệ và media queries mở trong Neovim" title="Hình 10: Định kiểu bảng, form liên hệ và media queries mở trong Neovim"/>
+            <wp:docPr id="7" name="Hình 7: Khai báo biến CSS :root và thiết lập Box Model mở trong Neovim" descr="Hình 7: Khai báo biến CSS :root và thiết lập Box Model mở trong Neovim" title="Hình 7: Khai báo biến CSS :root và thiết lập Box Model mở trong Neovim"/>
             <wp:cNvGraphicFramePr>
               <a:graphicFrameLocks xmlns:a="http://schemas.openxmlformats.org/drawingml/2006/main" noChangeAspect="1"/>
             </wp:cNvGraphicFramePr>
@@ -1384,7 +1098,7 @@
                     </pic:cNvPicPr>
                   </pic:nvPicPr>
                   <pic:blipFill>
-                    <a:blip r:embed="rId14" cstate="none"/>
+                    <a:blip r:embed="rId15" cstate="none"/>
                     <a:srcRect/>
                     <a:stretch>
                       <a:fillRect/>
@@ -1418,6 +1132,292 @@
           <w:sz w:val="18"/>
           <w:szCs w:val="18"/>
         </w:rPr>
+        <w:t xml:space="preserve">Hình 7: Khai báo biến CSS :root và thiết lập Box Model mở trong Neovim</w:t>
+      </w:r>
+    </w:p>
+    <w:p>
+      <w:pPr>
+        <w:pStyle w:val="Heading2"/>
+        <w:spacing w:after="80" w:before="180"/>
+      </w:pPr>
+      <w:r>
+        <w:rPr>
+          <w:rFonts w:ascii="Arial" w:cs="Arial" w:eastAsia="Arial" w:hAnsi="Arial"/>
+          <w:b/>
+          <w:bCs/>
+          <w:color w:val="1E293B"/>
+          <w:sz w:val="22"/>
+          <w:szCs w:val="22"/>
+        </w:rPr>
+        <w:t xml:space="preserve">3.2 Định kiểu Navigation &amp; Header</w:t>
+      </w:r>
+    </w:p>
+    <w:p>
+      <w:pPr>
+        <w:spacing w:after="100" w:line="260"/>
+      </w:pPr>
+      <w:r>
+        <w:rPr>
+          <w:rFonts w:ascii="Arial" w:cs="Arial" w:eastAsia="Arial" w:hAnsi="Arial"/>
+          <w:b w:val="false"/>
+          <w:bCs w:val="false"/>
+          <w:color w:val="334155"/>
+          <w:sz w:val="21"/>
+          <w:szCs w:val="21"/>
+        </w:rPr>
+        <w:t xml:space="preserve">• Thanh .navbar sử dụng position: sticky và backdrop-filter: blur(8px) giúp thanh menu cố định phía trên khi cuộn trang.
+• Bố cục header dùng Flexbox chia hai phần: khối văn bản thông tin bên trái và ảnh đại diện bo tròn bên phải.</w:t>
+      </w:r>
+    </w:p>
+    <w:p>
+      <w:pPr>
+        <w:spacing w:after="50" w:before="120"/>
+        <w:jc w:val="center"/>
+      </w:pPr>
+      <w:r>
+        <w:drawing>
+          <wp:inline distT="0" distB="0" distL="0" distR="0">
+            <wp:extent cx="5143500" cy="3286125"/>
+            <wp:effectExtent t="0" r="0" b="0" l="0"/>
+            <wp:docPr id="8" name="Hình 8: Định kiểu thanh điều hướng và header mở trong Neovim" descr="Hình 8: Định kiểu thanh điều hướng và header mở trong Neovim" title="Hình 8: Định kiểu thanh điều hướng và header mở trong Neovim"/>
+            <wp:cNvGraphicFramePr>
+              <a:graphicFrameLocks xmlns:a="http://schemas.openxmlformats.org/drawingml/2006/main" noChangeAspect="1"/>
+            </wp:cNvGraphicFramePr>
+            <a:graphic xmlns:a="http://schemas.openxmlformats.org/drawingml/2006/main">
+              <a:graphicData uri="http://schemas.openxmlformats.org/drawingml/2006/picture">
+                <pic:pic xmlns:pic="http://schemas.openxmlformats.org/drawingml/2006/picture">
+                  <pic:nvPicPr>
+                    <pic:cNvPr id="0" name="" descr=""/>
+                    <pic:cNvPicPr>
+                      <a:picLocks noChangeAspect="1" noChangeArrowheads="1"/>
+                    </pic:cNvPicPr>
+                  </pic:nvPicPr>
+                  <pic:blipFill>
+                    <a:blip r:embed="rId15" cstate="none"/>
+                    <a:srcRect/>
+                    <a:stretch>
+                      <a:fillRect/>
+                    </a:stretch>
+                  </pic:blipFill>
+                  <pic:spPr bwMode="auto">
+                    <a:xfrm>
+                      <a:off x="0" y="0"/>
+                      <a:ext cx="5143500" cy="3286125"/>
+                    </a:xfrm>
+                    <a:prstGeom prst="rect">
+                      <a:avLst/>
+                    </a:prstGeom>
+                  </pic:spPr>
+                </pic:pic>
+              </a:graphicData>
+            </a:graphic>
+          </wp:inline>
+        </w:drawing>
+      </w:r>
+    </w:p>
+    <w:p>
+      <w:pPr>
+        <w:spacing w:after="140"/>
+        <w:jc w:val="center"/>
+      </w:pPr>
+      <w:r>
+        <w:rPr>
+          <w:rFonts w:ascii="Arial" w:cs="Arial" w:eastAsia="Arial" w:hAnsi="Arial"/>
+          <w:color w:val="64748B"/>
+          <w:sz w:val="18"/>
+          <w:szCs w:val="18"/>
+        </w:rPr>
+        <w:t xml:space="preserve">Hình 8: Định kiểu thanh điều hướng và header mở trong Neovim</w:t>
+      </w:r>
+    </w:p>
+    <w:p>
+      <w:pPr>
+        <w:pStyle w:val="Heading2"/>
+        <w:spacing w:after="80" w:before="180"/>
+      </w:pPr>
+      <w:r>
+        <w:rPr>
+          <w:rFonts w:ascii="Arial" w:cs="Arial" w:eastAsia="Arial" w:hAnsi="Arial"/>
+          <w:b/>
+          <w:bCs/>
+          <w:color w:val="1E293B"/>
+          <w:sz w:val="22"/>
+          <w:szCs w:val="22"/>
+        </w:rPr>
+        <w:t xml:space="preserve">3.3 Bố cục nội dung chính, Card &amp; Hiệu ứng Hover (Exercise 4)</w:t>
+      </w:r>
+    </w:p>
+    <w:p>
+      <w:pPr>
+        <w:spacing w:after="100" w:line="260"/>
+      </w:pPr>
+      <w:r>
+        <w:rPr>
+          <w:rFonts w:ascii="Arial" w:cs="Arial" w:eastAsia="Arial" w:hAnsi="Arial"/>
+          <w:b w:val="false"/>
+          <w:bCs w:val="false"/>
+          <w:color w:val="334155"/>
+          <w:sz w:val="21"/>
+          <w:szCs w:val="21"/>
+        </w:rPr>
+        <w:t xml:space="preserve">• Bố cục trang chia thành 2 cột bằng CSS Grid (.layout-container { display: grid; grid-template-columns: 1fr 310px; gap: 48px; }).
+• Thực hiện yêu cầu Exercise 4 trong đề bài: Thẻ dự án .project-item và nút bấm đều được gắn transition: border-color 0.2s ease, transform 0.2s ease. Khi rê chuột qua (:hover), phần tử nhấc lên nhẹ nhàng bằng transform: translateY(-2px) và viền sáng hơn, tạo phản hồi xúc giác tự nhiên.</w:t>
+      </w:r>
+    </w:p>
+    <w:p>
+      <w:pPr>
+        <w:spacing w:after="50" w:before="120"/>
+        <w:jc w:val="center"/>
+      </w:pPr>
+      <w:r>
+        <w:drawing>
+          <wp:inline distT="0" distB="0" distL="0" distR="0">
+            <wp:extent cx="5143500" cy="3286125"/>
+            <wp:effectExtent t="0" r="0" b="0" l="0"/>
+            <wp:docPr id="9" name="Hình 9: Định kiểu danh sách bài viết và hiệu ứng hover mở trong Neovim" descr="Hình 9: Định kiểu danh sách bài viết và hiệu ứng hover mở trong Neovim" title="Hình 9: Định kiểu danh sách bài viết và hiệu ứng hover mở trong Neovim"/>
+            <wp:cNvGraphicFramePr>
+              <a:graphicFrameLocks xmlns:a="http://schemas.openxmlformats.org/drawingml/2006/main" noChangeAspect="1"/>
+            </wp:cNvGraphicFramePr>
+            <a:graphic xmlns:a="http://schemas.openxmlformats.org/drawingml/2006/main">
+              <a:graphicData uri="http://schemas.openxmlformats.org/drawingml/2006/picture">
+                <pic:pic xmlns:pic="http://schemas.openxmlformats.org/drawingml/2006/picture">
+                  <pic:nvPicPr>
+                    <pic:cNvPr id="0" name="" descr=""/>
+                    <pic:cNvPicPr>
+                      <a:picLocks noChangeAspect="1" noChangeArrowheads="1"/>
+                    </pic:cNvPicPr>
+                  </pic:nvPicPr>
+                  <pic:blipFill>
+                    <a:blip r:embed="rId16" cstate="none"/>
+                    <a:srcRect/>
+                    <a:stretch>
+                      <a:fillRect/>
+                    </a:stretch>
+                  </pic:blipFill>
+                  <pic:spPr bwMode="auto">
+                    <a:xfrm>
+                      <a:off x="0" y="0"/>
+                      <a:ext cx="5143500" cy="3286125"/>
+                    </a:xfrm>
+                    <a:prstGeom prst="rect">
+                      <a:avLst/>
+                    </a:prstGeom>
+                  </pic:spPr>
+                </pic:pic>
+              </a:graphicData>
+            </a:graphic>
+          </wp:inline>
+        </w:drawing>
+      </w:r>
+    </w:p>
+    <w:p>
+      <w:pPr>
+        <w:spacing w:after="140"/>
+        <w:jc w:val="center"/>
+      </w:pPr>
+      <w:r>
+        <w:rPr>
+          <w:rFonts w:ascii="Arial" w:cs="Arial" w:eastAsia="Arial" w:hAnsi="Arial"/>
+          <w:color w:val="64748B"/>
+          <w:sz w:val="18"/>
+          <w:szCs w:val="18"/>
+        </w:rPr>
+        <w:t xml:space="preserve">Hình 9: Định kiểu danh sách bài viết và hiệu ứng hover mở trong Neovim</w:t>
+      </w:r>
+    </w:p>
+    <w:p>
+      <w:pPr>
+        <w:pStyle w:val="Heading2"/>
+        <w:spacing w:after="80" w:before="180"/>
+      </w:pPr>
+      <w:r>
+        <w:rPr>
+          <w:rFonts w:ascii="Arial" w:cs="Arial" w:eastAsia="Arial" w:hAnsi="Arial"/>
+          <w:b/>
+          <w:bCs/>
+          <w:color w:val="1E293B"/>
+          <w:sz w:val="22"/>
+          <w:szCs w:val="22"/>
+        </w:rPr>
+        <w:t xml:space="preserve">3.4 Định kiểu Bảng dữ liệu &amp; Form liên hệ</w:t>
+      </w:r>
+    </w:p>
+    <w:p>
+      <w:pPr>
+        <w:spacing w:after="100" w:line="260"/>
+      </w:pPr>
+      <w:r>
+        <w:rPr>
+          <w:rFonts w:ascii="Arial" w:cs="Arial" w:eastAsia="Arial" w:hAnsi="Arial"/>
+          <w:b w:val="false"/>
+          <w:bCs w:val="false"/>
+          <w:color w:val="334155"/>
+          <w:sz w:val="21"/>
+          <w:szCs w:val="21"/>
+        </w:rPr>
+        <w:t xml:space="preserve">• Bảng dữ liệu được bọc trong container có overflow-x: auto để không bị tràn khi xem trên màn hình nhỏ. Hàng bảng có hiệu ứng đổi màu nền nhẹ khi rê chuột.
+• Ô nhập liệu input và textarea khi focus sẽ đổi màu viền sang --border-focus (#4b5563) để người dùng nhận biết vị trí đang gõ phím.
+• Áp dụng Media Query (@media (max-width: 860px) và @media (max-width: 600px)) để tự động chuyển bố cục lưới thành 1 cột trên màn hình điện thoại.</w:t>
+      </w:r>
+    </w:p>
+    <w:p>
+      <w:pPr>
+        <w:spacing w:after="50" w:before="120"/>
+        <w:jc w:val="center"/>
+      </w:pPr>
+      <w:r>
+        <w:drawing>
+          <wp:inline distT="0" distB="0" distL="0" distR="0">
+            <wp:extent cx="5143500" cy="3286125"/>
+            <wp:effectExtent t="0" r="0" b="0" l="0"/>
+            <wp:docPr id="10" name="Hình 10: Định kiểu bảng, form liên hệ và media queries mở trong Neovim" descr="Hình 10: Định kiểu bảng, form liên hệ và media queries mở trong Neovim" title="Hình 10: Định kiểu bảng, form liên hệ và media queries mở trong Neovim"/>
+            <wp:cNvGraphicFramePr>
+              <a:graphicFrameLocks xmlns:a="http://schemas.openxmlformats.org/drawingml/2006/main" noChangeAspect="1"/>
+            </wp:cNvGraphicFramePr>
+            <a:graphic xmlns:a="http://schemas.openxmlformats.org/drawingml/2006/main">
+              <a:graphicData uri="http://schemas.openxmlformats.org/drawingml/2006/picture">
+                <pic:pic xmlns:pic="http://schemas.openxmlformats.org/drawingml/2006/picture">
+                  <pic:nvPicPr>
+                    <pic:cNvPr id="0" name="" descr=""/>
+                    <pic:cNvPicPr>
+                      <a:picLocks noChangeAspect="1" noChangeArrowheads="1"/>
+                    </pic:cNvPicPr>
+                  </pic:nvPicPr>
+                  <pic:blipFill>
+                    <a:blip r:embed="rId17" cstate="none"/>
+                    <a:srcRect/>
+                    <a:stretch>
+                      <a:fillRect/>
+                    </a:stretch>
+                  </pic:blipFill>
+                  <pic:spPr bwMode="auto">
+                    <a:xfrm>
+                      <a:off x="0" y="0"/>
+                      <a:ext cx="5143500" cy="3286125"/>
+                    </a:xfrm>
+                    <a:prstGeom prst="rect">
+                      <a:avLst/>
+                    </a:prstGeom>
+                  </pic:spPr>
+                </pic:pic>
+              </a:graphicData>
+            </a:graphic>
+          </wp:inline>
+        </w:drawing>
+      </w:r>
+    </w:p>
+    <w:p>
+      <w:pPr>
+        <w:spacing w:after="140"/>
+        <w:jc w:val="center"/>
+      </w:pPr>
+      <w:r>
+        <w:rPr>
+          <w:rFonts w:ascii="Arial" w:cs="Arial" w:eastAsia="Arial" w:hAnsi="Arial"/>
+          <w:color w:val="64748B"/>
+          <w:sz w:val="18"/>
+          <w:szCs w:val="18"/>
+        </w:rPr>
         <w:t xml:space="preserve">Hình 10: Định kiểu bảng, form liên hệ và media queries mở trong Neovim</w:t>
       </w:r>
     </w:p>
@@ -1478,7 +1478,7 @@
                     </pic:cNvPicPr>
                   </pic:nvPicPr>
                   <pic:blipFill>
-                    <a:blip r:embed="rId15" cstate="none"/>
+                    <a:blip r:embed="rId18" cstate="none"/>
                     <a:srcRect/>
                     <a:stretch>
                       <a:fillRect/>

</xml_diff>

<commit_message>
feat: use Super+Shift+S snipping method with tight geometry and dynamic aspect ratio in docx
</commit_message>
<xml_diff>
--- a/Lab1_HuynhKhanhThien.docx
+++ b/Lab1_HuynhKhanhThien.docx
@@ -476,7 +476,7 @@
       <w:r>
         <w:drawing>
           <wp:inline distT="0" distB="0" distL="0" distR="0">
-            <wp:extent cx="5143500" cy="3286125"/>
+            <wp:extent cx="4667250" cy="2619375"/>
             <wp:effectExtent t="0" r="0" b="0" l="0"/>
             <wp:docPr id="1" name="Hình 1: Khởi tạo trang, metadata, favicon UIT và thẻ ngữ nghĩa &lt;nav&gt; mở trong Neovim" descr="Hình 1: Khởi tạo trang, metadata, favicon UIT và thẻ ngữ nghĩa &lt;nav&gt; mở trong Neovim" title="Hình 1: Khởi tạo trang, metadata, favicon UIT và thẻ ngữ nghĩa &lt;nav&gt; mở trong Neovim"/>
             <wp:cNvGraphicFramePr>
@@ -501,7 +501,7 @@
                   <pic:spPr bwMode="auto">
                     <a:xfrm>
                       <a:off x="0" y="0"/>
-                      <a:ext cx="5143500" cy="3286125"/>
+                      <a:ext cx="4667250" cy="2619375"/>
                     </a:xfrm>
                     <a:prstGeom prst="rect">
                       <a:avLst/>
@@ -572,7 +572,7 @@
       <w:r>
         <w:drawing>
           <wp:inline distT="0" distB="0" distL="0" distR="0">
-            <wp:extent cx="5143500" cy="3286125"/>
+            <wp:extent cx="4667250" cy="2619375"/>
             <wp:effectExtent t="0" r="0" b="0" l="0"/>
             <wp:docPr id="2" name="Hình 2: Cấu trúc &lt;header&gt; giới thiệu thông tin và liên hệ mở trong Neovim" descr="Hình 2: Cấu trúc &lt;header&gt; giới thiệu thông tin và liên hệ mở trong Neovim" title="Hình 2: Cấu trúc &lt;header&gt; giới thiệu thông tin và liên hệ mở trong Neovim"/>
             <wp:cNvGraphicFramePr>
@@ -597,7 +597,7 @@
                   <pic:spPr bwMode="auto">
                     <a:xfrm>
                       <a:off x="0" y="0"/>
-                      <a:ext cx="5143500" cy="3286125"/>
+                      <a:ext cx="4667250" cy="2619375"/>
                     </a:xfrm>
                     <a:prstGeom prst="rect">
                       <a:avLst/>
@@ -668,9 +668,423 @@
       <w:r>
         <w:drawing>
           <wp:inline distT="0" distB="0" distL="0" distR="0">
-            <wp:extent cx="5143500" cy="3286125"/>
+            <wp:extent cx="4667250" cy="2619375"/>
             <wp:effectExtent t="0" r="0" b="0" l="0"/>
             <wp:docPr id="3" name="Hình 3: Cấu trúc &lt;section&gt; và các thẻ &lt;article&gt; kinh nghiệm mở trong Neovim" descr="Hình 3: Cấu trúc &lt;section&gt; và các thẻ &lt;article&gt; kinh nghiệm mở trong Neovim" title="Hình 3: Cấu trúc &lt;section&gt; và các thẻ &lt;article&gt; kinh nghiệm mở trong Neovim"/>
+            <wp:cNvGraphicFramePr>
+              <a:graphicFrameLocks xmlns:a="http://schemas.openxmlformats.org/drawingml/2006/main" noChangeAspect="1"/>
+            </wp:cNvGraphicFramePr>
+            <a:graphic xmlns:a="http://schemas.openxmlformats.org/drawingml/2006/main">
+              <a:graphicData uri="http://schemas.openxmlformats.org/drawingml/2006/picture">
+                <pic:pic xmlns:pic="http://schemas.openxmlformats.org/drawingml/2006/picture">
+                  <pic:nvPicPr>
+                    <pic:cNvPr id="0" name="" descr=""/>
+                    <pic:cNvPicPr>
+                      <a:picLocks noChangeAspect="1" noChangeArrowheads="1"/>
+                    </pic:cNvPicPr>
+                  </pic:nvPicPr>
+                  <pic:blipFill>
+                    <a:blip r:embed="rId10" cstate="none"/>
+                    <a:srcRect/>
+                    <a:stretch>
+                      <a:fillRect/>
+                    </a:stretch>
+                  </pic:blipFill>
+                  <pic:spPr bwMode="auto">
+                    <a:xfrm>
+                      <a:off x="0" y="0"/>
+                      <a:ext cx="4667250" cy="2619375"/>
+                    </a:xfrm>
+                    <a:prstGeom prst="rect">
+                      <a:avLst/>
+                    </a:prstGeom>
+                  </pic:spPr>
+                </pic:pic>
+              </a:graphicData>
+            </a:graphic>
+          </wp:inline>
+        </w:drawing>
+      </w:r>
+    </w:p>
+    <w:p>
+      <w:pPr>
+        <w:spacing w:after="140"/>
+        <w:jc w:val="center"/>
+      </w:pPr>
+      <w:r>
+        <w:rPr>
+          <w:rFonts w:ascii="Arial" w:cs="Arial" w:eastAsia="Arial" w:hAnsi="Arial"/>
+          <w:color w:val="64748B"/>
+          <w:sz w:val="18"/>
+          <w:szCs w:val="18"/>
+        </w:rPr>
+        <w:t xml:space="preserve">Hình 3: Cấu trúc &lt;section&gt; và các thẻ &lt;article&gt; kinh nghiệm mở trong Neovim</w:t>
+      </w:r>
+    </w:p>
+    <w:p>
+      <w:pPr>
+        <w:pStyle w:val="Heading2"/>
+        <w:spacing w:after="80" w:before="180"/>
+      </w:pPr>
+      <w:r>
+        <w:rPr>
+          <w:rFonts w:ascii="Arial" w:cs="Arial" w:eastAsia="Arial" w:hAnsi="Arial"/>
+          <w:b/>
+          <w:bCs/>
+          <w:color w:val="1E293B"/>
+          <w:sz w:val="22"/>
+          <w:szCs w:val="22"/>
+        </w:rPr>
+        <w:t xml:space="preserve">2.4 Phần dự án tiêu biểu (&lt;section id="projects"&gt;)</w:t>
+      </w:r>
+    </w:p>
+    <w:p>
+      <w:pPr>
+        <w:spacing w:after="100" w:line="260"/>
+      </w:pPr>
+      <w:r>
+        <w:rPr>
+          <w:rFonts w:ascii="Arial" w:cs="Arial" w:eastAsia="Arial" w:hAnsi="Arial"/>
+          <w:b w:val="false"/>
+          <w:bCs w:val="false"/>
+          <w:color w:val="334155"/>
+          <w:sz w:val="21"/>
+          <w:szCs w:val="21"/>
+        </w:rPr>
+        <w:t xml:space="preserve">• Khu vực danh sách dự án bao gồm 4 dự án phần mềm chính: Streaming Anomaly Detector, Supply Chain Optimization Protocol, Deep Neural Network from Scratch, và Evolutionary Multi-Agent Simulator.
+• Mỗi dự án là một thẻ &lt;article class="project-item"&gt; chứa tiêu đề có liên kết &lt;a&gt;, nhãn công nghệ sử dụng và đoạn mô tả ngắn gọn.</w:t>
+      </w:r>
+    </w:p>
+    <w:p>
+      <w:pPr>
+        <w:spacing w:after="50" w:before="120"/>
+        <w:jc w:val="center"/>
+      </w:pPr>
+      <w:r>
+        <w:drawing>
+          <wp:inline distT="0" distB="0" distL="0" distR="0">
+            <wp:extent cx="4667250" cy="2619375"/>
+            <wp:effectExtent t="0" r="0" b="0" l="0"/>
+            <wp:docPr id="4" name="Hình 4: Danh sách thẻ dự án phần mềm tiêu biểu mở trong Neovim" descr="Hình 4: Danh sách thẻ dự án phần mềm tiêu biểu mở trong Neovim" title="Hình 4: Danh sách thẻ dự án phần mềm tiêu biểu mở trong Neovim"/>
+            <wp:cNvGraphicFramePr>
+              <a:graphicFrameLocks xmlns:a="http://schemas.openxmlformats.org/drawingml/2006/main" noChangeAspect="1"/>
+            </wp:cNvGraphicFramePr>
+            <a:graphic xmlns:a="http://schemas.openxmlformats.org/drawingml/2006/main">
+              <a:graphicData uri="http://schemas.openxmlformats.org/drawingml/2006/picture">
+                <pic:pic xmlns:pic="http://schemas.openxmlformats.org/drawingml/2006/picture">
+                  <pic:nvPicPr>
+                    <pic:cNvPr id="0" name="" descr=""/>
+                    <pic:cNvPicPr>
+                      <a:picLocks noChangeAspect="1" noChangeArrowheads="1"/>
+                    </pic:cNvPicPr>
+                  </pic:nvPicPr>
+                  <pic:blipFill>
+                    <a:blip r:embed="rId10" cstate="none"/>
+                    <a:srcRect/>
+                    <a:stretch>
+                      <a:fillRect/>
+                    </a:stretch>
+                  </pic:blipFill>
+                  <pic:spPr bwMode="auto">
+                    <a:xfrm>
+                      <a:off x="0" y="0"/>
+                      <a:ext cx="4667250" cy="2619375"/>
+                    </a:xfrm>
+                    <a:prstGeom prst="rect">
+                      <a:avLst/>
+                    </a:prstGeom>
+                  </pic:spPr>
+                </pic:pic>
+              </a:graphicData>
+            </a:graphic>
+          </wp:inline>
+        </w:drawing>
+      </w:r>
+    </w:p>
+    <w:p>
+      <w:pPr>
+        <w:spacing w:after="140"/>
+        <w:jc w:val="center"/>
+      </w:pPr>
+      <w:r>
+        <w:rPr>
+          <w:rFonts w:ascii="Arial" w:cs="Arial" w:eastAsia="Arial" w:hAnsi="Arial"/>
+          <w:color w:val="64748B"/>
+          <w:sz w:val="18"/>
+          <w:szCs w:val="18"/>
+        </w:rPr>
+        <w:t xml:space="preserve">Hình 4: Danh sách thẻ dự án phần mềm tiêu biểu mở trong Neovim</w:t>
+      </w:r>
+    </w:p>
+    <w:p>
+      <w:pPr>
+        <w:pStyle w:val="Heading2"/>
+        <w:spacing w:after="80" w:before="180"/>
+      </w:pPr>
+      <w:r>
+        <w:rPr>
+          <w:rFonts w:ascii="Arial" w:cs="Arial" w:eastAsia="Arial" w:hAnsi="Arial"/>
+          <w:b/>
+          <w:bCs/>
+          <w:color w:val="1E293B"/>
+          <w:sz w:val="22"/>
+          <w:szCs w:val="22"/>
+        </w:rPr>
+        <w:t xml:space="preserve">2.5 Bảng kỹ năng kỹ thuật (&lt;table&gt;)</w:t>
+      </w:r>
+    </w:p>
+    <w:p>
+      <w:pPr>
+        <w:spacing w:after="100" w:line="260"/>
+      </w:pPr>
+      <w:r>
+        <w:rPr>
+          <w:rFonts w:ascii="Arial" w:cs="Arial" w:eastAsia="Arial" w:hAnsi="Arial"/>
+          <w:b w:val="false"/>
+          <w:bCs w:val="false"/>
+          <w:color w:val="334155"/>
+          <w:sz w:val="21"/>
+          <w:szCs w:val="21"/>
+        </w:rPr>
+        <w:t xml:space="preserve">• Để đáp ứng yêu cầu sử dụng phần tử bảng (table) trong đề bài Lab 1, em tạo bảng tổng hợp kỹ năng kỹ thuật gồm 4 nhóm: Smart Contracts, Systems &amp; Languages, AI/ML &amp; Automation, và Infrastructure &amp; DevOps.
+• Cấu trúc bảng gồm thẻ &lt;table&gt;, phần đầu bảng &lt;thead&gt; chứa các ô tiêu đề &lt;th scope="col"&gt;, và phần thân &lt;tbody&gt; chứa các hàng &lt;tr&gt; cùng dữ liệu &lt;td&gt;.</w:t>
+      </w:r>
+    </w:p>
+    <w:p>
+      <w:pPr>
+        <w:spacing w:after="50" w:before="120"/>
+        <w:jc w:val="center"/>
+      </w:pPr>
+      <w:r>
+        <w:drawing>
+          <wp:inline distT="0" distB="0" distL="0" distR="0">
+            <wp:extent cx="4667250" cy="2619375"/>
+            <wp:effectExtent t="0" r="0" b="0" l="0"/>
+            <wp:docPr id="5" name="Hình 5: Bảng kỹ năng kỹ thuật với cấu trúc &lt;table&gt; chuẩn mở trong Neovim" descr="Hình 5: Bảng kỹ năng kỹ thuật với cấu trúc &lt;table&gt; chuẩn mở trong Neovim" title="Hình 5: Bảng kỹ năng kỹ thuật với cấu trúc &lt;table&gt; chuẩn mở trong Neovim"/>
+            <wp:cNvGraphicFramePr>
+              <a:graphicFrameLocks xmlns:a="http://schemas.openxmlformats.org/drawingml/2006/main" noChangeAspect="1"/>
+            </wp:cNvGraphicFramePr>
+            <a:graphic xmlns:a="http://schemas.openxmlformats.org/drawingml/2006/main">
+              <a:graphicData uri="http://schemas.openxmlformats.org/drawingml/2006/picture">
+                <pic:pic xmlns:pic="http://schemas.openxmlformats.org/drawingml/2006/picture">
+                  <pic:nvPicPr>
+                    <pic:cNvPr id="0" name="" descr=""/>
+                    <pic:cNvPicPr>
+                      <a:picLocks noChangeAspect="1" noChangeArrowheads="1"/>
+                    </pic:cNvPicPr>
+                  </pic:nvPicPr>
+                  <pic:blipFill>
+                    <a:blip r:embed="rId10" cstate="none"/>
+                    <a:srcRect/>
+                    <a:stretch>
+                      <a:fillRect/>
+                    </a:stretch>
+                  </pic:blipFill>
+                  <pic:spPr bwMode="auto">
+                    <a:xfrm>
+                      <a:off x="0" y="0"/>
+                      <a:ext cx="4667250" cy="2619375"/>
+                    </a:xfrm>
+                    <a:prstGeom prst="rect">
+                      <a:avLst/>
+                    </a:prstGeom>
+                  </pic:spPr>
+                </pic:pic>
+              </a:graphicData>
+            </a:graphic>
+          </wp:inline>
+        </w:drawing>
+      </w:r>
+    </w:p>
+    <w:p>
+      <w:pPr>
+        <w:spacing w:after="140"/>
+        <w:jc w:val="center"/>
+      </w:pPr>
+      <w:r>
+        <w:rPr>
+          <w:rFonts w:ascii="Arial" w:cs="Arial" w:eastAsia="Arial" w:hAnsi="Arial"/>
+          <w:color w:val="64748B"/>
+          <w:sz w:val="18"/>
+          <w:szCs w:val="18"/>
+        </w:rPr>
+        <w:t xml:space="preserve">Hình 5: Bảng kỹ năng kỹ thuật với cấu trúc &lt;table&gt; chuẩn mở trong Neovim</w:t>
+      </w:r>
+    </w:p>
+    <w:p>
+      <w:pPr>
+        <w:pStyle w:val="Heading2"/>
+        <w:spacing w:after="80" w:before="180"/>
+      </w:pPr>
+      <w:r>
+        <w:rPr>
+          <w:rFonts w:ascii="Arial" w:cs="Arial" w:eastAsia="Arial" w:hAnsi="Arial"/>
+          <w:b/>
+          <w:bCs/>
+          <w:color w:val="1E293B"/>
+          <w:sz w:val="22"/>
+          <w:szCs w:val="22"/>
+        </w:rPr>
+        <w:t xml:space="preserve">2.6 Biểu mẫu liên hệ &amp; Thanh bên Aside (&lt;form&gt;, &lt;aside&gt;, &lt;footer&gt;)</w:t>
+      </w:r>
+    </w:p>
+    <w:p>
+      <w:pPr>
+        <w:spacing w:after="100" w:line="260"/>
+      </w:pPr>
+      <w:r>
+        <w:rPr>
+          <w:rFonts w:ascii="Arial" w:cs="Arial" w:eastAsia="Arial" w:hAnsi="Arial"/>
+          <w:b w:val="false"/>
+          <w:bCs w:val="false"/>
+          <w:color w:val="334155"/>
+          <w:sz w:val="21"/>
+          <w:szCs w:val="21"/>
+        </w:rPr>
+        <w:t xml:space="preserve">• Thẻ &lt;form&gt;: Đáp ứng yêu cầu Form &amp; Input trong Lab 1 với các trường họ tên (&lt;input type="text"&gt;), email (&lt;input type="email"&gt;), ô nhập nội dung (&lt;textarea&gt;) và nút gửi (&lt;button type="submit"&gt;). Mỗi ô nhập đều có &lt;label&gt; gắn liền qua thuộc tính for/id.
+• Thẻ &lt;aside&gt;: Thanh bên chứa thông tin học vấn (Đại học Công nghệ Thông tin &amp; Birmingham City University), giải thưởng cuộc thi bằng danh sách có thứ tự &lt;ol&gt;, và thông số kỹ thuật nhanh bằng danh sách định nghĩa &lt;dl&gt;, &lt;dt&gt;, &lt;dd&gt;.
+• Thẻ &lt;footer&gt;: Chân trang thể hiện bản quyền cá nhân và đường link quay về đầu trang.</w:t>
+      </w:r>
+    </w:p>
+    <w:p>
+      <w:pPr>
+        <w:spacing w:after="50" w:before="120"/>
+        <w:jc w:val="center"/>
+      </w:pPr>
+      <w:r>
+        <w:drawing>
+          <wp:inline distT="0" distB="0" distL="0" distR="0">
+            <wp:extent cx="4667250" cy="2619375"/>
+            <wp:effectExtent t="0" r="0" b="0" l="0"/>
+            <wp:docPr id="6" name="Hình 6: Biểu mẫu &lt;form&gt;, thanh bên &lt;aside&gt; và chân trang &lt;footer&gt; mở trong Neovim" descr="Hình 6: Biểu mẫu &lt;form&gt;, thanh bên &lt;aside&gt; và chân trang &lt;footer&gt; mở trong Neovim" title="Hình 6: Biểu mẫu &lt;form&gt;, thanh bên &lt;aside&gt; và chân trang &lt;footer&gt; mở trong Neovim"/>
+            <wp:cNvGraphicFramePr>
+              <a:graphicFrameLocks xmlns:a="http://schemas.openxmlformats.org/drawingml/2006/main" noChangeAspect="1"/>
+            </wp:cNvGraphicFramePr>
+            <a:graphic xmlns:a="http://schemas.openxmlformats.org/drawingml/2006/main">
+              <a:graphicData uri="http://schemas.openxmlformats.org/drawingml/2006/picture">
+                <pic:pic xmlns:pic="http://schemas.openxmlformats.org/drawingml/2006/picture">
+                  <pic:nvPicPr>
+                    <pic:cNvPr id="0" name="" descr=""/>
+                    <pic:cNvPicPr>
+                      <a:picLocks noChangeAspect="1" noChangeArrowheads="1"/>
+                    </pic:cNvPicPr>
+                  </pic:nvPicPr>
+                  <pic:blipFill>
+                    <a:blip r:embed="rId10" cstate="none"/>
+                    <a:srcRect/>
+                    <a:stretch>
+                      <a:fillRect/>
+                    </a:stretch>
+                  </pic:blipFill>
+                  <pic:spPr bwMode="auto">
+                    <a:xfrm>
+                      <a:off x="0" y="0"/>
+                      <a:ext cx="4667250" cy="2619375"/>
+                    </a:xfrm>
+                    <a:prstGeom prst="rect">
+                      <a:avLst/>
+                    </a:prstGeom>
+                  </pic:spPr>
+                </pic:pic>
+              </a:graphicData>
+            </a:graphic>
+          </wp:inline>
+        </w:drawing>
+      </w:r>
+    </w:p>
+    <w:p>
+      <w:pPr>
+        <w:spacing w:after="140"/>
+        <w:jc w:val="center"/>
+      </w:pPr>
+      <w:r>
+        <w:rPr>
+          <w:rFonts w:ascii="Arial" w:cs="Arial" w:eastAsia="Arial" w:hAnsi="Arial"/>
+          <w:color w:val="64748B"/>
+          <w:sz w:val="18"/>
+          <w:szCs w:val="18"/>
+        </w:rPr>
+        <w:t xml:space="preserve">Hình 6: Biểu mẫu &lt;form&gt;, thanh bên &lt;aside&gt; và chân trang &lt;footer&gt; mở trong Neovim</w:t>
+      </w:r>
+    </w:p>
+    <w:p>
+      <w:pPr>
+        <w:pStyle w:val="Heading1"/>
+        <w:spacing w:after="120" w:before="240"/>
+      </w:pPr>
+      <w:r>
+        <w:rPr>
+          <w:rFonts w:ascii="Arial" w:cs="Arial" w:eastAsia="Arial" w:hAnsi="Arial"/>
+          <w:b/>
+          <w:bCs/>
+          <w:color w:val="0F172A"/>
+          <w:sz w:val="26"/>
+          <w:szCs w:val="26"/>
+        </w:rPr>
+        <w:t xml:space="preserve">3. Phân Tích Mã Nguồn CSS (style.css)</w:t>
+      </w:r>
+    </w:p>
+    <w:p>
+      <w:pPr>
+        <w:spacing w:after="100" w:line="260"/>
+      </w:pPr>
+      <w:r>
+        <w:rPr>
+          <w:rFonts w:ascii="Arial" w:cs="Arial" w:eastAsia="Arial" w:hAnsi="Arial"/>
+          <w:b w:val="false"/>
+          <w:bCs w:val="false"/>
+          <w:color w:val="334155"/>
+          <w:sz w:val="21"/>
+          <w:szCs w:val="21"/>
+        </w:rPr>
+        <w:t xml:space="preserve">File CSS được tách riêng và liên kết với HTML theo đúng khuyến nghị của đề bài (External CSS). Phong cách thiết kế ưu tiên sự gọn gàng, tính phân cấp rõ ràng và hỗ trợ tốt trên màn hình di động.</w:t>
+      </w:r>
+    </w:p>
+    <w:p>
+      <w:pPr>
+        <w:pStyle w:val="Heading2"/>
+        <w:spacing w:after="80" w:before="180"/>
+      </w:pPr>
+      <w:r>
+        <w:rPr>
+          <w:rFonts w:ascii="Arial" w:cs="Arial" w:eastAsia="Arial" w:hAnsi="Arial"/>
+          <w:b/>
+          <w:bCs/>
+          <w:color w:val="1E293B"/>
+          <w:sz w:val="22"/>
+          <w:szCs w:val="22"/>
+        </w:rPr>
+        <w:t xml:space="preserve">3.1 Biến CSS, Reset &amp; Box Model</w:t>
+      </w:r>
+    </w:p>
+    <w:p>
+      <w:pPr>
+        <w:spacing w:after="100" w:line="260"/>
+      </w:pPr>
+      <w:r>
+        <w:rPr>
+          <w:rFonts w:ascii="Arial" w:cs="Arial" w:eastAsia="Arial" w:hAnsi="Arial"/>
+          <w:b w:val="false"/>
+          <w:bCs w:val="false"/>
+          <w:color w:val="334155"/>
+          <w:sz w:val="21"/>
+          <w:szCs w:val="21"/>
+        </w:rPr>
+        <w:t xml:space="preserve">• Khối :root khai báo các biến CSS (CSS Variables) để quản lý tập trung mã màu nền (--bg: #0f1013), màu bề mặt (--surface: #15171c), màu viền (--border: #22252c) và màu chữ (--text: #e1e4ea).
+• Quy tắc * { box-sizing: border-box; } giúp tính toán kích thước phần tử chính xác gồm cả padding và border, tránh lỗi vỡ bố cục khi thêm khoảng đệm.</w:t>
+      </w:r>
+    </w:p>
+    <w:p>
+      <w:pPr>
+        <w:spacing w:after="50" w:before="120"/>
+        <w:jc w:val="center"/>
+      </w:pPr>
+      <w:r>
+        <w:drawing>
+          <wp:inline distT="0" distB="0" distL="0" distR="0">
+            <wp:extent cx="4667250" cy="2619375"/>
+            <wp:effectExtent t="0" r="0" b="0" l="0"/>
+            <wp:docPr id="7" name="Hình 7: Khai báo biến CSS :root và thiết lập Box Model mở trong Neovim" descr="Hình 7: Khai báo biến CSS :root và thiết lập Box Model mở trong Neovim" title="Hình 7: Khai báo biến CSS :root và thiết lập Box Model mở trong Neovim"/>
             <wp:cNvGraphicFramePr>
               <a:graphicFrameLocks xmlns:a="http://schemas.openxmlformats.org/drawingml/2006/main" noChangeAspect="1"/>
             </wp:cNvGraphicFramePr>
@@ -693,7 +1107,7 @@
                   <pic:spPr bwMode="auto">
                     <a:xfrm>
                       <a:off x="0" y="0"/>
-                      <a:ext cx="5143500" cy="3286125"/>
+                      <a:ext cx="4667250" cy="2619375"/>
                     </a:xfrm>
                     <a:prstGeom prst="rect">
                       <a:avLst/>
@@ -718,7 +1132,7 @@
           <w:sz w:val="18"/>
           <w:szCs w:val="18"/>
         </w:rPr>
-        <w:t xml:space="preserve">Hình 3: Cấu trúc &lt;section&gt; và các thẻ &lt;article&gt; kinh nghiệm mở trong Neovim</w:t>
+        <w:t xml:space="preserve">Hình 7: Khai báo biến CSS :root và thiết lập Box Model mở trong Neovim</w:t>
       </w:r>
     </w:p>
     <w:p>
@@ -735,7 +1149,7 @@
           <w:sz w:val="22"/>
           <w:szCs w:val="22"/>
         </w:rPr>
-        <w:t xml:space="preserve">2.4 Phần dự án tiêu biểu (&lt;section id="projects"&gt;)</w:t>
+        <w:t xml:space="preserve">3.2 Định kiểu Navigation &amp; Header</w:t>
       </w:r>
     </w:p>
     <w:p>
@@ -751,8 +1165,8 @@
           <w:sz w:val="21"/>
           <w:szCs w:val="21"/>
         </w:rPr>
-        <w:t xml:space="preserve">• Khu vực danh sách dự án bao gồm 4 dự án phần mềm chính: Streaming Anomaly Detector, Supply Chain Optimization Protocol, Deep Neural Network from Scratch, và Evolutionary Multi-Agent Simulator.
-• Mỗi dự án là một thẻ &lt;article class="project-item"&gt; chứa tiêu đề có liên kết &lt;a&gt;, nhãn công nghệ sử dụng và đoạn mô tả ngắn gọn.</w:t>
+        <w:t xml:space="preserve">• Thanh .navbar sử dụng position: sticky và backdrop-filter: blur(8px) giúp thanh menu cố định phía trên khi cuộn trang.
+• Bố cục header dùng Flexbox chia hai phần: khối văn bản thông tin bên trái và ảnh đại diện bo tròn bên phải.</w:t>
       </w:r>
     </w:p>
     <w:p>
@@ -763,9 +1177,294 @@
       <w:r>
         <w:drawing>
           <wp:inline distT="0" distB="0" distL="0" distR="0">
-            <wp:extent cx="5143500" cy="3286125"/>
+            <wp:extent cx="4667250" cy="2619375"/>
             <wp:effectExtent t="0" r="0" b="0" l="0"/>
-            <wp:docPr id="4" name="Hình 4: Danh sách thẻ dự án phần mềm tiêu biểu mở trong Neovim" descr="Hình 4: Danh sách thẻ dự án phần mềm tiêu biểu mở trong Neovim" title="Hình 4: Danh sách thẻ dự án phần mềm tiêu biểu mở trong Neovim"/>
+            <wp:docPr id="8" name="Hình 8: Định kiểu thanh điều hướng và header mở trong Neovim" descr="Hình 8: Định kiểu thanh điều hướng và header mở trong Neovim" title="Hình 8: Định kiểu thanh điều hướng và header mở trong Neovim"/>
+            <wp:cNvGraphicFramePr>
+              <a:graphicFrameLocks xmlns:a="http://schemas.openxmlformats.org/drawingml/2006/main" noChangeAspect="1"/>
+            </wp:cNvGraphicFramePr>
+            <a:graphic xmlns:a="http://schemas.openxmlformats.org/drawingml/2006/main">
+              <a:graphicData uri="http://schemas.openxmlformats.org/drawingml/2006/picture">
+                <pic:pic xmlns:pic="http://schemas.openxmlformats.org/drawingml/2006/picture">
+                  <pic:nvPicPr>
+                    <pic:cNvPr id="0" name="" descr=""/>
+                    <pic:cNvPicPr>
+                      <a:picLocks noChangeAspect="1" noChangeArrowheads="1"/>
+                    </pic:cNvPicPr>
+                  </pic:nvPicPr>
+                  <pic:blipFill>
+                    <a:blip r:embed="rId11" cstate="none"/>
+                    <a:srcRect/>
+                    <a:stretch>
+                      <a:fillRect/>
+                    </a:stretch>
+                  </pic:blipFill>
+                  <pic:spPr bwMode="auto">
+                    <a:xfrm>
+                      <a:off x="0" y="0"/>
+                      <a:ext cx="4667250" cy="2619375"/>
+                    </a:xfrm>
+                    <a:prstGeom prst="rect">
+                      <a:avLst/>
+                    </a:prstGeom>
+                  </pic:spPr>
+                </pic:pic>
+              </a:graphicData>
+            </a:graphic>
+          </wp:inline>
+        </w:drawing>
+      </w:r>
+    </w:p>
+    <w:p>
+      <w:pPr>
+        <w:spacing w:after="140"/>
+        <w:jc w:val="center"/>
+      </w:pPr>
+      <w:r>
+        <w:rPr>
+          <w:rFonts w:ascii="Arial" w:cs="Arial" w:eastAsia="Arial" w:hAnsi="Arial"/>
+          <w:color w:val="64748B"/>
+          <w:sz w:val="18"/>
+          <w:szCs w:val="18"/>
+        </w:rPr>
+        <w:t xml:space="preserve">Hình 8: Định kiểu thanh điều hướng và header mở trong Neovim</w:t>
+      </w:r>
+    </w:p>
+    <w:p>
+      <w:pPr>
+        <w:pStyle w:val="Heading2"/>
+        <w:spacing w:after="80" w:before="180"/>
+      </w:pPr>
+      <w:r>
+        <w:rPr>
+          <w:rFonts w:ascii="Arial" w:cs="Arial" w:eastAsia="Arial" w:hAnsi="Arial"/>
+          <w:b/>
+          <w:bCs/>
+          <w:color w:val="1E293B"/>
+          <w:sz w:val="22"/>
+          <w:szCs w:val="22"/>
+        </w:rPr>
+        <w:t xml:space="preserve">3.3 Bố cục nội dung chính, Card &amp; Hiệu ứng Hover (Exercise 4)</w:t>
+      </w:r>
+    </w:p>
+    <w:p>
+      <w:pPr>
+        <w:spacing w:after="100" w:line="260"/>
+      </w:pPr>
+      <w:r>
+        <w:rPr>
+          <w:rFonts w:ascii="Arial" w:cs="Arial" w:eastAsia="Arial" w:hAnsi="Arial"/>
+          <w:b w:val="false"/>
+          <w:bCs w:val="false"/>
+          <w:color w:val="334155"/>
+          <w:sz w:val="21"/>
+          <w:szCs w:val="21"/>
+        </w:rPr>
+        <w:t xml:space="preserve">• Bố cục trang chia thành 2 cột bằng CSS Grid (.layout-container { display: grid; grid-template-columns: 1fr 310px; gap: 48px; }).
+• Thực hiện yêu cầu Exercise 4 trong đề bài: Thẻ dự án .project-item và nút bấm đều được gắn transition: border-color 0.2s ease, transform 0.2s ease. Khi rê chuột qua (:hover), phần tử nhấc lên nhẹ nhàng bằng transform: translateY(-2px) và viền sáng hơn, tạo phản hồi xúc giác tự nhiên.</w:t>
+      </w:r>
+    </w:p>
+    <w:p>
+      <w:pPr>
+        <w:spacing w:after="50" w:before="120"/>
+        <w:jc w:val="center"/>
+      </w:pPr>
+      <w:r>
+        <w:drawing>
+          <wp:inline distT="0" distB="0" distL="0" distR="0">
+            <wp:extent cx="4667250" cy="2619375"/>
+            <wp:effectExtent t="0" r="0" b="0" l="0"/>
+            <wp:docPr id="9" name="Hình 9: Định kiểu danh sách bài viết và hiệu ứng hover mở trong Neovim" descr="Hình 9: Định kiểu danh sách bài viết và hiệu ứng hover mở trong Neovim" title="Hình 9: Định kiểu danh sách bài viết và hiệu ứng hover mở trong Neovim"/>
+            <wp:cNvGraphicFramePr>
+              <a:graphicFrameLocks xmlns:a="http://schemas.openxmlformats.org/drawingml/2006/main" noChangeAspect="1"/>
+            </wp:cNvGraphicFramePr>
+            <a:graphic xmlns:a="http://schemas.openxmlformats.org/drawingml/2006/main">
+              <a:graphicData uri="http://schemas.openxmlformats.org/drawingml/2006/picture">
+                <pic:pic xmlns:pic="http://schemas.openxmlformats.org/drawingml/2006/picture">
+                  <pic:nvPicPr>
+                    <pic:cNvPr id="0" name="" descr=""/>
+                    <pic:cNvPicPr>
+                      <a:picLocks noChangeAspect="1" noChangeArrowheads="1"/>
+                    </pic:cNvPicPr>
+                  </pic:nvPicPr>
+                  <pic:blipFill>
+                    <a:blip r:embed="rId11" cstate="none"/>
+                    <a:srcRect/>
+                    <a:stretch>
+                      <a:fillRect/>
+                    </a:stretch>
+                  </pic:blipFill>
+                  <pic:spPr bwMode="auto">
+                    <a:xfrm>
+                      <a:off x="0" y="0"/>
+                      <a:ext cx="4667250" cy="2619375"/>
+                    </a:xfrm>
+                    <a:prstGeom prst="rect">
+                      <a:avLst/>
+                    </a:prstGeom>
+                  </pic:spPr>
+                </pic:pic>
+              </a:graphicData>
+            </a:graphic>
+          </wp:inline>
+        </w:drawing>
+      </w:r>
+    </w:p>
+    <w:p>
+      <w:pPr>
+        <w:spacing w:after="140"/>
+        <w:jc w:val="center"/>
+      </w:pPr>
+      <w:r>
+        <w:rPr>
+          <w:rFonts w:ascii="Arial" w:cs="Arial" w:eastAsia="Arial" w:hAnsi="Arial"/>
+          <w:color w:val="64748B"/>
+          <w:sz w:val="18"/>
+          <w:szCs w:val="18"/>
+        </w:rPr>
+        <w:t xml:space="preserve">Hình 9: Định kiểu danh sách bài viết và hiệu ứng hover mở trong Neovim</w:t>
+      </w:r>
+    </w:p>
+    <w:p>
+      <w:pPr>
+        <w:pStyle w:val="Heading2"/>
+        <w:spacing w:after="80" w:before="180"/>
+      </w:pPr>
+      <w:r>
+        <w:rPr>
+          <w:rFonts w:ascii="Arial" w:cs="Arial" w:eastAsia="Arial" w:hAnsi="Arial"/>
+          <w:b/>
+          <w:bCs/>
+          <w:color w:val="1E293B"/>
+          <w:sz w:val="22"/>
+          <w:szCs w:val="22"/>
+        </w:rPr>
+        <w:t xml:space="preserve">3.4 Định kiểu Bảng dữ liệu &amp; Form liên hệ</w:t>
+      </w:r>
+    </w:p>
+    <w:p>
+      <w:pPr>
+        <w:spacing w:after="100" w:line="260"/>
+      </w:pPr>
+      <w:r>
+        <w:rPr>
+          <w:rFonts w:ascii="Arial" w:cs="Arial" w:eastAsia="Arial" w:hAnsi="Arial"/>
+          <w:b w:val="false"/>
+          <w:bCs w:val="false"/>
+          <w:color w:val="334155"/>
+          <w:sz w:val="21"/>
+          <w:szCs w:val="21"/>
+        </w:rPr>
+        <w:t xml:space="preserve">• Bảng dữ liệu được bọc trong container có overflow-x: auto để không bị tràn khi xem trên màn hình nhỏ. Hàng bảng có hiệu ứng đổi màu nền nhẹ khi rê chuột.
+• Ô nhập liệu input và textarea khi focus sẽ đổi màu viền sang --border-focus (#4b5563) để người dùng nhận biết vị trí đang gõ phím.
+• Áp dụng Media Query (@media (max-width: 860px) và @media (max-width: 600px)) để tự động chuyển bố cục lưới thành 1 cột trên màn hình điện thoại.</w:t>
+      </w:r>
+    </w:p>
+    <w:p>
+      <w:pPr>
+        <w:spacing w:after="50" w:before="120"/>
+        <w:jc w:val="center"/>
+      </w:pPr>
+      <w:r>
+        <w:drawing>
+          <wp:inline distT="0" distB="0" distL="0" distR="0">
+            <wp:extent cx="4667250" cy="2619375"/>
+            <wp:effectExtent t="0" r="0" b="0" l="0"/>
+            <wp:docPr id="10" name="Hình 10: Định kiểu bảng, form liên hệ và media queries mở trong Neovim" descr="Hình 10: Định kiểu bảng, form liên hệ và media queries mở trong Neovim" title="Hình 10: Định kiểu bảng, form liên hệ và media queries mở trong Neovim"/>
+            <wp:cNvGraphicFramePr>
+              <a:graphicFrameLocks xmlns:a="http://schemas.openxmlformats.org/drawingml/2006/main" noChangeAspect="1"/>
+            </wp:cNvGraphicFramePr>
+            <a:graphic xmlns:a="http://schemas.openxmlformats.org/drawingml/2006/main">
+              <a:graphicData uri="http://schemas.openxmlformats.org/drawingml/2006/picture">
+                <pic:pic xmlns:pic="http://schemas.openxmlformats.org/drawingml/2006/picture">
+                  <pic:nvPicPr>
+                    <pic:cNvPr id="0" name="" descr=""/>
+                    <pic:cNvPicPr>
+                      <a:picLocks noChangeAspect="1" noChangeArrowheads="1"/>
+                    </pic:cNvPicPr>
+                  </pic:nvPicPr>
+                  <pic:blipFill>
+                    <a:blip r:embed="rId11" cstate="none"/>
+                    <a:srcRect/>
+                    <a:stretch>
+                      <a:fillRect/>
+                    </a:stretch>
+                  </pic:blipFill>
+                  <pic:spPr bwMode="auto">
+                    <a:xfrm>
+                      <a:off x="0" y="0"/>
+                      <a:ext cx="4667250" cy="2619375"/>
+                    </a:xfrm>
+                    <a:prstGeom prst="rect">
+                      <a:avLst/>
+                    </a:prstGeom>
+                  </pic:spPr>
+                </pic:pic>
+              </a:graphicData>
+            </a:graphic>
+          </wp:inline>
+        </w:drawing>
+      </w:r>
+    </w:p>
+    <w:p>
+      <w:pPr>
+        <w:spacing w:after="140"/>
+        <w:jc w:val="center"/>
+      </w:pPr>
+      <w:r>
+        <w:rPr>
+          <w:rFonts w:ascii="Arial" w:cs="Arial" w:eastAsia="Arial" w:hAnsi="Arial"/>
+          <w:color w:val="64748B"/>
+          <w:sz w:val="18"/>
+          <w:szCs w:val="18"/>
+        </w:rPr>
+        <w:t xml:space="preserve">Hình 10: Định kiểu bảng, form liên hệ và media queries mở trong Neovim</w:t>
+      </w:r>
+    </w:p>
+    <w:p>
+      <w:pPr>
+        <w:pStyle w:val="Heading1"/>
+        <w:spacing w:after="120" w:before="240"/>
+      </w:pPr>
+      <w:r>
+        <w:rPr>
+          <w:rFonts w:ascii="Arial" w:cs="Arial" w:eastAsia="Arial" w:hAnsi="Arial"/>
+          <w:b/>
+          <w:bCs/>
+          <w:color w:val="0F172A"/>
+          <w:sz w:val="26"/>
+          <w:szCs w:val="26"/>
+        </w:rPr>
+        <w:t xml:space="preserve">4. Kết Quả Giao Diện Hiển Thị Trực Quan</w:t>
+      </w:r>
+    </w:p>
+    <w:p>
+      <w:pPr>
+        <w:spacing w:after="100" w:line="260"/>
+      </w:pPr>
+      <w:r>
+        <w:rPr>
+          <w:rFonts w:ascii="Arial" w:cs="Arial" w:eastAsia="Arial" w:hAnsi="Arial"/>
+          <w:b w:val="false"/>
+          <w:bCs w:val="false"/>
+          <w:color w:val="334155"/>
+          <w:sz w:val="21"/>
+          <w:szCs w:val="21"/>
+        </w:rPr>
+        <w:t xml:space="preserve">Dưới đây là hình ảnh chụp giao diện trang web CV cá nhân sau khi hoàn thiện toàn bộ mã nguồn HTML5 và CSS:</w:t>
+      </w:r>
+    </w:p>
+    <w:p>
+      <w:pPr>
+        <w:spacing w:after="50" w:before="120"/>
+        <w:jc w:val="center"/>
+      </w:pPr>
+      <w:r>
+        <w:drawing>
+          <wp:inline distT="0" distB="0" distL="0" distR="0">
+            <wp:extent cx="4667250" cy="6419850"/>
+            <wp:effectExtent t="0" r="0" b="0" l="0"/>
+            <wp:docPr id="11" name="Hình 11: Giao diện hoàn chỉnh trang web CV Huynh Khanh Thien trên trình duyệt" descr="Hình 11: Giao diện hoàn chỉnh trang web CV Huynh Khanh Thien trên trình duyệt" title="Hình 11: Giao diện hoàn chỉnh trang web CV Huynh Khanh Thien trên trình duyệt"/>
             <wp:cNvGraphicFramePr>
               <a:graphicFrameLocks xmlns:a="http://schemas.openxmlformats.org/drawingml/2006/main" noChangeAspect="1"/>
             </wp:cNvGraphicFramePr>
@@ -788,706 +1487,7 @@
                   <pic:spPr bwMode="auto">
                     <a:xfrm>
                       <a:off x="0" y="0"/>
-                      <a:ext cx="5143500" cy="3286125"/>
-                    </a:xfrm>
-                    <a:prstGeom prst="rect">
-                      <a:avLst/>
-                    </a:prstGeom>
-                  </pic:spPr>
-                </pic:pic>
-              </a:graphicData>
-            </a:graphic>
-          </wp:inline>
-        </w:drawing>
-      </w:r>
-    </w:p>
-    <w:p>
-      <w:pPr>
-        <w:spacing w:after="140"/>
-        <w:jc w:val="center"/>
-      </w:pPr>
-      <w:r>
-        <w:rPr>
-          <w:rFonts w:ascii="Arial" w:cs="Arial" w:eastAsia="Arial" w:hAnsi="Arial"/>
-          <w:color w:val="64748B"/>
-          <w:sz w:val="18"/>
-          <w:szCs w:val="18"/>
-        </w:rPr>
-        <w:t xml:space="preserve">Hình 4: Danh sách thẻ dự án phần mềm tiêu biểu mở trong Neovim</w:t>
-      </w:r>
-    </w:p>
-    <w:p>
-      <w:pPr>
-        <w:pStyle w:val="Heading2"/>
-        <w:spacing w:after="80" w:before="180"/>
-      </w:pPr>
-      <w:r>
-        <w:rPr>
-          <w:rFonts w:ascii="Arial" w:cs="Arial" w:eastAsia="Arial" w:hAnsi="Arial"/>
-          <w:b/>
-          <w:bCs/>
-          <w:color w:val="1E293B"/>
-          <w:sz w:val="22"/>
-          <w:szCs w:val="22"/>
-        </w:rPr>
-        <w:t xml:space="preserve">2.5 Bảng kỹ năng kỹ thuật (&lt;table&gt;)</w:t>
-      </w:r>
-    </w:p>
-    <w:p>
-      <w:pPr>
-        <w:spacing w:after="100" w:line="260"/>
-      </w:pPr>
-      <w:r>
-        <w:rPr>
-          <w:rFonts w:ascii="Arial" w:cs="Arial" w:eastAsia="Arial" w:hAnsi="Arial"/>
-          <w:b w:val="false"/>
-          <w:bCs w:val="false"/>
-          <w:color w:val="334155"/>
-          <w:sz w:val="21"/>
-          <w:szCs w:val="21"/>
-        </w:rPr>
-        <w:t xml:space="preserve">• Để đáp ứng yêu cầu sử dụng phần tử bảng (table) trong đề bài Lab 1, em tạo bảng tổng hợp kỹ năng kỹ thuật gồm 4 nhóm: Smart Contracts, Systems &amp; Languages, AI/ML &amp; Automation, và Infrastructure &amp; DevOps.
-• Cấu trúc bảng gồm thẻ &lt;table&gt;, phần đầu bảng &lt;thead&gt; chứa các ô tiêu đề &lt;th scope="col"&gt;, và phần thân &lt;tbody&gt; chứa các hàng &lt;tr&gt; cùng dữ liệu &lt;td&gt;.</w:t>
-      </w:r>
-    </w:p>
-    <w:p>
-      <w:pPr>
-        <w:spacing w:after="50" w:before="120"/>
-        <w:jc w:val="center"/>
-      </w:pPr>
-      <w:r>
-        <w:drawing>
-          <wp:inline distT="0" distB="0" distL="0" distR="0">
-            <wp:extent cx="5143500" cy="3286125"/>
-            <wp:effectExtent t="0" r="0" b="0" l="0"/>
-            <wp:docPr id="5" name="Hình 5: Bảng kỹ năng kỹ thuật với cấu trúc &lt;table&gt; chuẩn mở trong Neovim" descr="Hình 5: Bảng kỹ năng kỹ thuật với cấu trúc &lt;table&gt; chuẩn mở trong Neovim" title="Hình 5: Bảng kỹ năng kỹ thuật với cấu trúc &lt;table&gt; chuẩn mở trong Neovim"/>
-            <wp:cNvGraphicFramePr>
-              <a:graphicFrameLocks xmlns:a="http://schemas.openxmlformats.org/drawingml/2006/main" noChangeAspect="1"/>
-            </wp:cNvGraphicFramePr>
-            <a:graphic xmlns:a="http://schemas.openxmlformats.org/drawingml/2006/main">
-              <a:graphicData uri="http://schemas.openxmlformats.org/drawingml/2006/picture">
-                <pic:pic xmlns:pic="http://schemas.openxmlformats.org/drawingml/2006/picture">
-                  <pic:nvPicPr>
-                    <pic:cNvPr id="0" name="" descr=""/>
-                    <pic:cNvPicPr>
-                      <a:picLocks noChangeAspect="1" noChangeArrowheads="1"/>
-                    </pic:cNvPicPr>
-                  </pic:nvPicPr>
-                  <pic:blipFill>
-                    <a:blip r:embed="rId13" cstate="none"/>
-                    <a:srcRect/>
-                    <a:stretch>
-                      <a:fillRect/>
-                    </a:stretch>
-                  </pic:blipFill>
-                  <pic:spPr bwMode="auto">
-                    <a:xfrm>
-                      <a:off x="0" y="0"/>
-                      <a:ext cx="5143500" cy="3286125"/>
-                    </a:xfrm>
-                    <a:prstGeom prst="rect">
-                      <a:avLst/>
-                    </a:prstGeom>
-                  </pic:spPr>
-                </pic:pic>
-              </a:graphicData>
-            </a:graphic>
-          </wp:inline>
-        </w:drawing>
-      </w:r>
-    </w:p>
-    <w:p>
-      <w:pPr>
-        <w:spacing w:after="140"/>
-        <w:jc w:val="center"/>
-      </w:pPr>
-      <w:r>
-        <w:rPr>
-          <w:rFonts w:ascii="Arial" w:cs="Arial" w:eastAsia="Arial" w:hAnsi="Arial"/>
-          <w:color w:val="64748B"/>
-          <w:sz w:val="18"/>
-          <w:szCs w:val="18"/>
-        </w:rPr>
-        <w:t xml:space="preserve">Hình 5: Bảng kỹ năng kỹ thuật với cấu trúc &lt;table&gt; chuẩn mở trong Neovim</w:t>
-      </w:r>
-    </w:p>
-    <w:p>
-      <w:pPr>
-        <w:pStyle w:val="Heading2"/>
-        <w:spacing w:after="80" w:before="180"/>
-      </w:pPr>
-      <w:r>
-        <w:rPr>
-          <w:rFonts w:ascii="Arial" w:cs="Arial" w:eastAsia="Arial" w:hAnsi="Arial"/>
-          <w:b/>
-          <w:bCs/>
-          <w:color w:val="1E293B"/>
-          <w:sz w:val="22"/>
-          <w:szCs w:val="22"/>
-        </w:rPr>
-        <w:t xml:space="preserve">2.6 Biểu mẫu liên hệ &amp; Thanh bên Aside (&lt;form&gt;, &lt;aside&gt;, &lt;footer&gt;)</w:t>
-      </w:r>
-    </w:p>
-    <w:p>
-      <w:pPr>
-        <w:spacing w:after="100" w:line="260"/>
-      </w:pPr>
-      <w:r>
-        <w:rPr>
-          <w:rFonts w:ascii="Arial" w:cs="Arial" w:eastAsia="Arial" w:hAnsi="Arial"/>
-          <w:b w:val="false"/>
-          <w:bCs w:val="false"/>
-          <w:color w:val="334155"/>
-          <w:sz w:val="21"/>
-          <w:szCs w:val="21"/>
-        </w:rPr>
-        <w:t xml:space="preserve">• Thẻ &lt;form&gt;: Đáp ứng yêu cầu Form &amp; Input trong Lab 1 với các trường họ tên (&lt;input type="text"&gt;), email (&lt;input type="email"&gt;), ô nhập nội dung (&lt;textarea&gt;) và nút gửi (&lt;button type="submit"&gt;). Mỗi ô nhập đều có &lt;label&gt; gắn liền qua thuộc tính for/id.
-• Thẻ &lt;aside&gt;: Thanh bên chứa thông tin học vấn (Đại học Công nghệ Thông tin &amp; Birmingham City University), giải thưởng cuộc thi bằng danh sách có thứ tự &lt;ol&gt;, và thông số kỹ thuật nhanh bằng danh sách định nghĩa &lt;dl&gt;, &lt;dt&gt;, &lt;dd&gt;.
-• Thẻ &lt;footer&gt;: Chân trang thể hiện bản quyền cá nhân và đường link quay về đầu trang.</w:t>
-      </w:r>
-    </w:p>
-    <w:p>
-      <w:pPr>
-        <w:spacing w:after="50" w:before="120"/>
-        <w:jc w:val="center"/>
-      </w:pPr>
-      <w:r>
-        <w:drawing>
-          <wp:inline distT="0" distB="0" distL="0" distR="0">
-            <wp:extent cx="5143500" cy="3286125"/>
-            <wp:effectExtent t="0" r="0" b="0" l="0"/>
-            <wp:docPr id="6" name="Hình 6: Biểu mẫu &lt;form&gt;, thanh bên &lt;aside&gt; và chân trang &lt;footer&gt; mở trong Neovim" descr="Hình 6: Biểu mẫu &lt;form&gt;, thanh bên &lt;aside&gt; và chân trang &lt;footer&gt; mở trong Neovim" title="Hình 6: Biểu mẫu &lt;form&gt;, thanh bên &lt;aside&gt; và chân trang &lt;footer&gt; mở trong Neovim"/>
-            <wp:cNvGraphicFramePr>
-              <a:graphicFrameLocks xmlns:a="http://schemas.openxmlformats.org/drawingml/2006/main" noChangeAspect="1"/>
-            </wp:cNvGraphicFramePr>
-            <a:graphic xmlns:a="http://schemas.openxmlformats.org/drawingml/2006/main">
-              <a:graphicData uri="http://schemas.openxmlformats.org/drawingml/2006/picture">
-                <pic:pic xmlns:pic="http://schemas.openxmlformats.org/drawingml/2006/picture">
-                  <pic:nvPicPr>
-                    <pic:cNvPr id="0" name="" descr=""/>
-                    <pic:cNvPicPr>
-                      <a:picLocks noChangeAspect="1" noChangeArrowheads="1"/>
-                    </pic:cNvPicPr>
-                  </pic:nvPicPr>
-                  <pic:blipFill>
-                    <a:blip r:embed="rId14" cstate="none"/>
-                    <a:srcRect/>
-                    <a:stretch>
-                      <a:fillRect/>
-                    </a:stretch>
-                  </pic:blipFill>
-                  <pic:spPr bwMode="auto">
-                    <a:xfrm>
-                      <a:off x="0" y="0"/>
-                      <a:ext cx="5143500" cy="3286125"/>
-                    </a:xfrm>
-                    <a:prstGeom prst="rect">
-                      <a:avLst/>
-                    </a:prstGeom>
-                  </pic:spPr>
-                </pic:pic>
-              </a:graphicData>
-            </a:graphic>
-          </wp:inline>
-        </w:drawing>
-      </w:r>
-    </w:p>
-    <w:p>
-      <w:pPr>
-        <w:spacing w:after="140"/>
-        <w:jc w:val="center"/>
-      </w:pPr>
-      <w:r>
-        <w:rPr>
-          <w:rFonts w:ascii="Arial" w:cs="Arial" w:eastAsia="Arial" w:hAnsi="Arial"/>
-          <w:color w:val="64748B"/>
-          <w:sz w:val="18"/>
-          <w:szCs w:val="18"/>
-        </w:rPr>
-        <w:t xml:space="preserve">Hình 6: Biểu mẫu &lt;form&gt;, thanh bên &lt;aside&gt; và chân trang &lt;footer&gt; mở trong Neovim</w:t>
-      </w:r>
-    </w:p>
-    <w:p>
-      <w:pPr>
-        <w:pStyle w:val="Heading1"/>
-        <w:spacing w:after="120" w:before="240"/>
-      </w:pPr>
-      <w:r>
-        <w:rPr>
-          <w:rFonts w:ascii="Arial" w:cs="Arial" w:eastAsia="Arial" w:hAnsi="Arial"/>
-          <w:b/>
-          <w:bCs/>
-          <w:color w:val="0F172A"/>
-          <w:sz w:val="26"/>
-          <w:szCs w:val="26"/>
-        </w:rPr>
-        <w:t xml:space="preserve">3. Phân Tích Mã Nguồn CSS (style.css)</w:t>
-      </w:r>
-    </w:p>
-    <w:p>
-      <w:pPr>
-        <w:spacing w:after="100" w:line="260"/>
-      </w:pPr>
-      <w:r>
-        <w:rPr>
-          <w:rFonts w:ascii="Arial" w:cs="Arial" w:eastAsia="Arial" w:hAnsi="Arial"/>
-          <w:b w:val="false"/>
-          <w:bCs w:val="false"/>
-          <w:color w:val="334155"/>
-          <w:sz w:val="21"/>
-          <w:szCs w:val="21"/>
-        </w:rPr>
-        <w:t xml:space="preserve">File CSS được tách riêng và liên kết với HTML theo đúng khuyến nghị của đề bài (External CSS). Phong cách thiết kế ưu tiên sự gọn gàng, tính phân cấp rõ ràng và hỗ trợ tốt trên màn hình di động.</w:t>
-      </w:r>
-    </w:p>
-    <w:p>
-      <w:pPr>
-        <w:pStyle w:val="Heading2"/>
-        <w:spacing w:after="80" w:before="180"/>
-      </w:pPr>
-      <w:r>
-        <w:rPr>
-          <w:rFonts w:ascii="Arial" w:cs="Arial" w:eastAsia="Arial" w:hAnsi="Arial"/>
-          <w:b/>
-          <w:bCs/>
-          <w:color w:val="1E293B"/>
-          <w:sz w:val="22"/>
-          <w:szCs w:val="22"/>
-        </w:rPr>
-        <w:t xml:space="preserve">3.1 Biến CSS, Reset &amp; Box Model</w:t>
-      </w:r>
-    </w:p>
-    <w:p>
-      <w:pPr>
-        <w:spacing w:after="100" w:line="260"/>
-      </w:pPr>
-      <w:r>
-        <w:rPr>
-          <w:rFonts w:ascii="Arial" w:cs="Arial" w:eastAsia="Arial" w:hAnsi="Arial"/>
-          <w:b w:val="false"/>
-          <w:bCs w:val="false"/>
-          <w:color w:val="334155"/>
-          <w:sz w:val="21"/>
-          <w:szCs w:val="21"/>
-        </w:rPr>
-        <w:t xml:space="preserve">• Khối :root khai báo các biến CSS (CSS Variables) để quản lý tập trung mã màu nền (--bg: #0f1013), màu bề mặt (--surface: #15171c), màu viền (--border: #22252c) và màu chữ (--text: #e1e4ea).
-• Quy tắc * { box-sizing: border-box; } giúp tính toán kích thước phần tử chính xác gồm cả padding và border, tránh lỗi vỡ bố cục khi thêm khoảng đệm.</w:t>
-      </w:r>
-    </w:p>
-    <w:p>
-      <w:pPr>
-        <w:spacing w:after="50" w:before="120"/>
-        <w:jc w:val="center"/>
-      </w:pPr>
-      <w:r>
-        <w:drawing>
-          <wp:inline distT="0" distB="0" distL="0" distR="0">
-            <wp:extent cx="5143500" cy="3286125"/>
-            <wp:effectExtent t="0" r="0" b="0" l="0"/>
-            <wp:docPr id="7" name="Hình 7: Khai báo biến CSS :root và thiết lập Box Model mở trong Neovim" descr="Hình 7: Khai báo biến CSS :root và thiết lập Box Model mở trong Neovim" title="Hình 7: Khai báo biến CSS :root và thiết lập Box Model mở trong Neovim"/>
-            <wp:cNvGraphicFramePr>
-              <a:graphicFrameLocks xmlns:a="http://schemas.openxmlformats.org/drawingml/2006/main" noChangeAspect="1"/>
-            </wp:cNvGraphicFramePr>
-            <a:graphic xmlns:a="http://schemas.openxmlformats.org/drawingml/2006/main">
-              <a:graphicData uri="http://schemas.openxmlformats.org/drawingml/2006/picture">
-                <pic:pic xmlns:pic="http://schemas.openxmlformats.org/drawingml/2006/picture">
-                  <pic:nvPicPr>
-                    <pic:cNvPr id="0" name="" descr=""/>
-                    <pic:cNvPicPr>
-                      <a:picLocks noChangeAspect="1" noChangeArrowheads="1"/>
-                    </pic:cNvPicPr>
-                  </pic:nvPicPr>
-                  <pic:blipFill>
-                    <a:blip r:embed="rId15" cstate="none"/>
-                    <a:srcRect/>
-                    <a:stretch>
-                      <a:fillRect/>
-                    </a:stretch>
-                  </pic:blipFill>
-                  <pic:spPr bwMode="auto">
-                    <a:xfrm>
-                      <a:off x="0" y="0"/>
-                      <a:ext cx="5143500" cy="3286125"/>
-                    </a:xfrm>
-                    <a:prstGeom prst="rect">
-                      <a:avLst/>
-                    </a:prstGeom>
-                  </pic:spPr>
-                </pic:pic>
-              </a:graphicData>
-            </a:graphic>
-          </wp:inline>
-        </w:drawing>
-      </w:r>
-    </w:p>
-    <w:p>
-      <w:pPr>
-        <w:spacing w:after="140"/>
-        <w:jc w:val="center"/>
-      </w:pPr>
-      <w:r>
-        <w:rPr>
-          <w:rFonts w:ascii="Arial" w:cs="Arial" w:eastAsia="Arial" w:hAnsi="Arial"/>
-          <w:color w:val="64748B"/>
-          <w:sz w:val="18"/>
-          <w:szCs w:val="18"/>
-        </w:rPr>
-        <w:t xml:space="preserve">Hình 7: Khai báo biến CSS :root và thiết lập Box Model mở trong Neovim</w:t>
-      </w:r>
-    </w:p>
-    <w:p>
-      <w:pPr>
-        <w:pStyle w:val="Heading2"/>
-        <w:spacing w:after="80" w:before="180"/>
-      </w:pPr>
-      <w:r>
-        <w:rPr>
-          <w:rFonts w:ascii="Arial" w:cs="Arial" w:eastAsia="Arial" w:hAnsi="Arial"/>
-          <w:b/>
-          <w:bCs/>
-          <w:color w:val="1E293B"/>
-          <w:sz w:val="22"/>
-          <w:szCs w:val="22"/>
-        </w:rPr>
-        <w:t xml:space="preserve">3.2 Định kiểu Navigation &amp; Header</w:t>
-      </w:r>
-    </w:p>
-    <w:p>
-      <w:pPr>
-        <w:spacing w:after="100" w:line="260"/>
-      </w:pPr>
-      <w:r>
-        <w:rPr>
-          <w:rFonts w:ascii="Arial" w:cs="Arial" w:eastAsia="Arial" w:hAnsi="Arial"/>
-          <w:b w:val="false"/>
-          <w:bCs w:val="false"/>
-          <w:color w:val="334155"/>
-          <w:sz w:val="21"/>
-          <w:szCs w:val="21"/>
-        </w:rPr>
-        <w:t xml:space="preserve">• Thanh .navbar sử dụng position: sticky và backdrop-filter: blur(8px) giúp thanh menu cố định phía trên khi cuộn trang.
-• Bố cục header dùng Flexbox chia hai phần: khối văn bản thông tin bên trái và ảnh đại diện bo tròn bên phải.</w:t>
-      </w:r>
-    </w:p>
-    <w:p>
-      <w:pPr>
-        <w:spacing w:after="50" w:before="120"/>
-        <w:jc w:val="center"/>
-      </w:pPr>
-      <w:r>
-        <w:drawing>
-          <wp:inline distT="0" distB="0" distL="0" distR="0">
-            <wp:extent cx="5143500" cy="3286125"/>
-            <wp:effectExtent t="0" r="0" b="0" l="0"/>
-            <wp:docPr id="8" name="Hình 8: Định kiểu thanh điều hướng và header mở trong Neovim" descr="Hình 8: Định kiểu thanh điều hướng và header mở trong Neovim" title="Hình 8: Định kiểu thanh điều hướng và header mở trong Neovim"/>
-            <wp:cNvGraphicFramePr>
-              <a:graphicFrameLocks xmlns:a="http://schemas.openxmlformats.org/drawingml/2006/main" noChangeAspect="1"/>
-            </wp:cNvGraphicFramePr>
-            <a:graphic xmlns:a="http://schemas.openxmlformats.org/drawingml/2006/main">
-              <a:graphicData uri="http://schemas.openxmlformats.org/drawingml/2006/picture">
-                <pic:pic xmlns:pic="http://schemas.openxmlformats.org/drawingml/2006/picture">
-                  <pic:nvPicPr>
-                    <pic:cNvPr id="0" name="" descr=""/>
-                    <pic:cNvPicPr>
-                      <a:picLocks noChangeAspect="1" noChangeArrowheads="1"/>
-                    </pic:cNvPicPr>
-                  </pic:nvPicPr>
-                  <pic:blipFill>
-                    <a:blip r:embed="rId15" cstate="none"/>
-                    <a:srcRect/>
-                    <a:stretch>
-                      <a:fillRect/>
-                    </a:stretch>
-                  </pic:blipFill>
-                  <pic:spPr bwMode="auto">
-                    <a:xfrm>
-                      <a:off x="0" y="0"/>
-                      <a:ext cx="5143500" cy="3286125"/>
-                    </a:xfrm>
-                    <a:prstGeom prst="rect">
-                      <a:avLst/>
-                    </a:prstGeom>
-                  </pic:spPr>
-                </pic:pic>
-              </a:graphicData>
-            </a:graphic>
-          </wp:inline>
-        </w:drawing>
-      </w:r>
-    </w:p>
-    <w:p>
-      <w:pPr>
-        <w:spacing w:after="140"/>
-        <w:jc w:val="center"/>
-      </w:pPr>
-      <w:r>
-        <w:rPr>
-          <w:rFonts w:ascii="Arial" w:cs="Arial" w:eastAsia="Arial" w:hAnsi="Arial"/>
-          <w:color w:val="64748B"/>
-          <w:sz w:val="18"/>
-          <w:szCs w:val="18"/>
-        </w:rPr>
-        <w:t xml:space="preserve">Hình 8: Định kiểu thanh điều hướng và header mở trong Neovim</w:t>
-      </w:r>
-    </w:p>
-    <w:p>
-      <w:pPr>
-        <w:pStyle w:val="Heading2"/>
-        <w:spacing w:after="80" w:before="180"/>
-      </w:pPr>
-      <w:r>
-        <w:rPr>
-          <w:rFonts w:ascii="Arial" w:cs="Arial" w:eastAsia="Arial" w:hAnsi="Arial"/>
-          <w:b/>
-          <w:bCs/>
-          <w:color w:val="1E293B"/>
-          <w:sz w:val="22"/>
-          <w:szCs w:val="22"/>
-        </w:rPr>
-        <w:t xml:space="preserve">3.3 Bố cục nội dung chính, Card &amp; Hiệu ứng Hover (Exercise 4)</w:t>
-      </w:r>
-    </w:p>
-    <w:p>
-      <w:pPr>
-        <w:spacing w:after="100" w:line="260"/>
-      </w:pPr>
-      <w:r>
-        <w:rPr>
-          <w:rFonts w:ascii="Arial" w:cs="Arial" w:eastAsia="Arial" w:hAnsi="Arial"/>
-          <w:b w:val="false"/>
-          <w:bCs w:val="false"/>
-          <w:color w:val="334155"/>
-          <w:sz w:val="21"/>
-          <w:szCs w:val="21"/>
-        </w:rPr>
-        <w:t xml:space="preserve">• Bố cục trang chia thành 2 cột bằng CSS Grid (.layout-container { display: grid; grid-template-columns: 1fr 310px; gap: 48px; }).
-• Thực hiện yêu cầu Exercise 4 trong đề bài: Thẻ dự án .project-item và nút bấm đều được gắn transition: border-color 0.2s ease, transform 0.2s ease. Khi rê chuột qua (:hover), phần tử nhấc lên nhẹ nhàng bằng transform: translateY(-2px) và viền sáng hơn, tạo phản hồi xúc giác tự nhiên.</w:t>
-      </w:r>
-    </w:p>
-    <w:p>
-      <w:pPr>
-        <w:spacing w:after="50" w:before="120"/>
-        <w:jc w:val="center"/>
-      </w:pPr>
-      <w:r>
-        <w:drawing>
-          <wp:inline distT="0" distB="0" distL="0" distR="0">
-            <wp:extent cx="5143500" cy="3286125"/>
-            <wp:effectExtent t="0" r="0" b="0" l="0"/>
-            <wp:docPr id="9" name="Hình 9: Định kiểu danh sách bài viết và hiệu ứng hover mở trong Neovim" descr="Hình 9: Định kiểu danh sách bài viết và hiệu ứng hover mở trong Neovim" title="Hình 9: Định kiểu danh sách bài viết và hiệu ứng hover mở trong Neovim"/>
-            <wp:cNvGraphicFramePr>
-              <a:graphicFrameLocks xmlns:a="http://schemas.openxmlformats.org/drawingml/2006/main" noChangeAspect="1"/>
-            </wp:cNvGraphicFramePr>
-            <a:graphic xmlns:a="http://schemas.openxmlformats.org/drawingml/2006/main">
-              <a:graphicData uri="http://schemas.openxmlformats.org/drawingml/2006/picture">
-                <pic:pic xmlns:pic="http://schemas.openxmlformats.org/drawingml/2006/picture">
-                  <pic:nvPicPr>
-                    <pic:cNvPr id="0" name="" descr=""/>
-                    <pic:cNvPicPr>
-                      <a:picLocks noChangeAspect="1" noChangeArrowheads="1"/>
-                    </pic:cNvPicPr>
-                  </pic:nvPicPr>
-                  <pic:blipFill>
-                    <a:blip r:embed="rId16" cstate="none"/>
-                    <a:srcRect/>
-                    <a:stretch>
-                      <a:fillRect/>
-                    </a:stretch>
-                  </pic:blipFill>
-                  <pic:spPr bwMode="auto">
-                    <a:xfrm>
-                      <a:off x="0" y="0"/>
-                      <a:ext cx="5143500" cy="3286125"/>
-                    </a:xfrm>
-                    <a:prstGeom prst="rect">
-                      <a:avLst/>
-                    </a:prstGeom>
-                  </pic:spPr>
-                </pic:pic>
-              </a:graphicData>
-            </a:graphic>
-          </wp:inline>
-        </w:drawing>
-      </w:r>
-    </w:p>
-    <w:p>
-      <w:pPr>
-        <w:spacing w:after="140"/>
-        <w:jc w:val="center"/>
-      </w:pPr>
-      <w:r>
-        <w:rPr>
-          <w:rFonts w:ascii="Arial" w:cs="Arial" w:eastAsia="Arial" w:hAnsi="Arial"/>
-          <w:color w:val="64748B"/>
-          <w:sz w:val="18"/>
-          <w:szCs w:val="18"/>
-        </w:rPr>
-        <w:t xml:space="preserve">Hình 9: Định kiểu danh sách bài viết và hiệu ứng hover mở trong Neovim</w:t>
-      </w:r>
-    </w:p>
-    <w:p>
-      <w:pPr>
-        <w:pStyle w:val="Heading2"/>
-        <w:spacing w:after="80" w:before="180"/>
-      </w:pPr>
-      <w:r>
-        <w:rPr>
-          <w:rFonts w:ascii="Arial" w:cs="Arial" w:eastAsia="Arial" w:hAnsi="Arial"/>
-          <w:b/>
-          <w:bCs/>
-          <w:color w:val="1E293B"/>
-          <w:sz w:val="22"/>
-          <w:szCs w:val="22"/>
-        </w:rPr>
-        <w:t xml:space="preserve">3.4 Định kiểu Bảng dữ liệu &amp; Form liên hệ</w:t>
-      </w:r>
-    </w:p>
-    <w:p>
-      <w:pPr>
-        <w:spacing w:after="100" w:line="260"/>
-      </w:pPr>
-      <w:r>
-        <w:rPr>
-          <w:rFonts w:ascii="Arial" w:cs="Arial" w:eastAsia="Arial" w:hAnsi="Arial"/>
-          <w:b w:val="false"/>
-          <w:bCs w:val="false"/>
-          <w:color w:val="334155"/>
-          <w:sz w:val="21"/>
-          <w:szCs w:val="21"/>
-        </w:rPr>
-        <w:t xml:space="preserve">• Bảng dữ liệu được bọc trong container có overflow-x: auto để không bị tràn khi xem trên màn hình nhỏ. Hàng bảng có hiệu ứng đổi màu nền nhẹ khi rê chuột.
-• Ô nhập liệu input và textarea khi focus sẽ đổi màu viền sang --border-focus (#4b5563) để người dùng nhận biết vị trí đang gõ phím.
-• Áp dụng Media Query (@media (max-width: 860px) và @media (max-width: 600px)) để tự động chuyển bố cục lưới thành 1 cột trên màn hình điện thoại.</w:t>
-      </w:r>
-    </w:p>
-    <w:p>
-      <w:pPr>
-        <w:spacing w:after="50" w:before="120"/>
-        <w:jc w:val="center"/>
-      </w:pPr>
-      <w:r>
-        <w:drawing>
-          <wp:inline distT="0" distB="0" distL="0" distR="0">
-            <wp:extent cx="5143500" cy="3286125"/>
-            <wp:effectExtent t="0" r="0" b="0" l="0"/>
-            <wp:docPr id="10" name="Hình 10: Định kiểu bảng, form liên hệ và media queries mở trong Neovim" descr="Hình 10: Định kiểu bảng, form liên hệ và media queries mở trong Neovim" title="Hình 10: Định kiểu bảng, form liên hệ và media queries mở trong Neovim"/>
-            <wp:cNvGraphicFramePr>
-              <a:graphicFrameLocks xmlns:a="http://schemas.openxmlformats.org/drawingml/2006/main" noChangeAspect="1"/>
-            </wp:cNvGraphicFramePr>
-            <a:graphic xmlns:a="http://schemas.openxmlformats.org/drawingml/2006/main">
-              <a:graphicData uri="http://schemas.openxmlformats.org/drawingml/2006/picture">
-                <pic:pic xmlns:pic="http://schemas.openxmlformats.org/drawingml/2006/picture">
-                  <pic:nvPicPr>
-                    <pic:cNvPr id="0" name="" descr=""/>
-                    <pic:cNvPicPr>
-                      <a:picLocks noChangeAspect="1" noChangeArrowheads="1"/>
-                    </pic:cNvPicPr>
-                  </pic:nvPicPr>
-                  <pic:blipFill>
-                    <a:blip r:embed="rId17" cstate="none"/>
-                    <a:srcRect/>
-                    <a:stretch>
-                      <a:fillRect/>
-                    </a:stretch>
-                  </pic:blipFill>
-                  <pic:spPr bwMode="auto">
-                    <a:xfrm>
-                      <a:off x="0" y="0"/>
-                      <a:ext cx="5143500" cy="3286125"/>
-                    </a:xfrm>
-                    <a:prstGeom prst="rect">
-                      <a:avLst/>
-                    </a:prstGeom>
-                  </pic:spPr>
-                </pic:pic>
-              </a:graphicData>
-            </a:graphic>
-          </wp:inline>
-        </w:drawing>
-      </w:r>
-    </w:p>
-    <w:p>
-      <w:pPr>
-        <w:spacing w:after="140"/>
-        <w:jc w:val="center"/>
-      </w:pPr>
-      <w:r>
-        <w:rPr>
-          <w:rFonts w:ascii="Arial" w:cs="Arial" w:eastAsia="Arial" w:hAnsi="Arial"/>
-          <w:color w:val="64748B"/>
-          <w:sz w:val="18"/>
-          <w:szCs w:val="18"/>
-        </w:rPr>
-        <w:t xml:space="preserve">Hình 10: Định kiểu bảng, form liên hệ và media queries mở trong Neovim</w:t>
-      </w:r>
-    </w:p>
-    <w:p>
-      <w:pPr>
-        <w:pStyle w:val="Heading1"/>
-        <w:spacing w:after="120" w:before="240"/>
-      </w:pPr>
-      <w:r>
-        <w:rPr>
-          <w:rFonts w:ascii="Arial" w:cs="Arial" w:eastAsia="Arial" w:hAnsi="Arial"/>
-          <w:b/>
-          <w:bCs/>
-          <w:color w:val="0F172A"/>
-          <w:sz w:val="26"/>
-          <w:szCs w:val="26"/>
-        </w:rPr>
-        <w:t xml:space="preserve">4. Kết Quả Giao Diện Hiển Thị Trực Quan</w:t>
-      </w:r>
-    </w:p>
-    <w:p>
-      <w:pPr>
-        <w:spacing w:after="100" w:line="260"/>
-      </w:pPr>
-      <w:r>
-        <w:rPr>
-          <w:rFonts w:ascii="Arial" w:cs="Arial" w:eastAsia="Arial" w:hAnsi="Arial"/>
-          <w:b w:val="false"/>
-          <w:bCs w:val="false"/>
-          <w:color w:val="334155"/>
-          <w:sz w:val="21"/>
-          <w:szCs w:val="21"/>
-        </w:rPr>
-        <w:t xml:space="preserve">Dưới đây là hình ảnh chụp giao diện trang web CV cá nhân sau khi hoàn thiện toàn bộ mã nguồn HTML5 và CSS:</w:t>
-      </w:r>
-    </w:p>
-    <w:p>
-      <w:pPr>
-        <w:spacing w:after="50" w:before="120"/>
-        <w:jc w:val="center"/>
-      </w:pPr>
-      <w:r>
-        <w:drawing>
-          <wp:inline distT="0" distB="0" distL="0" distR="0">
-            <wp:extent cx="4762500" cy="6553200"/>
-            <wp:effectExtent t="0" r="0" b="0" l="0"/>
-            <wp:docPr id="11" name="Hình 11: Giao diện hoàn chỉnh trang web CV Huynh Khanh Thien trên trình duyệt" descr="Hình 11: Giao diện hoàn chỉnh trang web CV Huynh Khanh Thien trên trình duyệt" title="Hình 11: Giao diện hoàn chỉnh trang web CV Huynh Khanh Thien trên trình duyệt"/>
-            <wp:cNvGraphicFramePr>
-              <a:graphicFrameLocks xmlns:a="http://schemas.openxmlformats.org/drawingml/2006/main" noChangeAspect="1"/>
-            </wp:cNvGraphicFramePr>
-            <a:graphic xmlns:a="http://schemas.openxmlformats.org/drawingml/2006/main">
-              <a:graphicData uri="http://schemas.openxmlformats.org/drawingml/2006/picture">
-                <pic:pic xmlns:pic="http://schemas.openxmlformats.org/drawingml/2006/picture">
-                  <pic:nvPicPr>
-                    <pic:cNvPr id="0" name="" descr=""/>
-                    <pic:cNvPicPr>
-                      <a:picLocks noChangeAspect="1" noChangeArrowheads="1"/>
-                    </pic:cNvPicPr>
-                  </pic:nvPicPr>
-                  <pic:blipFill>
-                    <a:blip r:embed="rId18" cstate="none"/>
-                    <a:srcRect/>
-                    <a:stretch>
-                      <a:fillRect/>
-                    </a:stretch>
-                  </pic:blipFill>
-                  <pic:spPr bwMode="auto">
-                    <a:xfrm>
-                      <a:off x="0" y="0"/>
-                      <a:ext cx="4762500" cy="6553200"/>
+                      <a:ext cx="4667250" cy="6419850"/>
                     </a:xfrm>
                     <a:prstGeom prst="rect">
                       <a:avLst/>

</xml_diff>

<commit_message>
fix: resolve background striping caused by smear-cursor and treesitter-context; re-capture with matching TokyoNight background
</commit_message>
<xml_diff>
--- a/Lab1_HuynhKhanhThien.docx
+++ b/Lab1_HuynhKhanhThien.docx
@@ -684,420 +684,6 @@
                     </pic:cNvPicPr>
                   </pic:nvPicPr>
                   <pic:blipFill>
-                    <a:blip r:embed="rId10" cstate="none"/>
-                    <a:srcRect/>
-                    <a:stretch>
-                      <a:fillRect/>
-                    </a:stretch>
-                  </pic:blipFill>
-                  <pic:spPr bwMode="auto">
-                    <a:xfrm>
-                      <a:off x="0" y="0"/>
-                      <a:ext cx="4667250" cy="2619375"/>
-                    </a:xfrm>
-                    <a:prstGeom prst="rect">
-                      <a:avLst/>
-                    </a:prstGeom>
-                  </pic:spPr>
-                </pic:pic>
-              </a:graphicData>
-            </a:graphic>
-          </wp:inline>
-        </w:drawing>
-      </w:r>
-    </w:p>
-    <w:p>
-      <w:pPr>
-        <w:spacing w:after="140"/>
-        <w:jc w:val="center"/>
-      </w:pPr>
-      <w:r>
-        <w:rPr>
-          <w:rFonts w:ascii="Arial" w:cs="Arial" w:eastAsia="Arial" w:hAnsi="Arial"/>
-          <w:color w:val="64748B"/>
-          <w:sz w:val="18"/>
-          <w:szCs w:val="18"/>
-        </w:rPr>
-        <w:t xml:space="preserve">Hình 3: Cấu trúc &lt;section&gt; và các thẻ &lt;article&gt; kinh nghiệm mở trong Neovim</w:t>
-      </w:r>
-    </w:p>
-    <w:p>
-      <w:pPr>
-        <w:pStyle w:val="Heading2"/>
-        <w:spacing w:after="80" w:before="180"/>
-      </w:pPr>
-      <w:r>
-        <w:rPr>
-          <w:rFonts w:ascii="Arial" w:cs="Arial" w:eastAsia="Arial" w:hAnsi="Arial"/>
-          <w:b/>
-          <w:bCs/>
-          <w:color w:val="1E293B"/>
-          <w:sz w:val="22"/>
-          <w:szCs w:val="22"/>
-        </w:rPr>
-        <w:t xml:space="preserve">2.4 Phần dự án tiêu biểu (&lt;section id="projects"&gt;)</w:t>
-      </w:r>
-    </w:p>
-    <w:p>
-      <w:pPr>
-        <w:spacing w:after="100" w:line="260"/>
-      </w:pPr>
-      <w:r>
-        <w:rPr>
-          <w:rFonts w:ascii="Arial" w:cs="Arial" w:eastAsia="Arial" w:hAnsi="Arial"/>
-          <w:b w:val="false"/>
-          <w:bCs w:val="false"/>
-          <w:color w:val="334155"/>
-          <w:sz w:val="21"/>
-          <w:szCs w:val="21"/>
-        </w:rPr>
-        <w:t xml:space="preserve">• Khu vực danh sách dự án bao gồm 4 dự án phần mềm chính: Streaming Anomaly Detector, Supply Chain Optimization Protocol, Deep Neural Network from Scratch, và Evolutionary Multi-Agent Simulator.
-• Mỗi dự án là một thẻ &lt;article class="project-item"&gt; chứa tiêu đề có liên kết &lt;a&gt;, nhãn công nghệ sử dụng và đoạn mô tả ngắn gọn.</w:t>
-      </w:r>
-    </w:p>
-    <w:p>
-      <w:pPr>
-        <w:spacing w:after="50" w:before="120"/>
-        <w:jc w:val="center"/>
-      </w:pPr>
-      <w:r>
-        <w:drawing>
-          <wp:inline distT="0" distB="0" distL="0" distR="0">
-            <wp:extent cx="4667250" cy="2619375"/>
-            <wp:effectExtent t="0" r="0" b="0" l="0"/>
-            <wp:docPr id="4" name="Hình 4: Danh sách thẻ dự án phần mềm tiêu biểu mở trong Neovim" descr="Hình 4: Danh sách thẻ dự án phần mềm tiêu biểu mở trong Neovim" title="Hình 4: Danh sách thẻ dự án phần mềm tiêu biểu mở trong Neovim"/>
-            <wp:cNvGraphicFramePr>
-              <a:graphicFrameLocks xmlns:a="http://schemas.openxmlformats.org/drawingml/2006/main" noChangeAspect="1"/>
-            </wp:cNvGraphicFramePr>
-            <a:graphic xmlns:a="http://schemas.openxmlformats.org/drawingml/2006/main">
-              <a:graphicData uri="http://schemas.openxmlformats.org/drawingml/2006/picture">
-                <pic:pic xmlns:pic="http://schemas.openxmlformats.org/drawingml/2006/picture">
-                  <pic:nvPicPr>
-                    <pic:cNvPr id="0" name="" descr=""/>
-                    <pic:cNvPicPr>
-                      <a:picLocks noChangeAspect="1" noChangeArrowheads="1"/>
-                    </pic:cNvPicPr>
-                  </pic:nvPicPr>
-                  <pic:blipFill>
-                    <a:blip r:embed="rId10" cstate="none"/>
-                    <a:srcRect/>
-                    <a:stretch>
-                      <a:fillRect/>
-                    </a:stretch>
-                  </pic:blipFill>
-                  <pic:spPr bwMode="auto">
-                    <a:xfrm>
-                      <a:off x="0" y="0"/>
-                      <a:ext cx="4667250" cy="2619375"/>
-                    </a:xfrm>
-                    <a:prstGeom prst="rect">
-                      <a:avLst/>
-                    </a:prstGeom>
-                  </pic:spPr>
-                </pic:pic>
-              </a:graphicData>
-            </a:graphic>
-          </wp:inline>
-        </w:drawing>
-      </w:r>
-    </w:p>
-    <w:p>
-      <w:pPr>
-        <w:spacing w:after="140"/>
-        <w:jc w:val="center"/>
-      </w:pPr>
-      <w:r>
-        <w:rPr>
-          <w:rFonts w:ascii="Arial" w:cs="Arial" w:eastAsia="Arial" w:hAnsi="Arial"/>
-          <w:color w:val="64748B"/>
-          <w:sz w:val="18"/>
-          <w:szCs w:val="18"/>
-        </w:rPr>
-        <w:t xml:space="preserve">Hình 4: Danh sách thẻ dự án phần mềm tiêu biểu mở trong Neovim</w:t>
-      </w:r>
-    </w:p>
-    <w:p>
-      <w:pPr>
-        <w:pStyle w:val="Heading2"/>
-        <w:spacing w:after="80" w:before="180"/>
-      </w:pPr>
-      <w:r>
-        <w:rPr>
-          <w:rFonts w:ascii="Arial" w:cs="Arial" w:eastAsia="Arial" w:hAnsi="Arial"/>
-          <w:b/>
-          <w:bCs/>
-          <w:color w:val="1E293B"/>
-          <w:sz w:val="22"/>
-          <w:szCs w:val="22"/>
-        </w:rPr>
-        <w:t xml:space="preserve">2.5 Bảng kỹ năng kỹ thuật (&lt;table&gt;)</w:t>
-      </w:r>
-    </w:p>
-    <w:p>
-      <w:pPr>
-        <w:spacing w:after="100" w:line="260"/>
-      </w:pPr>
-      <w:r>
-        <w:rPr>
-          <w:rFonts w:ascii="Arial" w:cs="Arial" w:eastAsia="Arial" w:hAnsi="Arial"/>
-          <w:b w:val="false"/>
-          <w:bCs w:val="false"/>
-          <w:color w:val="334155"/>
-          <w:sz w:val="21"/>
-          <w:szCs w:val="21"/>
-        </w:rPr>
-        <w:t xml:space="preserve">• Để đáp ứng yêu cầu sử dụng phần tử bảng (table) trong đề bài Lab 1, em tạo bảng tổng hợp kỹ năng kỹ thuật gồm 4 nhóm: Smart Contracts, Systems &amp; Languages, AI/ML &amp; Automation, và Infrastructure &amp; DevOps.
-• Cấu trúc bảng gồm thẻ &lt;table&gt;, phần đầu bảng &lt;thead&gt; chứa các ô tiêu đề &lt;th scope="col"&gt;, và phần thân &lt;tbody&gt; chứa các hàng &lt;tr&gt; cùng dữ liệu &lt;td&gt;.</w:t>
-      </w:r>
-    </w:p>
-    <w:p>
-      <w:pPr>
-        <w:spacing w:after="50" w:before="120"/>
-        <w:jc w:val="center"/>
-      </w:pPr>
-      <w:r>
-        <w:drawing>
-          <wp:inline distT="0" distB="0" distL="0" distR="0">
-            <wp:extent cx="4667250" cy="2619375"/>
-            <wp:effectExtent t="0" r="0" b="0" l="0"/>
-            <wp:docPr id="5" name="Hình 5: Bảng kỹ năng kỹ thuật với cấu trúc &lt;table&gt; chuẩn mở trong Neovim" descr="Hình 5: Bảng kỹ năng kỹ thuật với cấu trúc &lt;table&gt; chuẩn mở trong Neovim" title="Hình 5: Bảng kỹ năng kỹ thuật với cấu trúc &lt;table&gt; chuẩn mở trong Neovim"/>
-            <wp:cNvGraphicFramePr>
-              <a:graphicFrameLocks xmlns:a="http://schemas.openxmlformats.org/drawingml/2006/main" noChangeAspect="1"/>
-            </wp:cNvGraphicFramePr>
-            <a:graphic xmlns:a="http://schemas.openxmlformats.org/drawingml/2006/main">
-              <a:graphicData uri="http://schemas.openxmlformats.org/drawingml/2006/picture">
-                <pic:pic xmlns:pic="http://schemas.openxmlformats.org/drawingml/2006/picture">
-                  <pic:nvPicPr>
-                    <pic:cNvPr id="0" name="" descr=""/>
-                    <pic:cNvPicPr>
-                      <a:picLocks noChangeAspect="1" noChangeArrowheads="1"/>
-                    </pic:cNvPicPr>
-                  </pic:nvPicPr>
-                  <pic:blipFill>
-                    <a:blip r:embed="rId10" cstate="none"/>
-                    <a:srcRect/>
-                    <a:stretch>
-                      <a:fillRect/>
-                    </a:stretch>
-                  </pic:blipFill>
-                  <pic:spPr bwMode="auto">
-                    <a:xfrm>
-                      <a:off x="0" y="0"/>
-                      <a:ext cx="4667250" cy="2619375"/>
-                    </a:xfrm>
-                    <a:prstGeom prst="rect">
-                      <a:avLst/>
-                    </a:prstGeom>
-                  </pic:spPr>
-                </pic:pic>
-              </a:graphicData>
-            </a:graphic>
-          </wp:inline>
-        </w:drawing>
-      </w:r>
-    </w:p>
-    <w:p>
-      <w:pPr>
-        <w:spacing w:after="140"/>
-        <w:jc w:val="center"/>
-      </w:pPr>
-      <w:r>
-        <w:rPr>
-          <w:rFonts w:ascii="Arial" w:cs="Arial" w:eastAsia="Arial" w:hAnsi="Arial"/>
-          <w:color w:val="64748B"/>
-          <w:sz w:val="18"/>
-          <w:szCs w:val="18"/>
-        </w:rPr>
-        <w:t xml:space="preserve">Hình 5: Bảng kỹ năng kỹ thuật với cấu trúc &lt;table&gt; chuẩn mở trong Neovim</w:t>
-      </w:r>
-    </w:p>
-    <w:p>
-      <w:pPr>
-        <w:pStyle w:val="Heading2"/>
-        <w:spacing w:after="80" w:before="180"/>
-      </w:pPr>
-      <w:r>
-        <w:rPr>
-          <w:rFonts w:ascii="Arial" w:cs="Arial" w:eastAsia="Arial" w:hAnsi="Arial"/>
-          <w:b/>
-          <w:bCs/>
-          <w:color w:val="1E293B"/>
-          <w:sz w:val="22"/>
-          <w:szCs w:val="22"/>
-        </w:rPr>
-        <w:t xml:space="preserve">2.6 Biểu mẫu liên hệ &amp; Thanh bên Aside (&lt;form&gt;, &lt;aside&gt;, &lt;footer&gt;)</w:t>
-      </w:r>
-    </w:p>
-    <w:p>
-      <w:pPr>
-        <w:spacing w:after="100" w:line="260"/>
-      </w:pPr>
-      <w:r>
-        <w:rPr>
-          <w:rFonts w:ascii="Arial" w:cs="Arial" w:eastAsia="Arial" w:hAnsi="Arial"/>
-          <w:b w:val="false"/>
-          <w:bCs w:val="false"/>
-          <w:color w:val="334155"/>
-          <w:sz w:val="21"/>
-          <w:szCs w:val="21"/>
-        </w:rPr>
-        <w:t xml:space="preserve">• Thẻ &lt;form&gt;: Đáp ứng yêu cầu Form &amp; Input trong Lab 1 với các trường họ tên (&lt;input type="text"&gt;), email (&lt;input type="email"&gt;), ô nhập nội dung (&lt;textarea&gt;) và nút gửi (&lt;button type="submit"&gt;). Mỗi ô nhập đều có &lt;label&gt; gắn liền qua thuộc tính for/id.
-• Thẻ &lt;aside&gt;: Thanh bên chứa thông tin học vấn (Đại học Công nghệ Thông tin &amp; Birmingham City University), giải thưởng cuộc thi bằng danh sách có thứ tự &lt;ol&gt;, và thông số kỹ thuật nhanh bằng danh sách định nghĩa &lt;dl&gt;, &lt;dt&gt;, &lt;dd&gt;.
-• Thẻ &lt;footer&gt;: Chân trang thể hiện bản quyền cá nhân và đường link quay về đầu trang.</w:t>
-      </w:r>
-    </w:p>
-    <w:p>
-      <w:pPr>
-        <w:spacing w:after="50" w:before="120"/>
-        <w:jc w:val="center"/>
-      </w:pPr>
-      <w:r>
-        <w:drawing>
-          <wp:inline distT="0" distB="0" distL="0" distR="0">
-            <wp:extent cx="4667250" cy="2619375"/>
-            <wp:effectExtent t="0" r="0" b="0" l="0"/>
-            <wp:docPr id="6" name="Hình 6: Biểu mẫu &lt;form&gt;, thanh bên &lt;aside&gt; và chân trang &lt;footer&gt; mở trong Neovim" descr="Hình 6: Biểu mẫu &lt;form&gt;, thanh bên &lt;aside&gt; và chân trang &lt;footer&gt; mở trong Neovim" title="Hình 6: Biểu mẫu &lt;form&gt;, thanh bên &lt;aside&gt; và chân trang &lt;footer&gt; mở trong Neovim"/>
-            <wp:cNvGraphicFramePr>
-              <a:graphicFrameLocks xmlns:a="http://schemas.openxmlformats.org/drawingml/2006/main" noChangeAspect="1"/>
-            </wp:cNvGraphicFramePr>
-            <a:graphic xmlns:a="http://schemas.openxmlformats.org/drawingml/2006/main">
-              <a:graphicData uri="http://schemas.openxmlformats.org/drawingml/2006/picture">
-                <pic:pic xmlns:pic="http://schemas.openxmlformats.org/drawingml/2006/picture">
-                  <pic:nvPicPr>
-                    <pic:cNvPr id="0" name="" descr=""/>
-                    <pic:cNvPicPr>
-                      <a:picLocks noChangeAspect="1" noChangeArrowheads="1"/>
-                    </pic:cNvPicPr>
-                  </pic:nvPicPr>
-                  <pic:blipFill>
-                    <a:blip r:embed="rId10" cstate="none"/>
-                    <a:srcRect/>
-                    <a:stretch>
-                      <a:fillRect/>
-                    </a:stretch>
-                  </pic:blipFill>
-                  <pic:spPr bwMode="auto">
-                    <a:xfrm>
-                      <a:off x="0" y="0"/>
-                      <a:ext cx="4667250" cy="2619375"/>
-                    </a:xfrm>
-                    <a:prstGeom prst="rect">
-                      <a:avLst/>
-                    </a:prstGeom>
-                  </pic:spPr>
-                </pic:pic>
-              </a:graphicData>
-            </a:graphic>
-          </wp:inline>
-        </w:drawing>
-      </w:r>
-    </w:p>
-    <w:p>
-      <w:pPr>
-        <w:spacing w:after="140"/>
-        <w:jc w:val="center"/>
-      </w:pPr>
-      <w:r>
-        <w:rPr>
-          <w:rFonts w:ascii="Arial" w:cs="Arial" w:eastAsia="Arial" w:hAnsi="Arial"/>
-          <w:color w:val="64748B"/>
-          <w:sz w:val="18"/>
-          <w:szCs w:val="18"/>
-        </w:rPr>
-        <w:t xml:space="preserve">Hình 6: Biểu mẫu &lt;form&gt;, thanh bên &lt;aside&gt; và chân trang &lt;footer&gt; mở trong Neovim</w:t>
-      </w:r>
-    </w:p>
-    <w:p>
-      <w:pPr>
-        <w:pStyle w:val="Heading1"/>
-        <w:spacing w:after="120" w:before="240"/>
-      </w:pPr>
-      <w:r>
-        <w:rPr>
-          <w:rFonts w:ascii="Arial" w:cs="Arial" w:eastAsia="Arial" w:hAnsi="Arial"/>
-          <w:b/>
-          <w:bCs/>
-          <w:color w:val="0F172A"/>
-          <w:sz w:val="26"/>
-          <w:szCs w:val="26"/>
-        </w:rPr>
-        <w:t xml:space="preserve">3. Phân Tích Mã Nguồn CSS (style.css)</w:t>
-      </w:r>
-    </w:p>
-    <w:p>
-      <w:pPr>
-        <w:spacing w:after="100" w:line="260"/>
-      </w:pPr>
-      <w:r>
-        <w:rPr>
-          <w:rFonts w:ascii="Arial" w:cs="Arial" w:eastAsia="Arial" w:hAnsi="Arial"/>
-          <w:b w:val="false"/>
-          <w:bCs w:val="false"/>
-          <w:color w:val="334155"/>
-          <w:sz w:val="21"/>
-          <w:szCs w:val="21"/>
-        </w:rPr>
-        <w:t xml:space="preserve">File CSS được tách riêng và liên kết với HTML theo đúng khuyến nghị của đề bài (External CSS). Phong cách thiết kế ưu tiên sự gọn gàng, tính phân cấp rõ ràng và hỗ trợ tốt trên màn hình di động.</w:t>
-      </w:r>
-    </w:p>
-    <w:p>
-      <w:pPr>
-        <w:pStyle w:val="Heading2"/>
-        <w:spacing w:after="80" w:before="180"/>
-      </w:pPr>
-      <w:r>
-        <w:rPr>
-          <w:rFonts w:ascii="Arial" w:cs="Arial" w:eastAsia="Arial" w:hAnsi="Arial"/>
-          <w:b/>
-          <w:bCs/>
-          <w:color w:val="1E293B"/>
-          <w:sz w:val="22"/>
-          <w:szCs w:val="22"/>
-        </w:rPr>
-        <w:t xml:space="preserve">3.1 Biến CSS, Reset &amp; Box Model</w:t>
-      </w:r>
-    </w:p>
-    <w:p>
-      <w:pPr>
-        <w:spacing w:after="100" w:line="260"/>
-      </w:pPr>
-      <w:r>
-        <w:rPr>
-          <w:rFonts w:ascii="Arial" w:cs="Arial" w:eastAsia="Arial" w:hAnsi="Arial"/>
-          <w:b w:val="false"/>
-          <w:bCs w:val="false"/>
-          <w:color w:val="334155"/>
-          <w:sz w:val="21"/>
-          <w:szCs w:val="21"/>
-        </w:rPr>
-        <w:t xml:space="preserve">• Khối :root khai báo các biến CSS (CSS Variables) để quản lý tập trung mã màu nền (--bg: #0f1013), màu bề mặt (--surface: #15171c), màu viền (--border: #22252c) và màu chữ (--text: #e1e4ea).
-• Quy tắc * { box-sizing: border-box; } giúp tính toán kích thước phần tử chính xác gồm cả padding và border, tránh lỗi vỡ bố cục khi thêm khoảng đệm.</w:t>
-      </w:r>
-    </w:p>
-    <w:p>
-      <w:pPr>
-        <w:spacing w:after="50" w:before="120"/>
-        <w:jc w:val="center"/>
-      </w:pPr>
-      <w:r>
-        <w:drawing>
-          <wp:inline distT="0" distB="0" distL="0" distR="0">
-            <wp:extent cx="4667250" cy="2619375"/>
-            <wp:effectExtent t="0" r="0" b="0" l="0"/>
-            <wp:docPr id="7" name="Hình 7: Khai báo biến CSS :root và thiết lập Box Model mở trong Neovim" descr="Hình 7: Khai báo biến CSS :root và thiết lập Box Model mở trong Neovim" title="Hình 7: Khai báo biến CSS :root và thiết lập Box Model mở trong Neovim"/>
-            <wp:cNvGraphicFramePr>
-              <a:graphicFrameLocks xmlns:a="http://schemas.openxmlformats.org/drawingml/2006/main" noChangeAspect="1"/>
-            </wp:cNvGraphicFramePr>
-            <a:graphic xmlns:a="http://schemas.openxmlformats.org/drawingml/2006/main">
-              <a:graphicData uri="http://schemas.openxmlformats.org/drawingml/2006/picture">
-                <pic:pic xmlns:pic="http://schemas.openxmlformats.org/drawingml/2006/picture">
-                  <pic:nvPicPr>
-                    <pic:cNvPr id="0" name="" descr=""/>
-                    <pic:cNvPicPr>
-                      <a:picLocks noChangeAspect="1" noChangeArrowheads="1"/>
-                    </pic:cNvPicPr>
-                  </pic:nvPicPr>
-                  <pic:blipFill>
                     <a:blip r:embed="rId11" cstate="none"/>
                     <a:srcRect/>
                     <a:stretch>
@@ -1132,7 +718,7 @@
           <w:sz w:val="18"/>
           <w:szCs w:val="18"/>
         </w:rPr>
-        <w:t xml:space="preserve">Hình 7: Khai báo biến CSS :root và thiết lập Box Model mở trong Neovim</w:t>
+        <w:t xml:space="preserve">Hình 3: Cấu trúc &lt;section&gt; và các thẻ &lt;article&gt; kinh nghiệm mở trong Neovim</w:t>
       </w:r>
     </w:p>
     <w:p>
@@ -1149,7 +735,7 @@
           <w:sz w:val="22"/>
           <w:szCs w:val="22"/>
         </w:rPr>
-        <w:t xml:space="preserve">3.2 Định kiểu Navigation &amp; Header</w:t>
+        <w:t xml:space="preserve">2.4 Phần dự án tiêu biểu (&lt;section id="projects"&gt;)</w:t>
       </w:r>
     </w:p>
     <w:p>
@@ -1165,8 +751,8 @@
           <w:sz w:val="21"/>
           <w:szCs w:val="21"/>
         </w:rPr>
-        <w:t xml:space="preserve">• Thanh .navbar sử dụng position: sticky và backdrop-filter: blur(8px) giúp thanh menu cố định phía trên khi cuộn trang.
-• Bố cục header dùng Flexbox chia hai phần: khối văn bản thông tin bên trái và ảnh đại diện bo tròn bên phải.</w:t>
+        <w:t xml:space="preserve">• Khu vực danh sách dự án bao gồm 4 dự án phần mềm chính: Streaming Anomaly Detector, Supply Chain Optimization Protocol, Deep Neural Network from Scratch, và Evolutionary Multi-Agent Simulator.
+• Mỗi dự án là một thẻ &lt;article class="project-item"&gt; chứa tiêu đề có liên kết &lt;a&gt;, nhãn công nghệ sử dụng và đoạn mô tả ngắn gọn.</w:t>
       </w:r>
     </w:p>
     <w:p>
@@ -1179,7 +765,7 @@
           <wp:inline distT="0" distB="0" distL="0" distR="0">
             <wp:extent cx="4667250" cy="2619375"/>
             <wp:effectExtent t="0" r="0" b="0" l="0"/>
-            <wp:docPr id="8" name="Hình 8: Định kiểu thanh điều hướng và header mở trong Neovim" descr="Hình 8: Định kiểu thanh điều hướng và header mở trong Neovim" title="Hình 8: Định kiểu thanh điều hướng và header mở trong Neovim"/>
+            <wp:docPr id="4" name="Hình 4: Danh sách thẻ dự án phần mềm tiêu biểu mở trong Neovim" descr="Hình 4: Danh sách thẻ dự án phần mềm tiêu biểu mở trong Neovim" title="Hình 4: Danh sách thẻ dự án phần mềm tiêu biểu mở trong Neovim"/>
             <wp:cNvGraphicFramePr>
               <a:graphicFrameLocks xmlns:a="http://schemas.openxmlformats.org/drawingml/2006/main" noChangeAspect="1"/>
             </wp:cNvGraphicFramePr>
@@ -1193,7 +779,7 @@
                     </pic:cNvPicPr>
                   </pic:nvPicPr>
                   <pic:blipFill>
-                    <a:blip r:embed="rId11" cstate="none"/>
+                    <a:blip r:embed="rId12" cstate="none"/>
                     <a:srcRect/>
                     <a:stretch>
                       <a:fillRect/>
@@ -1227,7 +813,7 @@
           <w:sz w:val="18"/>
           <w:szCs w:val="18"/>
         </w:rPr>
-        <w:t xml:space="preserve">Hình 8: Định kiểu thanh điều hướng và header mở trong Neovim</w:t>
+        <w:t xml:space="preserve">Hình 4: Danh sách thẻ dự án phần mềm tiêu biểu mở trong Neovim</w:t>
       </w:r>
     </w:p>
     <w:p>
@@ -1244,7 +830,7 @@
           <w:sz w:val="22"/>
           <w:szCs w:val="22"/>
         </w:rPr>
-        <w:t xml:space="preserve">3.3 Bố cục nội dung chính, Card &amp; Hiệu ứng Hover (Exercise 4)</w:t>
+        <w:t xml:space="preserve">2.5 Bảng kỹ năng kỹ thuật (&lt;table&gt;)</w:t>
       </w:r>
     </w:p>
     <w:p>
@@ -1260,8 +846,8 @@
           <w:sz w:val="21"/>
           <w:szCs w:val="21"/>
         </w:rPr>
-        <w:t xml:space="preserve">• Bố cục trang chia thành 2 cột bằng CSS Grid (.layout-container { display: grid; grid-template-columns: 1fr 310px; gap: 48px; }).
-• Thực hiện yêu cầu Exercise 4 trong đề bài: Thẻ dự án .project-item và nút bấm đều được gắn transition: border-color 0.2s ease, transform 0.2s ease. Khi rê chuột qua (:hover), phần tử nhấc lên nhẹ nhàng bằng transform: translateY(-2px) và viền sáng hơn, tạo phản hồi xúc giác tự nhiên.</w:t>
+        <w:t xml:space="preserve">• Để đáp ứng yêu cầu sử dụng phần tử bảng (table) trong đề bài Lab 1, em tạo bảng tổng hợp kỹ năng kỹ thuật gồm 4 nhóm: Smart Contracts, Systems &amp; Languages, AI/ML &amp; Automation, và Infrastructure &amp; DevOps.
+• Cấu trúc bảng gồm thẻ &lt;table&gt;, phần đầu bảng &lt;thead&gt; chứa các ô tiêu đề &lt;th scope="col"&gt;, và phần thân &lt;tbody&gt; chứa các hàng &lt;tr&gt; cùng dữ liệu &lt;td&gt;.</w:t>
       </w:r>
     </w:p>
     <w:p>
@@ -1274,7 +860,7 @@
           <wp:inline distT="0" distB="0" distL="0" distR="0">
             <wp:extent cx="4667250" cy="2619375"/>
             <wp:effectExtent t="0" r="0" b="0" l="0"/>
-            <wp:docPr id="9" name="Hình 9: Định kiểu danh sách bài viết và hiệu ứng hover mở trong Neovim" descr="Hình 9: Định kiểu danh sách bài viết và hiệu ứng hover mở trong Neovim" title="Hình 9: Định kiểu danh sách bài viết và hiệu ứng hover mở trong Neovim"/>
+            <wp:docPr id="5" name="Hình 5: Bảng kỹ năng kỹ thuật với cấu trúc &lt;table&gt; chuẩn mở trong Neovim" descr="Hình 5: Bảng kỹ năng kỹ thuật với cấu trúc &lt;table&gt; chuẩn mở trong Neovim" title="Hình 5: Bảng kỹ năng kỹ thuật với cấu trúc &lt;table&gt; chuẩn mở trong Neovim"/>
             <wp:cNvGraphicFramePr>
               <a:graphicFrameLocks xmlns:a="http://schemas.openxmlformats.org/drawingml/2006/main" noChangeAspect="1"/>
             </wp:cNvGraphicFramePr>
@@ -1288,7 +874,7 @@
                     </pic:cNvPicPr>
                   </pic:nvPicPr>
                   <pic:blipFill>
-                    <a:blip r:embed="rId11" cstate="none"/>
+                    <a:blip r:embed="rId13" cstate="none"/>
                     <a:srcRect/>
                     <a:stretch>
                       <a:fillRect/>
@@ -1322,7 +908,7 @@
           <w:sz w:val="18"/>
           <w:szCs w:val="18"/>
         </w:rPr>
-        <w:t xml:space="preserve">Hình 9: Định kiểu danh sách bài viết và hiệu ứng hover mở trong Neovim</w:t>
+        <w:t xml:space="preserve">Hình 5: Bảng kỹ năng kỹ thuật với cấu trúc &lt;table&gt; chuẩn mở trong Neovim</w:t>
       </w:r>
     </w:p>
     <w:p>
@@ -1339,7 +925,7 @@
           <w:sz w:val="22"/>
           <w:szCs w:val="22"/>
         </w:rPr>
-        <w:t xml:space="preserve">3.4 Định kiểu Bảng dữ liệu &amp; Form liên hệ</w:t>
+        <w:t xml:space="preserve">2.6 Biểu mẫu liên hệ &amp; Thanh bên Aside (&lt;form&gt;, &lt;aside&gt;, &lt;footer&gt;)</w:t>
       </w:r>
     </w:p>
     <w:p>
@@ -1355,9 +941,9 @@
           <w:sz w:val="21"/>
           <w:szCs w:val="21"/>
         </w:rPr>
-        <w:t xml:space="preserve">• Bảng dữ liệu được bọc trong container có overflow-x: auto để không bị tràn khi xem trên màn hình nhỏ. Hàng bảng có hiệu ứng đổi màu nền nhẹ khi rê chuột.
-• Ô nhập liệu input và textarea khi focus sẽ đổi màu viền sang --border-focus (#4b5563) để người dùng nhận biết vị trí đang gõ phím.
-• Áp dụng Media Query (@media (max-width: 860px) và @media (max-width: 600px)) để tự động chuyển bố cục lưới thành 1 cột trên màn hình điện thoại.</w:t>
+        <w:t xml:space="preserve">• Thẻ &lt;form&gt;: Đáp ứng yêu cầu Form &amp; Input trong Lab 1 với các trường họ tên (&lt;input type="text"&gt;), email (&lt;input type="email"&gt;), ô nhập nội dung (&lt;textarea&gt;) và nút gửi (&lt;button type="submit"&gt;). Mỗi ô nhập đều có &lt;label&gt; gắn liền qua thuộc tính for/id.
+• Thẻ &lt;aside&gt;: Thanh bên chứa thông tin học vấn (Đại học Công nghệ Thông tin &amp; Birmingham City University), giải thưởng cuộc thi bằng danh sách có thứ tự &lt;ol&gt;, và thông số kỹ thuật nhanh bằng danh sách định nghĩa &lt;dl&gt;, &lt;dt&gt;, &lt;dd&gt;.
+• Thẻ &lt;footer&gt;: Chân trang thể hiện bản quyền cá nhân và đường link quay về đầu trang.</w:t>
       </w:r>
     </w:p>
     <w:p>
@@ -1370,7 +956,7 @@
           <wp:inline distT="0" distB="0" distL="0" distR="0">
             <wp:extent cx="4667250" cy="2619375"/>
             <wp:effectExtent t="0" r="0" b="0" l="0"/>
-            <wp:docPr id="10" name="Hình 10: Định kiểu bảng, form liên hệ và media queries mở trong Neovim" descr="Hình 10: Định kiểu bảng, form liên hệ và media queries mở trong Neovim" title="Hình 10: Định kiểu bảng, form liên hệ và media queries mở trong Neovim"/>
+            <wp:docPr id="6" name="Hình 6: Biểu mẫu &lt;form&gt;, thanh bên &lt;aside&gt; và chân trang &lt;footer&gt; mở trong Neovim" descr="Hình 6: Biểu mẫu &lt;form&gt;, thanh bên &lt;aside&gt; và chân trang &lt;footer&gt; mở trong Neovim" title="Hình 6: Biểu mẫu &lt;form&gt;, thanh bên &lt;aside&gt; và chân trang &lt;footer&gt; mở trong Neovim"/>
             <wp:cNvGraphicFramePr>
               <a:graphicFrameLocks xmlns:a="http://schemas.openxmlformats.org/drawingml/2006/main" noChangeAspect="1"/>
             </wp:cNvGraphicFramePr>
@@ -1384,7 +970,7 @@
                     </pic:cNvPicPr>
                   </pic:nvPicPr>
                   <pic:blipFill>
-                    <a:blip r:embed="rId11" cstate="none"/>
+                    <a:blip r:embed="rId14" cstate="none"/>
                     <a:srcRect/>
                     <a:stretch>
                       <a:fillRect/>
@@ -1418,6 +1004,420 @@
           <w:sz w:val="18"/>
           <w:szCs w:val="18"/>
         </w:rPr>
+        <w:t xml:space="preserve">Hình 6: Biểu mẫu &lt;form&gt;, thanh bên &lt;aside&gt; và chân trang &lt;footer&gt; mở trong Neovim</w:t>
+      </w:r>
+    </w:p>
+    <w:p>
+      <w:pPr>
+        <w:pStyle w:val="Heading1"/>
+        <w:spacing w:after="120" w:before="240"/>
+      </w:pPr>
+      <w:r>
+        <w:rPr>
+          <w:rFonts w:ascii="Arial" w:cs="Arial" w:eastAsia="Arial" w:hAnsi="Arial"/>
+          <w:b/>
+          <w:bCs/>
+          <w:color w:val="0F172A"/>
+          <w:sz w:val="26"/>
+          <w:szCs w:val="26"/>
+        </w:rPr>
+        <w:t xml:space="preserve">3. Phân Tích Mã Nguồn CSS (style.css)</w:t>
+      </w:r>
+    </w:p>
+    <w:p>
+      <w:pPr>
+        <w:spacing w:after="100" w:line="260"/>
+      </w:pPr>
+      <w:r>
+        <w:rPr>
+          <w:rFonts w:ascii="Arial" w:cs="Arial" w:eastAsia="Arial" w:hAnsi="Arial"/>
+          <w:b w:val="false"/>
+          <w:bCs w:val="false"/>
+          <w:color w:val="334155"/>
+          <w:sz w:val="21"/>
+          <w:szCs w:val="21"/>
+        </w:rPr>
+        <w:t xml:space="preserve">File CSS được tách riêng và liên kết với HTML theo đúng khuyến nghị của đề bài (External CSS). Phong cách thiết kế ưu tiên sự gọn gàng, tính phân cấp rõ ràng và hỗ trợ tốt trên màn hình di động.</w:t>
+      </w:r>
+    </w:p>
+    <w:p>
+      <w:pPr>
+        <w:pStyle w:val="Heading2"/>
+        <w:spacing w:after="80" w:before="180"/>
+      </w:pPr>
+      <w:r>
+        <w:rPr>
+          <w:rFonts w:ascii="Arial" w:cs="Arial" w:eastAsia="Arial" w:hAnsi="Arial"/>
+          <w:b/>
+          <w:bCs/>
+          <w:color w:val="1E293B"/>
+          <w:sz w:val="22"/>
+          <w:szCs w:val="22"/>
+        </w:rPr>
+        <w:t xml:space="preserve">3.1 Biến CSS, Reset &amp; Box Model</w:t>
+      </w:r>
+    </w:p>
+    <w:p>
+      <w:pPr>
+        <w:spacing w:after="100" w:line="260"/>
+      </w:pPr>
+      <w:r>
+        <w:rPr>
+          <w:rFonts w:ascii="Arial" w:cs="Arial" w:eastAsia="Arial" w:hAnsi="Arial"/>
+          <w:b w:val="false"/>
+          <w:bCs w:val="false"/>
+          <w:color w:val="334155"/>
+          <w:sz w:val="21"/>
+          <w:szCs w:val="21"/>
+        </w:rPr>
+        <w:t xml:space="preserve">• Khối :root khai báo các biến CSS (CSS Variables) để quản lý tập trung mã màu nền (--bg: #0f1013), màu bề mặt (--surface: #15171c), màu viền (--border: #22252c) và màu chữ (--text: #e1e4ea).
+• Quy tắc * { box-sizing: border-box; } giúp tính toán kích thước phần tử chính xác gồm cả padding và border, tránh lỗi vỡ bố cục khi thêm khoảng đệm.</w:t>
+      </w:r>
+    </w:p>
+    <w:p>
+      <w:pPr>
+        <w:spacing w:after="50" w:before="120"/>
+        <w:jc w:val="center"/>
+      </w:pPr>
+      <w:r>
+        <w:drawing>
+          <wp:inline distT="0" distB="0" distL="0" distR="0">
+            <wp:extent cx="4667250" cy="2619375"/>
+            <wp:effectExtent t="0" r="0" b="0" l="0"/>
+            <wp:docPr id="7" name="Hình 7: Khai báo biến CSS :root và thiết lập Box Model mở trong Neovim" descr="Hình 7: Khai báo biến CSS :root và thiết lập Box Model mở trong Neovim" title="Hình 7: Khai báo biến CSS :root và thiết lập Box Model mở trong Neovim"/>
+            <wp:cNvGraphicFramePr>
+              <a:graphicFrameLocks xmlns:a="http://schemas.openxmlformats.org/drawingml/2006/main" noChangeAspect="1"/>
+            </wp:cNvGraphicFramePr>
+            <a:graphic xmlns:a="http://schemas.openxmlformats.org/drawingml/2006/main">
+              <a:graphicData uri="http://schemas.openxmlformats.org/drawingml/2006/picture">
+                <pic:pic xmlns:pic="http://schemas.openxmlformats.org/drawingml/2006/picture">
+                  <pic:nvPicPr>
+                    <pic:cNvPr id="0" name="" descr=""/>
+                    <pic:cNvPicPr>
+                      <a:picLocks noChangeAspect="1" noChangeArrowheads="1"/>
+                    </pic:cNvPicPr>
+                  </pic:nvPicPr>
+                  <pic:blipFill>
+                    <a:blip r:embed="rId15" cstate="none"/>
+                    <a:srcRect/>
+                    <a:stretch>
+                      <a:fillRect/>
+                    </a:stretch>
+                  </pic:blipFill>
+                  <pic:spPr bwMode="auto">
+                    <a:xfrm>
+                      <a:off x="0" y="0"/>
+                      <a:ext cx="4667250" cy="2619375"/>
+                    </a:xfrm>
+                    <a:prstGeom prst="rect">
+                      <a:avLst/>
+                    </a:prstGeom>
+                  </pic:spPr>
+                </pic:pic>
+              </a:graphicData>
+            </a:graphic>
+          </wp:inline>
+        </w:drawing>
+      </w:r>
+    </w:p>
+    <w:p>
+      <w:pPr>
+        <w:spacing w:after="140"/>
+        <w:jc w:val="center"/>
+      </w:pPr>
+      <w:r>
+        <w:rPr>
+          <w:rFonts w:ascii="Arial" w:cs="Arial" w:eastAsia="Arial" w:hAnsi="Arial"/>
+          <w:color w:val="64748B"/>
+          <w:sz w:val="18"/>
+          <w:szCs w:val="18"/>
+        </w:rPr>
+        <w:t xml:space="preserve">Hình 7: Khai báo biến CSS :root và thiết lập Box Model mở trong Neovim</w:t>
+      </w:r>
+    </w:p>
+    <w:p>
+      <w:pPr>
+        <w:pStyle w:val="Heading2"/>
+        <w:spacing w:after="80" w:before="180"/>
+      </w:pPr>
+      <w:r>
+        <w:rPr>
+          <w:rFonts w:ascii="Arial" w:cs="Arial" w:eastAsia="Arial" w:hAnsi="Arial"/>
+          <w:b/>
+          <w:bCs/>
+          <w:color w:val="1E293B"/>
+          <w:sz w:val="22"/>
+          <w:szCs w:val="22"/>
+        </w:rPr>
+        <w:t xml:space="preserve">3.2 Định kiểu Navigation &amp; Header</w:t>
+      </w:r>
+    </w:p>
+    <w:p>
+      <w:pPr>
+        <w:spacing w:after="100" w:line="260"/>
+      </w:pPr>
+      <w:r>
+        <w:rPr>
+          <w:rFonts w:ascii="Arial" w:cs="Arial" w:eastAsia="Arial" w:hAnsi="Arial"/>
+          <w:b w:val="false"/>
+          <w:bCs w:val="false"/>
+          <w:color w:val="334155"/>
+          <w:sz w:val="21"/>
+          <w:szCs w:val="21"/>
+        </w:rPr>
+        <w:t xml:space="preserve">• Thanh .navbar sử dụng position: sticky và backdrop-filter: blur(8px) giúp thanh menu cố định phía trên khi cuộn trang.
+• Bố cục header dùng Flexbox chia hai phần: khối văn bản thông tin bên trái và ảnh đại diện bo tròn bên phải.</w:t>
+      </w:r>
+    </w:p>
+    <w:p>
+      <w:pPr>
+        <w:spacing w:after="50" w:before="120"/>
+        <w:jc w:val="center"/>
+      </w:pPr>
+      <w:r>
+        <w:drawing>
+          <wp:inline distT="0" distB="0" distL="0" distR="0">
+            <wp:extent cx="4667250" cy="2619375"/>
+            <wp:effectExtent t="0" r="0" b="0" l="0"/>
+            <wp:docPr id="8" name="Hình 8: Định kiểu thanh điều hướng và header mở trong Neovim" descr="Hình 8: Định kiểu thanh điều hướng và header mở trong Neovim" title="Hình 8: Định kiểu thanh điều hướng và header mở trong Neovim"/>
+            <wp:cNvGraphicFramePr>
+              <a:graphicFrameLocks xmlns:a="http://schemas.openxmlformats.org/drawingml/2006/main" noChangeAspect="1"/>
+            </wp:cNvGraphicFramePr>
+            <a:graphic xmlns:a="http://schemas.openxmlformats.org/drawingml/2006/main">
+              <a:graphicData uri="http://schemas.openxmlformats.org/drawingml/2006/picture">
+                <pic:pic xmlns:pic="http://schemas.openxmlformats.org/drawingml/2006/picture">
+                  <pic:nvPicPr>
+                    <pic:cNvPr id="0" name="" descr=""/>
+                    <pic:cNvPicPr>
+                      <a:picLocks noChangeAspect="1" noChangeArrowheads="1"/>
+                    </pic:cNvPicPr>
+                  </pic:nvPicPr>
+                  <pic:blipFill>
+                    <a:blip r:embed="rId16" cstate="none"/>
+                    <a:srcRect/>
+                    <a:stretch>
+                      <a:fillRect/>
+                    </a:stretch>
+                  </pic:blipFill>
+                  <pic:spPr bwMode="auto">
+                    <a:xfrm>
+                      <a:off x="0" y="0"/>
+                      <a:ext cx="4667250" cy="2619375"/>
+                    </a:xfrm>
+                    <a:prstGeom prst="rect">
+                      <a:avLst/>
+                    </a:prstGeom>
+                  </pic:spPr>
+                </pic:pic>
+              </a:graphicData>
+            </a:graphic>
+          </wp:inline>
+        </w:drawing>
+      </w:r>
+    </w:p>
+    <w:p>
+      <w:pPr>
+        <w:spacing w:after="140"/>
+        <w:jc w:val="center"/>
+      </w:pPr>
+      <w:r>
+        <w:rPr>
+          <w:rFonts w:ascii="Arial" w:cs="Arial" w:eastAsia="Arial" w:hAnsi="Arial"/>
+          <w:color w:val="64748B"/>
+          <w:sz w:val="18"/>
+          <w:szCs w:val="18"/>
+        </w:rPr>
+        <w:t xml:space="preserve">Hình 8: Định kiểu thanh điều hướng và header mở trong Neovim</w:t>
+      </w:r>
+    </w:p>
+    <w:p>
+      <w:pPr>
+        <w:pStyle w:val="Heading2"/>
+        <w:spacing w:after="80" w:before="180"/>
+      </w:pPr>
+      <w:r>
+        <w:rPr>
+          <w:rFonts w:ascii="Arial" w:cs="Arial" w:eastAsia="Arial" w:hAnsi="Arial"/>
+          <w:b/>
+          <w:bCs/>
+          <w:color w:val="1E293B"/>
+          <w:sz w:val="22"/>
+          <w:szCs w:val="22"/>
+        </w:rPr>
+        <w:t xml:space="preserve">3.3 Bố cục nội dung chính, Card &amp; Hiệu ứng Hover (Exercise 4)</w:t>
+      </w:r>
+    </w:p>
+    <w:p>
+      <w:pPr>
+        <w:spacing w:after="100" w:line="260"/>
+      </w:pPr>
+      <w:r>
+        <w:rPr>
+          <w:rFonts w:ascii="Arial" w:cs="Arial" w:eastAsia="Arial" w:hAnsi="Arial"/>
+          <w:b w:val="false"/>
+          <w:bCs w:val="false"/>
+          <w:color w:val="334155"/>
+          <w:sz w:val="21"/>
+          <w:szCs w:val="21"/>
+        </w:rPr>
+        <w:t xml:space="preserve">• Bố cục trang chia thành 2 cột bằng CSS Grid (.layout-container { display: grid; grid-template-columns: 1fr 310px; gap: 48px; }).
+• Thực hiện yêu cầu Exercise 4 trong đề bài: Thẻ dự án .project-item và nút bấm đều được gắn transition: border-color 0.2s ease, transform 0.2s ease. Khi rê chuột qua (:hover), phần tử nhấc lên nhẹ nhàng bằng transform: translateY(-2px) và viền sáng hơn, tạo phản hồi xúc giác tự nhiên.</w:t>
+      </w:r>
+    </w:p>
+    <w:p>
+      <w:pPr>
+        <w:spacing w:after="50" w:before="120"/>
+        <w:jc w:val="center"/>
+      </w:pPr>
+      <w:r>
+        <w:drawing>
+          <wp:inline distT="0" distB="0" distL="0" distR="0">
+            <wp:extent cx="4667250" cy="2619375"/>
+            <wp:effectExtent t="0" r="0" b="0" l="0"/>
+            <wp:docPr id="9" name="Hình 9: Định kiểu danh sách bài viết và hiệu ứng hover mở trong Neovim" descr="Hình 9: Định kiểu danh sách bài viết và hiệu ứng hover mở trong Neovim" title="Hình 9: Định kiểu danh sách bài viết và hiệu ứng hover mở trong Neovim"/>
+            <wp:cNvGraphicFramePr>
+              <a:graphicFrameLocks xmlns:a="http://schemas.openxmlformats.org/drawingml/2006/main" noChangeAspect="1"/>
+            </wp:cNvGraphicFramePr>
+            <a:graphic xmlns:a="http://schemas.openxmlformats.org/drawingml/2006/main">
+              <a:graphicData uri="http://schemas.openxmlformats.org/drawingml/2006/picture">
+                <pic:pic xmlns:pic="http://schemas.openxmlformats.org/drawingml/2006/picture">
+                  <pic:nvPicPr>
+                    <pic:cNvPr id="0" name="" descr=""/>
+                    <pic:cNvPicPr>
+                      <a:picLocks noChangeAspect="1" noChangeArrowheads="1"/>
+                    </pic:cNvPicPr>
+                  </pic:nvPicPr>
+                  <pic:blipFill>
+                    <a:blip r:embed="rId17" cstate="none"/>
+                    <a:srcRect/>
+                    <a:stretch>
+                      <a:fillRect/>
+                    </a:stretch>
+                  </pic:blipFill>
+                  <pic:spPr bwMode="auto">
+                    <a:xfrm>
+                      <a:off x="0" y="0"/>
+                      <a:ext cx="4667250" cy="2619375"/>
+                    </a:xfrm>
+                    <a:prstGeom prst="rect">
+                      <a:avLst/>
+                    </a:prstGeom>
+                  </pic:spPr>
+                </pic:pic>
+              </a:graphicData>
+            </a:graphic>
+          </wp:inline>
+        </w:drawing>
+      </w:r>
+    </w:p>
+    <w:p>
+      <w:pPr>
+        <w:spacing w:after="140"/>
+        <w:jc w:val="center"/>
+      </w:pPr>
+      <w:r>
+        <w:rPr>
+          <w:rFonts w:ascii="Arial" w:cs="Arial" w:eastAsia="Arial" w:hAnsi="Arial"/>
+          <w:color w:val="64748B"/>
+          <w:sz w:val="18"/>
+          <w:szCs w:val="18"/>
+        </w:rPr>
+        <w:t xml:space="preserve">Hình 9: Định kiểu danh sách bài viết và hiệu ứng hover mở trong Neovim</w:t>
+      </w:r>
+    </w:p>
+    <w:p>
+      <w:pPr>
+        <w:pStyle w:val="Heading2"/>
+        <w:spacing w:after="80" w:before="180"/>
+      </w:pPr>
+      <w:r>
+        <w:rPr>
+          <w:rFonts w:ascii="Arial" w:cs="Arial" w:eastAsia="Arial" w:hAnsi="Arial"/>
+          <w:b/>
+          <w:bCs/>
+          <w:color w:val="1E293B"/>
+          <w:sz w:val="22"/>
+          <w:szCs w:val="22"/>
+        </w:rPr>
+        <w:t xml:space="preserve">3.4 Định kiểu Bảng dữ liệu &amp; Form liên hệ</w:t>
+      </w:r>
+    </w:p>
+    <w:p>
+      <w:pPr>
+        <w:spacing w:after="100" w:line="260"/>
+      </w:pPr>
+      <w:r>
+        <w:rPr>
+          <w:rFonts w:ascii="Arial" w:cs="Arial" w:eastAsia="Arial" w:hAnsi="Arial"/>
+          <w:b w:val="false"/>
+          <w:bCs w:val="false"/>
+          <w:color w:val="334155"/>
+          <w:sz w:val="21"/>
+          <w:szCs w:val="21"/>
+        </w:rPr>
+        <w:t xml:space="preserve">• Bảng dữ liệu được bọc trong container có overflow-x: auto để không bị tràn khi xem trên màn hình nhỏ. Hàng bảng có hiệu ứng đổi màu nền nhẹ khi rê chuột.
+• Ô nhập liệu input và textarea khi focus sẽ đổi màu viền sang --border-focus (#4b5563) để người dùng nhận biết vị trí đang gõ phím.
+• Áp dụng Media Query (@media (max-width: 860px) và @media (max-width: 600px)) để tự động chuyển bố cục lưới thành 1 cột trên màn hình điện thoại.</w:t>
+      </w:r>
+    </w:p>
+    <w:p>
+      <w:pPr>
+        <w:spacing w:after="50" w:before="120"/>
+        <w:jc w:val="center"/>
+      </w:pPr>
+      <w:r>
+        <w:drawing>
+          <wp:inline distT="0" distB="0" distL="0" distR="0">
+            <wp:extent cx="4667250" cy="2619375"/>
+            <wp:effectExtent t="0" r="0" b="0" l="0"/>
+            <wp:docPr id="10" name="Hình 10: Định kiểu bảng, form liên hệ và media queries mở trong Neovim" descr="Hình 10: Định kiểu bảng, form liên hệ và media queries mở trong Neovim" title="Hình 10: Định kiểu bảng, form liên hệ và media queries mở trong Neovim"/>
+            <wp:cNvGraphicFramePr>
+              <a:graphicFrameLocks xmlns:a="http://schemas.openxmlformats.org/drawingml/2006/main" noChangeAspect="1"/>
+            </wp:cNvGraphicFramePr>
+            <a:graphic xmlns:a="http://schemas.openxmlformats.org/drawingml/2006/main">
+              <a:graphicData uri="http://schemas.openxmlformats.org/drawingml/2006/picture">
+                <pic:pic xmlns:pic="http://schemas.openxmlformats.org/drawingml/2006/picture">
+                  <pic:nvPicPr>
+                    <pic:cNvPr id="0" name="" descr=""/>
+                    <pic:cNvPicPr>
+                      <a:picLocks noChangeAspect="1" noChangeArrowheads="1"/>
+                    </pic:cNvPicPr>
+                  </pic:nvPicPr>
+                  <pic:blipFill>
+                    <a:blip r:embed="rId18" cstate="none"/>
+                    <a:srcRect/>
+                    <a:stretch>
+                      <a:fillRect/>
+                    </a:stretch>
+                  </pic:blipFill>
+                  <pic:spPr bwMode="auto">
+                    <a:xfrm>
+                      <a:off x="0" y="0"/>
+                      <a:ext cx="4667250" cy="2619375"/>
+                    </a:xfrm>
+                    <a:prstGeom prst="rect">
+                      <a:avLst/>
+                    </a:prstGeom>
+                  </pic:spPr>
+                </pic:pic>
+              </a:graphicData>
+            </a:graphic>
+          </wp:inline>
+        </w:drawing>
+      </w:r>
+    </w:p>
+    <w:p>
+      <w:pPr>
+        <w:spacing w:after="140"/>
+        <w:jc w:val="center"/>
+      </w:pPr>
+      <w:r>
+        <w:rPr>
+          <w:rFonts w:ascii="Arial" w:cs="Arial" w:eastAsia="Arial" w:hAnsi="Arial"/>
+          <w:color w:val="64748B"/>
+          <w:sz w:val="18"/>
+          <w:szCs w:val="18"/>
+        </w:rPr>
         <w:t xml:space="preserve">Hình 10: Định kiểu bảng, form liên hệ và media queries mở trong Neovim</w:t>
       </w:r>
     </w:p>
@@ -1478,7 +1478,7 @@
                     </pic:cNvPicPr>
                   </pic:nvPicPr>
                   <pic:blipFill>
-                    <a:blip r:embed="rId12" cstate="none"/>
+                    <a:blip r:embed="rId19" cstate="none"/>
                     <a:srcRect/>
                     <a:stretch>
                       <a:fillRect/>

</xml_diff>

<commit_message>
feat(homework): implement all 3 Lab 1 homework exercises and update lab report
- implement Homework 1 (Flip Card Gallery) with 3D perspective flip effects
- implement Homework 2 (Login/Sign-up Card) with two-column flex layout and custom form styling
- implement Homework 3 (Infinite Scrolling Marquee) with seamless keyframe animation and pause on hover
- create comprehensive homework showcase portal with bidirectional navigation
- capture Neovim code snippets and rendered screenshots for all homework deliverables
- update build_docx.js to include Section 6 (Homework) and Section 7 (Public Repository Links)
- re-generate Lab1_HuynhKhanhThien.docx
</commit_message>
<xml_diff>
--- a/Lab1_HuynhKhanhThien.docx
+++ b/Lab1_HuynhKhanhThien.docx
@@ -1549,12 +1549,722 @@
 1. Khởi tạo kho chứa và commit: git add . &amp;&amp; git commit -m '...'
 2. Đẩy mã nguồn lên GitHub: git remote add origin https://github.com/thien-z3d3r/lab1-cv.git &amp;&amp; git push -u origin main
 3. Kích hoạt GitHub Pages trong phần Settings -&gt; Pages của repository, chọn nguồn từ nhánh main và thư mục /(root).
-4. Nghiệm thu trang web hoạt động bình thường tại địa chỉ: https://thien-z3d3r.github.io/lab1-cv/</w:t>
-      </w:r>
-    </w:p>
-    <w:p>
-      <w:pPr>
-        <w:spacing w:after="60" w:before="180"/>
+4. Nghiệm thu trang web hoạt động bình thường tại địa chỉ: https://thien-z3d3r.github.io/lab1-cv/
+5. Toàn bộ các bài tập về nhà cũng được triển khai công khai tại: https://thien-z3d3r.github.io/lab1-cv/homework/</w:t>
+      </w:r>
+    </w:p>
+    <w:p>
+      <w:pPr>
+        <w:pStyle w:val="Heading1"/>
+        <w:spacing w:after="120" w:before="240"/>
+      </w:pPr>
+      <w:r>
+        <w:rPr>
+          <w:rFonts w:ascii="Arial" w:cs="Arial" w:eastAsia="Arial" w:hAnsi="Arial"/>
+          <w:b/>
+          <w:bCs/>
+          <w:color w:val="0F172A"/>
+          <w:sz w:val="26"/>
+          <w:szCs w:val="26"/>
+        </w:rPr>
+        <w:t xml:space="preserve">6. Bài Tập Về Nhà (Homework Exercises)</w:t>
+      </w:r>
+    </w:p>
+    <w:p>
+      <w:pPr>
+        <w:spacing w:after="100" w:line="260"/>
+      </w:pPr>
+      <w:r>
+        <w:rPr>
+          <w:rFonts w:ascii="Arial" w:cs="Arial" w:eastAsia="Arial" w:hAnsi="Arial"/>
+          <w:b w:val="false"/>
+          <w:bCs w:val="false"/>
+          <w:color w:val="334155"/>
+          <w:sz w:val="21"/>
+          <w:szCs w:val="21"/>
+        </w:rPr>
+        <w:t xml:space="preserve">Phần này trình bày kết quả thực hiện đầy đủ 3 bài tập về nhà trong Mục 6 của tài liệu hướng dẫn Lab 1, với mã nguồn HTML5 và CSS3 đạt độ chính xác cao so với ảnh mẫu quy chuẩn:</w:t>
+      </w:r>
+    </w:p>
+    <w:p>
+      <w:pPr>
+        <w:pStyle w:val="Heading2"/>
+        <w:spacing w:after="80" w:before="180"/>
+      </w:pPr>
+      <w:r>
+        <w:rPr>
+          <w:rFonts w:ascii="Arial" w:cs="Arial" w:eastAsia="Arial" w:hAnsi="Arial"/>
+          <w:b/>
+          <w:bCs/>
+          <w:color w:val="1E293B"/>
+          <w:sz w:val="22"/>
+          <w:szCs w:val="22"/>
+        </w:rPr>
+        <w:t xml:space="preserve">6.1 Bài Tập 1: Flip Card Gallery (Phòng trưng bày thẻ lật 3D)</w:t>
+      </w:r>
+    </w:p>
+    <w:p>
+      <w:pPr>
+        <w:spacing w:after="100" w:line="260"/>
+      </w:pPr>
+      <w:r>
+        <w:rPr>
+          <w:rFonts w:ascii="Arial" w:cs="Arial" w:eastAsia="Arial" w:hAnsi="Arial"/>
+          <w:b w:val="false"/>
+          <w:bCs w:val="false"/>
+          <w:color w:val="334155"/>
+          <w:sz w:val="21"/>
+          <w:szCs w:val="21"/>
+        </w:rPr>
+        <w:t xml:space="preserve">Bài tập yêu cầu xây dựng 3 thẻ công nghệ (HTML, CSS, JavaScript) có khả năng xoay lật 180 độ trong không gian 3 chiều khi người dùng rê chuột (hover). Mặt trước hiển thị biểu tượng và tiêu đề, mặt sau hiển thị tóm tắt chức năng công nghệ.
+Các kỹ thuật CSS trọng tâm được áp dụng:
+• perspective: 1000px: Khởi tạo chiều sâu không gian 3 chiều cho khung chứa flip-card.
+• transform-style: preserve-3d: Duy trì không gian 3D cho các lớp con trong quá trình xoay.
+• transition: transform 0.6s cubic-bezier(0.4, 0, 0.2, 1): Đảm bảo chuyển động lật êm mượt.
+• backface-visibility: hidden: Ẩn mặt phía sau khi xoay lưng về phía người xem.
+• transform: rotateY(180deg): Xoay lật quanh trục dọc Y khi hover.</w:t>
+      </w:r>
+    </w:p>
+    <w:p>
+      <w:pPr>
+        <w:spacing w:after="50" w:before="120"/>
+        <w:jc w:val="center"/>
+      </w:pPr>
+      <w:r>
+        <w:drawing>
+          <wp:inline distT="0" distB="0" distL="0" distR="0">
+            <wp:extent cx="4667250" cy="3914775"/>
+            <wp:effectExtent t="0" r="0" b="0" l="0"/>
+            <wp:docPr id="12" name="Hình 12: Đoạn mã CSS xử lý hiệu ứng lật thẻ 3D trong flip-card.css" descr="Hình 12: Đoạn mã CSS xử lý hiệu ứng lật thẻ 3D trong flip-card.css" title="Hình 12: Đoạn mã CSS xử lý hiệu ứng lật thẻ 3D trong flip-card.css"/>
+            <wp:cNvGraphicFramePr>
+              <a:graphicFrameLocks xmlns:a="http://schemas.openxmlformats.org/drawingml/2006/main" noChangeAspect="1"/>
+            </wp:cNvGraphicFramePr>
+            <a:graphic xmlns:a="http://schemas.openxmlformats.org/drawingml/2006/main">
+              <a:graphicData uri="http://schemas.openxmlformats.org/drawingml/2006/picture">
+                <pic:pic xmlns:pic="http://schemas.openxmlformats.org/drawingml/2006/picture">
+                  <pic:nvPicPr>
+                    <pic:cNvPr id="0" name="" descr=""/>
+                    <pic:cNvPicPr>
+                      <a:picLocks noChangeAspect="1" noChangeArrowheads="1"/>
+                    </pic:cNvPicPr>
+                  </pic:nvPicPr>
+                  <pic:blipFill>
+                    <a:blip r:embed="rId20" cstate="none"/>
+                    <a:srcRect/>
+                    <a:stretch>
+                      <a:fillRect/>
+                    </a:stretch>
+                  </pic:blipFill>
+                  <pic:spPr bwMode="auto">
+                    <a:xfrm>
+                      <a:off x="0" y="0"/>
+                      <a:ext cx="4667250" cy="3914775"/>
+                    </a:xfrm>
+                    <a:prstGeom prst="rect">
+                      <a:avLst/>
+                    </a:prstGeom>
+                  </pic:spPr>
+                </pic:pic>
+              </a:graphicData>
+            </a:graphic>
+          </wp:inline>
+        </w:drawing>
+      </w:r>
+    </w:p>
+    <w:p>
+      <w:pPr>
+        <w:spacing w:after="140"/>
+        <w:jc w:val="center"/>
+      </w:pPr>
+      <w:r>
+        <w:rPr>
+          <w:rFonts w:ascii="Arial" w:cs="Arial" w:eastAsia="Arial" w:hAnsi="Arial"/>
+          <w:color w:val="64748B"/>
+          <w:sz w:val="18"/>
+          <w:szCs w:val="18"/>
+        </w:rPr>
+        <w:t xml:space="preserve">Hình 12: Đoạn mã CSS xử lý hiệu ứng lật thẻ 3D trong flip-card.css</w:t>
+      </w:r>
+    </w:p>
+    <w:p>
+      <w:pPr>
+        <w:spacing w:after="50" w:before="120"/>
+        <w:jc w:val="center"/>
+      </w:pPr>
+      <w:r>
+        <w:drawing>
+          <wp:inline distT="0" distB="0" distL="0" distR="0">
+            <wp:extent cx="4667250" cy="2590800"/>
+            <wp:effectExtent t="0" r="0" b="0" l="0"/>
+            <wp:docPr id="13" name="Hình 13: Giao diện Flip Card Gallery ở trạng thái mặc định (Mặt trước)" descr="Hình 13: Giao diện Flip Card Gallery ở trạng thái mặc định (Mặt trước)" title="Hình 13: Giao diện Flip Card Gallery ở trạng thái mặc định (Mặt trước)"/>
+            <wp:cNvGraphicFramePr>
+              <a:graphicFrameLocks xmlns:a="http://schemas.openxmlformats.org/drawingml/2006/main" noChangeAspect="1"/>
+            </wp:cNvGraphicFramePr>
+            <a:graphic xmlns:a="http://schemas.openxmlformats.org/drawingml/2006/main">
+              <a:graphicData uri="http://schemas.openxmlformats.org/drawingml/2006/picture">
+                <pic:pic xmlns:pic="http://schemas.openxmlformats.org/drawingml/2006/picture">
+                  <pic:nvPicPr>
+                    <pic:cNvPr id="0" name="" descr=""/>
+                    <pic:cNvPicPr>
+                      <a:picLocks noChangeAspect="1" noChangeArrowheads="1"/>
+                    </pic:cNvPicPr>
+                  </pic:nvPicPr>
+                  <pic:blipFill>
+                    <a:blip r:embed="rId21" cstate="none"/>
+                    <a:srcRect/>
+                    <a:stretch>
+                      <a:fillRect/>
+                    </a:stretch>
+                  </pic:blipFill>
+                  <pic:spPr bwMode="auto">
+                    <a:xfrm>
+                      <a:off x="0" y="0"/>
+                      <a:ext cx="4667250" cy="2590800"/>
+                    </a:xfrm>
+                    <a:prstGeom prst="rect">
+                      <a:avLst/>
+                    </a:prstGeom>
+                  </pic:spPr>
+                </pic:pic>
+              </a:graphicData>
+            </a:graphic>
+          </wp:inline>
+        </w:drawing>
+      </w:r>
+    </w:p>
+    <w:p>
+      <w:pPr>
+        <w:spacing w:after="140"/>
+        <w:jc w:val="center"/>
+      </w:pPr>
+      <w:r>
+        <w:rPr>
+          <w:rFonts w:ascii="Arial" w:cs="Arial" w:eastAsia="Arial" w:hAnsi="Arial"/>
+          <w:color w:val="64748B"/>
+          <w:sz w:val="18"/>
+          <w:szCs w:val="18"/>
+        </w:rPr>
+        <w:t xml:space="preserve">Hình 13: Giao diện Flip Card Gallery ở trạng thái mặc định (Mặt trước)</w:t>
+      </w:r>
+    </w:p>
+    <w:p>
+      <w:pPr>
+        <w:spacing w:after="50" w:before="120"/>
+        <w:jc w:val="center"/>
+      </w:pPr>
+      <w:r>
+        <w:drawing>
+          <wp:inline distT="0" distB="0" distL="0" distR="0">
+            <wp:extent cx="4667250" cy="2590800"/>
+            <wp:effectExtent t="0" r="0" b="0" l="0"/>
+            <wp:docPr id="14" name="Hình 14: Giao diện thẻ khi hover – Mặt sau hiển thị thông tin mô tả chi tiết" descr="Hình 14: Giao diện thẻ khi hover – Mặt sau hiển thị thông tin mô tả chi tiết" title="Hình 14: Giao diện thẻ khi hover – Mặt sau hiển thị thông tin mô tả chi tiết"/>
+            <wp:cNvGraphicFramePr>
+              <a:graphicFrameLocks xmlns:a="http://schemas.openxmlformats.org/drawingml/2006/main" noChangeAspect="1"/>
+            </wp:cNvGraphicFramePr>
+            <a:graphic xmlns:a="http://schemas.openxmlformats.org/drawingml/2006/main">
+              <a:graphicData uri="http://schemas.openxmlformats.org/drawingml/2006/picture">
+                <pic:pic xmlns:pic="http://schemas.openxmlformats.org/drawingml/2006/picture">
+                  <pic:nvPicPr>
+                    <pic:cNvPr id="0" name="" descr=""/>
+                    <pic:cNvPicPr>
+                      <a:picLocks noChangeAspect="1" noChangeArrowheads="1"/>
+                    </pic:cNvPicPr>
+                  </pic:nvPicPr>
+                  <pic:blipFill>
+                    <a:blip r:embed="rId22" cstate="none"/>
+                    <a:srcRect/>
+                    <a:stretch>
+                      <a:fillRect/>
+                    </a:stretch>
+                  </pic:blipFill>
+                  <pic:spPr bwMode="auto">
+                    <a:xfrm>
+                      <a:off x="0" y="0"/>
+                      <a:ext cx="4667250" cy="2590800"/>
+                    </a:xfrm>
+                    <a:prstGeom prst="rect">
+                      <a:avLst/>
+                    </a:prstGeom>
+                  </pic:spPr>
+                </pic:pic>
+              </a:graphicData>
+            </a:graphic>
+          </wp:inline>
+        </w:drawing>
+      </w:r>
+    </w:p>
+    <w:p>
+      <w:pPr>
+        <w:spacing w:after="140"/>
+        <w:jc w:val="center"/>
+      </w:pPr>
+      <w:r>
+        <w:rPr>
+          <w:rFonts w:ascii="Arial" w:cs="Arial" w:eastAsia="Arial" w:hAnsi="Arial"/>
+          <w:color w:val="64748B"/>
+          <w:sz w:val="18"/>
+          <w:szCs w:val="18"/>
+        </w:rPr>
+        <w:t xml:space="preserve">Hình 14: Giao diện thẻ khi hover – Mặt sau hiển thị thông tin mô tả chi tiết</w:t>
+      </w:r>
+    </w:p>
+    <w:p>
+      <w:pPr>
+        <w:pStyle w:val="Heading2"/>
+        <w:spacing w:after="80" w:before="180"/>
+      </w:pPr>
+      <w:r>
+        <w:rPr>
+          <w:rFonts w:ascii="Arial" w:cs="Arial" w:eastAsia="Arial" w:hAnsi="Arial"/>
+          <w:b/>
+          <w:bCs/>
+          <w:color w:val="1E293B"/>
+          <w:sz w:val="22"/>
+          <w:szCs w:val="22"/>
+        </w:rPr>
+        <w:t xml:space="preserve">6.2 Bài Tập 2: Login / Sign-up Card (Thẻ xác thực hai cột)</w:t>
+      </w:r>
+    </w:p>
+    <w:p>
+      <w:pPr>
+        <w:spacing w:after="100" w:line="260"/>
+      </w:pPr>
+      <w:r>
+        <w:rPr>
+          <w:rFonts w:ascii="Arial" w:cs="Arial" w:eastAsia="Arial" w:hAnsi="Arial"/>
+          <w:b w:val="false"/>
+          <w:bCs w:val="false"/>
+          <w:color w:val="334155"/>
+          <w:sz w:val="21"/>
+          <w:szCs w:val="21"/>
+        </w:rPr>
+        <w:t xml:space="preserve">Bài tập yêu cầu thiết kế một thẻ xác thực hai cột cân đối được căn giữa màn hình (Flexbox centering):
+• Cột trái (Form Panel): Nền trắng tinh tế, bao gồm tiêu đề 'Welcome back', phụ đề 'Sign in to continue', ô nhập Email (you@example.com), Password (••••••••), checkbox 'Remember me', và nút 'Sign In' màu xanh dương với hiệu ứng hover nâng nhẹ.
+• Cột phải (Decorative Panel): Nền gradient chuyển sắc từ xanh dương sang xanh đậm (#2563eb -&gt; #1e40af), hiển thị lời chào 'Hello, Friend!' và thông điệp truyền cảm hứng xây dựng dự án web.
+Các thuộc tính CSS chủ đạo:
+• Flexbox centering: display: flex; justify-content: center; align-items: center; min-height: 100vh.
+• Card styling: border-radius: 16px; overflow: hidden; box-shadow: 0 20px 25px -5px rgba(0,0,0,0.08).
+• Form controls: Ô nhập liệu có viền mềm mại, hiệu ứng focus phát sáng xanh, nút bấm chuyển màu và nâng nhẹ translateY(-1px) khi tương tác.</w:t>
+      </w:r>
+    </w:p>
+    <w:p>
+      <w:pPr>
+        <w:spacing w:after="50" w:before="120"/>
+        <w:jc w:val="center"/>
+      </w:pPr>
+      <w:r>
+        <w:drawing>
+          <wp:inline distT="0" distB="0" distL="0" distR="0">
+            <wp:extent cx="4667250" cy="3914775"/>
+            <wp:effectExtent t="0" r="0" b="0" l="0"/>
+            <wp:docPr id="15" name="Hình 15: Đoạn mã CSS định kiểu thẻ xác thực hai cột trong login-card.css" descr="Hình 15: Đoạn mã CSS định kiểu thẻ xác thực hai cột trong login-card.css" title="Hình 15: Đoạn mã CSS định kiểu thẻ xác thực hai cột trong login-card.css"/>
+            <wp:cNvGraphicFramePr>
+              <a:graphicFrameLocks xmlns:a="http://schemas.openxmlformats.org/drawingml/2006/main" noChangeAspect="1"/>
+            </wp:cNvGraphicFramePr>
+            <a:graphic xmlns:a="http://schemas.openxmlformats.org/drawingml/2006/main">
+              <a:graphicData uri="http://schemas.openxmlformats.org/drawingml/2006/picture">
+                <pic:pic xmlns:pic="http://schemas.openxmlformats.org/drawingml/2006/picture">
+                  <pic:nvPicPr>
+                    <pic:cNvPr id="0" name="" descr=""/>
+                    <pic:cNvPicPr>
+                      <a:picLocks noChangeAspect="1" noChangeArrowheads="1"/>
+                    </pic:cNvPicPr>
+                  </pic:nvPicPr>
+                  <pic:blipFill>
+                    <a:blip r:embed="rId23" cstate="none"/>
+                    <a:srcRect/>
+                    <a:stretch>
+                      <a:fillRect/>
+                    </a:stretch>
+                  </pic:blipFill>
+                  <pic:spPr bwMode="auto">
+                    <a:xfrm>
+                      <a:off x="0" y="0"/>
+                      <a:ext cx="4667250" cy="3914775"/>
+                    </a:xfrm>
+                    <a:prstGeom prst="rect">
+                      <a:avLst/>
+                    </a:prstGeom>
+                  </pic:spPr>
+                </pic:pic>
+              </a:graphicData>
+            </a:graphic>
+          </wp:inline>
+        </w:drawing>
+      </w:r>
+    </w:p>
+    <w:p>
+      <w:pPr>
+        <w:spacing w:after="140"/>
+        <w:jc w:val="center"/>
+      </w:pPr>
+      <w:r>
+        <w:rPr>
+          <w:rFonts w:ascii="Arial" w:cs="Arial" w:eastAsia="Arial" w:hAnsi="Arial"/>
+          <w:color w:val="64748B"/>
+          <w:sz w:val="18"/>
+          <w:szCs w:val="18"/>
+        </w:rPr>
+        <w:t xml:space="preserve">Hình 15: Đoạn mã CSS định kiểu thẻ xác thực hai cột trong login-card.css</w:t>
+      </w:r>
+    </w:p>
+    <w:p>
+      <w:pPr>
+        <w:spacing w:after="50" w:before="120"/>
+        <w:jc w:val="center"/>
+      </w:pPr>
+      <w:r>
+        <w:drawing>
+          <wp:inline distT="0" distB="0" distL="0" distR="0">
+            <wp:extent cx="4667250" cy="3038475"/>
+            <wp:effectExtent t="0" r="0" b="0" l="0"/>
+            <wp:docPr id="16" name="Hình 16: Giao diện Login / Sign-up Card hoàn chỉnh bám sát ảnh mẫu quy chuẩn" descr="Hình 16: Giao diện Login / Sign-up Card hoàn chỉnh bám sát ảnh mẫu quy chuẩn" title="Hình 16: Giao diện Login / Sign-up Card hoàn chỉnh bám sát ảnh mẫu quy chuẩn"/>
+            <wp:cNvGraphicFramePr>
+              <a:graphicFrameLocks xmlns:a="http://schemas.openxmlformats.org/drawingml/2006/main" noChangeAspect="1"/>
+            </wp:cNvGraphicFramePr>
+            <a:graphic xmlns:a="http://schemas.openxmlformats.org/drawingml/2006/main">
+              <a:graphicData uri="http://schemas.openxmlformats.org/drawingml/2006/picture">
+                <pic:pic xmlns:pic="http://schemas.openxmlformats.org/drawingml/2006/picture">
+                  <pic:nvPicPr>
+                    <pic:cNvPr id="0" name="" descr=""/>
+                    <pic:cNvPicPr>
+                      <a:picLocks noChangeAspect="1" noChangeArrowheads="1"/>
+                    </pic:cNvPicPr>
+                  </pic:nvPicPr>
+                  <pic:blipFill>
+                    <a:blip r:embed="rId24" cstate="none"/>
+                    <a:srcRect/>
+                    <a:stretch>
+                      <a:fillRect/>
+                    </a:stretch>
+                  </pic:blipFill>
+                  <pic:spPr bwMode="auto">
+                    <a:xfrm>
+                      <a:off x="0" y="0"/>
+                      <a:ext cx="4667250" cy="3038475"/>
+                    </a:xfrm>
+                    <a:prstGeom prst="rect">
+                      <a:avLst/>
+                    </a:prstGeom>
+                  </pic:spPr>
+                </pic:pic>
+              </a:graphicData>
+            </a:graphic>
+          </wp:inline>
+        </w:drawing>
+      </w:r>
+    </w:p>
+    <w:p>
+      <w:pPr>
+        <w:spacing w:after="140"/>
+        <w:jc w:val="center"/>
+      </w:pPr>
+      <w:r>
+        <w:rPr>
+          <w:rFonts w:ascii="Arial" w:cs="Arial" w:eastAsia="Arial" w:hAnsi="Arial"/>
+          <w:color w:val="64748B"/>
+          <w:sz w:val="18"/>
+          <w:szCs w:val="18"/>
+        </w:rPr>
+        <w:t xml:space="preserve">Hình 16: Giao diện Login / Sign-up Card hoàn chỉnh bám sát ảnh mẫu quy chuẩn</w:t>
+      </w:r>
+    </w:p>
+    <w:p>
+      <w:pPr>
+        <w:pStyle w:val="Heading2"/>
+        <w:spacing w:after="80" w:before="180"/>
+      </w:pPr>
+      <w:r>
+        <w:rPr>
+          <w:rFonts w:ascii="Arial" w:cs="Arial" w:eastAsia="Arial" w:hAnsi="Arial"/>
+          <w:b/>
+          <w:bCs/>
+          <w:color w:val="1E293B"/>
+          <w:sz w:val="22"/>
+          <w:szCs w:val="22"/>
+        </w:rPr>
+        <w:t xml:space="preserve">6.3 Bài Tập 3: Infinite Scrolling Marquee (Dải băng cuộn vô tận)</w:t>
+      </w:r>
+    </w:p>
+    <w:p>
+      <w:pPr>
+        <w:spacing w:after="100" w:line="260"/>
+      </w:pPr>
+      <w:r>
+        <w:rPr>
+          <w:rFonts w:ascii="Arial" w:cs="Arial" w:eastAsia="Arial" w:hAnsi="Arial"/>
+          <w:b w:val="false"/>
+          <w:bCs w:val="false"/>
+          <w:color w:val="334155"/>
+          <w:sz w:val="21"/>
+          <w:szCs w:val="21"/>
+        </w:rPr>
+        <w:t xml:space="preserve">Bài tập yêu cầu xây dựng một dải băng cuộn các nhãn công nghệ (HTML, CSS, JavaScript, Git, GitHub, VS Code) lặp vô tận liên tục, và tự động tạm dừng khi người dùng rê chuột vào banner.
+Các kỹ thuật CSS trọng tâm:
+• @keyframes scrollMarquee: Tịnh tiến thanh trượt từ translateX(0) đến translateX(-50%).
+• Seamless looping: Nhân đôi chuỗi phần tử trong HTML để khi nhóm 1 trôi hết thì nhóm 2 lập tức nối tiếp, tạo cảm giác vô tận không ngắt quãng.
+• animation: scrollMarquee 20s linear infinite: Chuyển động đều đặn và mượt mà.
+• animation-play-state: paused: Tạm dừng chuyển động ngay khi hover chuột vào banner.</w:t>
+      </w:r>
+    </w:p>
+    <w:p>
+      <w:pPr>
+        <w:spacing w:after="50" w:before="120"/>
+        <w:jc w:val="center"/>
+      </w:pPr>
+      <w:r>
+        <w:drawing>
+          <wp:inline distT="0" distB="0" distL="0" distR="0">
+            <wp:extent cx="4667250" cy="3914775"/>
+            <wp:effectExtent t="0" r="0" b="0" l="0"/>
+            <wp:docPr id="17" name="Hình 17: Đoạn mã CSS điều khiển animation cuộn vô tận và tạm dừng khi hover trong marquee.css" descr="Hình 17: Đoạn mã CSS điều khiển animation cuộn vô tận và tạm dừng khi hover trong marquee.css" title="Hình 17: Đoạn mã CSS điều khiển animation cuộn vô tận và tạm dừng khi hover trong marquee.css"/>
+            <wp:cNvGraphicFramePr>
+              <a:graphicFrameLocks xmlns:a="http://schemas.openxmlformats.org/drawingml/2006/main" noChangeAspect="1"/>
+            </wp:cNvGraphicFramePr>
+            <a:graphic xmlns:a="http://schemas.openxmlformats.org/drawingml/2006/main">
+              <a:graphicData uri="http://schemas.openxmlformats.org/drawingml/2006/picture">
+                <pic:pic xmlns:pic="http://schemas.openxmlformats.org/drawingml/2006/picture">
+                  <pic:nvPicPr>
+                    <pic:cNvPr id="0" name="" descr=""/>
+                    <pic:cNvPicPr>
+                      <a:picLocks noChangeAspect="1" noChangeArrowheads="1"/>
+                    </pic:cNvPicPr>
+                  </pic:nvPicPr>
+                  <pic:blipFill>
+                    <a:blip r:embed="rId25" cstate="none"/>
+                    <a:srcRect/>
+                    <a:stretch>
+                      <a:fillRect/>
+                    </a:stretch>
+                  </pic:blipFill>
+                  <pic:spPr bwMode="auto">
+                    <a:xfrm>
+                      <a:off x="0" y="0"/>
+                      <a:ext cx="4667250" cy="3914775"/>
+                    </a:xfrm>
+                    <a:prstGeom prst="rect">
+                      <a:avLst/>
+                    </a:prstGeom>
+                  </pic:spPr>
+                </pic:pic>
+              </a:graphicData>
+            </a:graphic>
+          </wp:inline>
+        </w:drawing>
+      </w:r>
+    </w:p>
+    <w:p>
+      <w:pPr>
+        <w:spacing w:after="140"/>
+        <w:jc w:val="center"/>
+      </w:pPr>
+      <w:r>
+        <w:rPr>
+          <w:rFonts w:ascii="Arial" w:cs="Arial" w:eastAsia="Arial" w:hAnsi="Arial"/>
+          <w:color w:val="64748B"/>
+          <w:sz w:val="18"/>
+          <w:szCs w:val="18"/>
+        </w:rPr>
+        <w:t xml:space="preserve">Hình 17: Đoạn mã CSS điều khiển animation cuộn vô tận và tạm dừng khi hover trong marquee.css</w:t>
+      </w:r>
+    </w:p>
+    <w:p>
+      <w:pPr>
+        <w:spacing w:after="50" w:before="120"/>
+        <w:jc w:val="center"/>
+      </w:pPr>
+      <w:r>
+        <w:drawing>
+          <wp:inline distT="0" distB="0" distL="0" distR="0">
+            <wp:extent cx="4667250" cy="1066800"/>
+            <wp:effectExtent t="0" r="0" b="0" l="0"/>
+            <wp:docPr id="18" name="Hình 18: Giao diện dải băng cuộn Infinite Scrolling Marquee trên nền tối #1f2937" descr="Hình 18: Giao diện dải băng cuộn Infinite Scrolling Marquee trên nền tối #1f2937" title="Hình 18: Giao diện dải băng cuộn Infinite Scrolling Marquee trên nền tối #1f2937"/>
+            <wp:cNvGraphicFramePr>
+              <a:graphicFrameLocks xmlns:a="http://schemas.openxmlformats.org/drawingml/2006/main" noChangeAspect="1"/>
+            </wp:cNvGraphicFramePr>
+            <a:graphic xmlns:a="http://schemas.openxmlformats.org/drawingml/2006/main">
+              <a:graphicData uri="http://schemas.openxmlformats.org/drawingml/2006/picture">
+                <pic:pic xmlns:pic="http://schemas.openxmlformats.org/drawingml/2006/picture">
+                  <pic:nvPicPr>
+                    <pic:cNvPr id="0" name="" descr=""/>
+                    <pic:cNvPicPr>
+                      <a:picLocks noChangeAspect="1" noChangeArrowheads="1"/>
+                    </pic:cNvPicPr>
+                  </pic:nvPicPr>
+                  <pic:blipFill>
+                    <a:blip r:embed="rId26" cstate="none"/>
+                    <a:srcRect/>
+                    <a:stretch>
+                      <a:fillRect/>
+                    </a:stretch>
+                  </pic:blipFill>
+                  <pic:spPr bwMode="auto">
+                    <a:xfrm>
+                      <a:off x="0" y="0"/>
+                      <a:ext cx="4667250" cy="1066800"/>
+                    </a:xfrm>
+                    <a:prstGeom prst="rect">
+                      <a:avLst/>
+                    </a:prstGeom>
+                  </pic:spPr>
+                </pic:pic>
+              </a:graphicData>
+            </a:graphic>
+          </wp:inline>
+        </w:drawing>
+      </w:r>
+    </w:p>
+    <w:p>
+      <w:pPr>
+        <w:spacing w:after="140"/>
+        <w:jc w:val="center"/>
+      </w:pPr>
+      <w:r>
+        <w:rPr>
+          <w:rFonts w:ascii="Arial" w:cs="Arial" w:eastAsia="Arial" w:hAnsi="Arial"/>
+          <w:color w:val="64748B"/>
+          <w:sz w:val="18"/>
+          <w:szCs w:val="18"/>
+        </w:rPr>
+        <w:t xml:space="preserve">Hình 18: Giao diện dải băng cuộn Infinite Scrolling Marquee trên nền tối #1f2937</w:t>
+      </w:r>
+    </w:p>
+    <w:p>
+      <w:pPr>
+        <w:pStyle w:val="Heading2"/>
+        <w:spacing w:after="80" w:before="180"/>
+      </w:pPr>
+      <w:r>
+        <w:rPr>
+          <w:rFonts w:ascii="Arial" w:cs="Arial" w:eastAsia="Arial" w:hAnsi="Arial"/>
+          <w:b/>
+          <w:bCs/>
+          <w:color w:val="1E293B"/>
+          <w:sz w:val="22"/>
+          <w:szCs w:val="22"/>
+        </w:rPr>
+        <w:t xml:space="preserve">6.4 Cổng Trực Tuyến Tổng Hợp (Homework Showcase Portal)</w:t>
+      </w:r>
+    </w:p>
+    <w:p>
+      <w:pPr>
+        <w:spacing w:after="100" w:line="260"/>
+      </w:pPr>
+      <w:r>
+        <w:rPr>
+          <w:rFonts w:ascii="Arial" w:cs="Arial" w:eastAsia="Arial" w:hAnsi="Arial"/>
+          <w:b w:val="false"/>
+          <w:bCs w:val="false"/>
+          <w:color w:val="334155"/>
+          <w:sz w:val="21"/>
+          <w:szCs w:val="21"/>
+        </w:rPr>
+        <w:t xml:space="preserve">Để hỗ trợ việc chấm bài và nghiệm thu trực tiếp thuận tiện nhất, em đã tích hợp toàn bộ các bài tập vào một giao diện Showcase đồng nhất tại thư mục homework/ (homework/index.html). Người chấm có thể dễ dàng trải nghiệm cả 3 bài tập trên cùng một trang hoặc mở riêng biệt từng bài tập qua các liên kết độc lập.</w:t>
+      </w:r>
+    </w:p>
+    <w:p>
+      <w:pPr>
+        <w:spacing w:after="50" w:before="120"/>
+        <w:jc w:val="center"/>
+      </w:pPr>
+      <w:r>
+        <w:drawing>
+          <wp:inline distT="0" distB="0" distL="0" distR="0">
+            <wp:extent cx="4667250" cy="6219825"/>
+            <wp:effectExtent t="0" r="0" b="0" l="0"/>
+            <wp:docPr id="19" name="Hình 19: Giao diện trang tổng hợp Showcase các bài tập về nhà" descr="Hình 19: Giao diện trang tổng hợp Showcase các bài tập về nhà" title="Hình 19: Giao diện trang tổng hợp Showcase các bài tập về nhà"/>
+            <wp:cNvGraphicFramePr>
+              <a:graphicFrameLocks xmlns:a="http://schemas.openxmlformats.org/drawingml/2006/main" noChangeAspect="1"/>
+            </wp:cNvGraphicFramePr>
+            <a:graphic xmlns:a="http://schemas.openxmlformats.org/drawingml/2006/main">
+              <a:graphicData uri="http://schemas.openxmlformats.org/drawingml/2006/picture">
+                <pic:pic xmlns:pic="http://schemas.openxmlformats.org/drawingml/2006/picture">
+                  <pic:nvPicPr>
+                    <pic:cNvPr id="0" name="" descr=""/>
+                    <pic:cNvPicPr>
+                      <a:picLocks noChangeAspect="1" noChangeArrowheads="1"/>
+                    </pic:cNvPicPr>
+                  </pic:nvPicPr>
+                  <pic:blipFill>
+                    <a:blip r:embed="rId27" cstate="none"/>
+                    <a:srcRect/>
+                    <a:stretch>
+                      <a:fillRect/>
+                    </a:stretch>
+                  </pic:blipFill>
+                  <pic:spPr bwMode="auto">
+                    <a:xfrm>
+                      <a:off x="0" y="0"/>
+                      <a:ext cx="4667250" cy="6219825"/>
+                    </a:xfrm>
+                    <a:prstGeom prst="rect">
+                      <a:avLst/>
+                    </a:prstGeom>
+                  </pic:spPr>
+                </pic:pic>
+              </a:graphicData>
+            </a:graphic>
+          </wp:inline>
+        </w:drawing>
+      </w:r>
+    </w:p>
+    <w:p>
+      <w:pPr>
+        <w:spacing w:after="140"/>
+        <w:jc w:val="center"/>
+      </w:pPr>
+      <w:r>
+        <w:rPr>
+          <w:rFonts w:ascii="Arial" w:cs="Arial" w:eastAsia="Arial" w:hAnsi="Arial"/>
+          <w:color w:val="64748B"/>
+          <w:sz w:val="18"/>
+          <w:szCs w:val="18"/>
+        </w:rPr>
+        <w:t xml:space="preserve">Hình 19: Giao diện trang tổng hợp Showcase các bài tập về nhà</w:t>
+      </w:r>
+    </w:p>
+    <w:p>
+      <w:pPr>
+        <w:pStyle w:val="Heading1"/>
+        <w:spacing w:after="120" w:before="240"/>
+      </w:pPr>
+      <w:r>
+        <w:rPr>
+          <w:rFonts w:ascii="Arial" w:cs="Arial" w:eastAsia="Arial" w:hAnsi="Arial"/>
+          <w:b/>
+          <w:bCs/>
+          <w:color w:val="0F172A"/>
+          <w:sz w:val="26"/>
+          <w:szCs w:val="26"/>
+        </w:rPr>
+        <w:t xml:space="preserve">7. Liên Kết Nộp Bài (Public Repository Links)</w:t>
+      </w:r>
+    </w:p>
+    <w:p>
+      <w:pPr>
+        <w:spacing w:after="100" w:line="260"/>
+      </w:pPr>
+      <w:r>
+        <w:rPr>
+          <w:rFonts w:ascii="Arial" w:cs="Arial" w:eastAsia="Arial" w:hAnsi="Arial"/>
+          <w:b w:val="false"/>
+          <w:bCs w:val="false"/>
+          <w:color w:val="334155"/>
+          <w:sz w:val="21"/>
+          <w:szCs w:val="21"/>
+        </w:rPr>
+        <w:t xml:space="preserve">Theo đúng quy định nộp bài tại Mục 1.b của tài liệu Lab 1, dưới đây là liên kết công khai (Public) đến mã nguồn và sản phẩm đã triển khai của em:
+• GitHub Repository (Public): https://github.com/thien-z3d3r/lab1-cv
+• Trực tuyến CV Resume (GitHub Pages): https://thien-z3d3r.github.io/lab1-cv/
+• Trực tuyến Homework Portal: https://thien-z3d3r.github.io/lab1-cv/homework/
+• Standalone Exercise 1 (Flip Cards): https://thien-z3d3r.github.io/lab1-cv/homework/flip-card.html
+• Standalone Exercise 2 (Login Card): https://thien-z3d3r.github.io/lab1-cv/homework/login-card.html
+• Standalone Exercise 3 (Marquee): https://thien-z3d3r.github.io/lab1-cv/homework/marquee.html</w:t>
+      </w:r>
+    </w:p>
+    <w:p>
+      <w:pPr>
+        <w:spacing w:after="60" w:before="200"/>
         <w:jc w:val="center"/>
       </w:pPr>
       <w:r>
@@ -1566,7 +2276,7 @@
           <w:sz w:val="20"/>
           <w:szCs w:val="20"/>
         </w:rPr>
-        <w:t xml:space="preserve">--- HẾT BÁO CÁO ---</w:t>
+        <w:t xml:space="preserve">--- HẾT BÁO CÁO LAB 1 ---</w:t>
       </w:r>
     </w:p>
     <w:sectPr>

</xml_diff>

<commit_message>
docs: update full-page browser preview screenshot and docx report
</commit_message>
<xml_diff>
--- a/Lab1_HuynhKhanhThien.docx
+++ b/Lab1_HuynhKhanhThien.docx
@@ -1462,7 +1462,7 @@
       <w:r>
         <w:drawing>
           <wp:inline distT="0" distB="0" distL="0" distR="0">
-            <wp:extent cx="4667250" cy="6419850"/>
+            <wp:extent cx="4667250" cy="6562725"/>
             <wp:effectExtent t="0" r="0" b="0" l="0"/>
             <wp:docPr id="11" name="Hình 11: Giao diện hoàn chỉnh trang web CV Huynh Khanh Thien trên trình duyệt" descr="Hình 11: Giao diện hoàn chỉnh trang web CV Huynh Khanh Thien trên trình duyệt" title="Hình 11: Giao diện hoàn chỉnh trang web CV Huynh Khanh Thien trên trình duyệt"/>
             <wp:cNvGraphicFramePr>
@@ -1487,7 +1487,7 @@
                   <pic:spPr bwMode="auto">
                     <a:xfrm>
                       <a:off x="0" y="0"/>
-                      <a:ext cx="4667250" cy="6419850"/>
+                      <a:ext cx="4667250" cy="6562725"/>
                     </a:xfrm>
                     <a:prstGeom prst="rect">
                       <a:avLst/>

</xml_diff>

<commit_message>
docs: rewrite lab 1 report in full english
</commit_message>
<xml_diff>
--- a/Lab1_HuynhKhanhThien.docx
+++ b/Lab1_HuynhKhanhThien.docx
@@ -5,6 +5,23 @@
     <w:p>
       <w:pPr>
         <w:spacing w:after="40" w:before="60"/>
+        <w:jc w:val="center"/>
+      </w:pPr>
+      <w:r>
+        <w:rPr>
+          <w:rFonts w:ascii="Arial" w:cs="Arial" w:eastAsia="Arial" w:hAnsi="Arial"/>
+          <w:b/>
+          <w:bCs/>
+          <w:color w:val="475569"/>
+          <w:sz w:val="20"/>
+          <w:szCs w:val="20"/>
+        </w:rPr>
+        <w:t xml:space="preserve">VIETNAM NATIONAL UNIVERSITY HO CHI MINH CITY</w:t>
+      </w:r>
+    </w:p>
+    <w:p>
+      <w:pPr>
+        <w:spacing w:after="40"/>
         <w:jc w:val="center"/>
       </w:pPr>
       <w:r>
@@ -16,7 +33,7 @@
           <w:sz w:val="22"/>
           <w:szCs w:val="22"/>
         </w:rPr>
-        <w:t xml:space="preserve">TRƯỜNG ĐẠI HỌC CÔNG NGHỆ THÔNG TIN - ĐHQG TP.HCM</w:t>
+        <w:t xml:space="preserve">UNIVERSITY OF INFORMATION TECHNOLOGY</w:t>
       </w:r>
     </w:p>
     <w:p>
@@ -31,7 +48,7 @@
           <w:sz w:val="19"/>
           <w:szCs w:val="19"/>
         </w:rPr>
-        <w:t xml:space="preserve">CHƯƠNG TRÌNH LIÊN KẾT BIRMINGHAM CITY UNIVERSITY (BCU)</w:t>
+        <w:t xml:space="preserve">BIRMINGHAM CITY UNIVERSITY (BCU) JOINT PROGRAMME</w:t>
       </w:r>
     </w:p>
     <w:p>
@@ -48,7 +65,7 @@
           <w:sz w:val="28"/>
           <w:szCs w:val="28"/>
         </w:rPr>
-        <w:t xml:space="preserve">BÁO CÁO BÀI TẬP THỰC HÀNH LAB 1</w:t>
+        <w:t xml:space="preserve">LAB 1 PRACTICAL REPORT</w:t>
       </w:r>
     </w:p>
     <w:p>
@@ -65,8 +82,8 @@
           <w:sz w:val="21"/>
           <w:szCs w:val="21"/>
         </w:rPr>
-        <w:t xml:space="preserve">Môn học: Web Design and Development
-Đề tài: Môi trường &amp; Cơ bản về HTML / CSS (Trang CV Cá Nhân)</w:t>
+        <w:t xml:space="preserve">Course: Web Design and Development
+Topic: Development Environment &amp; HTML/CSS Fundamentals (Personal CV Page)</w:t>
       </w:r>
     </w:p>
     <w:tbl>
@@ -112,7 +129,7 @@
                 <w:sz w:val="20"/>
                 <w:szCs w:val="20"/>
               </w:rPr>
-              <w:t xml:space="preserve">Họ và tên sinh viên:</w:t>
+              <w:t xml:space="preserve">Student Name:</w:t>
             </w:r>
           </w:p>
         </w:tc>
@@ -141,7 +158,7 @@
                 <w:sz w:val="20"/>
                 <w:szCs w:val="20"/>
               </w:rPr>
-              <w:t xml:space="preserve">Huỳnh Khánh Thiện (Huynh Khanh Thien)</w:t>
+              <w:t xml:space="preserve">Huynh Khanh Thien</w:t>
             </w:r>
           </w:p>
         </w:tc>
@@ -173,7 +190,7 @@
                 <w:sz w:val="20"/>
                 <w:szCs w:val="20"/>
               </w:rPr>
-              <w:t xml:space="preserve">Chuyên ngành:</w:t>
+              <w:t xml:space="preserve">Major:</w:t>
             </w:r>
           </w:p>
         </w:tc>
@@ -200,7 +217,7 @@
                 <w:sz w:val="20"/>
                 <w:szCs w:val="20"/>
               </w:rPr>
-              <w:t xml:space="preserve">Khoa học Máy tính (Computer Science - BCU Joint Program)</w:t>
+              <w:t xml:space="preserve">Computer Science (BCU Joint Programme)</w:t>
             </w:r>
           </w:p>
         </w:tc>
@@ -345,7 +362,7 @@
           <w:sz w:val="26"/>
           <w:szCs w:val="26"/>
         </w:rPr>
-        <w:t xml:space="preserve">1. Mục Tiêu &amp; Cấu Trúc Dự Án</w:t>
+        <w:t xml:space="preserve">1. Project Objectives &amp; Repository Structure</w:t>
       </w:r>
     </w:p>
     <w:p>
@@ -361,7 +378,7 @@
           <w:sz w:val="21"/>
           <w:szCs w:val="21"/>
         </w:rPr>
-        <w:t xml:space="preserve">Trong bài Lab 1, em thực hiện xây dựng một trang web lý lịch cá nhân (Online CV/Resume) bằng HTML5 và CSS thuần. Toàn bộ nội dung trang được xây dựng trực tiếp dựa trên hồ sơ cá nhân của em về mảng lập trình Smart Contract trên EVM, tối ưu hóa hệ thống (Solidity, Yul, Rust, C++) và hạ tầng tính toán phân tán.</w:t>
+        <w:t xml:space="preserve">In Lab 1, I developed a personal curriculum vitae (Online CV/Resume) website using pure HTML5 and CSS3. The contents of the page are directly tailored to my professional background in EVM Smart Contract development, low-level systems optimization (Solidity, Yul, Rust, C++), and distributed computing infrastructure.</w:t>
       </w:r>
     </w:p>
     <w:p>
@@ -377,7 +394,7 @@
           <w:sz w:val="21"/>
           <w:szCs w:val="21"/>
         </w:rPr>
-        <w:t xml:space="preserve">Giao diện trang web được định hướng theo phong cách tối giản (minimalist) với gam màu tối trầm (#0f1013), hạn chế các chi tiết trang trí thừa thãi để tập trung vào khả năng đọc và bố cục nội dung mạch lạc. Toàn bộ codebase được viết bằng tiếng Anh chuẩn mực để phục vụ môi trường học tập và công việc.</w:t>
+        <w:t xml:space="preserve">The visual design follows a clean, minimalist aesthetic with a deep dark palette (#0f1013), eliminating superfluous decoration to focus on clear typography, structured readability, and visual hierarchy. The entire codebase and content are written in standard English to align with international academic and professional standards.</w:t>
       </w:r>
     </w:p>
     <w:p>
@@ -393,10 +410,10 @@
           <w:sz w:val="21"/>
           <w:szCs w:val="21"/>
         </w:rPr>
-        <w:t xml:space="preserve">Cấu trúc thư mục dự án gồm:
-• index.html: Chứa mã nguồn cấu trúc trang, sử dụng các thẻ HTML5 Semantic chuẩn.
-• style.css: Tệp định kiểu CSS riêng biệt (External CSS), quản lý biến màu sắc và responsive.
-• assets/: Thư mục chứa ảnh đại diện avatar.svg và favicon logo UIT.</w:t>
+        <w:t xml:space="preserve">The project directory structure is organized as follows:
+• index.html: Contains the core document structure utilizing semantic HTML5 elements.
+• style.css: Dedicated external stylesheet managing design tokens, custom properties, and responsive layout rules.
+• assets/: Directory containing the vector profile avatar (avatar.svg) and the official UIT favicon icon.</w:t>
       </w:r>
     </w:p>
     <w:p>
@@ -413,7 +430,7 @@
           <w:sz w:val="26"/>
           <w:szCs w:val="26"/>
         </w:rPr>
-        <w:t xml:space="preserve">2. Phân Tích Mã Nguồn HTML (index.html)</w:t>
+        <w:t xml:space="preserve">2. HTML Source Code Analysis (index.html)</w:t>
       </w:r>
     </w:p>
     <w:p>
@@ -429,7 +446,7 @@
           <w:sz w:val="21"/>
           <w:szCs w:val="21"/>
         </w:rPr>
-        <w:t xml:space="preserve">Dưới đây là phần giải thích các khối thẻ HTML chính trong bài làm, kèm theo ảnh chụp màn hình trực tiếp từ trình soạn thảo Neovim của em:</w:t>
+        <w:t xml:space="preserve">The following subsections explain each major semantic block within index.html, accompanied by screenshots captured directly from my Neovim editing environment:</w:t>
       </w:r>
     </w:p>
     <w:p>
@@ -446,7 +463,7 @@
           <w:sz w:val="22"/>
           <w:szCs w:val="22"/>
         </w:rPr>
-        <w:t xml:space="preserve">2.1 Khởi tạo trang và thanh điều hướng (&lt;head&gt;, &lt;nav&gt;)</w:t>
+        <w:t xml:space="preserve">2.1 Page Initialization and Navigation Bar (&lt;head&gt;, &lt;nav&gt;)</w:t>
       </w:r>
     </w:p>
     <w:p>
@@ -462,10 +479,10 @@
           <w:sz w:val="21"/>
           <w:szCs w:val="21"/>
         </w:rPr>
-        <w:t xml:space="preserve">• Khai báo &lt;!DOCTYPE html&gt; và thẻ gốc &lt;html lang="en"&gt; theo chuẩn HTML5.
-• Thẻ &lt;meta charset="UTF-8"&gt; và &lt;meta name="viewport" content="width=device-width, initial-scale=1.0"&gt; đảm bảo trang co giãn đúng tỷ lệ trên các kích thước màn hình.
-• Thẻ &lt;link rel="icon"&gt; lấy logo UIT theo đúng gợi ý trong Exercise 1.
-• Thẻ ngữ nghĩa &lt;nav&gt; chứa tiêu đề tên cá nhân và danh sách liên kết neo (jump links) đến các phần tương ứng: About, Experience, Projects, Skills, Education, Contact.</w:t>
+        <w:t xml:space="preserve">• The &lt;!DOCTYPE html&gt; declaration and root element &lt;html lang="en"&gt; adhere strictly to HTML5 specifications.
+• The &lt;meta charset="UTF-8"&gt; and &lt;meta name="viewport" content="width=device-width, initial-scale=1.0"&gt; tags guarantee proper character encoding and responsive scaling across diverse device viewports.
+• The &lt;link rel="icon"&gt; element links the official UIT logo as suggested in Exercise 1.
+• The semantic &lt;nav&gt; element houses the personal identity header along with jump links targeting key document sections: About, Experience, Projects, Skills, Education, and Contact.</w:t>
       </w:r>
     </w:p>
     <w:p>
@@ -478,7 +495,7 @@
           <wp:inline distT="0" distB="0" distL="0" distR="0">
             <wp:extent cx="4667250" cy="2619375"/>
             <wp:effectExtent t="0" r="0" b="0" l="0"/>
-            <wp:docPr id="1" name="Hình 1: Khởi tạo trang, metadata, favicon UIT và thẻ ngữ nghĩa &lt;nav&gt; mở trong Neovim" descr="Hình 1: Khởi tạo trang, metadata, favicon UIT và thẻ ngữ nghĩa &lt;nav&gt; mở trong Neovim" title="Hình 1: Khởi tạo trang, metadata, favicon UIT và thẻ ngữ nghĩa &lt;nav&gt; mở trong Neovim"/>
+            <wp:docPr id="1" name="Figure 1: Page initialization, metadata, UIT favicon, and semantic &lt;nav&gt; element in Neovim" descr="Figure 1: Page initialization, metadata, UIT favicon, and semantic &lt;nav&gt; element in Neovim" title="Figure 1: Page initialization, metadata, UIT favicon, and semantic &lt;nav&gt; element in Neovim"/>
             <wp:cNvGraphicFramePr>
               <a:graphicFrameLocks xmlns:a="http://schemas.openxmlformats.org/drawingml/2006/main" noChangeAspect="1"/>
             </wp:cNvGraphicFramePr>
@@ -526,7 +543,7 @@
           <w:sz w:val="18"/>
           <w:szCs w:val="18"/>
         </w:rPr>
-        <w:t xml:space="preserve">Hình 1: Khởi tạo trang, metadata, favicon UIT và thẻ ngữ nghĩa &lt;nav&gt; mở trong Neovim</w:t>
+        <w:t xml:space="preserve">Figure 1: Page initialization, metadata, UIT favicon, and semantic &lt;nav&gt; element in Neovim</w:t>
       </w:r>
     </w:p>
     <w:p>
@@ -543,7 +560,7 @@
           <w:sz w:val="22"/>
           <w:szCs w:val="22"/>
         </w:rPr>
-        <w:t xml:space="preserve">2.2 Phần giới thiệu đầu trang (&lt;header&gt;)</w:t>
+        <w:t xml:space="preserve">2.2 Header and Hero Section (&lt;header&gt;)</w:t>
       </w:r>
     </w:p>
     <w:p>
@@ -559,9 +576,9 @@
           <w:sz w:val="21"/>
           <w:szCs w:val="21"/>
         </w:rPr>
-        <w:t xml:space="preserve">• Thẻ &lt;header id="about"&gt; đóng vai trò phần giới thiệu đầu trang (Hero Section).
-• Sử dụng tiêu đề chính &lt;h1&gt; cho họ tên, thẻ &lt;p&gt; cho chức danh và đoạn tóm tắt định hướng nghề nghiệp.
-• Thẻ &lt;img&gt; nhúng ảnh đại diện vector (avatar.svg), đi kèm danh sách liên kết liên hệ trực tiếp (Email, Điện thoại, GitHub, LinkedIn).</w:t>
+        <w:t xml:space="preserve">• The &lt;header id="about"&gt; element serves as the introductory hero section of the portfolio.
+• It utilizes a primary &lt;h1&gt; heading for the developer name, paragraph tags &lt;p&gt; for professional title and mission statement, and direct communication channels.
+• The &lt;img&gt; element embeds the vector profile graphic (avatar.svg), complemented by an interactive contact link list (Email, Phone, GitHub, and LinkedIn).</w:t>
       </w:r>
     </w:p>
     <w:p>
@@ -574,7 +591,7 @@
           <wp:inline distT="0" distB="0" distL="0" distR="0">
             <wp:extent cx="4667250" cy="2619375"/>
             <wp:effectExtent t="0" r="0" b="0" l="0"/>
-            <wp:docPr id="2" name="Hình 2: Cấu trúc &lt;header&gt; giới thiệu thông tin và liên hệ mở trong Neovim" descr="Hình 2: Cấu trúc &lt;header&gt; giới thiệu thông tin và liên hệ mở trong Neovim" title="Hình 2: Cấu trúc &lt;header&gt; giới thiệu thông tin và liên hệ mở trong Neovim"/>
+            <wp:docPr id="2" name="Figure 2: Structure of the &lt;header&gt; hero section and contact links in Neovim" descr="Figure 2: Structure of the &lt;header&gt; hero section and contact links in Neovim" title="Figure 2: Structure of the &lt;header&gt; hero section and contact links in Neovim"/>
             <wp:cNvGraphicFramePr>
               <a:graphicFrameLocks xmlns:a="http://schemas.openxmlformats.org/drawingml/2006/main" noChangeAspect="1"/>
             </wp:cNvGraphicFramePr>
@@ -622,7 +639,7 @@
           <w:sz w:val="18"/>
           <w:szCs w:val="18"/>
         </w:rPr>
-        <w:t xml:space="preserve">Hình 2: Cấu trúc &lt;header&gt; giới thiệu thông tin và liên hệ mở trong Neovim</w:t>
+        <w:t xml:space="preserve">Figure 2: Structure of the &lt;header&gt; hero section and contact links in Neovim</w:t>
       </w:r>
     </w:p>
     <w:p>
@@ -639,7 +656,7 @@
           <w:sz w:val="22"/>
           <w:szCs w:val="22"/>
         </w:rPr>
-        <w:t xml:space="preserve">2.3 Phần kinh nghiệm làm việc (&lt;section id="experience"&gt;)</w:t>
+        <w:t xml:space="preserve">2.3 Professional Experience Section (&lt;section id="experience"&gt;)</w:t>
       </w:r>
     </w:p>
     <w:p>
@@ -655,9 +672,9 @@
           <w:sz w:val="21"/>
           <w:szCs w:val="21"/>
         </w:rPr>
-        <w:t xml:space="preserve">• Thẻ &lt;section id="experience"&gt; nhóm toàn bộ nội dung kinh nghiệm làm việc.
-• Mỗi vị trí công tác (Uniswap Labs và Hệ thống giao dịch phân tán) được đóng gói trong một thẻ &lt;article class="item-block"&gt; riêng biệt, thể hiện đúng ngữ nghĩa của một mẩu nội dung độc lập trong HTML5.
-• Tiêu đề công việc dùng &lt;h3&gt;, thời gian dùng &lt;span&gt;, và các trách nhiệm/kết quả được trình bày rõ ràng bằng danh sách &lt;ul&gt; và &lt;li&gt;.</w:t>
+        <w:t xml:space="preserve">• The &lt;section id="experience"&gt; element groups all professional work history.
+• Each role (Uniswap Labs and High-Performance Distributed Systems) is isolated inside an &lt;article class="item-block"&gt; element, fulfilling HTML5 semantic standards for standalone, self-contained items.
+• Position titles use &lt;h3&gt;, timelines are marked using &lt;span&gt;, and core achievements are clearly structured with unordered lists (&lt;ul&gt;, &lt;li&gt;).</w:t>
       </w:r>
     </w:p>
     <w:p>
@@ -670,7 +687,7 @@
           <wp:inline distT="0" distB="0" distL="0" distR="0">
             <wp:extent cx="4667250" cy="2619375"/>
             <wp:effectExtent t="0" r="0" b="0" l="0"/>
-            <wp:docPr id="3" name="Hình 3: Cấu trúc &lt;section&gt; và các thẻ &lt;article&gt; kinh nghiệm mở trong Neovim" descr="Hình 3: Cấu trúc &lt;section&gt; và các thẻ &lt;article&gt; kinh nghiệm mở trong Neovim" title="Hình 3: Cấu trúc &lt;section&gt; và các thẻ &lt;article&gt; kinh nghiệm mở trong Neovim"/>
+            <wp:docPr id="3" name="Figure 3: Semantic &lt;section&gt; and &lt;article&gt; elements for work experience in Neovim" descr="Figure 3: Semantic &lt;section&gt; and &lt;article&gt; elements for work experience in Neovim" title="Figure 3: Semantic &lt;section&gt; and &lt;article&gt; elements for work experience in Neovim"/>
             <wp:cNvGraphicFramePr>
               <a:graphicFrameLocks xmlns:a="http://schemas.openxmlformats.org/drawingml/2006/main" noChangeAspect="1"/>
             </wp:cNvGraphicFramePr>
@@ -718,7 +735,7 @@
           <w:sz w:val="18"/>
           <w:szCs w:val="18"/>
         </w:rPr>
-        <w:t xml:space="preserve">Hình 3: Cấu trúc &lt;section&gt; và các thẻ &lt;article&gt; kinh nghiệm mở trong Neovim</w:t>
+        <w:t xml:space="preserve">Figure 3: Semantic &lt;section&gt; and &lt;article&gt; elements for work experience in Neovim</w:t>
       </w:r>
     </w:p>
     <w:p>
@@ -735,7 +752,7 @@
           <w:sz w:val="22"/>
           <w:szCs w:val="22"/>
         </w:rPr>
-        <w:t xml:space="preserve">2.4 Phần dự án tiêu biểu (&lt;section id="projects"&gt;)</w:t>
+        <w:t xml:space="preserve">2.4 Featured Projects Section (&lt;section id="projects"&gt;)</w:t>
       </w:r>
     </w:p>
     <w:p>
@@ -751,8 +768,8 @@
           <w:sz w:val="21"/>
           <w:szCs w:val="21"/>
         </w:rPr>
-        <w:t xml:space="preserve">• Khu vực danh sách dự án bao gồm 4 dự án phần mềm chính: Streaming Anomaly Detector, Supply Chain Optimization Protocol, Deep Neural Network from Scratch, và Evolutionary Multi-Agent Simulator.
-• Mỗi dự án là một thẻ &lt;article class="project-item"&gt; chứa tiêu đề có liên kết &lt;a&gt;, nhãn công nghệ sử dụng và đoạn mô tả ngắn gọn.</w:t>
+        <w:t xml:space="preserve">• The project portfolio showcases four core software engineering projects: Streaming Anomaly Detector, Supply Chain Optimization Protocol, Deep Neural Network from Scratch, and Evolutionary Multi-Agent Simulator.
+• Each project is implemented as an &lt;article class="project-item"&gt; element containing hyperlink headings &lt;a&gt;, technology badge tags, and concise technical summaries.</w:t>
       </w:r>
     </w:p>
     <w:p>
@@ -765,7 +782,7 @@
           <wp:inline distT="0" distB="0" distL="0" distR="0">
             <wp:extent cx="4667250" cy="2619375"/>
             <wp:effectExtent t="0" r="0" b="0" l="0"/>
-            <wp:docPr id="4" name="Hình 4: Danh sách thẻ dự án phần mềm tiêu biểu mở trong Neovim" descr="Hình 4: Danh sách thẻ dự án phần mềm tiêu biểu mở trong Neovim" title="Hình 4: Danh sách thẻ dự án phần mềm tiêu biểu mở trong Neovim"/>
+            <wp:docPr id="4" name="Figure 4: Featured software engineering project articles in Neovim" descr="Figure 4: Featured software engineering project articles in Neovim" title="Figure 4: Featured software engineering project articles in Neovim"/>
             <wp:cNvGraphicFramePr>
               <a:graphicFrameLocks xmlns:a="http://schemas.openxmlformats.org/drawingml/2006/main" noChangeAspect="1"/>
             </wp:cNvGraphicFramePr>
@@ -813,7 +830,7 @@
           <w:sz w:val="18"/>
           <w:szCs w:val="18"/>
         </w:rPr>
-        <w:t xml:space="preserve">Hình 4: Danh sách thẻ dự án phần mềm tiêu biểu mở trong Neovim</w:t>
+        <w:t xml:space="preserve">Figure 4: Featured software engineering project articles in Neovim</w:t>
       </w:r>
     </w:p>
     <w:p>
@@ -830,7 +847,7 @@
           <w:sz w:val="22"/>
           <w:szCs w:val="22"/>
         </w:rPr>
-        <w:t xml:space="preserve">2.5 Bảng kỹ năng kỹ thuật (&lt;table&gt;)</w:t>
+        <w:t xml:space="preserve">2.5 Technical Skills Table (&lt;table&gt;)</w:t>
       </w:r>
     </w:p>
     <w:p>
@@ -846,8 +863,8 @@
           <w:sz w:val="21"/>
           <w:szCs w:val="21"/>
         </w:rPr>
-        <w:t xml:space="preserve">• Để đáp ứng yêu cầu sử dụng phần tử bảng (table) trong đề bài Lab 1, em tạo bảng tổng hợp kỹ năng kỹ thuật gồm 4 nhóm: Smart Contracts, Systems &amp; Languages, AI/ML &amp; Automation, và Infrastructure &amp; DevOps.
-• Cấu trúc bảng gồm thẻ &lt;table&gt;, phần đầu bảng &lt;thead&gt; chứa các ô tiêu đề &lt;th scope="col"&gt;, và phần thân &lt;tbody&gt; chứa các hàng &lt;tr&gt; cùng dữ liệu &lt;td&gt;.</w:t>
+        <w:t xml:space="preserve">• To fulfill the tabular data requirements of Lab 1, a comprehensive technical skills matrix was structured across four domains: Smart Contracts, Systems &amp; Languages, AI/ML &amp; Automation, and Infrastructure &amp; DevOps.
+• The table conforms to strict HTML5 standards, featuring a &lt;table&gt; container, a &lt;thead&gt; block with scoped header cells (&lt;th scope="col"&gt;), and a &lt;tbody&gt; section containing rows (&lt;tr&gt;) and data cells (&lt;td&gt;).</w:t>
       </w:r>
     </w:p>
     <w:p>
@@ -860,7 +877,7 @@
           <wp:inline distT="0" distB="0" distL="0" distR="0">
             <wp:extent cx="4667250" cy="2619375"/>
             <wp:effectExtent t="0" r="0" b="0" l="0"/>
-            <wp:docPr id="5" name="Hình 5: Bảng kỹ năng kỹ thuật với cấu trúc &lt;table&gt; chuẩn mở trong Neovim" descr="Hình 5: Bảng kỹ năng kỹ thuật với cấu trúc &lt;table&gt; chuẩn mở trong Neovim" title="Hình 5: Bảng kỹ năng kỹ thuật với cấu trúc &lt;table&gt; chuẩn mở trong Neovim"/>
+            <wp:docPr id="5" name="Figure 5: Technical skills matrix rendered with standard &lt;table&gt; structure in Neovim" descr="Figure 5: Technical skills matrix rendered with standard &lt;table&gt; structure in Neovim" title="Figure 5: Technical skills matrix rendered with standard &lt;table&gt; structure in Neovim"/>
             <wp:cNvGraphicFramePr>
               <a:graphicFrameLocks xmlns:a="http://schemas.openxmlformats.org/drawingml/2006/main" noChangeAspect="1"/>
             </wp:cNvGraphicFramePr>
@@ -908,7 +925,7 @@
           <w:sz w:val="18"/>
           <w:szCs w:val="18"/>
         </w:rPr>
-        <w:t xml:space="preserve">Hình 5: Bảng kỹ năng kỹ thuật với cấu trúc &lt;table&gt; chuẩn mở trong Neovim</w:t>
+        <w:t xml:space="preserve">Figure 5: Technical skills matrix rendered with standard &lt;table&gt; structure in Neovim</w:t>
       </w:r>
     </w:p>
     <w:p>
@@ -925,7 +942,7 @@
           <w:sz w:val="22"/>
           <w:szCs w:val="22"/>
         </w:rPr>
-        <w:t xml:space="preserve">2.6 Biểu mẫu liên hệ &amp; Thanh bên Aside (&lt;form&gt;, &lt;aside&gt;, &lt;footer&gt;)</w:t>
+        <w:t xml:space="preserve">2.6 Contact Form, Aside Sidebar, and Footer (&lt;form&gt;, &lt;aside&gt;, &lt;footer&gt;)</w:t>
       </w:r>
     </w:p>
     <w:p>
@@ -941,9 +958,9 @@
           <w:sz w:val="21"/>
           <w:szCs w:val="21"/>
         </w:rPr>
-        <w:t xml:space="preserve">• Thẻ &lt;form&gt;: Đáp ứng yêu cầu Form &amp; Input trong Lab 1 với các trường họ tên (&lt;input type="text"&gt;), email (&lt;input type="email"&gt;), ô nhập nội dung (&lt;textarea&gt;) và nút gửi (&lt;button type="submit"&gt;). Mỗi ô nhập đều có &lt;label&gt; gắn liền qua thuộc tính for/id.
-• Thẻ &lt;aside&gt;: Thanh bên chứa thông tin học vấn (Đại học Công nghệ Thông tin &amp; Birmingham City University), giải thưởng cuộc thi bằng danh sách có thứ tự &lt;ol&gt;, và thông số kỹ thuật nhanh bằng danh sách định nghĩa &lt;dl&gt;, &lt;dt&gt;, &lt;dd&gt;.
-• Thẻ &lt;footer&gt;: Chân trang thể hiện bản quyền cá nhân và đường link quay về đầu trang.</w:t>
+        <w:t xml:space="preserve">• &lt;form&gt; Element: Satisfies the Lab 1 form requirements with accessible inputs for Name (&lt;input type="text"&gt;), Email (&lt;input type="email"&gt;), Message (&lt;textarea&gt;), and a submit button (&lt;button type="submit"&gt;). All inputs are bound to descriptive &lt;label&gt; elements via matching for and id attributes.
+• &lt;aside&gt; Element: Acts as a complementary sidebar featuring educational qualifications (University of Information Technology &amp; Birmingham City University), competitive awards using an ordered list (&lt;ol&gt;), and quick technical specifications via a definition list (&lt;dl&gt;, &lt;dt&gt;, &lt;dd&gt;).
+• &lt;footer&gt; Element: Marks the page ending with personal copyright notes and an accessible back-to-top navigation link.</w:t>
       </w:r>
     </w:p>
     <w:p>
@@ -956,7 +973,7 @@
           <wp:inline distT="0" distB="0" distL="0" distR="0">
             <wp:extent cx="4667250" cy="2619375"/>
             <wp:effectExtent t="0" r="0" b="0" l="0"/>
-            <wp:docPr id="6" name="Hình 6: Biểu mẫu &lt;form&gt;, thanh bên &lt;aside&gt; và chân trang &lt;footer&gt; mở trong Neovim" descr="Hình 6: Biểu mẫu &lt;form&gt;, thanh bên &lt;aside&gt; và chân trang &lt;footer&gt; mở trong Neovim" title="Hình 6: Biểu mẫu &lt;form&gt;, thanh bên &lt;aside&gt; và chân trang &lt;footer&gt; mở trong Neovim"/>
+            <wp:docPr id="6" name="Figure 6: Contact &lt;form&gt;, supplementary &lt;aside&gt; sidebar, and &lt;footer&gt; in Neovim" descr="Figure 6: Contact &lt;form&gt;, supplementary &lt;aside&gt; sidebar, and &lt;footer&gt; in Neovim" title="Figure 6: Contact &lt;form&gt;, supplementary &lt;aside&gt; sidebar, and &lt;footer&gt; in Neovim"/>
             <wp:cNvGraphicFramePr>
               <a:graphicFrameLocks xmlns:a="http://schemas.openxmlformats.org/drawingml/2006/main" noChangeAspect="1"/>
             </wp:cNvGraphicFramePr>
@@ -1004,7 +1021,7 @@
           <w:sz w:val="18"/>
           <w:szCs w:val="18"/>
         </w:rPr>
-        <w:t xml:space="preserve">Hình 6: Biểu mẫu &lt;form&gt;, thanh bên &lt;aside&gt; và chân trang &lt;footer&gt; mở trong Neovim</w:t>
+        <w:t xml:space="preserve">Figure 6: Contact &lt;form&gt;, supplementary &lt;aside&gt; sidebar, and &lt;footer&gt; in Neovim</w:t>
       </w:r>
     </w:p>
     <w:p>
@@ -1021,7 +1038,7 @@
           <w:sz w:val="26"/>
           <w:szCs w:val="26"/>
         </w:rPr>
-        <w:t xml:space="preserve">3. Phân Tích Mã Nguồn CSS (style.css)</w:t>
+        <w:t xml:space="preserve">3. CSS Source Code Analysis (style.css)</w:t>
       </w:r>
     </w:p>
     <w:p>
@@ -1037,7 +1054,7 @@
           <w:sz w:val="21"/>
           <w:szCs w:val="21"/>
         </w:rPr>
-        <w:t xml:space="preserve">File CSS được tách riêng và liên kết với HTML theo đúng khuyến nghị của đề bài (External CSS). Phong cách thiết kế ưu tiên sự gọn gàng, tính phân cấp rõ ràng và hỗ trợ tốt trên màn hình di động.</w:t>
+        <w:t xml:space="preserve">The styling rules are encapsulated within a separate external stylesheet (style.css) following Lab 1 best practices. The design prioritizes visual simplicity, distinct typographic hierarchy, and robust mobile responsiveness.</w:t>
       </w:r>
     </w:p>
     <w:p>
@@ -1054,7 +1071,7 @@
           <w:sz w:val="22"/>
           <w:szCs w:val="22"/>
         </w:rPr>
-        <w:t xml:space="preserve">3.1 Biến CSS, Reset &amp; Box Model</w:t>
+        <w:t xml:space="preserve">3.1 CSS Custom Properties, Global Reset &amp; Box Model</w:t>
       </w:r>
     </w:p>
     <w:p>
@@ -1070,8 +1087,8 @@
           <w:sz w:val="21"/>
           <w:szCs w:val="21"/>
         </w:rPr>
-        <w:t xml:space="preserve">• Khối :root khai báo các biến CSS (CSS Variables) để quản lý tập trung mã màu nền (--bg: #0f1013), màu bề mặt (--surface: #15171c), màu viền (--border: #22252c) và màu chữ (--text: #e1e4ea).
-• Quy tắc * { box-sizing: border-box; } giúp tính toán kích thước phần tử chính xác gồm cả padding và border, tránh lỗi vỡ bố cục khi thêm khoảng đệm.</w:t>
+        <w:t xml:space="preserve">• The :root pseudo-class declares centralized CSS variables for background colors (--bg: #0f1013), card surfaces (--surface: #15171c), subtle borders (--border: #22252c), and body text (--text: #e1e4ea).
+• The universal selector * enforces box-sizing: border-box, ensuring padding and border dimensions are accounted for within defined element dimensions to prevent unexpected layout breakage.</w:t>
       </w:r>
     </w:p>
     <w:p>
@@ -1084,7 +1101,7 @@
           <wp:inline distT="0" distB="0" distL="0" distR="0">
             <wp:extent cx="4667250" cy="2619375"/>
             <wp:effectExtent t="0" r="0" b="0" l="0"/>
-            <wp:docPr id="7" name="Hình 7: Khai báo biến CSS :root và thiết lập Box Model mở trong Neovim" descr="Hình 7: Khai báo biến CSS :root và thiết lập Box Model mở trong Neovim" title="Hình 7: Khai báo biến CSS :root và thiết lập Box Model mở trong Neovim"/>
+            <wp:docPr id="7" name="Figure 7: Centralized CSS custom properties (:root) and box model reset in Neovim" descr="Figure 7: Centralized CSS custom properties (:root) and box model reset in Neovim" title="Figure 7: Centralized CSS custom properties (:root) and box model reset in Neovim"/>
             <wp:cNvGraphicFramePr>
               <a:graphicFrameLocks xmlns:a="http://schemas.openxmlformats.org/drawingml/2006/main" noChangeAspect="1"/>
             </wp:cNvGraphicFramePr>
@@ -1132,7 +1149,7 @@
           <w:sz w:val="18"/>
           <w:szCs w:val="18"/>
         </w:rPr>
-        <w:t xml:space="preserve">Hình 7: Khai báo biến CSS :root và thiết lập Box Model mở trong Neovim</w:t>
+        <w:t xml:space="preserve">Figure 7: Centralized CSS custom properties (:root) and box model reset in Neovim</w:t>
       </w:r>
     </w:p>
     <w:p>
@@ -1149,7 +1166,7 @@
           <w:sz w:val="22"/>
           <w:szCs w:val="22"/>
         </w:rPr>
-        <w:t xml:space="preserve">3.2 Định kiểu Navigation &amp; Header</w:t>
+        <w:t xml:space="preserve">3.2 Navigation Bar &amp; Header Hero Styling</w:t>
       </w:r>
     </w:p>
     <w:p>
@@ -1165,8 +1182,8 @@
           <w:sz w:val="21"/>
           <w:szCs w:val="21"/>
         </w:rPr>
-        <w:t xml:space="preserve">• Thanh .navbar sử dụng position: sticky và backdrop-filter: blur(8px) giúp thanh menu cố định phía trên khi cuộn trang.
-• Bố cục header dùng Flexbox chia hai phần: khối văn bản thông tin bên trái và ảnh đại diện bo tròn bên phải.</w:t>
+        <w:t xml:space="preserve">• The .navbar class uses position: sticky and backdrop-filter: blur(8px), creating a persistent translucent top navigation bar during scrolling.
+• The header layout is structured via CSS Flexbox, arranging biographical introductory text on the left and the circular profile avatar on the right.</w:t>
       </w:r>
     </w:p>
     <w:p>
@@ -1179,7 +1196,7 @@
           <wp:inline distT="0" distB="0" distL="0" distR="0">
             <wp:extent cx="4667250" cy="2619375"/>
             <wp:effectExtent t="0" r="0" b="0" l="0"/>
-            <wp:docPr id="8" name="Hình 8: Định kiểu thanh điều hướng và header mở trong Neovim" descr="Hình 8: Định kiểu thanh điều hướng và header mở trong Neovim" title="Hình 8: Định kiểu thanh điều hướng và header mở trong Neovim"/>
+            <wp:docPr id="8" name="Figure 8: Sticky navigation bar and flexbox header styling in Neovim" descr="Figure 8: Sticky navigation bar and flexbox header styling in Neovim" title="Figure 8: Sticky navigation bar and flexbox header styling in Neovim"/>
             <wp:cNvGraphicFramePr>
               <a:graphicFrameLocks xmlns:a="http://schemas.openxmlformats.org/drawingml/2006/main" noChangeAspect="1"/>
             </wp:cNvGraphicFramePr>
@@ -1227,7 +1244,7 @@
           <w:sz w:val="18"/>
           <w:szCs w:val="18"/>
         </w:rPr>
-        <w:t xml:space="preserve">Hình 8: Định kiểu thanh điều hướng và header mở trong Neovim</w:t>
+        <w:t xml:space="preserve">Figure 8: Sticky navigation bar and flexbox header styling in Neovim</w:t>
       </w:r>
     </w:p>
     <w:p>
@@ -1244,7 +1261,7 @@
           <w:sz w:val="22"/>
           <w:szCs w:val="22"/>
         </w:rPr>
-        <w:t xml:space="preserve">3.3 Bố cục nội dung chính, Card &amp; Hiệu ứng Hover (Exercise 4)</w:t>
+        <w:t xml:space="preserve">3.3 Main Layout Grid, Card Design &amp; Hover Transitions (Exercise 4)</w:t>
       </w:r>
     </w:p>
     <w:p>
@@ -1260,8 +1277,8 @@
           <w:sz w:val="21"/>
           <w:szCs w:val="21"/>
         </w:rPr>
-        <w:t xml:space="preserve">• Bố cục trang chia thành 2 cột bằng CSS Grid (.layout-container { display: grid; grid-template-columns: 1fr 310px; gap: 48px; }).
-• Thực hiện yêu cầu Exercise 4 trong đề bài: Thẻ dự án .project-item và nút bấm đều được gắn transition: border-color 0.2s ease, transform 0.2s ease. Khi rê chuột qua (:hover), phần tử nhấc lên nhẹ nhàng bằng transform: translateY(-2px) và viền sáng hơn, tạo phản hồi xúc giác tự nhiên.</w:t>
+        <w:t xml:space="preserve">• The primary content area utilizes a two-column CSS Grid (.layout-container { display: grid; grid-template-columns: 1fr 310px; gap: 48px; }).
+• Implements Exercise 4 requirements: Project cards (.project-item) and action buttons include smooth transition rules (transition: border-color 0.2s ease, transform 0.2s ease). When hovered (:hover), elements smoothly elevate via transform: translateY(-2px) with an illuminated border, providing natural tactile feedback.</w:t>
       </w:r>
     </w:p>
     <w:p>
@@ -1274,7 +1291,7 @@
           <wp:inline distT="0" distB="0" distL="0" distR="0">
             <wp:extent cx="4667250" cy="2619375"/>
             <wp:effectExtent t="0" r="0" b="0" l="0"/>
-            <wp:docPr id="9" name="Hình 9: Định kiểu danh sách bài viết và hiệu ứng hover mở trong Neovim" descr="Hình 9: Định kiểu danh sách bài viết và hiệu ứng hover mở trong Neovim" title="Hình 9: Định kiểu danh sách bài viết và hiệu ứng hover mở trong Neovim"/>
+            <wp:docPr id="9" name="Figure 9: Article styling, grid alignment, and hover transitions in Neovim" descr="Figure 9: Article styling, grid alignment, and hover transitions in Neovim" title="Figure 9: Article styling, grid alignment, and hover transitions in Neovim"/>
             <wp:cNvGraphicFramePr>
               <a:graphicFrameLocks xmlns:a="http://schemas.openxmlformats.org/drawingml/2006/main" noChangeAspect="1"/>
             </wp:cNvGraphicFramePr>
@@ -1322,7 +1339,7 @@
           <w:sz w:val="18"/>
           <w:szCs w:val="18"/>
         </w:rPr>
-        <w:t xml:space="preserve">Hình 9: Định kiểu danh sách bài viết và hiệu ứng hover mở trong Neovim</w:t>
+        <w:t xml:space="preserve">Figure 9: Article styling, grid alignment, and hover transitions in Neovim</w:t>
       </w:r>
     </w:p>
     <w:p>
@@ -1339,7 +1356,7 @@
           <w:sz w:val="22"/>
           <w:szCs w:val="22"/>
         </w:rPr>
-        <w:t xml:space="preserve">3.4 Định kiểu Bảng dữ liệu &amp; Form liên hệ</w:t>
+        <w:t xml:space="preserve">3.4 Data Table Styling, Contact Form &amp; Responsive Media Queries</w:t>
       </w:r>
     </w:p>
     <w:p>
@@ -1355,9 +1372,9 @@
           <w:sz w:val="21"/>
           <w:szCs w:val="21"/>
         </w:rPr>
-        <w:t xml:space="preserve">• Bảng dữ liệu được bọc trong container có overflow-x: auto để không bị tràn khi xem trên màn hình nhỏ. Hàng bảng có hiệu ứng đổi màu nền nhẹ khi rê chuột.
-• Ô nhập liệu input và textarea khi focus sẽ đổi màu viền sang --border-focus (#4b5563) để người dùng nhận biết vị trí đang gõ phím.
-• Áp dụng Media Query (@media (max-width: 860px) và @media (max-width: 600px)) để tự động chuyển bố cục lưới thành 1 cột trên màn hình điện thoại.</w:t>
+        <w:t xml:space="preserve">• The data table is wrapped inside a scroll container with overflow-x: auto to prevent horizontal viewport clipping on mobile screens, paired with subtle row hover effects.
+• Form controls (input and textarea) dynamically update their border color to --border-focus (#4b5563) on focus, giving users clear visual cues.
+• CSS Media Queries (@media (max-width: 860px) and @media (max-width: 600px)) collapse the multi-column grid into a single-column layout on smaller screens.</w:t>
       </w:r>
     </w:p>
     <w:p>
@@ -1370,7 +1387,7 @@
           <wp:inline distT="0" distB="0" distL="0" distR="0">
             <wp:extent cx="4667250" cy="2619375"/>
             <wp:effectExtent t="0" r="0" b="0" l="0"/>
-            <wp:docPr id="10" name="Hình 10: Định kiểu bảng, form liên hệ và media queries mở trong Neovim" descr="Hình 10: Định kiểu bảng, form liên hệ và media queries mở trong Neovim" title="Hình 10: Định kiểu bảng, form liên hệ và media queries mở trong Neovim"/>
+            <wp:docPr id="10" name="Figure 10: Table styling, input focus states, and responsive media queries in Neovim" descr="Figure 10: Table styling, input focus states, and responsive media queries in Neovim" title="Figure 10: Table styling, input focus states, and responsive media queries in Neovim"/>
             <wp:cNvGraphicFramePr>
               <a:graphicFrameLocks xmlns:a="http://schemas.openxmlformats.org/drawingml/2006/main" noChangeAspect="1"/>
             </wp:cNvGraphicFramePr>
@@ -1418,7 +1435,7 @@
           <w:sz w:val="18"/>
           <w:szCs w:val="18"/>
         </w:rPr>
-        <w:t xml:space="preserve">Hình 10: Định kiểu bảng, form liên hệ và media queries mở trong Neovim</w:t>
+        <w:t xml:space="preserve">Figure 10: Table styling, input focus states, and responsive media queries in Neovim</w:t>
       </w:r>
     </w:p>
     <w:p>
@@ -1435,7 +1452,7 @@
           <w:sz w:val="26"/>
           <w:szCs w:val="26"/>
         </w:rPr>
-        <w:t xml:space="preserve">4. Kết Quả Giao Diện Hiển Thị Trực Quan</w:t>
+        <w:t xml:space="preserve">4. Visual Output &amp; Rendered Page Results</w:t>
       </w:r>
     </w:p>
     <w:p>
@@ -1451,7 +1468,7 @@
           <w:sz w:val="21"/>
           <w:szCs w:val="21"/>
         </w:rPr>
-        <w:t xml:space="preserve">Dưới đây là hình ảnh chụp giao diện trang web CV cá nhân sau khi hoàn thiện toàn bộ mã nguồn HTML5 và CSS:</w:t>
+        <w:t xml:space="preserve">Below is the complete visual capture of the rendered personal CV webpage following the implementation of all HTML5 and CSS3 specifications:</w:t>
       </w:r>
     </w:p>
     <w:p>
@@ -1464,7 +1481,7 @@
           <wp:inline distT="0" distB="0" distL="0" distR="0">
             <wp:extent cx="4667250" cy="6562725"/>
             <wp:effectExtent t="0" r="0" b="0" l="0"/>
-            <wp:docPr id="11" name="Hình 11: Giao diện hoàn chỉnh trang web CV Huynh Khanh Thien trên trình duyệt" descr="Hình 11: Giao diện hoàn chỉnh trang web CV Huynh Khanh Thien trên trình duyệt" title="Hình 11: Giao diện hoàn chỉnh trang web CV Huynh Khanh Thien trên trình duyệt"/>
+            <wp:docPr id="11" name="Figure 11: Complete browser view of the personal CV portfolio for Huynh Khanh Thien" descr="Figure 11: Complete browser view of the personal CV portfolio for Huynh Khanh Thien" title="Figure 11: Complete browser view of the personal CV portfolio for Huynh Khanh Thien"/>
             <wp:cNvGraphicFramePr>
               <a:graphicFrameLocks xmlns:a="http://schemas.openxmlformats.org/drawingml/2006/main" noChangeAspect="1"/>
             </wp:cNvGraphicFramePr>
@@ -1512,7 +1529,7 @@
           <w:sz w:val="18"/>
           <w:szCs w:val="18"/>
         </w:rPr>
-        <w:t xml:space="preserve">Hình 11: Giao diện hoàn chỉnh trang web CV Huynh Khanh Thien trên trình duyệt</w:t>
+        <w:t xml:space="preserve">Figure 11: Complete browser view of the personal CV portfolio for Huynh Khanh Thien</w:t>
       </w:r>
     </w:p>
     <w:p>
@@ -1529,7 +1546,7 @@
           <w:sz w:val="26"/>
           <w:szCs w:val="26"/>
         </w:rPr>
-        <w:t xml:space="preserve">5. Quy Trình Triển Khai GitHub Pages</w:t>
+        <w:t xml:space="preserve">5. Deployment Workflow &amp; GitHub Pages Setup</w:t>
       </w:r>
     </w:p>
     <w:p>
@@ -1545,12 +1562,12 @@
           <w:sz w:val="21"/>
           <w:szCs w:val="21"/>
         </w:rPr>
-        <w:t xml:space="preserve">Sau khi hoàn thiện mã nguồn, em thực hiện các bước triển khai lên môi trường mạng theo hướng dẫn tại Mục 5 của Lab 1:
-1. Khởi tạo kho chứa và commit: git add . &amp;&amp; git commit -m '...'
-2. Đẩy mã nguồn lên GitHub: git remote add origin https://github.com/thien-z3d3r/lab1-cv.git &amp;&amp; git push -u origin main
-3. Kích hoạt GitHub Pages trong phần Settings -&gt; Pages của repository, chọn nguồn từ nhánh main và thư mục /(root).
-4. Nghiệm thu trang web hoạt động bình thường tại địa chỉ: https://thien-z3d3r.github.io/lab1-cv/
-5. Toàn bộ các bài tập về nhà cũng được triển khai công khai tại: https://thien-z3d3r.github.io/lab1-cv/homework/</w:t>
+        <w:t xml:space="preserve">Following local development, the project was deployed to a production web environment following Section 5 of the Lab 1 manual:
+1. Repository initialization and local commit: git add . &amp;&amp; git commit -m '...'
+2. Remote synchronization: git remote add origin https://github.com/thien-z3d3r/lab1-cv.git &amp;&amp; git push -u origin main
+3. GitHub Pages activation: Configured under Repository Settings -&gt; Pages, targeting the main branch and root folder /(root).
+4. Production acceptance testing: Verified live and fully accessible at https://thien-z3d3r.github.io/lab1-cv/
+5. All supplementary homework assignments were also deployed under https://thien-z3d3r.github.io/lab1-cv/homework/</w:t>
       </w:r>
     </w:p>
     <w:p>
@@ -1567,7 +1584,7 @@
           <w:sz w:val="26"/>
           <w:szCs w:val="26"/>
         </w:rPr>
-        <w:t xml:space="preserve">6. Bài Tập Về Nhà (Homework Exercises)</w:t>
+        <w:t xml:space="preserve">6. Homework Exercises</w:t>
       </w:r>
     </w:p>
     <w:p>
@@ -1583,7 +1600,7 @@
           <w:sz w:val="21"/>
           <w:szCs w:val="21"/>
         </w:rPr>
-        <w:t xml:space="preserve">Phần này trình bày kết quả thực hiện đầy đủ 3 bài tập về nhà trong Mục 6 của tài liệu hướng dẫn Lab 1, với mã nguồn HTML5 và CSS3 đạt độ chính xác cao so với ảnh mẫu quy chuẩn:</w:t>
+        <w:t xml:space="preserve">This section details the complete implementation of the 3 homework assignments outlined in Section 6 of the Lab 1 laboratory manual, matching standard target design references with high fidelity:</w:t>
       </w:r>
     </w:p>
     <w:p>
@@ -1600,7 +1617,7 @@
           <w:sz w:val="22"/>
           <w:szCs w:val="22"/>
         </w:rPr>
-        <w:t xml:space="preserve">6.1 Bài Tập 1: Flip Card Gallery (Phòng trưng bày thẻ lật 3D)</w:t>
+        <w:t xml:space="preserve">6.1 Exercise 1: 3D Flip Card Gallery</w:t>
       </w:r>
     </w:p>
     <w:p>
@@ -1616,13 +1633,13 @@
           <w:sz w:val="21"/>
           <w:szCs w:val="21"/>
         </w:rPr>
-        <w:t xml:space="preserve">Bài tập yêu cầu xây dựng 3 thẻ công nghệ (HTML, CSS, JavaScript) có khả năng xoay lật 180 độ trong không gian 3 chiều khi người dùng rê chuột (hover). Mặt trước hiển thị biểu tượng và tiêu đề, mặt sau hiển thị tóm tắt chức năng công nghệ.
-Các kỹ thuật CSS trọng tâm được áp dụng:
-• perspective: 1000px: Khởi tạo chiều sâu không gian 3 chiều cho khung chứa flip-card.
-• transform-style: preserve-3d: Duy trì không gian 3D cho các lớp con trong quá trình xoay.
-• transition: transform 0.6s cubic-bezier(0.4, 0, 0.2, 1): Đảm bảo chuyển động lật êm mượt.
-• backface-visibility: hidden: Ẩn mặt phía sau khi xoay lưng về phía người xem.
-• transform: rotateY(180deg): Xoay lật quanh trục dọc Y khi hover.</w:t>
+        <w:t xml:space="preserve">The objective is to construct three technology cards (HTML, CSS, JavaScript) that perform a realistic 180-degree 3D flip on hover. The front face displays the technology icon and title, while the back face reveals a detailed functional summary.
+Key CSS3 techniques implemented:
+• perspective: 1000px: Establishes three-dimensional scene depth on the parent container.
+• transform-style: preserve-3d: Preserves child elements within 3D coordinate space throughout rotations.
+• transition: transform 0.6s cubic-bezier(0.4, 0, 0.2, 1): Delivers a polished, natural flipping motion.
+• backface-visibility: hidden: Hides the reverse side of card planes when facing away from the camera.
+• transform: rotateY(180deg): Flips the card 180 degrees along its vertical Y-axis on mouse hover.</w:t>
       </w:r>
     </w:p>
     <w:p>
@@ -1635,7 +1652,7 @@
           <wp:inline distT="0" distB="0" distL="0" distR="0">
             <wp:extent cx="4667250" cy="3914775"/>
             <wp:effectExtent t="0" r="0" b="0" l="0"/>
-            <wp:docPr id="12" name="Hình 12: Đoạn mã CSS xử lý hiệu ứng lật thẻ 3D trong flip-card.css" descr="Hình 12: Đoạn mã CSS xử lý hiệu ứng lật thẻ 3D trong flip-card.css" title="Hình 12: Đoạn mã CSS xử lý hiệu ứng lật thẻ 3D trong flip-card.css"/>
+            <wp:docPr id="12" name="Figure 12: CSS implementation of 3D card rotation and transitions in flip-card.css" descr="Figure 12: CSS implementation of 3D card rotation and transitions in flip-card.css" title="Figure 12: CSS implementation of 3D card rotation and transitions in flip-card.css"/>
             <wp:cNvGraphicFramePr>
               <a:graphicFrameLocks xmlns:a="http://schemas.openxmlformats.org/drawingml/2006/main" noChangeAspect="1"/>
             </wp:cNvGraphicFramePr>
@@ -1683,7 +1700,7 @@
           <w:sz w:val="18"/>
           <w:szCs w:val="18"/>
         </w:rPr>
-        <w:t xml:space="preserve">Hình 12: Đoạn mã CSS xử lý hiệu ứng lật thẻ 3D trong flip-card.css</w:t>
+        <w:t xml:space="preserve">Figure 12: CSS implementation of 3D card rotation and transitions in flip-card.css</w:t>
       </w:r>
     </w:p>
     <w:p>
@@ -1696,7 +1713,7 @@
           <wp:inline distT="0" distB="0" distL="0" distR="0">
             <wp:extent cx="4667250" cy="2590800"/>
             <wp:effectExtent t="0" r="0" b="0" l="0"/>
-            <wp:docPr id="13" name="Hình 13: Giao diện Flip Card Gallery ở trạng thái mặc định (Mặt trước)" descr="Hình 13: Giao diện Flip Card Gallery ở trạng thái mặc định (Mặt trước)" title="Hình 13: Giao diện Flip Card Gallery ở trạng thái mặc định (Mặt trước)"/>
+            <wp:docPr id="13" name="Figure 13: 3D Flip Card Gallery in default state (Front faces)" descr="Figure 13: 3D Flip Card Gallery in default state (Front faces)" title="Figure 13: 3D Flip Card Gallery in default state (Front faces)"/>
             <wp:cNvGraphicFramePr>
               <a:graphicFrameLocks xmlns:a="http://schemas.openxmlformats.org/drawingml/2006/main" noChangeAspect="1"/>
             </wp:cNvGraphicFramePr>
@@ -1744,7 +1761,7 @@
           <w:sz w:val="18"/>
           <w:szCs w:val="18"/>
         </w:rPr>
-        <w:t xml:space="preserve">Hình 13: Giao diện Flip Card Gallery ở trạng thái mặc định (Mặt trước)</w:t>
+        <w:t xml:space="preserve">Figure 13: 3D Flip Card Gallery in default state (Front faces)</w:t>
       </w:r>
     </w:p>
     <w:p>
@@ -1757,7 +1774,7 @@
           <wp:inline distT="0" distB="0" distL="0" distR="0">
             <wp:extent cx="4667250" cy="2590800"/>
             <wp:effectExtent t="0" r="0" b="0" l="0"/>
-            <wp:docPr id="14" name="Hình 14: Giao diện thẻ khi hover – Mặt sau hiển thị thông tin mô tả chi tiết" descr="Hình 14: Giao diện thẻ khi hover – Mặt sau hiển thị thông tin mô tả chi tiết" title="Hình 14: Giao diện thẻ khi hover – Mặt sau hiển thị thông tin mô tả chi tiết"/>
+            <wp:docPr id="14" name="Figure 14: 3D Flip Card Gallery on hover - reverse face displaying functional summary" descr="Figure 14: 3D Flip Card Gallery on hover - reverse face displaying functional summary" title="Figure 14: 3D Flip Card Gallery on hover - reverse face displaying functional summary"/>
             <wp:cNvGraphicFramePr>
               <a:graphicFrameLocks xmlns:a="http://schemas.openxmlformats.org/drawingml/2006/main" noChangeAspect="1"/>
             </wp:cNvGraphicFramePr>
@@ -1805,7 +1822,7 @@
           <w:sz w:val="18"/>
           <w:szCs w:val="18"/>
         </w:rPr>
-        <w:t xml:space="preserve">Hình 14: Giao diện thẻ khi hover – Mặt sau hiển thị thông tin mô tả chi tiết</w:t>
+        <w:t xml:space="preserve">Figure 14: 3D Flip Card Gallery on hover - reverse face displaying functional summary</w:t>
       </w:r>
     </w:p>
     <w:p>
@@ -1822,7 +1839,7 @@
           <w:sz w:val="22"/>
           <w:szCs w:val="22"/>
         </w:rPr>
-        <w:t xml:space="preserve">6.2 Bài Tập 2: Login / Sign-up Card (Thẻ xác thực hai cột)</w:t>
+        <w:t xml:space="preserve">6.2 Exercise 2: Two-Column Login / Sign-up Card</w:t>
       </w:r>
     </w:p>
     <w:p>
@@ -1838,13 +1855,13 @@
           <w:sz w:val="21"/>
           <w:szCs w:val="21"/>
         </w:rPr>
-        <w:t xml:space="preserve">Bài tập yêu cầu thiết kế một thẻ xác thực hai cột cân đối được căn giữa màn hình (Flexbox centering):
-• Cột trái (Form Panel): Nền trắng tinh tế, bao gồm tiêu đề 'Welcome back', phụ đề 'Sign in to continue', ô nhập Email (you@example.com), Password (••••••••), checkbox 'Remember me', và nút 'Sign In' màu xanh dương với hiệu ứng hover nâng nhẹ.
-• Cột phải (Decorative Panel): Nền gradient chuyển sắc từ xanh dương sang xanh đậm (#2563eb -&gt; #1e40af), hiển thị lời chào 'Hello, Friend!' và thông điệp truyền cảm hứng xây dựng dự án web.
-Các thuộc tính CSS chủ đạo:
-• Flexbox centering: display: flex; justify-content: center; align-items: center; min-height: 100vh.
-• Card styling: border-radius: 16px; overflow: hidden; box-shadow: 0 20px 25px -5px rgba(0,0,0,0.08).
-• Form controls: Ô nhập liệu có viền mềm mại, hiệu ứng focus phát sáng xanh, nút bấm chuyển màu và nâng nhẹ translateY(-1px) khi tương tác.</w:t>
+        <w:t xml:space="preserve">This assignment requires building a responsive, centered two-column authentication card using CSS Flexbox:
+• Left Column (Form Panel): Clean white background containing the 'Welcome back' heading, 'Sign in to continue' subtitle, input fields for Email (you@example.com) and Password (••••••••), a 'Remember me' checkbox, and a prominent blue 'Sign In' button with subtle hover elevation.
+• Right Column (Decorative Panel): Rich blue gradient (#2563eb to #1e40af) presenting a 'Hello, Friend!' greeting and inspiring copy encouraging web development.
+Key CSS techniques:
+• Viewport Flexbox centering: display: flex; justify-content: center; align-items: center; min-height: 100vh.
+• Card aesthetics: border-radius: 16px; overflow: hidden; box-shadow: 0 20px 25px -5px rgba(0,0,0,0.08).
+• Form controls: Polished input borders, focused glow styling, smooth button transitions, and hover elevation (transform: translateY(-1px)).</w:t>
       </w:r>
     </w:p>
     <w:p>
@@ -1857,7 +1874,7 @@
           <wp:inline distT="0" distB="0" distL="0" distR="0">
             <wp:extent cx="4667250" cy="3914775"/>
             <wp:effectExtent t="0" r="0" b="0" l="0"/>
-            <wp:docPr id="15" name="Hình 15: Đoạn mã CSS định kiểu thẻ xác thực hai cột trong login-card.css" descr="Hình 15: Đoạn mã CSS định kiểu thẻ xác thực hai cột trong login-card.css" title="Hình 15: Đoạn mã CSS định kiểu thẻ xác thực hai cột trong login-card.css"/>
+            <wp:docPr id="15" name="Figure 15: CSS implementation for the two-column authentication card in login-card.css" descr="Figure 15: CSS implementation for the two-column authentication card in login-card.css" title="Figure 15: CSS implementation for the two-column authentication card in login-card.css"/>
             <wp:cNvGraphicFramePr>
               <a:graphicFrameLocks xmlns:a="http://schemas.openxmlformats.org/drawingml/2006/main" noChangeAspect="1"/>
             </wp:cNvGraphicFramePr>
@@ -1905,7 +1922,7 @@
           <w:sz w:val="18"/>
           <w:szCs w:val="18"/>
         </w:rPr>
-        <w:t xml:space="preserve">Hình 15: Đoạn mã CSS định kiểu thẻ xác thực hai cột trong login-card.css</w:t>
+        <w:t xml:space="preserve">Figure 15: CSS implementation for the two-column authentication card in login-card.css</w:t>
       </w:r>
     </w:p>
     <w:p>
@@ -1918,7 +1935,7 @@
           <wp:inline distT="0" distB="0" distL="0" distR="0">
             <wp:extent cx="4667250" cy="3038475"/>
             <wp:effectExtent t="0" r="0" b="0" l="0"/>
-            <wp:docPr id="16" name="Hình 16: Giao diện Login / Sign-up Card hoàn chỉnh bám sát ảnh mẫu quy chuẩn" descr="Hình 16: Giao diện Login / Sign-up Card hoàn chỉnh bám sát ảnh mẫu quy chuẩn" title="Hình 16: Giao diện Login / Sign-up Card hoàn chỉnh bám sát ảnh mẫu quy chuẩn"/>
+            <wp:docPr id="16" name="Figure 16: Completed Login / Sign-up Card matching reference specifications" descr="Figure 16: Completed Login / Sign-up Card matching reference specifications" title="Figure 16: Completed Login / Sign-up Card matching reference specifications"/>
             <wp:cNvGraphicFramePr>
               <a:graphicFrameLocks xmlns:a="http://schemas.openxmlformats.org/drawingml/2006/main" noChangeAspect="1"/>
             </wp:cNvGraphicFramePr>
@@ -1966,7 +1983,7 @@
           <w:sz w:val="18"/>
           <w:szCs w:val="18"/>
         </w:rPr>
-        <w:t xml:space="preserve">Hình 16: Giao diện Login / Sign-up Card hoàn chỉnh bám sát ảnh mẫu quy chuẩn</w:t>
+        <w:t xml:space="preserve">Figure 16: Completed Login / Sign-up Card matching reference specifications</w:t>
       </w:r>
     </w:p>
     <w:p>
@@ -1983,7 +2000,7 @@
           <w:sz w:val="22"/>
           <w:szCs w:val="22"/>
         </w:rPr>
-        <w:t xml:space="preserve">6.3 Bài Tập 3: Infinite Scrolling Marquee (Dải băng cuộn vô tận)</w:t>
+        <w:t xml:space="preserve">6.3 Exercise 3: Infinite Scrolling Technology Marquee</w:t>
       </w:r>
     </w:p>
     <w:p>
@@ -1999,12 +2016,12 @@
           <w:sz w:val="21"/>
           <w:szCs w:val="21"/>
         </w:rPr>
-        <w:t xml:space="preserve">Bài tập yêu cầu xây dựng một dải băng cuộn các nhãn công nghệ (HTML, CSS, JavaScript, Git, GitHub, VS Code) lặp vô tận liên tục, và tự động tạm dừng khi người dùng rê chuột vào banner.
-Các kỹ thuật CSS trọng tâm:
-• @keyframes scrollMarquee: Tịnh tiến thanh trượt từ translateX(0) đến translateX(-50%).
-• Seamless looping: Nhân đôi chuỗi phần tử trong HTML để khi nhóm 1 trôi hết thì nhóm 2 lập tức nối tiếp, tạo cảm giác vô tận không ngắt quãng.
-• animation: scrollMarquee 20s linear infinite: Chuyển động đều đặn và mượt mà.
-• animation-play-state: paused: Tạm dừng chuyển động ngay khi hover chuột vào banner.</w:t>
+        <w:t xml:space="preserve">This assignment builds an uninterrupted, horizontally scrolling ticker displaying modern web technologies (HTML, CSS, JavaScript, Git, GitHub, VS Code) that automatically pauses when the user hovers over the track.
+Key CSS techniques:
+• @keyframes scrollMarquee: Continuously translates the inner track from translateX(0) to translateX(-50%).
+• Seamless looping: Items are duplicated in HTML so that as track group 1 scrolls out of view, group 2 seamlessly continues with zero visual jitter or gaps.
+• animation: scrollMarquee 20s linear infinite: Ensures uniform velocity across all screen widths.
+• animation-play-state: paused: Temporarily suspends ticker motion whenever hovered.</w:t>
       </w:r>
     </w:p>
     <w:p>
@@ -2017,7 +2034,7 @@
           <wp:inline distT="0" distB="0" distL="0" distR="0">
             <wp:extent cx="4667250" cy="3914775"/>
             <wp:effectExtent t="0" r="0" b="0" l="0"/>
-            <wp:docPr id="17" name="Hình 17: Đoạn mã CSS điều khiển animation cuộn vô tận và tạm dừng khi hover trong marquee.css" descr="Hình 17: Đoạn mã CSS điều khiển animation cuộn vô tận và tạm dừng khi hover trong marquee.css" title="Hình 17: Đoạn mã CSS điều khiển animation cuộn vô tận và tạm dừng khi hover trong marquee.css"/>
+            <wp:docPr id="17" name="Figure 17: CSS keyframe animations and hover pause controls in marquee.css" descr="Figure 17: CSS keyframe animations and hover pause controls in marquee.css" title="Figure 17: CSS keyframe animations and hover pause controls in marquee.css"/>
             <wp:cNvGraphicFramePr>
               <a:graphicFrameLocks xmlns:a="http://schemas.openxmlformats.org/drawingml/2006/main" noChangeAspect="1"/>
             </wp:cNvGraphicFramePr>
@@ -2065,7 +2082,7 @@
           <w:sz w:val="18"/>
           <w:szCs w:val="18"/>
         </w:rPr>
-        <w:t xml:space="preserve">Hình 17: Đoạn mã CSS điều khiển animation cuộn vô tận và tạm dừng khi hover trong marquee.css</w:t>
+        <w:t xml:space="preserve">Figure 17: CSS keyframe animations and hover pause controls in marquee.css</w:t>
       </w:r>
     </w:p>
     <w:p>
@@ -2078,7 +2095,7 @@
           <wp:inline distT="0" distB="0" distL="0" distR="0">
             <wp:extent cx="4667250" cy="1066800"/>
             <wp:effectExtent t="0" r="0" b="0" l="0"/>
-            <wp:docPr id="18" name="Hình 18: Giao diện dải băng cuộn Infinite Scrolling Marquee trên nền tối #1f2937" descr="Hình 18: Giao diện dải băng cuộn Infinite Scrolling Marquee trên nền tối #1f2937" title="Hình 18: Giao diện dải băng cuộn Infinite Scrolling Marquee trên nền tối #1f2937"/>
+            <wp:docPr id="18" name="Figure 18: Infinite Scrolling Marquee rendered on dark slate background (#1f2937)" descr="Figure 18: Infinite Scrolling Marquee rendered on dark slate background (#1f2937)" title="Figure 18: Infinite Scrolling Marquee rendered on dark slate background (#1f2937)"/>
             <wp:cNvGraphicFramePr>
               <a:graphicFrameLocks xmlns:a="http://schemas.openxmlformats.org/drawingml/2006/main" noChangeAspect="1"/>
             </wp:cNvGraphicFramePr>
@@ -2126,7 +2143,7 @@
           <w:sz w:val="18"/>
           <w:szCs w:val="18"/>
         </w:rPr>
-        <w:t xml:space="preserve">Hình 18: Giao diện dải băng cuộn Infinite Scrolling Marquee trên nền tối #1f2937</w:t>
+        <w:t xml:space="preserve">Figure 18: Infinite Scrolling Marquee rendered on dark slate background (#1f2937)</w:t>
       </w:r>
     </w:p>
     <w:p>
@@ -2143,7 +2160,7 @@
           <w:sz w:val="22"/>
           <w:szCs w:val="22"/>
         </w:rPr>
-        <w:t xml:space="preserve">6.4 Cổng Trực Tuyến Tổng Hợp (Homework Showcase Portal)</w:t>
+        <w:t xml:space="preserve">6.4 Homework Showcase Portal</w:t>
       </w:r>
     </w:p>
     <w:p>
@@ -2159,7 +2176,7 @@
           <w:sz w:val="21"/>
           <w:szCs w:val="21"/>
         </w:rPr>
-        <w:t xml:space="preserve">Để hỗ trợ việc chấm bài và nghiệm thu trực tiếp thuận tiện nhất, em đã tích hợp toàn bộ các bài tập vào một giao diện Showcase đồng nhất tại thư mục homework/ (homework/index.html). Người chấm có thể dễ dàng trải nghiệm cả 3 bài tập trên cùng một trang hoặc mở riêng biệt từng bài tập qua các liên kết độc lập.</w:t>
+        <w:t xml:space="preserve">To facilitate streamlined evaluation and testing, all homework exercises were unified under an interactive Showcase Portal at homework/index.html. Evaluators can test all three interactive components on a single portal page or open standalone views via dedicated links.</w:t>
       </w:r>
     </w:p>
     <w:p>
@@ -2172,7 +2189,7 @@
           <wp:inline distT="0" distB="0" distL="0" distR="0">
             <wp:extent cx="4667250" cy="6219825"/>
             <wp:effectExtent t="0" r="0" b="0" l="0"/>
-            <wp:docPr id="19" name="Hình 19: Giao diện trang tổng hợp Showcase các bài tập về nhà" descr="Hình 19: Giao diện trang tổng hợp Showcase các bài tập về nhà" title="Hình 19: Giao diện trang tổng hợp Showcase các bài tập về nhà"/>
+            <wp:docPr id="19" name="Figure 19: Unified interactive Showcase Portal for all homework assignments" descr="Figure 19: Unified interactive Showcase Portal for all homework assignments" title="Figure 19: Unified interactive Showcase Portal for all homework assignments"/>
             <wp:cNvGraphicFramePr>
               <a:graphicFrameLocks xmlns:a="http://schemas.openxmlformats.org/drawingml/2006/main" noChangeAspect="1"/>
             </wp:cNvGraphicFramePr>
@@ -2220,7 +2237,7 @@
           <w:sz w:val="18"/>
           <w:szCs w:val="18"/>
         </w:rPr>
-        <w:t xml:space="preserve">Hình 19: Giao diện trang tổng hợp Showcase các bài tập về nhà</w:t>
+        <w:t xml:space="preserve">Figure 19: Unified interactive Showcase Portal for all homework assignments</w:t>
       </w:r>
     </w:p>
     <w:p>
@@ -2237,7 +2254,7 @@
           <w:sz w:val="26"/>
           <w:szCs w:val="26"/>
         </w:rPr>
-        <w:t xml:space="preserve">7. Liên Kết Nộp Bài (Public Repository Links)</w:t>
+        <w:t xml:space="preserve">7. Submission &amp; Public Links</w:t>
       </w:r>
     </w:p>
     <w:p>
@@ -2253,10 +2270,10 @@
           <w:sz w:val="21"/>
           <w:szCs w:val="21"/>
         </w:rPr>
-        <w:t xml:space="preserve">Theo đúng quy định nộp bài tại Mục 1.b của tài liệu Lab 1, dưới đây là liên kết công khai (Public) đến mã nguồn và sản phẩm đã triển khai của em:
-• GitHub Repository (Public): https://github.com/thien-z3d3r/lab1-cv
-• Trực tuyến CV Resume (GitHub Pages): https://thien-z3d3r.github.io/lab1-cv/
-• Trực tuyến Homework Portal: https://thien-z3d3r.github.io/lab1-cv/homework/
+        <w:t xml:space="preserve">In accordance with Section 1.b of the Lab 1 submission requirements, the following public links provide immediate access to the project source code and deployed web environments:
+• Public GitHub Repository: https://github.com/thien-z3d3r/lab1-cv
+• Live CV Portfolio (GitHub Pages): https://thien-z3d3r.github.io/lab1-cv/
+• Live Homework Showcase Portal: https://thien-z3d3r.github.io/lab1-cv/homework/
 • Standalone Exercise 1 (Flip Cards): https://thien-z3d3r.github.io/lab1-cv/homework/flip-card.html
 • Standalone Exercise 2 (Login Card): https://thien-z3d3r.github.io/lab1-cv/homework/login-card.html
 • Standalone Exercise 3 (Marquee): https://thien-z3d3r.github.io/lab1-cv/homework/marquee.html</w:t>
@@ -2276,7 +2293,7 @@
           <w:sz w:val="20"/>
           <w:szCs w:val="20"/>
         </w:rPr>
-        <w:t xml:space="preserve">--- HẾT BÁO CÁO LAB 1 ---</w:t>
+        <w:t xml:space="preserve">--- END OF LAB 1 REPORT ---</w:t>
       </w:r>
     </w:p>
     <w:sectPr>
@@ -2341,7 +2358,7 @@
         <w:sz w:val="17"/>
         <w:szCs w:val="17"/>
       </w:rPr>
-      <w:t xml:space="preserve">Trang </w:t>
+      <w:t xml:space="preserve">Page </w:t>
     </w:r>
     <w:r>
       <w:rPr>
@@ -2478,7 +2495,7 @@
         <w:sz w:val="17"/>
         <w:szCs w:val="17"/>
       </w:rPr>
-      <w:t xml:space="preserve">Báo Cáo Thực Hành Lab 1 - Thiết Kế &amp; Phát Triển Web | Huỳnh Khánh Thiện</w:t>
+      <w:t xml:space="preserve">Lab 1 Practical Report - Web Design &amp; Development | Huynh Khanh Thien</w:t>
     </w:r>
   </w:p>
 </w:hdr>

</xml_diff>